<commit_message>
Add prominent-figures encyclopedia, Treasury navigation, and deployment package.
Ship bilingual profile catalog with enriched content, replace the top-level Encyclopedia link with a Treasury/Xəziné submenu, and regenerate the production deployment folder for release.

Co-authored-by: Cursor <cursoragent@cursor.com>
</commit_message>
<xml_diff>
--- a/documents/docx/Prompts.docx
+++ b/documents/docx/Prompts.docx
@@ -15757,6 +15757,670 @@
       <w:pPr>
         <w:spacing w:after="0" w:line="240" w:lineRule="auto"/>
         <w:ind w:left="360"/>
+      </w:pPr>
+    </w:p>
+    <w:p>
+      <w:pPr>
+        <w:spacing w:after="0" w:line="240" w:lineRule="auto"/>
+        <w:ind w:left="360"/>
+      </w:pPr>
+    </w:p>
+    <w:p>
+      <w:pPr>
+        <w:spacing w:after="0" w:line="240" w:lineRule="auto"/>
+        <w:ind w:left="360"/>
+      </w:pPr>
+    </w:p>
+    <w:p>
+      <w:pPr>
+        <w:pBdr>
+          <w:bottom w:val="single" w:sz="6" w:space="1" w:color="auto"/>
+        </w:pBdr>
+        <w:spacing w:after="0" w:line="240" w:lineRule="auto"/>
+        <w:ind w:left="360"/>
+      </w:pPr>
+    </w:p>
+    <w:p>
+      <w:pPr>
+        <w:spacing w:after="0" w:line="240" w:lineRule="auto"/>
+        <w:ind w:left="360"/>
+      </w:pPr>
+    </w:p>
+    <w:p>
+      <w:pPr>
+        <w:spacing w:after="0" w:line="240" w:lineRule="auto"/>
+        <w:ind w:left="360"/>
+      </w:pPr>
+      <w:r>
+        <w:t>Qədim zamanlardan bu günə qədər dünyada məşhur olmuş Azərbaycan və türk əsilli alimləri, ziyalıları, təbibləri, şairləri və digər görkəmli şəxsiyyətləri saytımızda tanıtmaq istəyirəm.</w:t>
+      </w:r>
+    </w:p>
+    <w:p>
+      <w:pPr>
+        <w:spacing w:after="0" w:line="240" w:lineRule="auto"/>
+        <w:ind w:left="360"/>
+      </w:pPr>
+      <w:r>
+        <w:t>Mənə onların şəkilləri, həyat yolu, elmi və yaradıcılıq fəaliyyəti, əsas əsərləri və həyatlarından maraqlı hadisələr haqqında məlumatlar lazımdır.</w:t>
+      </w:r>
+    </w:p>
+    <w:p>
+      <w:pPr>
+        <w:spacing w:after="0" w:line="240" w:lineRule="auto"/>
+        <w:ind w:left="360"/>
+      </w:pPr>
+    </w:p>
+    <w:p>
+      <w:pPr>
+        <w:spacing w:after="0" w:line="240" w:lineRule="auto"/>
+        <w:ind w:left="360"/>
+      </w:pPr>
+      <w:r>
+        <w:t>-</w:t>
+      </w:r>
+      <w:r>
+        <w:t xml:space="preserve">  Siyahıya bütün türk xalqlarının — o cümlədən Osmanlı, Azərbaycan, özbək, uyğur, tatar, qazax, qırğız, türkmən və digər türk xalqlarının nümayəndələri daxil edilsin.</w:t>
+      </w:r>
+    </w:p>
+    <w:p>
+      <w:pPr>
+        <w:spacing w:after="0" w:line="240" w:lineRule="auto"/>
+        <w:ind w:left="360"/>
+      </w:pPr>
+      <w:r>
+        <w:t>-</w:t>
+      </w:r>
+      <w:r>
+        <w:t xml:space="preserve">  Məlumatlar tam olaraq təklif etdiyiniz struktur əsasında hazırlansın: şəxsiyyətin portreti, həyat yolu, elmi və yaradıcılıq fəaliyyəti, əsas əsərləri, cəmiyyətə verdiyi töhfələr və həyatından maraqlı hadisələr.</w:t>
+      </w:r>
+    </w:p>
+    <w:p>
+      <w:pPr>
+        <w:spacing w:after="0" w:line="240" w:lineRule="auto"/>
+        <w:ind w:left="360"/>
+      </w:pPr>
+      <w:r>
+        <w:t>-</w:t>
+      </w:r>
+      <w:r>
+        <w:t xml:space="preserve">  İşə qədim dövrlərdən başlayaq və materialları tarixi ardıcıllıqla təqdim edək.</w:t>
+      </w:r>
+    </w:p>
+    <w:p>
+      <w:pPr>
+        <w:spacing w:after="0" w:line="240" w:lineRule="auto"/>
+        <w:ind w:left="360"/>
+      </w:pPr>
+      <w:r>
+        <w:t>-</w:t>
+      </w:r>
+      <w:r>
+        <w:t xml:space="preserve">  Hazırlanacaq materiallar sayt üçün uyğunlaşdırılmış HTML formatında təqdim edilsin.</w:t>
+      </w:r>
+    </w:p>
+    <w:p>
+      <w:pPr>
+        <w:spacing w:after="0" w:line="240" w:lineRule="auto"/>
+        <w:ind w:left="360"/>
+      </w:pPr>
+      <w:r>
+        <w:t>- Qaynaqları da göstər</w:t>
+      </w:r>
+    </w:p>
+    <w:p>
+      <w:pPr>
+        <w:pBdr>
+          <w:bottom w:val="single" w:sz="6" w:space="1" w:color="auto"/>
+        </w:pBdr>
+        <w:spacing w:after="0" w:line="240" w:lineRule="auto"/>
+        <w:ind w:left="360"/>
+      </w:pPr>
+    </w:p>
+    <w:p>
+      <w:pPr>
+        <w:spacing w:after="0" w:line="240" w:lineRule="auto"/>
+        <w:ind w:left="360"/>
+        <w:rPr>
+          <w:lang w:val="az-Latn-AZ"/>
+        </w:rPr>
+      </w:pPr>
+    </w:p>
+    <w:p>
+      <w:pPr>
+        <w:spacing w:after="0" w:line="240" w:lineRule="auto"/>
+        <w:ind w:left="360"/>
+      </w:pPr>
+      <w:r>
+        <w:t>I would like to create a catalogue of the world’s most prominent historical figures.</w:t>
+      </w:r>
+    </w:p>
+    <w:p>
+      <w:pPr>
+        <w:spacing w:after="0" w:line="240" w:lineRule="auto"/>
+        <w:ind w:left="360"/>
+      </w:pPr>
+      <w:r>
+        <w:t>The catalogue should include world-renowned scientists, scholars, cultural figures, artists, military commanders, statesmen, physicians, and writers — from antiquity to the present day — whose achievements, ideas, discoveries, leadership, or creative work have made significant contributions to science, advanced human knowledge, or brought about transformative progress in human civilisation.</w:t>
+      </w:r>
+    </w:p>
+    <w:p>
+      <w:pPr>
+        <w:spacing w:after="0" w:line="240" w:lineRule="auto"/>
+        <w:ind w:left="360"/>
+      </w:pPr>
+      <w:r>
+        <w:t>The catalogue should include representatives of Azerbaijan and other Turkic-speaking peoples, as well as distinguished figures from other regions and civilisations of the world.</w:t>
+      </w:r>
+    </w:p>
+    <w:p>
+      <w:pPr>
+        <w:spacing w:after="0" w:line="240" w:lineRule="auto"/>
+        <w:ind w:left="360"/>
+      </w:pPr>
+      <w:r>
+        <w:lastRenderedPageBreak/>
+        <w:t xml:space="preserve">Please consider preparing profile pages for </w:t>
+      </w:r>
+      <w:r>
+        <w:rPr>
+          <w:b/>
+          <w:bCs/>
+        </w:rPr>
+        <w:t>100 of the most prominent figures in world history</w:t>
+      </w:r>
+      <w:r>
+        <w:t>, selected on the basis of their lasting impact on science, culture, society, governance, medicine, literature, the arts, military history, or human civilisation more broadly.</w:t>
+      </w:r>
+    </w:p>
+    <w:p>
+      <w:pPr>
+        <w:spacing w:after="0" w:line="240" w:lineRule="auto"/>
+        <w:ind w:left="360"/>
+      </w:pPr>
+      <w:r>
+        <w:t>For each figure, prepare a dedicated HTML profile page consistent with the existing UI/UX design standards adopted for our website.</w:t>
+      </w:r>
+    </w:p>
+    <w:p>
+      <w:pPr>
+        <w:spacing w:after="0" w:line="240" w:lineRule="auto"/>
+        <w:ind w:left="360"/>
+      </w:pPr>
+      <w:r>
+        <w:t>Each profile page should include the following sections:</w:t>
+      </w:r>
+    </w:p>
+    <w:p>
+      <w:pPr>
+        <w:numPr>
+          <w:ilvl w:val="0"/>
+          <w:numId w:val="105"/>
+        </w:numPr>
+        <w:spacing w:after="0" w:line="240" w:lineRule="auto"/>
+      </w:pPr>
+      <w:r>
+        <w:rPr>
+          <w:b/>
+          <w:bCs/>
+        </w:rPr>
+        <w:t>Life and Career</w:t>
+      </w:r>
+      <w:r>
+        <w:t xml:space="preserve"> — a biographical overview and historical context;</w:t>
+      </w:r>
+    </w:p>
+    <w:p>
+      <w:pPr>
+        <w:numPr>
+          <w:ilvl w:val="0"/>
+          <w:numId w:val="105"/>
+        </w:numPr>
+        <w:spacing w:after="0" w:line="240" w:lineRule="auto"/>
+      </w:pPr>
+      <w:r>
+        <w:rPr>
+          <w:b/>
+          <w:bCs/>
+        </w:rPr>
+        <w:t>Scholarly and Creative Activity</w:t>
+      </w:r>
+      <w:r>
+        <w:t xml:space="preserve"> — the figure’s fields of work and intellectual contribution;</w:t>
+      </w:r>
+    </w:p>
+    <w:p>
+      <w:pPr>
+        <w:numPr>
+          <w:ilvl w:val="0"/>
+          <w:numId w:val="105"/>
+        </w:numPr>
+        <w:spacing w:after="0" w:line="240" w:lineRule="auto"/>
+      </w:pPr>
+      <w:r>
+        <w:rPr>
+          <w:b/>
+          <w:bCs/>
+        </w:rPr>
+        <w:t>Principal Discoveries and Works</w:t>
+      </w:r>
+      <w:r>
+        <w:t xml:space="preserve"> — key achievements, discoveries, publications, reforms, or creative works;</w:t>
+      </w:r>
+    </w:p>
+    <w:p>
+      <w:pPr>
+        <w:numPr>
+          <w:ilvl w:val="0"/>
+          <w:numId w:val="105"/>
+        </w:numPr>
+        <w:spacing w:after="0" w:line="240" w:lineRule="auto"/>
+      </w:pPr>
+      <w:r>
+        <w:rPr>
+          <w:b/>
+          <w:bCs/>
+        </w:rPr>
+        <w:t>Contributions to Humanity</w:t>
+      </w:r>
+      <w:r>
+        <w:t xml:space="preserve"> — the figure’s lasting impact on science, culture, society, governance, medicine, literature, art, or civilisation;</w:t>
+      </w:r>
+    </w:p>
+    <w:p>
+      <w:pPr>
+        <w:numPr>
+          <w:ilvl w:val="0"/>
+          <w:numId w:val="105"/>
+        </w:numPr>
+        <w:spacing w:after="0" w:line="240" w:lineRule="auto"/>
+      </w:pPr>
+      <w:r>
+        <w:rPr>
+          <w:b/>
+          <w:bCs/>
+        </w:rPr>
+        <w:t>Notable Facts</w:t>
+      </w:r>
+      <w:r>
+        <w:t xml:space="preserve"> — compelling, meaningful, or lesser-known episodes from the figure’s life;</w:t>
+      </w:r>
+    </w:p>
+    <w:p>
+      <w:pPr>
+        <w:numPr>
+          <w:ilvl w:val="0"/>
+          <w:numId w:val="105"/>
+        </w:numPr>
+        <w:spacing w:after="0" w:line="240" w:lineRule="auto"/>
+      </w:pPr>
+      <w:r>
+        <w:rPr>
+          <w:b/>
+          <w:bCs/>
+        </w:rPr>
+        <w:t>Sources</w:t>
+      </w:r>
+      <w:r>
+        <w:t xml:space="preserve"> — verified and reliable references listed separately.</w:t>
+      </w:r>
+    </w:p>
+    <w:p>
+      <w:pPr>
+        <w:spacing w:after="0" w:line="240" w:lineRule="auto"/>
+        <w:ind w:left="360"/>
+      </w:pPr>
+      <w:r>
+        <w:t>Please create both English and Azerbaijani versions of all required pages. The language should be polished, natural, and appropriate for an academic and institutional audience.</w:t>
+      </w:r>
+    </w:p>
+    <w:p>
+      <w:pPr>
+        <w:spacing w:after="0" w:line="240" w:lineRule="auto"/>
+        <w:ind w:left="360"/>
+      </w:pPr>
+      <w:r>
+        <w:t>Use internationally recognized academic, scientific, governmental, biographical, museum, archival, and other reliable sources when preparing the content. All sources should be clearly listed at the end of each profile page.</w:t>
+      </w:r>
+    </w:p>
+    <w:p>
+      <w:pPr>
+        <w:pBdr>
+          <w:bottom w:val="single" w:sz="6" w:space="1" w:color="auto"/>
+        </w:pBdr>
+        <w:spacing w:after="0" w:line="240" w:lineRule="auto"/>
+        <w:ind w:left="360"/>
+      </w:pPr>
+    </w:p>
+    <w:p>
+      <w:pPr>
+        <w:spacing w:after="0" w:line="240" w:lineRule="auto"/>
+        <w:ind w:left="360"/>
+      </w:pPr>
+      <w:r>
+        <w:t>This document describes the business requirements relevant to the DAAB website.</w:t>
+      </w:r>
+    </w:p>
+    <w:p>
+      <w:pPr>
+        <w:spacing w:after="0" w:line="240" w:lineRule="auto"/>
+        <w:ind w:left="360"/>
+      </w:pPr>
+      <w:r>
+        <w:t>Please elaborate on these requirements and prepare a new document that translates them into a clear, structured technical specification. The specification should be detailed enough to guide software developers, UI/UX designers, and QA engineers in designing, developing, testing, and delivering a high-quality, modern, responsive, and user-friendly DAAB website.</w:t>
+      </w:r>
+    </w:p>
+    <w:p>
+      <w:pPr>
+        <w:spacing w:after="0" w:line="240" w:lineRule="auto"/>
+        <w:ind w:left="360"/>
+      </w:pPr>
+      <w:r>
+        <w:t>The technical specification should include functional requirements, non-functional requirements, UI/UX standards, information architecture, navigation structure, content management needs, multilingual support, responsiveness rules, accessibility requirements, performance expectations, security considerations, integration points, testing criteria, and acceptance criteria for each major feature.</w:t>
+      </w:r>
+    </w:p>
+    <w:p>
+      <w:pPr>
+        <w:pBdr>
+          <w:bottom w:val="single" w:sz="6" w:space="1" w:color="auto"/>
+        </w:pBdr>
+        <w:spacing w:after="0" w:line="240" w:lineRule="auto"/>
+        <w:ind w:left="360"/>
+      </w:pPr>
+    </w:p>
+    <w:p>
+      <w:pPr>
+        <w:spacing w:after="0" w:line="240" w:lineRule="auto"/>
+        <w:ind w:left="360"/>
+      </w:pPr>
+    </w:p>
+    <w:p>
+      <w:pPr>
+        <w:spacing w:after="0" w:line="240" w:lineRule="auto"/>
+        <w:ind w:left="360"/>
+      </w:pPr>
+      <w:r>
+        <w:t>I noticed that some sentences in the English version of the profile pages still contain Azerbaijani words or phrases.</w:t>
+      </w:r>
+    </w:p>
+    <w:p>
+      <w:pPr>
+        <w:spacing w:after="0" w:line="240" w:lineRule="auto"/>
+        <w:ind w:left="360"/>
+      </w:pPr>
+      <w:r>
+        <w:t>Please locate all such sentences, review them carefully, compare them with the original Azerbaijani text, and translate them into proper, polished English. The final English version should be natural, professional, and should not contain any Azerbaijani words, phrases, or untranslated fragments.</w:t>
+      </w:r>
+    </w:p>
+    <w:p>
+      <w:pPr>
+        <w:spacing w:after="0" w:line="240" w:lineRule="auto"/>
+        <w:ind w:left="360"/>
+      </w:pPr>
+      <w:r>
+        <w:t>Please apply this correction consistently across all English profile pages.</w:t>
+      </w:r>
+    </w:p>
+    <w:p>
+      <w:pPr>
+        <w:pBdr>
+          <w:bottom w:val="single" w:sz="6" w:space="1" w:color="auto"/>
+        </w:pBdr>
+        <w:spacing w:after="0" w:line="240" w:lineRule="auto"/>
+        <w:ind w:left="360"/>
+      </w:pPr>
+    </w:p>
+    <w:p>
+      <w:pPr>
+        <w:spacing w:after="0" w:line="240" w:lineRule="auto"/>
+        <w:ind w:left="360"/>
+      </w:pPr>
+    </w:p>
+    <w:p>
+      <w:pPr>
+        <w:spacing w:after="0" w:line="240" w:lineRule="auto"/>
+        <w:ind w:left="360"/>
+      </w:pPr>
+      <w:r>
+        <w:t>I have noticed a serious issue with the profile pages of the prominent figures.</w:t>
+      </w:r>
+    </w:p>
+    <w:p>
+      <w:pPr>
+        <w:spacing w:after="0" w:line="240" w:lineRule="auto"/>
+        <w:ind w:left="360"/>
+      </w:pPr>
+      <w:r>
+        <w:t xml:space="preserve">The information provided in the sections </w:t>
+      </w:r>
+      <w:r>
+        <w:rPr>
+          <w:b/>
+          <w:bCs/>
+        </w:rPr>
+        <w:t>“Contribution to Society,” “Key Works and Contributions,”</w:t>
+      </w:r>
+      <w:r>
+        <w:t xml:space="preserve"> and </w:t>
+      </w:r>
+      <w:r>
+        <w:rPr>
+          <w:b/>
+          <w:bCs/>
+        </w:rPr>
+        <w:t>“Notable Aspects of Life and Work”</w:t>
+      </w:r>
+      <w:r>
+        <w:t xml:space="preserve"> is currently very limited and appears to be almost identical across many profiles. This creates the impression that the content has been copied from one profile to another, which is not acceptable for an academic and institutional website.</w:t>
+      </w:r>
+    </w:p>
+    <w:p>
+      <w:pPr>
+        <w:spacing w:after="0" w:line="240" w:lineRule="auto"/>
+        <w:ind w:left="360"/>
+      </w:pPr>
+      <w:r>
+        <w:lastRenderedPageBreak/>
+        <w:t>Please conduct deeper research for each individual profile and enrich these sections with specific, accurate, and meaningful information that reflects the actual life, work, achievements, influence, and historical importance of each figure.</w:t>
+      </w:r>
+    </w:p>
+    <w:p>
+      <w:pPr>
+        <w:spacing w:after="0" w:line="240" w:lineRule="auto"/>
+        <w:ind w:left="360"/>
+      </w:pPr>
+      <w:r>
+        <w:t>Each profile should contain unique, well-researched content based on reliable sources. The text should be professional, informative, and tailored to the particular person rather than using generic or repetitive formulations.</w:t>
+      </w:r>
+    </w:p>
+    <w:p>
+      <w:pPr>
+        <w:pBdr>
+          <w:bottom w:val="single" w:sz="6" w:space="1" w:color="auto"/>
+        </w:pBdr>
+        <w:spacing w:after="0" w:line="240" w:lineRule="auto"/>
+        <w:ind w:left="360"/>
+        <w:rPr>
+          <w:lang w:val="az-Latn-AZ"/>
+        </w:rPr>
+      </w:pPr>
+    </w:p>
+    <w:p>
+      <w:pPr>
+        <w:spacing w:after="0" w:line="240" w:lineRule="auto"/>
+        <w:ind w:left="360"/>
+        <w:rPr>
+          <w:lang w:val="az-Latn-AZ"/>
+        </w:rPr>
+      </w:pPr>
+    </w:p>
+    <w:p>
+      <w:pPr>
+        <w:spacing w:after="0" w:line="240" w:lineRule="auto"/>
+        <w:ind w:left="360"/>
+      </w:pPr>
+      <w:r>
+        <w:t>Please update the top navigation menu as follows:</w:t>
+      </w:r>
+    </w:p>
+    <w:p>
+      <w:pPr>
+        <w:spacing w:after="0" w:line="240" w:lineRule="auto"/>
+        <w:ind w:left="360"/>
+      </w:pPr>
+      <w:r>
+        <w:t xml:space="preserve">Rename the top-level menu item </w:t>
+      </w:r>
+      <w:r>
+        <w:rPr>
+          <w:b/>
+          <w:bCs/>
+        </w:rPr>
+        <w:t>“Encyclopedia”</w:t>
+      </w:r>
+      <w:r>
+        <w:t xml:space="preserve"> to:</w:t>
+      </w:r>
+    </w:p>
+    <w:p>
+      <w:pPr>
+        <w:numPr>
+          <w:ilvl w:val="0"/>
+          <w:numId w:val="106"/>
+        </w:numPr>
+        <w:spacing w:after="0" w:line="240" w:lineRule="auto"/>
+      </w:pPr>
+      <w:r>
+        <w:rPr>
+          <w:b/>
+          <w:bCs/>
+        </w:rPr>
+        <w:t>“Treasury”</w:t>
+      </w:r>
+      <w:r>
+        <w:t xml:space="preserve"> in the English version;</w:t>
+      </w:r>
+    </w:p>
+    <w:p>
+      <w:pPr>
+        <w:numPr>
+          <w:ilvl w:val="0"/>
+          <w:numId w:val="106"/>
+        </w:numPr>
+        <w:spacing w:after="0" w:line="240" w:lineRule="auto"/>
+      </w:pPr>
+      <w:r>
+        <w:rPr>
+          <w:b/>
+          <w:bCs/>
+        </w:rPr>
+        <w:t>“Xəzinə”</w:t>
+      </w:r>
+      <w:r>
+        <w:t xml:space="preserve"> in the Azerbaijani version.</w:t>
+      </w:r>
+    </w:p>
+    <w:p>
+      <w:pPr>
+        <w:spacing w:after="0" w:line="240" w:lineRule="auto"/>
+        <w:ind w:left="360"/>
+      </w:pPr>
+      <w:r>
+        <w:t>Under this top-level menu item, add the following submenu items:</w:t>
+      </w:r>
+    </w:p>
+    <w:p>
+      <w:pPr>
+        <w:numPr>
+          <w:ilvl w:val="0"/>
+          <w:numId w:val="107"/>
+        </w:numPr>
+        <w:spacing w:after="0" w:line="240" w:lineRule="auto"/>
+      </w:pPr>
+      <w:r>
+        <w:rPr>
+          <w:b/>
+          <w:bCs/>
+        </w:rPr>
+        <w:t>Prominent Figures</w:t>
+      </w:r>
+    </w:p>
+    <w:p>
+      <w:pPr>
+        <w:numPr>
+          <w:ilvl w:val="0"/>
+          <w:numId w:val="107"/>
+        </w:numPr>
+        <w:spacing w:after="0" w:line="240" w:lineRule="auto"/>
+      </w:pPr>
+      <w:r>
+        <w:rPr>
+          <w:b/>
+          <w:bCs/>
+        </w:rPr>
+        <w:t>Industrial Revolutions</w:t>
+      </w:r>
+    </w:p>
+    <w:p>
+      <w:pPr>
+        <w:numPr>
+          <w:ilvl w:val="0"/>
+          <w:numId w:val="107"/>
+        </w:numPr>
+        <w:spacing w:after="0" w:line="240" w:lineRule="auto"/>
+      </w:pPr>
+      <w:r>
+        <w:rPr>
+          <w:b/>
+          <w:bCs/>
+        </w:rPr>
+        <w:t>Major Scientific Inventions</w:t>
+      </w:r>
+    </w:p>
+    <w:p>
+      <w:pPr>
+        <w:spacing w:after="0" w:line="240" w:lineRule="auto"/>
+        <w:ind w:left="360"/>
+      </w:pPr>
+      <w:r>
+        <w:t xml:space="preserve">Move the current functionality and link of the existing </w:t>
+      </w:r>
+      <w:r>
+        <w:rPr>
+          <w:b/>
+          <w:bCs/>
+        </w:rPr>
+        <w:t>“Encyclopedia”</w:t>
+      </w:r>
+      <w:r>
+        <w:t xml:space="preserve"> menu item to the new </w:t>
+      </w:r>
+      <w:r>
+        <w:rPr>
+          <w:b/>
+          <w:bCs/>
+        </w:rPr>
+        <w:t>“Prominent Figures”</w:t>
+      </w:r>
+      <w:r>
+        <w:t xml:space="preserve"> submenu item.</w:t>
+      </w:r>
+    </w:p>
+    <w:p>
+      <w:pPr>
+        <w:spacing w:after="0" w:line="240" w:lineRule="auto"/>
+        <w:ind w:left="360"/>
+      </w:pPr>
+      <w:r>
+        <w:t>Ensure that the new submenu follows the existing UI/UX standards of the website, including styling, spacing, hover behavior, dropdown behavior, responsiveness, and multilingual consistency across the English and Azerbaijani versions.</w:t>
+      </w:r>
+    </w:p>
+    <w:p>
+      <w:pPr>
+        <w:spacing w:after="0" w:line="240" w:lineRule="auto"/>
+        <w:ind w:left="360"/>
+        <w:rPr>
+          <w:lang w:val="az-Latn-AZ"/>
+        </w:rPr>
       </w:pPr>
     </w:p>
     <w:sectPr>
@@ -16519,6 +17183,155 @@
     </w:lvl>
   </w:abstractNum>
   <w:abstractNum w:abstractNumId="6" w15:restartNumberingAfterBreak="0">
+    <w:nsid w:val="03015F84"/>
+    <w:multiLevelType w:val="multilevel"/>
+    <w:tmpl w:val="33F0F0EA"/>
+    <w:lvl w:ilvl="0">
+      <w:start w:val="1"/>
+      <w:numFmt w:val="bullet"/>
+      <w:lvlText w:val=""/>
+      <w:lvlJc w:val="left"/>
+      <w:pPr>
+        <w:tabs>
+          <w:tab w:val="num" w:pos="720"/>
+        </w:tabs>
+        <w:ind w:left="720" w:hanging="360"/>
+      </w:pPr>
+      <w:rPr>
+        <w:rFonts w:ascii="Symbol" w:hAnsi="Symbol" w:hint="default"/>
+        <w:sz w:val="20"/>
+      </w:rPr>
+    </w:lvl>
+    <w:lvl w:ilvl="1" w:tentative="1">
+      <w:start w:val="1"/>
+      <w:numFmt w:val="bullet"/>
+      <w:lvlText w:val="o"/>
+      <w:lvlJc w:val="left"/>
+      <w:pPr>
+        <w:tabs>
+          <w:tab w:val="num" w:pos="1440"/>
+        </w:tabs>
+        <w:ind w:left="1440" w:hanging="360"/>
+      </w:pPr>
+      <w:rPr>
+        <w:rFonts w:ascii="Courier New" w:hAnsi="Courier New" w:hint="default"/>
+        <w:sz w:val="20"/>
+      </w:rPr>
+    </w:lvl>
+    <w:lvl w:ilvl="2" w:tentative="1">
+      <w:start w:val="1"/>
+      <w:numFmt w:val="bullet"/>
+      <w:lvlText w:val=""/>
+      <w:lvlJc w:val="left"/>
+      <w:pPr>
+        <w:tabs>
+          <w:tab w:val="num" w:pos="2160"/>
+        </w:tabs>
+        <w:ind w:left="2160" w:hanging="360"/>
+      </w:pPr>
+      <w:rPr>
+        <w:rFonts w:ascii="Wingdings" w:hAnsi="Wingdings" w:hint="default"/>
+        <w:sz w:val="20"/>
+      </w:rPr>
+    </w:lvl>
+    <w:lvl w:ilvl="3" w:tentative="1">
+      <w:start w:val="1"/>
+      <w:numFmt w:val="bullet"/>
+      <w:lvlText w:val=""/>
+      <w:lvlJc w:val="left"/>
+      <w:pPr>
+        <w:tabs>
+          <w:tab w:val="num" w:pos="2880"/>
+        </w:tabs>
+        <w:ind w:left="2880" w:hanging="360"/>
+      </w:pPr>
+      <w:rPr>
+        <w:rFonts w:ascii="Wingdings" w:hAnsi="Wingdings" w:hint="default"/>
+        <w:sz w:val="20"/>
+      </w:rPr>
+    </w:lvl>
+    <w:lvl w:ilvl="4" w:tentative="1">
+      <w:start w:val="1"/>
+      <w:numFmt w:val="bullet"/>
+      <w:lvlText w:val=""/>
+      <w:lvlJc w:val="left"/>
+      <w:pPr>
+        <w:tabs>
+          <w:tab w:val="num" w:pos="3600"/>
+        </w:tabs>
+        <w:ind w:left="3600" w:hanging="360"/>
+      </w:pPr>
+      <w:rPr>
+        <w:rFonts w:ascii="Wingdings" w:hAnsi="Wingdings" w:hint="default"/>
+        <w:sz w:val="20"/>
+      </w:rPr>
+    </w:lvl>
+    <w:lvl w:ilvl="5" w:tentative="1">
+      <w:start w:val="1"/>
+      <w:numFmt w:val="bullet"/>
+      <w:lvlText w:val=""/>
+      <w:lvlJc w:val="left"/>
+      <w:pPr>
+        <w:tabs>
+          <w:tab w:val="num" w:pos="4320"/>
+        </w:tabs>
+        <w:ind w:left="4320" w:hanging="360"/>
+      </w:pPr>
+      <w:rPr>
+        <w:rFonts w:ascii="Wingdings" w:hAnsi="Wingdings" w:hint="default"/>
+        <w:sz w:val="20"/>
+      </w:rPr>
+    </w:lvl>
+    <w:lvl w:ilvl="6" w:tentative="1">
+      <w:start w:val="1"/>
+      <w:numFmt w:val="bullet"/>
+      <w:lvlText w:val=""/>
+      <w:lvlJc w:val="left"/>
+      <w:pPr>
+        <w:tabs>
+          <w:tab w:val="num" w:pos="5040"/>
+        </w:tabs>
+        <w:ind w:left="5040" w:hanging="360"/>
+      </w:pPr>
+      <w:rPr>
+        <w:rFonts w:ascii="Wingdings" w:hAnsi="Wingdings" w:hint="default"/>
+        <w:sz w:val="20"/>
+      </w:rPr>
+    </w:lvl>
+    <w:lvl w:ilvl="7" w:tentative="1">
+      <w:start w:val="1"/>
+      <w:numFmt w:val="bullet"/>
+      <w:lvlText w:val=""/>
+      <w:lvlJc w:val="left"/>
+      <w:pPr>
+        <w:tabs>
+          <w:tab w:val="num" w:pos="5760"/>
+        </w:tabs>
+        <w:ind w:left="5760" w:hanging="360"/>
+      </w:pPr>
+      <w:rPr>
+        <w:rFonts w:ascii="Wingdings" w:hAnsi="Wingdings" w:hint="default"/>
+        <w:sz w:val="20"/>
+      </w:rPr>
+    </w:lvl>
+    <w:lvl w:ilvl="8" w:tentative="1">
+      <w:start w:val="1"/>
+      <w:numFmt w:val="bullet"/>
+      <w:lvlText w:val=""/>
+      <w:lvlJc w:val="left"/>
+      <w:pPr>
+        <w:tabs>
+          <w:tab w:val="num" w:pos="6480"/>
+        </w:tabs>
+        <w:ind w:left="6480" w:hanging="360"/>
+      </w:pPr>
+      <w:rPr>
+        <w:rFonts w:ascii="Wingdings" w:hAnsi="Wingdings" w:hint="default"/>
+        <w:sz w:val="20"/>
+      </w:rPr>
+    </w:lvl>
+  </w:abstractNum>
+  <w:abstractNum w:abstractNumId="7" w15:restartNumberingAfterBreak="0">
     <w:nsid w:val="030454D8"/>
     <w:multiLevelType w:val="multilevel"/>
     <w:tmpl w:val="5460399E"/>
@@ -16667,7 +17480,7 @@
       </w:rPr>
     </w:lvl>
   </w:abstractNum>
-  <w:abstractNum w:abstractNumId="7" w15:restartNumberingAfterBreak="0">
+  <w:abstractNum w:abstractNumId="8" w15:restartNumberingAfterBreak="0">
     <w:nsid w:val="04B37D57"/>
     <w:multiLevelType w:val="multilevel"/>
     <w:tmpl w:val="969C7DB4"/>
@@ -16780,7 +17593,7 @@
       </w:pPr>
     </w:lvl>
   </w:abstractNum>
-  <w:abstractNum w:abstractNumId="8" w15:restartNumberingAfterBreak="0">
+  <w:abstractNum w:abstractNumId="9" w15:restartNumberingAfterBreak="0">
     <w:nsid w:val="04B71142"/>
     <w:multiLevelType w:val="multilevel"/>
     <w:tmpl w:val="8862BA3A"/>
@@ -16929,7 +17742,7 @@
       </w:rPr>
     </w:lvl>
   </w:abstractNum>
-  <w:abstractNum w:abstractNumId="9" w15:restartNumberingAfterBreak="0">
+  <w:abstractNum w:abstractNumId="10" w15:restartNumberingAfterBreak="0">
     <w:nsid w:val="0D7856B1"/>
     <w:multiLevelType w:val="hybridMultilevel"/>
     <w:tmpl w:val="2898D4BA"/>
@@ -17041,7 +17854,7 @@
       </w:rPr>
     </w:lvl>
   </w:abstractNum>
-  <w:abstractNum w:abstractNumId="10" w15:restartNumberingAfterBreak="0">
+  <w:abstractNum w:abstractNumId="11" w15:restartNumberingAfterBreak="0">
     <w:nsid w:val="0EF628C1"/>
     <w:multiLevelType w:val="hybridMultilevel"/>
     <w:tmpl w:val="3FECA2B0"/>
@@ -17154,7 +17967,7 @@
       </w:rPr>
     </w:lvl>
   </w:abstractNum>
-  <w:abstractNum w:abstractNumId="11" w15:restartNumberingAfterBreak="0">
+  <w:abstractNum w:abstractNumId="12" w15:restartNumberingAfterBreak="0">
     <w:nsid w:val="0FE04871"/>
     <w:multiLevelType w:val="hybridMultilevel"/>
     <w:tmpl w:val="D1565958"/>
@@ -17267,7 +18080,7 @@
       </w:rPr>
     </w:lvl>
   </w:abstractNum>
-  <w:abstractNum w:abstractNumId="12" w15:restartNumberingAfterBreak="0">
+  <w:abstractNum w:abstractNumId="13" w15:restartNumberingAfterBreak="0">
     <w:nsid w:val="10523C97"/>
     <w:multiLevelType w:val="hybridMultilevel"/>
     <w:tmpl w:val="5244902C"/>
@@ -17380,7 +18193,7 @@
       </w:rPr>
     </w:lvl>
   </w:abstractNum>
-  <w:abstractNum w:abstractNumId="13" w15:restartNumberingAfterBreak="0">
+  <w:abstractNum w:abstractNumId="14" w15:restartNumberingAfterBreak="0">
     <w:nsid w:val="11552863"/>
     <w:multiLevelType w:val="hybridMultilevel"/>
     <w:tmpl w:val="42AC51D2"/>
@@ -17492,7 +18305,7 @@
       </w:rPr>
     </w:lvl>
   </w:abstractNum>
-  <w:abstractNum w:abstractNumId="14" w15:restartNumberingAfterBreak="0">
+  <w:abstractNum w:abstractNumId="15" w15:restartNumberingAfterBreak="0">
     <w:nsid w:val="14831279"/>
     <w:multiLevelType w:val="multilevel"/>
     <w:tmpl w:val="B02AD528"/>
@@ -17641,7 +18454,7 @@
       </w:rPr>
     </w:lvl>
   </w:abstractNum>
-  <w:abstractNum w:abstractNumId="15" w15:restartNumberingAfterBreak="0">
+  <w:abstractNum w:abstractNumId="16" w15:restartNumberingAfterBreak="0">
     <w:nsid w:val="168B796C"/>
     <w:multiLevelType w:val="hybridMultilevel"/>
     <w:tmpl w:val="DA50B3A8"/>
@@ -17753,7 +18566,7 @@
       </w:rPr>
     </w:lvl>
   </w:abstractNum>
-  <w:abstractNum w:abstractNumId="16" w15:restartNumberingAfterBreak="0">
+  <w:abstractNum w:abstractNumId="17" w15:restartNumberingAfterBreak="0">
     <w:nsid w:val="19E06C2D"/>
     <w:multiLevelType w:val="hybridMultilevel"/>
     <w:tmpl w:val="79E4B8F4"/>
@@ -17866,7 +18679,7 @@
       </w:rPr>
     </w:lvl>
   </w:abstractNum>
-  <w:abstractNum w:abstractNumId="17" w15:restartNumberingAfterBreak="0">
+  <w:abstractNum w:abstractNumId="18" w15:restartNumberingAfterBreak="0">
     <w:nsid w:val="1ABB3A53"/>
     <w:multiLevelType w:val="hybridMultilevel"/>
     <w:tmpl w:val="63F04ED8"/>
@@ -17978,7 +18791,7 @@
       </w:rPr>
     </w:lvl>
   </w:abstractNum>
-  <w:abstractNum w:abstractNumId="18" w15:restartNumberingAfterBreak="0">
+  <w:abstractNum w:abstractNumId="19" w15:restartNumberingAfterBreak="0">
     <w:nsid w:val="1B0B2056"/>
     <w:multiLevelType w:val="multilevel"/>
     <w:tmpl w:val="70AA8958"/>
@@ -18127,7 +18940,7 @@
       </w:rPr>
     </w:lvl>
   </w:abstractNum>
-  <w:abstractNum w:abstractNumId="19" w15:restartNumberingAfterBreak="0">
+  <w:abstractNum w:abstractNumId="20" w15:restartNumberingAfterBreak="0">
     <w:nsid w:val="1E0977E0"/>
     <w:multiLevelType w:val="hybridMultilevel"/>
     <w:tmpl w:val="549675B6"/>
@@ -18239,7 +19052,7 @@
       </w:rPr>
     </w:lvl>
   </w:abstractNum>
-  <w:abstractNum w:abstractNumId="20" w15:restartNumberingAfterBreak="0">
+  <w:abstractNum w:abstractNumId="21" w15:restartNumberingAfterBreak="0">
     <w:nsid w:val="1E5D0B16"/>
     <w:multiLevelType w:val="multilevel"/>
     <w:tmpl w:val="DDD27F94"/>
@@ -18388,7 +19201,7 @@
       </w:rPr>
     </w:lvl>
   </w:abstractNum>
-  <w:abstractNum w:abstractNumId="21" w15:restartNumberingAfterBreak="0">
+  <w:abstractNum w:abstractNumId="22" w15:restartNumberingAfterBreak="0">
     <w:nsid w:val="1FF82639"/>
     <w:multiLevelType w:val="hybridMultilevel"/>
     <w:tmpl w:val="3D58A3A4"/>
@@ -18500,7 +19313,7 @@
       </w:rPr>
     </w:lvl>
   </w:abstractNum>
-  <w:abstractNum w:abstractNumId="22" w15:restartNumberingAfterBreak="0">
+  <w:abstractNum w:abstractNumId="23" w15:restartNumberingAfterBreak="0">
     <w:nsid w:val="21561542"/>
     <w:multiLevelType w:val="hybridMultilevel"/>
     <w:tmpl w:val="5A365C6E"/>
@@ -18613,7 +19426,7 @@
       </w:rPr>
     </w:lvl>
   </w:abstractNum>
-  <w:abstractNum w:abstractNumId="23" w15:restartNumberingAfterBreak="0">
+  <w:abstractNum w:abstractNumId="24" w15:restartNumberingAfterBreak="0">
     <w:nsid w:val="229E3A8A"/>
     <w:multiLevelType w:val="hybridMultilevel"/>
     <w:tmpl w:val="F9A0F2D6"/>
@@ -18725,7 +19538,7 @@
       </w:rPr>
     </w:lvl>
   </w:abstractNum>
-  <w:abstractNum w:abstractNumId="24" w15:restartNumberingAfterBreak="0">
+  <w:abstractNum w:abstractNumId="25" w15:restartNumberingAfterBreak="0">
     <w:nsid w:val="24F04132"/>
     <w:multiLevelType w:val="hybridMultilevel"/>
     <w:tmpl w:val="D9763222"/>
@@ -18837,7 +19650,7 @@
       </w:rPr>
     </w:lvl>
   </w:abstractNum>
-  <w:abstractNum w:abstractNumId="25" w15:restartNumberingAfterBreak="0">
+  <w:abstractNum w:abstractNumId="26" w15:restartNumberingAfterBreak="0">
     <w:nsid w:val="25A03424"/>
     <w:multiLevelType w:val="hybridMultilevel"/>
     <w:tmpl w:val="01D22A8A"/>
@@ -18950,7 +19763,7 @@
       </w:rPr>
     </w:lvl>
   </w:abstractNum>
-  <w:abstractNum w:abstractNumId="26" w15:restartNumberingAfterBreak="0">
+  <w:abstractNum w:abstractNumId="27" w15:restartNumberingAfterBreak="0">
     <w:nsid w:val="25C95C75"/>
     <w:multiLevelType w:val="multilevel"/>
     <w:tmpl w:val="8C681C84"/>
@@ -19099,7 +19912,7 @@
       </w:rPr>
     </w:lvl>
   </w:abstractNum>
-  <w:abstractNum w:abstractNumId="27" w15:restartNumberingAfterBreak="0">
+  <w:abstractNum w:abstractNumId="28" w15:restartNumberingAfterBreak="0">
     <w:nsid w:val="26A95B53"/>
     <w:multiLevelType w:val="multilevel"/>
     <w:tmpl w:val="8E6E75B0"/>
@@ -19216,7 +20029,7 @@
       </w:pPr>
     </w:lvl>
   </w:abstractNum>
-  <w:abstractNum w:abstractNumId="28" w15:restartNumberingAfterBreak="0">
+  <w:abstractNum w:abstractNumId="29" w15:restartNumberingAfterBreak="0">
     <w:nsid w:val="27D37713"/>
     <w:multiLevelType w:val="hybridMultilevel"/>
     <w:tmpl w:val="DCFC50E8"/>
@@ -19329,7 +20142,7 @@
       </w:rPr>
     </w:lvl>
   </w:abstractNum>
-  <w:abstractNum w:abstractNumId="29" w15:restartNumberingAfterBreak="0">
+  <w:abstractNum w:abstractNumId="30" w15:restartNumberingAfterBreak="0">
     <w:nsid w:val="298F11E7"/>
     <w:multiLevelType w:val="hybridMultilevel"/>
     <w:tmpl w:val="1108B76C"/>
@@ -19441,7 +20254,7 @@
       </w:rPr>
     </w:lvl>
   </w:abstractNum>
-  <w:abstractNum w:abstractNumId="30" w15:restartNumberingAfterBreak="0">
+  <w:abstractNum w:abstractNumId="31" w15:restartNumberingAfterBreak="0">
     <w:nsid w:val="29B23F98"/>
     <w:multiLevelType w:val="hybridMultilevel"/>
     <w:tmpl w:val="DF880AF0"/>
@@ -19554,7 +20367,7 @@
       </w:rPr>
     </w:lvl>
   </w:abstractNum>
-  <w:abstractNum w:abstractNumId="31" w15:restartNumberingAfterBreak="0">
+  <w:abstractNum w:abstractNumId="32" w15:restartNumberingAfterBreak="0">
     <w:nsid w:val="2A535D37"/>
     <w:multiLevelType w:val="hybridMultilevel"/>
     <w:tmpl w:val="7FECFCC0"/>
@@ -19666,7 +20479,7 @@
       </w:rPr>
     </w:lvl>
   </w:abstractNum>
-  <w:abstractNum w:abstractNumId="32" w15:restartNumberingAfterBreak="0">
+  <w:abstractNum w:abstractNumId="33" w15:restartNumberingAfterBreak="0">
     <w:nsid w:val="2AFF4127"/>
     <w:multiLevelType w:val="multilevel"/>
     <w:tmpl w:val="5CF69D86"/>
@@ -19815,7 +20628,7 @@
       </w:rPr>
     </w:lvl>
   </w:abstractNum>
-  <w:abstractNum w:abstractNumId="33" w15:restartNumberingAfterBreak="0">
+  <w:abstractNum w:abstractNumId="34" w15:restartNumberingAfterBreak="0">
     <w:nsid w:val="2B087E4A"/>
     <w:multiLevelType w:val="hybridMultilevel"/>
     <w:tmpl w:val="5BA2AE44"/>
@@ -19928,7 +20741,7 @@
       </w:rPr>
     </w:lvl>
   </w:abstractNum>
-  <w:abstractNum w:abstractNumId="34" w15:restartNumberingAfterBreak="0">
+  <w:abstractNum w:abstractNumId="35" w15:restartNumberingAfterBreak="0">
     <w:nsid w:val="2B687FD7"/>
     <w:multiLevelType w:val="multilevel"/>
     <w:tmpl w:val="4D4478B0"/>
@@ -20077,7 +20890,7 @@
       </w:rPr>
     </w:lvl>
   </w:abstractNum>
-  <w:abstractNum w:abstractNumId="35" w15:restartNumberingAfterBreak="0">
+  <w:abstractNum w:abstractNumId="36" w15:restartNumberingAfterBreak="0">
     <w:nsid w:val="2CBB2E60"/>
     <w:multiLevelType w:val="hybridMultilevel"/>
     <w:tmpl w:val="B20AB142"/>
@@ -20189,7 +21002,7 @@
       </w:rPr>
     </w:lvl>
   </w:abstractNum>
-  <w:abstractNum w:abstractNumId="36" w15:restartNumberingAfterBreak="0">
+  <w:abstractNum w:abstractNumId="37" w15:restartNumberingAfterBreak="0">
     <w:nsid w:val="2D682597"/>
     <w:multiLevelType w:val="hybridMultilevel"/>
     <w:tmpl w:val="8AEE5F66"/>
@@ -20301,7 +21114,156 @@
       </w:rPr>
     </w:lvl>
   </w:abstractNum>
-  <w:abstractNum w:abstractNumId="37" w15:restartNumberingAfterBreak="0">
+  <w:abstractNum w:abstractNumId="38" w15:restartNumberingAfterBreak="0">
+    <w:nsid w:val="2E82781B"/>
+    <w:multiLevelType w:val="multilevel"/>
+    <w:tmpl w:val="F360605E"/>
+    <w:lvl w:ilvl="0">
+      <w:start w:val="1"/>
+      <w:numFmt w:val="bullet"/>
+      <w:lvlText w:val=""/>
+      <w:lvlJc w:val="left"/>
+      <w:pPr>
+        <w:tabs>
+          <w:tab w:val="num" w:pos="1080"/>
+        </w:tabs>
+        <w:ind w:left="1080" w:hanging="360"/>
+      </w:pPr>
+      <w:rPr>
+        <w:rFonts w:ascii="Symbol" w:hAnsi="Symbol" w:hint="default"/>
+        <w:sz w:val="20"/>
+      </w:rPr>
+    </w:lvl>
+    <w:lvl w:ilvl="1" w:tentative="1">
+      <w:start w:val="1"/>
+      <w:numFmt w:val="bullet"/>
+      <w:lvlText w:val="o"/>
+      <w:lvlJc w:val="left"/>
+      <w:pPr>
+        <w:tabs>
+          <w:tab w:val="num" w:pos="1800"/>
+        </w:tabs>
+        <w:ind w:left="1800" w:hanging="360"/>
+      </w:pPr>
+      <w:rPr>
+        <w:rFonts w:ascii="Courier New" w:hAnsi="Courier New" w:hint="default"/>
+        <w:sz w:val="20"/>
+      </w:rPr>
+    </w:lvl>
+    <w:lvl w:ilvl="2" w:tentative="1">
+      <w:start w:val="1"/>
+      <w:numFmt w:val="bullet"/>
+      <w:lvlText w:val=""/>
+      <w:lvlJc w:val="left"/>
+      <w:pPr>
+        <w:tabs>
+          <w:tab w:val="num" w:pos="2520"/>
+        </w:tabs>
+        <w:ind w:left="2520" w:hanging="360"/>
+      </w:pPr>
+      <w:rPr>
+        <w:rFonts w:ascii="Wingdings" w:hAnsi="Wingdings" w:hint="default"/>
+        <w:sz w:val="20"/>
+      </w:rPr>
+    </w:lvl>
+    <w:lvl w:ilvl="3" w:tentative="1">
+      <w:start w:val="1"/>
+      <w:numFmt w:val="bullet"/>
+      <w:lvlText w:val=""/>
+      <w:lvlJc w:val="left"/>
+      <w:pPr>
+        <w:tabs>
+          <w:tab w:val="num" w:pos="3240"/>
+        </w:tabs>
+        <w:ind w:left="3240" w:hanging="360"/>
+      </w:pPr>
+      <w:rPr>
+        <w:rFonts w:ascii="Wingdings" w:hAnsi="Wingdings" w:hint="default"/>
+        <w:sz w:val="20"/>
+      </w:rPr>
+    </w:lvl>
+    <w:lvl w:ilvl="4" w:tentative="1">
+      <w:start w:val="1"/>
+      <w:numFmt w:val="bullet"/>
+      <w:lvlText w:val=""/>
+      <w:lvlJc w:val="left"/>
+      <w:pPr>
+        <w:tabs>
+          <w:tab w:val="num" w:pos="3960"/>
+        </w:tabs>
+        <w:ind w:left="3960" w:hanging="360"/>
+      </w:pPr>
+      <w:rPr>
+        <w:rFonts w:ascii="Wingdings" w:hAnsi="Wingdings" w:hint="default"/>
+        <w:sz w:val="20"/>
+      </w:rPr>
+    </w:lvl>
+    <w:lvl w:ilvl="5" w:tentative="1">
+      <w:start w:val="1"/>
+      <w:numFmt w:val="bullet"/>
+      <w:lvlText w:val=""/>
+      <w:lvlJc w:val="left"/>
+      <w:pPr>
+        <w:tabs>
+          <w:tab w:val="num" w:pos="4680"/>
+        </w:tabs>
+        <w:ind w:left="4680" w:hanging="360"/>
+      </w:pPr>
+      <w:rPr>
+        <w:rFonts w:ascii="Wingdings" w:hAnsi="Wingdings" w:hint="default"/>
+        <w:sz w:val="20"/>
+      </w:rPr>
+    </w:lvl>
+    <w:lvl w:ilvl="6" w:tentative="1">
+      <w:start w:val="1"/>
+      <w:numFmt w:val="bullet"/>
+      <w:lvlText w:val=""/>
+      <w:lvlJc w:val="left"/>
+      <w:pPr>
+        <w:tabs>
+          <w:tab w:val="num" w:pos="5400"/>
+        </w:tabs>
+        <w:ind w:left="5400" w:hanging="360"/>
+      </w:pPr>
+      <w:rPr>
+        <w:rFonts w:ascii="Wingdings" w:hAnsi="Wingdings" w:hint="default"/>
+        <w:sz w:val="20"/>
+      </w:rPr>
+    </w:lvl>
+    <w:lvl w:ilvl="7" w:tentative="1">
+      <w:start w:val="1"/>
+      <w:numFmt w:val="bullet"/>
+      <w:lvlText w:val=""/>
+      <w:lvlJc w:val="left"/>
+      <w:pPr>
+        <w:tabs>
+          <w:tab w:val="num" w:pos="6120"/>
+        </w:tabs>
+        <w:ind w:left="6120" w:hanging="360"/>
+      </w:pPr>
+      <w:rPr>
+        <w:rFonts w:ascii="Wingdings" w:hAnsi="Wingdings" w:hint="default"/>
+        <w:sz w:val="20"/>
+      </w:rPr>
+    </w:lvl>
+    <w:lvl w:ilvl="8" w:tentative="1">
+      <w:start w:val="1"/>
+      <w:numFmt w:val="bullet"/>
+      <w:lvlText w:val=""/>
+      <w:lvlJc w:val="left"/>
+      <w:pPr>
+        <w:tabs>
+          <w:tab w:val="num" w:pos="6840"/>
+        </w:tabs>
+        <w:ind w:left="6840" w:hanging="360"/>
+      </w:pPr>
+      <w:rPr>
+        <w:rFonts w:ascii="Wingdings" w:hAnsi="Wingdings" w:hint="default"/>
+        <w:sz w:val="20"/>
+      </w:rPr>
+    </w:lvl>
+  </w:abstractNum>
+  <w:abstractNum w:abstractNumId="39" w15:restartNumberingAfterBreak="0">
     <w:nsid w:val="2F0D491F"/>
     <w:multiLevelType w:val="hybridMultilevel"/>
     <w:tmpl w:val="D7D0F52A"/>
@@ -20414,7 +21376,7 @@
       </w:rPr>
     </w:lvl>
   </w:abstractNum>
-  <w:abstractNum w:abstractNumId="38" w15:restartNumberingAfterBreak="0">
+  <w:abstractNum w:abstractNumId="40" w15:restartNumberingAfterBreak="0">
     <w:nsid w:val="309C07EC"/>
     <w:multiLevelType w:val="hybridMultilevel"/>
     <w:tmpl w:val="43E654DC"/>
@@ -20527,7 +21489,7 @@
       </w:rPr>
     </w:lvl>
   </w:abstractNum>
-  <w:abstractNum w:abstractNumId="39" w15:restartNumberingAfterBreak="0">
+  <w:abstractNum w:abstractNumId="41" w15:restartNumberingAfterBreak="0">
     <w:nsid w:val="3122254E"/>
     <w:multiLevelType w:val="multilevel"/>
     <w:tmpl w:val="B470B2CA"/>
@@ -20676,7 +21638,7 @@
       </w:rPr>
     </w:lvl>
   </w:abstractNum>
-  <w:abstractNum w:abstractNumId="40" w15:restartNumberingAfterBreak="0">
+  <w:abstractNum w:abstractNumId="42" w15:restartNumberingAfterBreak="0">
     <w:nsid w:val="31D20FF2"/>
     <w:multiLevelType w:val="hybridMultilevel"/>
     <w:tmpl w:val="EA3CB86A"/>
@@ -20788,7 +21750,7 @@
       </w:rPr>
     </w:lvl>
   </w:abstractNum>
-  <w:abstractNum w:abstractNumId="41" w15:restartNumberingAfterBreak="0">
+  <w:abstractNum w:abstractNumId="43" w15:restartNumberingAfterBreak="0">
     <w:nsid w:val="35E55AC7"/>
     <w:multiLevelType w:val="hybridMultilevel"/>
     <w:tmpl w:val="BCFCACC6"/>
@@ -20900,7 +21862,7 @@
       </w:rPr>
     </w:lvl>
   </w:abstractNum>
-  <w:abstractNum w:abstractNumId="42" w15:restartNumberingAfterBreak="0">
+  <w:abstractNum w:abstractNumId="44" w15:restartNumberingAfterBreak="0">
     <w:nsid w:val="380E36DB"/>
     <w:multiLevelType w:val="hybridMultilevel"/>
     <w:tmpl w:val="7B3E5C58"/>
@@ -21012,7 +21974,7 @@
       </w:rPr>
     </w:lvl>
   </w:abstractNum>
-  <w:abstractNum w:abstractNumId="43" w15:restartNumberingAfterBreak="0">
+  <w:abstractNum w:abstractNumId="45" w15:restartNumberingAfterBreak="0">
     <w:nsid w:val="38530E13"/>
     <w:multiLevelType w:val="hybridMultilevel"/>
     <w:tmpl w:val="263AC0D6"/>
@@ -21125,7 +22087,7 @@
       </w:rPr>
     </w:lvl>
   </w:abstractNum>
-  <w:abstractNum w:abstractNumId="44" w15:restartNumberingAfterBreak="0">
+  <w:abstractNum w:abstractNumId="46" w15:restartNumberingAfterBreak="0">
     <w:nsid w:val="39DB4418"/>
     <w:multiLevelType w:val="hybridMultilevel"/>
     <w:tmpl w:val="1C843710"/>
@@ -21237,7 +22199,7 @@
       </w:rPr>
     </w:lvl>
   </w:abstractNum>
-  <w:abstractNum w:abstractNumId="45" w15:restartNumberingAfterBreak="0">
+  <w:abstractNum w:abstractNumId="47" w15:restartNumberingAfterBreak="0">
     <w:nsid w:val="3A2445DB"/>
     <w:multiLevelType w:val="hybridMultilevel"/>
     <w:tmpl w:val="629C8E56"/>
@@ -21349,7 +22311,7 @@
       </w:rPr>
     </w:lvl>
   </w:abstractNum>
-  <w:abstractNum w:abstractNumId="46" w15:restartNumberingAfterBreak="0">
+  <w:abstractNum w:abstractNumId="48" w15:restartNumberingAfterBreak="0">
     <w:nsid w:val="3A2A15F0"/>
     <w:multiLevelType w:val="multilevel"/>
     <w:tmpl w:val="8EC800BA"/>
@@ -21498,7 +22460,7 @@
       </w:rPr>
     </w:lvl>
   </w:abstractNum>
-  <w:abstractNum w:abstractNumId="47" w15:restartNumberingAfterBreak="0">
+  <w:abstractNum w:abstractNumId="49" w15:restartNumberingAfterBreak="0">
     <w:nsid w:val="3C6C2C33"/>
     <w:multiLevelType w:val="hybridMultilevel"/>
     <w:tmpl w:val="D8EA41E8"/>
@@ -21610,7 +22572,7 @@
       </w:rPr>
     </w:lvl>
   </w:abstractNum>
-  <w:abstractNum w:abstractNumId="48" w15:restartNumberingAfterBreak="0">
+  <w:abstractNum w:abstractNumId="50" w15:restartNumberingAfterBreak="0">
     <w:nsid w:val="3E017A65"/>
     <w:multiLevelType w:val="hybridMultilevel"/>
     <w:tmpl w:val="7DC43054"/>
@@ -21722,7 +22684,7 @@
       </w:rPr>
     </w:lvl>
   </w:abstractNum>
-  <w:abstractNum w:abstractNumId="49" w15:restartNumberingAfterBreak="0">
+  <w:abstractNum w:abstractNumId="51" w15:restartNumberingAfterBreak="0">
     <w:nsid w:val="3F2F2766"/>
     <w:multiLevelType w:val="hybridMultilevel"/>
     <w:tmpl w:val="4502E290"/>
@@ -21835,7 +22797,7 @@
       </w:rPr>
     </w:lvl>
   </w:abstractNum>
-  <w:abstractNum w:abstractNumId="50" w15:restartNumberingAfterBreak="0">
+  <w:abstractNum w:abstractNumId="52" w15:restartNumberingAfterBreak="0">
     <w:nsid w:val="3F670876"/>
     <w:multiLevelType w:val="hybridMultilevel"/>
     <w:tmpl w:val="87CAC3F6"/>
@@ -21947,7 +22909,7 @@
       </w:rPr>
     </w:lvl>
   </w:abstractNum>
-  <w:abstractNum w:abstractNumId="51" w15:restartNumberingAfterBreak="0">
+  <w:abstractNum w:abstractNumId="53" w15:restartNumberingAfterBreak="0">
     <w:nsid w:val="3FEE4530"/>
     <w:multiLevelType w:val="hybridMultilevel"/>
     <w:tmpl w:val="EFB48A48"/>
@@ -22060,7 +23022,7 @@
       </w:rPr>
     </w:lvl>
   </w:abstractNum>
-  <w:abstractNum w:abstractNumId="52" w15:restartNumberingAfterBreak="0">
+  <w:abstractNum w:abstractNumId="54" w15:restartNumberingAfterBreak="0">
     <w:nsid w:val="42516CF2"/>
     <w:multiLevelType w:val="multilevel"/>
     <w:tmpl w:val="B0706E5A"/>
@@ -22209,7 +23171,7 @@
       </w:rPr>
     </w:lvl>
   </w:abstractNum>
-  <w:abstractNum w:abstractNumId="53" w15:restartNumberingAfterBreak="0">
+  <w:abstractNum w:abstractNumId="55" w15:restartNumberingAfterBreak="0">
     <w:nsid w:val="42545CBC"/>
     <w:multiLevelType w:val="hybridMultilevel"/>
     <w:tmpl w:val="A6D487CC"/>
@@ -22321,7 +23283,7 @@
       </w:rPr>
     </w:lvl>
   </w:abstractNum>
-  <w:abstractNum w:abstractNumId="54" w15:restartNumberingAfterBreak="0">
+  <w:abstractNum w:abstractNumId="56" w15:restartNumberingAfterBreak="0">
     <w:nsid w:val="444A7F9A"/>
     <w:multiLevelType w:val="hybridMultilevel"/>
     <w:tmpl w:val="FC3C1540"/>
@@ -22433,7 +23395,7 @@
       </w:rPr>
     </w:lvl>
   </w:abstractNum>
-  <w:abstractNum w:abstractNumId="55" w15:restartNumberingAfterBreak="0">
+  <w:abstractNum w:abstractNumId="57" w15:restartNumberingAfterBreak="0">
     <w:nsid w:val="445D654F"/>
     <w:multiLevelType w:val="hybridMultilevel"/>
     <w:tmpl w:val="C8920D36"/>
@@ -22546,7 +23508,7 @@
       </w:rPr>
     </w:lvl>
   </w:abstractNum>
-  <w:abstractNum w:abstractNumId="56" w15:restartNumberingAfterBreak="0">
+  <w:abstractNum w:abstractNumId="58" w15:restartNumberingAfterBreak="0">
     <w:nsid w:val="451619A4"/>
     <w:multiLevelType w:val="hybridMultilevel"/>
     <w:tmpl w:val="D3B8B1B0"/>
@@ -22658,7 +23620,7 @@
       </w:rPr>
     </w:lvl>
   </w:abstractNum>
-  <w:abstractNum w:abstractNumId="57" w15:restartNumberingAfterBreak="0">
+  <w:abstractNum w:abstractNumId="59" w15:restartNumberingAfterBreak="0">
     <w:nsid w:val="45867B90"/>
     <w:multiLevelType w:val="hybridMultilevel"/>
     <w:tmpl w:val="47BA1232"/>
@@ -22770,7 +23732,7 @@
       </w:rPr>
     </w:lvl>
   </w:abstractNum>
-  <w:abstractNum w:abstractNumId="58" w15:restartNumberingAfterBreak="0">
+  <w:abstractNum w:abstractNumId="60" w15:restartNumberingAfterBreak="0">
     <w:nsid w:val="470C54C3"/>
     <w:multiLevelType w:val="hybridMultilevel"/>
     <w:tmpl w:val="0A827D10"/>
@@ -22883,7 +23845,7 @@
       </w:rPr>
     </w:lvl>
   </w:abstractNum>
-  <w:abstractNum w:abstractNumId="59" w15:restartNumberingAfterBreak="0">
+  <w:abstractNum w:abstractNumId="61" w15:restartNumberingAfterBreak="0">
     <w:nsid w:val="48691879"/>
     <w:multiLevelType w:val="multilevel"/>
     <w:tmpl w:val="24FA03BA"/>
@@ -23032,7 +23994,7 @@
       </w:rPr>
     </w:lvl>
   </w:abstractNum>
-  <w:abstractNum w:abstractNumId="60" w15:restartNumberingAfterBreak="0">
+  <w:abstractNum w:abstractNumId="62" w15:restartNumberingAfterBreak="0">
     <w:nsid w:val="4A136C87"/>
     <w:multiLevelType w:val="hybridMultilevel"/>
     <w:tmpl w:val="78608C6C"/>
@@ -23144,7 +24106,7 @@
       </w:rPr>
     </w:lvl>
   </w:abstractNum>
-  <w:abstractNum w:abstractNumId="61" w15:restartNumberingAfterBreak="0">
+  <w:abstractNum w:abstractNumId="63" w15:restartNumberingAfterBreak="0">
     <w:nsid w:val="4A236E9D"/>
     <w:multiLevelType w:val="hybridMultilevel"/>
     <w:tmpl w:val="9F9812D0"/>
@@ -23256,7 +24218,7 @@
       </w:rPr>
     </w:lvl>
   </w:abstractNum>
-  <w:abstractNum w:abstractNumId="62" w15:restartNumberingAfterBreak="0">
+  <w:abstractNum w:abstractNumId="64" w15:restartNumberingAfterBreak="0">
     <w:nsid w:val="4A5F55A9"/>
     <w:multiLevelType w:val="hybridMultilevel"/>
     <w:tmpl w:val="0D3AC080"/>
@@ -23368,7 +24330,7 @@
       </w:rPr>
     </w:lvl>
   </w:abstractNum>
-  <w:abstractNum w:abstractNumId="63" w15:restartNumberingAfterBreak="0">
+  <w:abstractNum w:abstractNumId="65" w15:restartNumberingAfterBreak="0">
     <w:nsid w:val="4A753E2F"/>
     <w:multiLevelType w:val="multilevel"/>
     <w:tmpl w:val="AABC8488"/>
@@ -23517,7 +24479,7 @@
       </w:rPr>
     </w:lvl>
   </w:abstractNum>
-  <w:abstractNum w:abstractNumId="64" w15:restartNumberingAfterBreak="0">
+  <w:abstractNum w:abstractNumId="66" w15:restartNumberingAfterBreak="0">
     <w:nsid w:val="4BB76C74"/>
     <w:multiLevelType w:val="hybridMultilevel"/>
     <w:tmpl w:val="D5303D68"/>
@@ -23629,7 +24591,7 @@
       </w:rPr>
     </w:lvl>
   </w:abstractNum>
-  <w:abstractNum w:abstractNumId="65" w15:restartNumberingAfterBreak="0">
+  <w:abstractNum w:abstractNumId="67" w15:restartNumberingAfterBreak="0">
     <w:nsid w:val="4DA617C0"/>
     <w:multiLevelType w:val="hybridMultilevel"/>
     <w:tmpl w:val="CBB6B620"/>
@@ -23741,7 +24703,7 @@
       </w:rPr>
     </w:lvl>
   </w:abstractNum>
-  <w:abstractNum w:abstractNumId="66" w15:restartNumberingAfterBreak="0">
+  <w:abstractNum w:abstractNumId="68" w15:restartNumberingAfterBreak="0">
     <w:nsid w:val="4E3A3B25"/>
     <w:multiLevelType w:val="hybridMultilevel"/>
     <w:tmpl w:val="99AA89AC"/>
@@ -23853,7 +24815,7 @@
       </w:rPr>
     </w:lvl>
   </w:abstractNum>
-  <w:abstractNum w:abstractNumId="67" w15:restartNumberingAfterBreak="0">
+  <w:abstractNum w:abstractNumId="69" w15:restartNumberingAfterBreak="0">
     <w:nsid w:val="4F2C133C"/>
     <w:multiLevelType w:val="multilevel"/>
     <w:tmpl w:val="25603220"/>
@@ -24002,7 +24964,7 @@
       </w:rPr>
     </w:lvl>
   </w:abstractNum>
-  <w:abstractNum w:abstractNumId="68" w15:restartNumberingAfterBreak="0">
+  <w:abstractNum w:abstractNumId="70" w15:restartNumberingAfterBreak="0">
     <w:nsid w:val="50256ADE"/>
     <w:multiLevelType w:val="hybridMultilevel"/>
     <w:tmpl w:val="0818EA64"/>
@@ -24114,7 +25076,7 @@
       </w:rPr>
     </w:lvl>
   </w:abstractNum>
-  <w:abstractNum w:abstractNumId="69" w15:restartNumberingAfterBreak="0">
+  <w:abstractNum w:abstractNumId="71" w15:restartNumberingAfterBreak="0">
     <w:nsid w:val="51713097"/>
     <w:multiLevelType w:val="multilevel"/>
     <w:tmpl w:val="AB2C4482"/>
@@ -24263,7 +25225,7 @@
       </w:rPr>
     </w:lvl>
   </w:abstractNum>
-  <w:abstractNum w:abstractNumId="70" w15:restartNumberingAfterBreak="0">
+  <w:abstractNum w:abstractNumId="72" w15:restartNumberingAfterBreak="0">
     <w:nsid w:val="51975149"/>
     <w:multiLevelType w:val="hybridMultilevel"/>
     <w:tmpl w:val="2EF4D1CA"/>
@@ -24376,7 +25338,7 @@
       </w:rPr>
     </w:lvl>
   </w:abstractNum>
-  <w:abstractNum w:abstractNumId="71" w15:restartNumberingAfterBreak="0">
+  <w:abstractNum w:abstractNumId="73" w15:restartNumberingAfterBreak="0">
     <w:nsid w:val="522764ED"/>
     <w:multiLevelType w:val="hybridMultilevel"/>
     <w:tmpl w:val="DAFA377A"/>
@@ -24465,7 +25427,7 @@
       </w:pPr>
     </w:lvl>
   </w:abstractNum>
-  <w:abstractNum w:abstractNumId="72" w15:restartNumberingAfterBreak="0">
+  <w:abstractNum w:abstractNumId="74" w15:restartNumberingAfterBreak="0">
     <w:nsid w:val="53FB0753"/>
     <w:multiLevelType w:val="hybridMultilevel"/>
     <w:tmpl w:val="36C23286"/>
@@ -24577,7 +25539,7 @@
       </w:rPr>
     </w:lvl>
   </w:abstractNum>
-  <w:abstractNum w:abstractNumId="73" w15:restartNumberingAfterBreak="0">
+  <w:abstractNum w:abstractNumId="75" w15:restartNumberingAfterBreak="0">
     <w:nsid w:val="54CD7F04"/>
     <w:multiLevelType w:val="multilevel"/>
     <w:tmpl w:val="020E20BE"/>
@@ -24690,7 +25652,7 @@
       </w:pPr>
     </w:lvl>
   </w:abstractNum>
-  <w:abstractNum w:abstractNumId="74" w15:restartNumberingAfterBreak="0">
+  <w:abstractNum w:abstractNumId="76" w15:restartNumberingAfterBreak="0">
     <w:nsid w:val="56A967D5"/>
     <w:multiLevelType w:val="hybridMultilevel"/>
     <w:tmpl w:val="4AD2C76C"/>
@@ -24802,7 +25764,156 @@
       </w:rPr>
     </w:lvl>
   </w:abstractNum>
-  <w:abstractNum w:abstractNumId="75" w15:restartNumberingAfterBreak="0">
+  <w:abstractNum w:abstractNumId="77" w15:restartNumberingAfterBreak="0">
+    <w:nsid w:val="578F4A30"/>
+    <w:multiLevelType w:val="multilevel"/>
+    <w:tmpl w:val="AA3C5686"/>
+    <w:lvl w:ilvl="0">
+      <w:start w:val="1"/>
+      <w:numFmt w:val="bullet"/>
+      <w:lvlText w:val=""/>
+      <w:lvlJc w:val="left"/>
+      <w:pPr>
+        <w:tabs>
+          <w:tab w:val="num" w:pos="720"/>
+        </w:tabs>
+        <w:ind w:left="720" w:hanging="360"/>
+      </w:pPr>
+      <w:rPr>
+        <w:rFonts w:ascii="Symbol" w:hAnsi="Symbol" w:hint="default"/>
+        <w:sz w:val="20"/>
+      </w:rPr>
+    </w:lvl>
+    <w:lvl w:ilvl="1" w:tentative="1">
+      <w:start w:val="1"/>
+      <w:numFmt w:val="bullet"/>
+      <w:lvlText w:val="o"/>
+      <w:lvlJc w:val="left"/>
+      <w:pPr>
+        <w:tabs>
+          <w:tab w:val="num" w:pos="1440"/>
+        </w:tabs>
+        <w:ind w:left="1440" w:hanging="360"/>
+      </w:pPr>
+      <w:rPr>
+        <w:rFonts w:ascii="Courier New" w:hAnsi="Courier New" w:hint="default"/>
+        <w:sz w:val="20"/>
+      </w:rPr>
+    </w:lvl>
+    <w:lvl w:ilvl="2" w:tentative="1">
+      <w:start w:val="1"/>
+      <w:numFmt w:val="bullet"/>
+      <w:lvlText w:val=""/>
+      <w:lvlJc w:val="left"/>
+      <w:pPr>
+        <w:tabs>
+          <w:tab w:val="num" w:pos="2160"/>
+        </w:tabs>
+        <w:ind w:left="2160" w:hanging="360"/>
+      </w:pPr>
+      <w:rPr>
+        <w:rFonts w:ascii="Wingdings" w:hAnsi="Wingdings" w:hint="default"/>
+        <w:sz w:val="20"/>
+      </w:rPr>
+    </w:lvl>
+    <w:lvl w:ilvl="3" w:tentative="1">
+      <w:start w:val="1"/>
+      <w:numFmt w:val="bullet"/>
+      <w:lvlText w:val=""/>
+      <w:lvlJc w:val="left"/>
+      <w:pPr>
+        <w:tabs>
+          <w:tab w:val="num" w:pos="2880"/>
+        </w:tabs>
+        <w:ind w:left="2880" w:hanging="360"/>
+      </w:pPr>
+      <w:rPr>
+        <w:rFonts w:ascii="Wingdings" w:hAnsi="Wingdings" w:hint="default"/>
+        <w:sz w:val="20"/>
+      </w:rPr>
+    </w:lvl>
+    <w:lvl w:ilvl="4" w:tentative="1">
+      <w:start w:val="1"/>
+      <w:numFmt w:val="bullet"/>
+      <w:lvlText w:val=""/>
+      <w:lvlJc w:val="left"/>
+      <w:pPr>
+        <w:tabs>
+          <w:tab w:val="num" w:pos="3600"/>
+        </w:tabs>
+        <w:ind w:left="3600" w:hanging="360"/>
+      </w:pPr>
+      <w:rPr>
+        <w:rFonts w:ascii="Wingdings" w:hAnsi="Wingdings" w:hint="default"/>
+        <w:sz w:val="20"/>
+      </w:rPr>
+    </w:lvl>
+    <w:lvl w:ilvl="5" w:tentative="1">
+      <w:start w:val="1"/>
+      <w:numFmt w:val="bullet"/>
+      <w:lvlText w:val=""/>
+      <w:lvlJc w:val="left"/>
+      <w:pPr>
+        <w:tabs>
+          <w:tab w:val="num" w:pos="4320"/>
+        </w:tabs>
+        <w:ind w:left="4320" w:hanging="360"/>
+      </w:pPr>
+      <w:rPr>
+        <w:rFonts w:ascii="Wingdings" w:hAnsi="Wingdings" w:hint="default"/>
+        <w:sz w:val="20"/>
+      </w:rPr>
+    </w:lvl>
+    <w:lvl w:ilvl="6" w:tentative="1">
+      <w:start w:val="1"/>
+      <w:numFmt w:val="bullet"/>
+      <w:lvlText w:val=""/>
+      <w:lvlJc w:val="left"/>
+      <w:pPr>
+        <w:tabs>
+          <w:tab w:val="num" w:pos="5040"/>
+        </w:tabs>
+        <w:ind w:left="5040" w:hanging="360"/>
+      </w:pPr>
+      <w:rPr>
+        <w:rFonts w:ascii="Wingdings" w:hAnsi="Wingdings" w:hint="default"/>
+        <w:sz w:val="20"/>
+      </w:rPr>
+    </w:lvl>
+    <w:lvl w:ilvl="7" w:tentative="1">
+      <w:start w:val="1"/>
+      <w:numFmt w:val="bullet"/>
+      <w:lvlText w:val=""/>
+      <w:lvlJc w:val="left"/>
+      <w:pPr>
+        <w:tabs>
+          <w:tab w:val="num" w:pos="5760"/>
+        </w:tabs>
+        <w:ind w:left="5760" w:hanging="360"/>
+      </w:pPr>
+      <w:rPr>
+        <w:rFonts w:ascii="Wingdings" w:hAnsi="Wingdings" w:hint="default"/>
+        <w:sz w:val="20"/>
+      </w:rPr>
+    </w:lvl>
+    <w:lvl w:ilvl="8" w:tentative="1">
+      <w:start w:val="1"/>
+      <w:numFmt w:val="bullet"/>
+      <w:lvlText w:val=""/>
+      <w:lvlJc w:val="left"/>
+      <w:pPr>
+        <w:tabs>
+          <w:tab w:val="num" w:pos="6480"/>
+        </w:tabs>
+        <w:ind w:left="6480" w:hanging="360"/>
+      </w:pPr>
+      <w:rPr>
+        <w:rFonts w:ascii="Wingdings" w:hAnsi="Wingdings" w:hint="default"/>
+        <w:sz w:val="20"/>
+      </w:rPr>
+    </w:lvl>
+  </w:abstractNum>
+  <w:abstractNum w:abstractNumId="78" w15:restartNumberingAfterBreak="0">
     <w:nsid w:val="57F8144A"/>
     <w:multiLevelType w:val="hybridMultilevel"/>
     <w:tmpl w:val="1F8208A2"/>
@@ -24914,7 +26025,7 @@
       </w:rPr>
     </w:lvl>
   </w:abstractNum>
-  <w:abstractNum w:abstractNumId="76" w15:restartNumberingAfterBreak="0">
+  <w:abstractNum w:abstractNumId="79" w15:restartNumberingAfterBreak="0">
     <w:nsid w:val="57FA4B86"/>
     <w:multiLevelType w:val="hybridMultilevel"/>
     <w:tmpl w:val="24E2749A"/>
@@ -25026,7 +26137,156 @@
       </w:rPr>
     </w:lvl>
   </w:abstractNum>
-  <w:abstractNum w:abstractNumId="77" w15:restartNumberingAfterBreak="0">
+  <w:abstractNum w:abstractNumId="80" w15:restartNumberingAfterBreak="0">
+    <w:nsid w:val="59A37E1D"/>
+    <w:multiLevelType w:val="multilevel"/>
+    <w:tmpl w:val="C77A0876"/>
+    <w:lvl w:ilvl="0">
+      <w:start w:val="1"/>
+      <w:numFmt w:val="bullet"/>
+      <w:lvlText w:val=""/>
+      <w:lvlJc w:val="left"/>
+      <w:pPr>
+        <w:tabs>
+          <w:tab w:val="num" w:pos="720"/>
+        </w:tabs>
+        <w:ind w:left="720" w:hanging="360"/>
+      </w:pPr>
+      <w:rPr>
+        <w:rFonts w:ascii="Symbol" w:hAnsi="Symbol" w:hint="default"/>
+        <w:sz w:val="20"/>
+      </w:rPr>
+    </w:lvl>
+    <w:lvl w:ilvl="1" w:tentative="1">
+      <w:start w:val="1"/>
+      <w:numFmt w:val="bullet"/>
+      <w:lvlText w:val="o"/>
+      <w:lvlJc w:val="left"/>
+      <w:pPr>
+        <w:tabs>
+          <w:tab w:val="num" w:pos="1440"/>
+        </w:tabs>
+        <w:ind w:left="1440" w:hanging="360"/>
+      </w:pPr>
+      <w:rPr>
+        <w:rFonts w:ascii="Courier New" w:hAnsi="Courier New" w:hint="default"/>
+        <w:sz w:val="20"/>
+      </w:rPr>
+    </w:lvl>
+    <w:lvl w:ilvl="2" w:tentative="1">
+      <w:start w:val="1"/>
+      <w:numFmt w:val="bullet"/>
+      <w:lvlText w:val=""/>
+      <w:lvlJc w:val="left"/>
+      <w:pPr>
+        <w:tabs>
+          <w:tab w:val="num" w:pos="2160"/>
+        </w:tabs>
+        <w:ind w:left="2160" w:hanging="360"/>
+      </w:pPr>
+      <w:rPr>
+        <w:rFonts w:ascii="Wingdings" w:hAnsi="Wingdings" w:hint="default"/>
+        <w:sz w:val="20"/>
+      </w:rPr>
+    </w:lvl>
+    <w:lvl w:ilvl="3" w:tentative="1">
+      <w:start w:val="1"/>
+      <w:numFmt w:val="bullet"/>
+      <w:lvlText w:val=""/>
+      <w:lvlJc w:val="left"/>
+      <w:pPr>
+        <w:tabs>
+          <w:tab w:val="num" w:pos="2880"/>
+        </w:tabs>
+        <w:ind w:left="2880" w:hanging="360"/>
+      </w:pPr>
+      <w:rPr>
+        <w:rFonts w:ascii="Wingdings" w:hAnsi="Wingdings" w:hint="default"/>
+        <w:sz w:val="20"/>
+      </w:rPr>
+    </w:lvl>
+    <w:lvl w:ilvl="4" w:tentative="1">
+      <w:start w:val="1"/>
+      <w:numFmt w:val="bullet"/>
+      <w:lvlText w:val=""/>
+      <w:lvlJc w:val="left"/>
+      <w:pPr>
+        <w:tabs>
+          <w:tab w:val="num" w:pos="3600"/>
+        </w:tabs>
+        <w:ind w:left="3600" w:hanging="360"/>
+      </w:pPr>
+      <w:rPr>
+        <w:rFonts w:ascii="Wingdings" w:hAnsi="Wingdings" w:hint="default"/>
+        <w:sz w:val="20"/>
+      </w:rPr>
+    </w:lvl>
+    <w:lvl w:ilvl="5" w:tentative="1">
+      <w:start w:val="1"/>
+      <w:numFmt w:val="bullet"/>
+      <w:lvlText w:val=""/>
+      <w:lvlJc w:val="left"/>
+      <w:pPr>
+        <w:tabs>
+          <w:tab w:val="num" w:pos="4320"/>
+        </w:tabs>
+        <w:ind w:left="4320" w:hanging="360"/>
+      </w:pPr>
+      <w:rPr>
+        <w:rFonts w:ascii="Wingdings" w:hAnsi="Wingdings" w:hint="default"/>
+        <w:sz w:val="20"/>
+      </w:rPr>
+    </w:lvl>
+    <w:lvl w:ilvl="6" w:tentative="1">
+      <w:start w:val="1"/>
+      <w:numFmt w:val="bullet"/>
+      <w:lvlText w:val=""/>
+      <w:lvlJc w:val="left"/>
+      <w:pPr>
+        <w:tabs>
+          <w:tab w:val="num" w:pos="5040"/>
+        </w:tabs>
+        <w:ind w:left="5040" w:hanging="360"/>
+      </w:pPr>
+      <w:rPr>
+        <w:rFonts w:ascii="Wingdings" w:hAnsi="Wingdings" w:hint="default"/>
+        <w:sz w:val="20"/>
+      </w:rPr>
+    </w:lvl>
+    <w:lvl w:ilvl="7" w:tentative="1">
+      <w:start w:val="1"/>
+      <w:numFmt w:val="bullet"/>
+      <w:lvlText w:val=""/>
+      <w:lvlJc w:val="left"/>
+      <w:pPr>
+        <w:tabs>
+          <w:tab w:val="num" w:pos="5760"/>
+        </w:tabs>
+        <w:ind w:left="5760" w:hanging="360"/>
+      </w:pPr>
+      <w:rPr>
+        <w:rFonts w:ascii="Wingdings" w:hAnsi="Wingdings" w:hint="default"/>
+        <w:sz w:val="20"/>
+      </w:rPr>
+    </w:lvl>
+    <w:lvl w:ilvl="8" w:tentative="1">
+      <w:start w:val="1"/>
+      <w:numFmt w:val="bullet"/>
+      <w:lvlText w:val=""/>
+      <w:lvlJc w:val="left"/>
+      <w:pPr>
+        <w:tabs>
+          <w:tab w:val="num" w:pos="6480"/>
+        </w:tabs>
+        <w:ind w:left="6480" w:hanging="360"/>
+      </w:pPr>
+      <w:rPr>
+        <w:rFonts w:ascii="Wingdings" w:hAnsi="Wingdings" w:hint="default"/>
+        <w:sz w:val="20"/>
+      </w:rPr>
+    </w:lvl>
+  </w:abstractNum>
+  <w:abstractNum w:abstractNumId="81" w15:restartNumberingAfterBreak="0">
     <w:nsid w:val="5AC635B5"/>
     <w:multiLevelType w:val="hybridMultilevel"/>
     <w:tmpl w:val="51A0E17A"/>
@@ -25138,7 +26398,7 @@
       </w:rPr>
     </w:lvl>
   </w:abstractNum>
-  <w:abstractNum w:abstractNumId="78" w15:restartNumberingAfterBreak="0">
+  <w:abstractNum w:abstractNumId="82" w15:restartNumberingAfterBreak="0">
     <w:nsid w:val="5D3D35B1"/>
     <w:multiLevelType w:val="multilevel"/>
     <w:tmpl w:val="1DB64FCA"/>
@@ -25287,7 +26547,7 @@
       </w:rPr>
     </w:lvl>
   </w:abstractNum>
-  <w:abstractNum w:abstractNumId="79" w15:restartNumberingAfterBreak="0">
+  <w:abstractNum w:abstractNumId="83" w15:restartNumberingAfterBreak="0">
     <w:nsid w:val="5D751E17"/>
     <w:multiLevelType w:val="multilevel"/>
     <w:tmpl w:val="02722D60"/>
@@ -25436,7 +26696,156 @@
       </w:rPr>
     </w:lvl>
   </w:abstractNum>
-  <w:abstractNum w:abstractNumId="80" w15:restartNumberingAfterBreak="0">
+  <w:abstractNum w:abstractNumId="84" w15:restartNumberingAfterBreak="0">
+    <w:nsid w:val="5DCE038E"/>
+    <w:multiLevelType w:val="multilevel"/>
+    <w:tmpl w:val="15907428"/>
+    <w:lvl w:ilvl="0">
+      <w:start w:val="1"/>
+      <w:numFmt w:val="bullet"/>
+      <w:lvlText w:val=""/>
+      <w:lvlJc w:val="left"/>
+      <w:pPr>
+        <w:tabs>
+          <w:tab w:val="num" w:pos="720"/>
+        </w:tabs>
+        <w:ind w:left="720" w:hanging="360"/>
+      </w:pPr>
+      <w:rPr>
+        <w:rFonts w:ascii="Symbol" w:hAnsi="Symbol" w:hint="default"/>
+        <w:sz w:val="20"/>
+      </w:rPr>
+    </w:lvl>
+    <w:lvl w:ilvl="1" w:tentative="1">
+      <w:start w:val="1"/>
+      <w:numFmt w:val="bullet"/>
+      <w:lvlText w:val="o"/>
+      <w:lvlJc w:val="left"/>
+      <w:pPr>
+        <w:tabs>
+          <w:tab w:val="num" w:pos="1440"/>
+        </w:tabs>
+        <w:ind w:left="1440" w:hanging="360"/>
+      </w:pPr>
+      <w:rPr>
+        <w:rFonts w:ascii="Courier New" w:hAnsi="Courier New" w:hint="default"/>
+        <w:sz w:val="20"/>
+      </w:rPr>
+    </w:lvl>
+    <w:lvl w:ilvl="2" w:tentative="1">
+      <w:start w:val="1"/>
+      <w:numFmt w:val="bullet"/>
+      <w:lvlText w:val=""/>
+      <w:lvlJc w:val="left"/>
+      <w:pPr>
+        <w:tabs>
+          <w:tab w:val="num" w:pos="2160"/>
+        </w:tabs>
+        <w:ind w:left="2160" w:hanging="360"/>
+      </w:pPr>
+      <w:rPr>
+        <w:rFonts w:ascii="Wingdings" w:hAnsi="Wingdings" w:hint="default"/>
+        <w:sz w:val="20"/>
+      </w:rPr>
+    </w:lvl>
+    <w:lvl w:ilvl="3" w:tentative="1">
+      <w:start w:val="1"/>
+      <w:numFmt w:val="bullet"/>
+      <w:lvlText w:val=""/>
+      <w:lvlJc w:val="left"/>
+      <w:pPr>
+        <w:tabs>
+          <w:tab w:val="num" w:pos="2880"/>
+        </w:tabs>
+        <w:ind w:left="2880" w:hanging="360"/>
+      </w:pPr>
+      <w:rPr>
+        <w:rFonts w:ascii="Wingdings" w:hAnsi="Wingdings" w:hint="default"/>
+        <w:sz w:val="20"/>
+      </w:rPr>
+    </w:lvl>
+    <w:lvl w:ilvl="4" w:tentative="1">
+      <w:start w:val="1"/>
+      <w:numFmt w:val="bullet"/>
+      <w:lvlText w:val=""/>
+      <w:lvlJc w:val="left"/>
+      <w:pPr>
+        <w:tabs>
+          <w:tab w:val="num" w:pos="3600"/>
+        </w:tabs>
+        <w:ind w:left="3600" w:hanging="360"/>
+      </w:pPr>
+      <w:rPr>
+        <w:rFonts w:ascii="Wingdings" w:hAnsi="Wingdings" w:hint="default"/>
+        <w:sz w:val="20"/>
+      </w:rPr>
+    </w:lvl>
+    <w:lvl w:ilvl="5" w:tentative="1">
+      <w:start w:val="1"/>
+      <w:numFmt w:val="bullet"/>
+      <w:lvlText w:val=""/>
+      <w:lvlJc w:val="left"/>
+      <w:pPr>
+        <w:tabs>
+          <w:tab w:val="num" w:pos="4320"/>
+        </w:tabs>
+        <w:ind w:left="4320" w:hanging="360"/>
+      </w:pPr>
+      <w:rPr>
+        <w:rFonts w:ascii="Wingdings" w:hAnsi="Wingdings" w:hint="default"/>
+        <w:sz w:val="20"/>
+      </w:rPr>
+    </w:lvl>
+    <w:lvl w:ilvl="6" w:tentative="1">
+      <w:start w:val="1"/>
+      <w:numFmt w:val="bullet"/>
+      <w:lvlText w:val=""/>
+      <w:lvlJc w:val="left"/>
+      <w:pPr>
+        <w:tabs>
+          <w:tab w:val="num" w:pos="5040"/>
+        </w:tabs>
+        <w:ind w:left="5040" w:hanging="360"/>
+      </w:pPr>
+      <w:rPr>
+        <w:rFonts w:ascii="Wingdings" w:hAnsi="Wingdings" w:hint="default"/>
+        <w:sz w:val="20"/>
+      </w:rPr>
+    </w:lvl>
+    <w:lvl w:ilvl="7" w:tentative="1">
+      <w:start w:val="1"/>
+      <w:numFmt w:val="bullet"/>
+      <w:lvlText w:val=""/>
+      <w:lvlJc w:val="left"/>
+      <w:pPr>
+        <w:tabs>
+          <w:tab w:val="num" w:pos="5760"/>
+        </w:tabs>
+        <w:ind w:left="5760" w:hanging="360"/>
+      </w:pPr>
+      <w:rPr>
+        <w:rFonts w:ascii="Wingdings" w:hAnsi="Wingdings" w:hint="default"/>
+        <w:sz w:val="20"/>
+      </w:rPr>
+    </w:lvl>
+    <w:lvl w:ilvl="8" w:tentative="1">
+      <w:start w:val="1"/>
+      <w:numFmt w:val="bullet"/>
+      <w:lvlText w:val=""/>
+      <w:lvlJc w:val="left"/>
+      <w:pPr>
+        <w:tabs>
+          <w:tab w:val="num" w:pos="6480"/>
+        </w:tabs>
+        <w:ind w:left="6480" w:hanging="360"/>
+      </w:pPr>
+      <w:rPr>
+        <w:rFonts w:ascii="Wingdings" w:hAnsi="Wingdings" w:hint="default"/>
+        <w:sz w:val="20"/>
+      </w:rPr>
+    </w:lvl>
+  </w:abstractNum>
+  <w:abstractNum w:abstractNumId="85" w15:restartNumberingAfterBreak="0">
     <w:nsid w:val="5E8562F4"/>
     <w:multiLevelType w:val="multilevel"/>
     <w:tmpl w:val="E0D01132"/>
@@ -25585,7 +26994,7 @@
       </w:rPr>
     </w:lvl>
   </w:abstractNum>
-  <w:abstractNum w:abstractNumId="81" w15:restartNumberingAfterBreak="0">
+  <w:abstractNum w:abstractNumId="86" w15:restartNumberingAfterBreak="0">
     <w:nsid w:val="5E9D7FF9"/>
     <w:multiLevelType w:val="hybridMultilevel"/>
     <w:tmpl w:val="9FEC9846"/>
@@ -25698,7 +27107,7 @@
       </w:rPr>
     </w:lvl>
   </w:abstractNum>
-  <w:abstractNum w:abstractNumId="82" w15:restartNumberingAfterBreak="0">
+  <w:abstractNum w:abstractNumId="87" w15:restartNumberingAfterBreak="0">
     <w:nsid w:val="5FC668DA"/>
     <w:multiLevelType w:val="multilevel"/>
     <w:tmpl w:val="684224A0"/>
@@ -25847,7 +27256,7 @@
       </w:rPr>
     </w:lvl>
   </w:abstractNum>
-  <w:abstractNum w:abstractNumId="83" w15:restartNumberingAfterBreak="0">
+  <w:abstractNum w:abstractNumId="88" w15:restartNumberingAfterBreak="0">
     <w:nsid w:val="641534EF"/>
     <w:multiLevelType w:val="multilevel"/>
     <w:tmpl w:val="D9F652B8"/>
@@ -25960,7 +27369,7 @@
       </w:pPr>
     </w:lvl>
   </w:abstractNum>
-  <w:abstractNum w:abstractNumId="84" w15:restartNumberingAfterBreak="0">
+  <w:abstractNum w:abstractNumId="89" w15:restartNumberingAfterBreak="0">
     <w:nsid w:val="66C01D91"/>
     <w:multiLevelType w:val="hybridMultilevel"/>
     <w:tmpl w:val="056EB786"/>
@@ -26073,7 +27482,7 @@
       </w:rPr>
     </w:lvl>
   </w:abstractNum>
-  <w:abstractNum w:abstractNumId="85" w15:restartNumberingAfterBreak="0">
+  <w:abstractNum w:abstractNumId="90" w15:restartNumberingAfterBreak="0">
     <w:nsid w:val="68FF3E14"/>
     <w:multiLevelType w:val="hybridMultilevel"/>
     <w:tmpl w:val="852ED156"/>
@@ -26185,7 +27594,7 @@
       </w:rPr>
     </w:lvl>
   </w:abstractNum>
-  <w:abstractNum w:abstractNumId="86" w15:restartNumberingAfterBreak="0">
+  <w:abstractNum w:abstractNumId="91" w15:restartNumberingAfterBreak="0">
     <w:nsid w:val="6B531966"/>
     <w:multiLevelType w:val="hybridMultilevel"/>
     <w:tmpl w:val="2758CFC0"/>
@@ -26297,7 +27706,7 @@
       </w:rPr>
     </w:lvl>
   </w:abstractNum>
-  <w:abstractNum w:abstractNumId="87" w15:restartNumberingAfterBreak="0">
+  <w:abstractNum w:abstractNumId="92" w15:restartNumberingAfterBreak="0">
     <w:nsid w:val="6C181A8F"/>
     <w:multiLevelType w:val="hybridMultilevel"/>
     <w:tmpl w:val="AE1A9754"/>
@@ -26409,7 +27818,7 @@
       </w:rPr>
     </w:lvl>
   </w:abstractNum>
-  <w:abstractNum w:abstractNumId="88" w15:restartNumberingAfterBreak="0">
+  <w:abstractNum w:abstractNumId="93" w15:restartNumberingAfterBreak="0">
     <w:nsid w:val="6C52622C"/>
     <w:multiLevelType w:val="multilevel"/>
     <w:tmpl w:val="F8B03172"/>
@@ -26558,7 +27967,7 @@
       </w:rPr>
     </w:lvl>
   </w:abstractNum>
-  <w:abstractNum w:abstractNumId="89" w15:restartNumberingAfterBreak="0">
+  <w:abstractNum w:abstractNumId="94" w15:restartNumberingAfterBreak="0">
     <w:nsid w:val="6D674DC7"/>
     <w:multiLevelType w:val="multilevel"/>
     <w:tmpl w:val="4342CC68"/>
@@ -26707,7 +28116,7 @@
       </w:rPr>
     </w:lvl>
   </w:abstractNum>
-  <w:abstractNum w:abstractNumId="90" w15:restartNumberingAfterBreak="0">
+  <w:abstractNum w:abstractNumId="95" w15:restartNumberingAfterBreak="0">
     <w:nsid w:val="6E08011E"/>
     <w:multiLevelType w:val="hybridMultilevel"/>
     <w:tmpl w:val="33DE4EDC"/>
@@ -26819,7 +28228,7 @@
       </w:rPr>
     </w:lvl>
   </w:abstractNum>
-  <w:abstractNum w:abstractNumId="91" w15:restartNumberingAfterBreak="0">
+  <w:abstractNum w:abstractNumId="96" w15:restartNumberingAfterBreak="0">
     <w:nsid w:val="71C01D39"/>
     <w:multiLevelType w:val="multilevel"/>
     <w:tmpl w:val="7C4E5656"/>
@@ -26968,7 +28377,7 @@
       </w:rPr>
     </w:lvl>
   </w:abstractNum>
-  <w:abstractNum w:abstractNumId="92" w15:restartNumberingAfterBreak="0">
+  <w:abstractNum w:abstractNumId="97" w15:restartNumberingAfterBreak="0">
     <w:nsid w:val="722717AC"/>
     <w:multiLevelType w:val="hybridMultilevel"/>
     <w:tmpl w:val="935CC4B6"/>
@@ -27080,7 +28489,7 @@
       </w:rPr>
     </w:lvl>
   </w:abstractNum>
-  <w:abstractNum w:abstractNumId="93" w15:restartNumberingAfterBreak="0">
+  <w:abstractNum w:abstractNumId="98" w15:restartNumberingAfterBreak="0">
     <w:nsid w:val="7266168E"/>
     <w:multiLevelType w:val="hybridMultilevel"/>
     <w:tmpl w:val="163AFB96"/>
@@ -27192,7 +28601,7 @@
       </w:rPr>
     </w:lvl>
   </w:abstractNum>
-  <w:abstractNum w:abstractNumId="94" w15:restartNumberingAfterBreak="0">
+  <w:abstractNum w:abstractNumId="99" w15:restartNumberingAfterBreak="0">
     <w:nsid w:val="743E3484"/>
     <w:multiLevelType w:val="hybridMultilevel"/>
     <w:tmpl w:val="F148EE2C"/>
@@ -27305,7 +28714,7 @@
       </w:rPr>
     </w:lvl>
   </w:abstractNum>
-  <w:abstractNum w:abstractNumId="95" w15:restartNumberingAfterBreak="0">
+  <w:abstractNum w:abstractNumId="100" w15:restartNumberingAfterBreak="0">
     <w:nsid w:val="777C1D77"/>
     <w:multiLevelType w:val="hybridMultilevel"/>
     <w:tmpl w:val="2D0210B8"/>
@@ -27417,7 +28826,7 @@
       </w:rPr>
     </w:lvl>
   </w:abstractNum>
-  <w:abstractNum w:abstractNumId="96" w15:restartNumberingAfterBreak="0">
+  <w:abstractNum w:abstractNumId="101" w15:restartNumberingAfterBreak="0">
     <w:nsid w:val="79033895"/>
     <w:multiLevelType w:val="hybridMultilevel"/>
     <w:tmpl w:val="D0EC68D0"/>
@@ -27529,7 +28938,7 @@
       </w:rPr>
     </w:lvl>
   </w:abstractNum>
-  <w:abstractNum w:abstractNumId="97" w15:restartNumberingAfterBreak="0">
+  <w:abstractNum w:abstractNumId="102" w15:restartNumberingAfterBreak="0">
     <w:nsid w:val="79254661"/>
     <w:multiLevelType w:val="multilevel"/>
     <w:tmpl w:val="577EED92"/>
@@ -27678,7 +29087,7 @@
       </w:rPr>
     </w:lvl>
   </w:abstractNum>
-  <w:abstractNum w:abstractNumId="98" w15:restartNumberingAfterBreak="0">
+  <w:abstractNum w:abstractNumId="103" w15:restartNumberingAfterBreak="0">
     <w:nsid w:val="7A8751EA"/>
     <w:multiLevelType w:val="multilevel"/>
     <w:tmpl w:val="ADFE54B8"/>
@@ -27827,7 +29236,7 @@
       </w:rPr>
     </w:lvl>
   </w:abstractNum>
-  <w:abstractNum w:abstractNumId="99" w15:restartNumberingAfterBreak="0">
+  <w:abstractNum w:abstractNumId="104" w15:restartNumberingAfterBreak="0">
     <w:nsid w:val="7BB76968"/>
     <w:multiLevelType w:val="hybridMultilevel"/>
     <w:tmpl w:val="F1945E5E"/>
@@ -27939,7 +29348,7 @@
       </w:rPr>
     </w:lvl>
   </w:abstractNum>
-  <w:abstractNum w:abstractNumId="100" w15:restartNumberingAfterBreak="0">
+  <w:abstractNum w:abstractNumId="105" w15:restartNumberingAfterBreak="0">
     <w:nsid w:val="7D0F73BE"/>
     <w:multiLevelType w:val="multilevel"/>
     <w:tmpl w:val="283CE29A"/>
@@ -28088,7 +29497,7 @@
       </w:rPr>
     </w:lvl>
   </w:abstractNum>
-  <w:abstractNum w:abstractNumId="101" w15:restartNumberingAfterBreak="0">
+  <w:abstractNum w:abstractNumId="106" w15:restartNumberingAfterBreak="0">
     <w:nsid w:val="7E1427B3"/>
     <w:multiLevelType w:val="multilevel"/>
     <w:tmpl w:val="760E8CDE"/>
@@ -28238,310 +29647,325 @@
     </w:lvl>
   </w:abstractNum>
   <w:num w:numId="1" w16cid:durableId="1956208242">
-    <w:abstractNumId w:val="6"/>
+    <w:abstractNumId w:val="7"/>
   </w:num>
   <w:num w:numId="2" w16cid:durableId="77288022">
-    <w:abstractNumId w:val="7"/>
+    <w:abstractNumId w:val="8"/>
   </w:num>
   <w:num w:numId="3" w16cid:durableId="1080636982">
-    <w:abstractNumId w:val="67"/>
+    <w:abstractNumId w:val="69"/>
   </w:num>
   <w:num w:numId="4" w16cid:durableId="716128754">
+    <w:abstractNumId w:val="27"/>
+  </w:num>
+  <w:num w:numId="5" w16cid:durableId="1356880465">
+    <w:abstractNumId w:val="102"/>
+  </w:num>
+  <w:num w:numId="6" w16cid:durableId="1210613002">
+    <w:abstractNumId w:val="19"/>
+  </w:num>
+  <w:num w:numId="7" w16cid:durableId="2002191770">
+    <w:abstractNumId w:val="54"/>
+  </w:num>
+  <w:num w:numId="8" w16cid:durableId="998534124">
+    <w:abstractNumId w:val="35"/>
+  </w:num>
+  <w:num w:numId="9" w16cid:durableId="523247384">
+    <w:abstractNumId w:val="94"/>
+  </w:num>
+  <w:num w:numId="10" w16cid:durableId="261114341">
+    <w:abstractNumId w:val="15"/>
+  </w:num>
+  <w:num w:numId="11" w16cid:durableId="987244375">
+    <w:abstractNumId w:val="103"/>
+  </w:num>
+  <w:num w:numId="12" w16cid:durableId="1765805581">
+    <w:abstractNumId w:val="9"/>
+  </w:num>
+  <w:num w:numId="13" w16cid:durableId="820117559">
+    <w:abstractNumId w:val="89"/>
+  </w:num>
+  <w:num w:numId="14" w16cid:durableId="452291802">
+    <w:abstractNumId w:val="39"/>
+  </w:num>
+  <w:num w:numId="15" w16cid:durableId="71853967">
     <w:abstractNumId w:val="26"/>
   </w:num>
-  <w:num w:numId="5" w16cid:durableId="1356880465">
-    <w:abstractNumId w:val="97"/>
-  </w:num>
-  <w:num w:numId="6" w16cid:durableId="1210613002">
-    <w:abstractNumId w:val="18"/>
-  </w:num>
-  <w:num w:numId="7" w16cid:durableId="2002191770">
-    <w:abstractNumId w:val="52"/>
-  </w:num>
-  <w:num w:numId="8" w16cid:durableId="998534124">
-    <w:abstractNumId w:val="34"/>
-  </w:num>
-  <w:num w:numId="9" w16cid:durableId="523247384">
-    <w:abstractNumId w:val="89"/>
-  </w:num>
-  <w:num w:numId="10" w16cid:durableId="261114341">
-    <w:abstractNumId w:val="14"/>
-  </w:num>
-  <w:num w:numId="11" w16cid:durableId="987244375">
-    <w:abstractNumId w:val="98"/>
-  </w:num>
-  <w:num w:numId="12" w16cid:durableId="1765805581">
-    <w:abstractNumId w:val="8"/>
-  </w:num>
-  <w:num w:numId="13" w16cid:durableId="820117559">
-    <w:abstractNumId w:val="84"/>
-  </w:num>
-  <w:num w:numId="14" w16cid:durableId="452291802">
-    <w:abstractNumId w:val="37"/>
-  </w:num>
-  <w:num w:numId="15" w16cid:durableId="71853967">
-    <w:abstractNumId w:val="25"/>
-  </w:num>
   <w:num w:numId="16" w16cid:durableId="1587035945">
-    <w:abstractNumId w:val="51"/>
+    <w:abstractNumId w:val="53"/>
   </w:num>
   <w:num w:numId="17" w16cid:durableId="1439452709">
-    <w:abstractNumId w:val="43"/>
+    <w:abstractNumId w:val="45"/>
   </w:num>
   <w:num w:numId="18" w16cid:durableId="1627157179">
-    <w:abstractNumId w:val="70"/>
+    <w:abstractNumId w:val="72"/>
   </w:num>
   <w:num w:numId="19" w16cid:durableId="1214316601">
-    <w:abstractNumId w:val="55"/>
+    <w:abstractNumId w:val="57"/>
   </w:num>
   <w:num w:numId="20" w16cid:durableId="1685471909">
     <w:abstractNumId w:val="2"/>
   </w:num>
   <w:num w:numId="21" w16cid:durableId="914435209">
-    <w:abstractNumId w:val="38"/>
+    <w:abstractNumId w:val="40"/>
   </w:num>
   <w:num w:numId="22" w16cid:durableId="1255505909">
-    <w:abstractNumId w:val="33"/>
+    <w:abstractNumId w:val="34"/>
   </w:num>
   <w:num w:numId="23" w16cid:durableId="529799065">
-    <w:abstractNumId w:val="10"/>
+    <w:abstractNumId w:val="11"/>
   </w:num>
   <w:num w:numId="24" w16cid:durableId="1664163106">
-    <w:abstractNumId w:val="81"/>
+    <w:abstractNumId w:val="86"/>
   </w:num>
   <w:num w:numId="25" w16cid:durableId="1714576960">
-    <w:abstractNumId w:val="16"/>
+    <w:abstractNumId w:val="17"/>
   </w:num>
   <w:num w:numId="26" w16cid:durableId="2121341683">
-    <w:abstractNumId w:val="22"/>
+    <w:abstractNumId w:val="23"/>
   </w:num>
   <w:num w:numId="27" w16cid:durableId="827793205">
-    <w:abstractNumId w:val="94"/>
+    <w:abstractNumId w:val="99"/>
   </w:num>
   <w:num w:numId="28" w16cid:durableId="1275989163">
+    <w:abstractNumId w:val="51"/>
+  </w:num>
+  <w:num w:numId="29" w16cid:durableId="621544332">
+    <w:abstractNumId w:val="60"/>
+  </w:num>
+  <w:num w:numId="30" w16cid:durableId="1089692455">
+    <w:abstractNumId w:val="12"/>
+  </w:num>
+  <w:num w:numId="31" w16cid:durableId="1926265000">
+    <w:abstractNumId w:val="29"/>
+  </w:num>
+  <w:num w:numId="32" w16cid:durableId="2092268856">
+    <w:abstractNumId w:val="13"/>
+  </w:num>
+  <w:num w:numId="33" w16cid:durableId="46222972">
+    <w:abstractNumId w:val="31"/>
+  </w:num>
+  <w:num w:numId="34" w16cid:durableId="721440043">
+    <w:abstractNumId w:val="66"/>
+  </w:num>
+  <w:num w:numId="35" w16cid:durableId="1074085621">
+    <w:abstractNumId w:val="92"/>
+  </w:num>
+  <w:num w:numId="36" w16cid:durableId="164785594">
+    <w:abstractNumId w:val="62"/>
+  </w:num>
+  <w:num w:numId="37" w16cid:durableId="1690908687">
+    <w:abstractNumId w:val="63"/>
+  </w:num>
+  <w:num w:numId="38" w16cid:durableId="1494486041">
     <w:abstractNumId w:val="49"/>
   </w:num>
-  <w:num w:numId="29" w16cid:durableId="621544332">
+  <w:num w:numId="39" w16cid:durableId="301084558">
+    <w:abstractNumId w:val="18"/>
+  </w:num>
+  <w:num w:numId="40" w16cid:durableId="1202018679">
+    <w:abstractNumId w:val="98"/>
+  </w:num>
+  <w:num w:numId="41" w16cid:durableId="696003112">
+    <w:abstractNumId w:val="104"/>
+  </w:num>
+  <w:num w:numId="42" w16cid:durableId="1488278798">
+    <w:abstractNumId w:val="59"/>
+  </w:num>
+  <w:num w:numId="43" w16cid:durableId="630794293">
     <w:abstractNumId w:val="58"/>
   </w:num>
-  <w:num w:numId="30" w16cid:durableId="1089692455">
-    <w:abstractNumId w:val="11"/>
-  </w:num>
-  <w:num w:numId="31" w16cid:durableId="1926265000">
-    <w:abstractNumId w:val="28"/>
-  </w:num>
-  <w:num w:numId="32" w16cid:durableId="2092268856">
-    <w:abstractNumId w:val="12"/>
-  </w:num>
-  <w:num w:numId="33" w16cid:durableId="46222972">
-    <w:abstractNumId w:val="30"/>
-  </w:num>
-  <w:num w:numId="34" w16cid:durableId="721440043">
-    <w:abstractNumId w:val="64"/>
-  </w:num>
-  <w:num w:numId="35" w16cid:durableId="1074085621">
-    <w:abstractNumId w:val="87"/>
-  </w:num>
-  <w:num w:numId="36" w16cid:durableId="164785594">
-    <w:abstractNumId w:val="60"/>
-  </w:num>
-  <w:num w:numId="37" w16cid:durableId="1690908687">
-    <w:abstractNumId w:val="61"/>
-  </w:num>
-  <w:num w:numId="38" w16cid:durableId="1494486041">
-    <w:abstractNumId w:val="47"/>
-  </w:num>
-  <w:num w:numId="39" w16cid:durableId="301084558">
-    <w:abstractNumId w:val="17"/>
-  </w:num>
-  <w:num w:numId="40" w16cid:durableId="1202018679">
-    <w:abstractNumId w:val="93"/>
-  </w:num>
-  <w:num w:numId="41" w16cid:durableId="696003112">
-    <w:abstractNumId w:val="99"/>
-  </w:num>
-  <w:num w:numId="42" w16cid:durableId="1488278798">
-    <w:abstractNumId w:val="57"/>
-  </w:num>
-  <w:num w:numId="43" w16cid:durableId="630794293">
-    <w:abstractNumId w:val="56"/>
-  </w:num>
   <w:num w:numId="44" w16cid:durableId="170145410">
-    <w:abstractNumId w:val="74"/>
+    <w:abstractNumId w:val="76"/>
   </w:num>
   <w:num w:numId="45" w16cid:durableId="127862477">
-    <w:abstractNumId w:val="19"/>
+    <w:abstractNumId w:val="20"/>
   </w:num>
   <w:num w:numId="46" w16cid:durableId="105513983">
-    <w:abstractNumId w:val="86"/>
+    <w:abstractNumId w:val="91"/>
   </w:num>
   <w:num w:numId="47" w16cid:durableId="1514762862">
-    <w:abstractNumId w:val="24"/>
+    <w:abstractNumId w:val="25"/>
   </w:num>
   <w:num w:numId="48" w16cid:durableId="2091274094">
     <w:abstractNumId w:val="4"/>
   </w:num>
   <w:num w:numId="49" w16cid:durableId="1099376477">
-    <w:abstractNumId w:val="54"/>
+    <w:abstractNumId w:val="56"/>
   </w:num>
   <w:num w:numId="50" w16cid:durableId="1000231748">
-    <w:abstractNumId w:val="13"/>
+    <w:abstractNumId w:val="14"/>
   </w:num>
   <w:num w:numId="51" w16cid:durableId="1626617711">
-    <w:abstractNumId w:val="62"/>
+    <w:abstractNumId w:val="64"/>
   </w:num>
   <w:num w:numId="52" w16cid:durableId="853420226">
-    <w:abstractNumId w:val="76"/>
+    <w:abstractNumId w:val="79"/>
   </w:num>
   <w:num w:numId="53" w16cid:durableId="1519540791">
-    <w:abstractNumId w:val="53"/>
+    <w:abstractNumId w:val="55"/>
   </w:num>
   <w:num w:numId="54" w16cid:durableId="1148135894">
-    <w:abstractNumId w:val="44"/>
+    <w:abstractNumId w:val="46"/>
   </w:num>
   <w:num w:numId="55" w16cid:durableId="1808281118">
-    <w:abstractNumId w:val="85"/>
+    <w:abstractNumId w:val="90"/>
   </w:num>
   <w:num w:numId="56" w16cid:durableId="1758408107">
-    <w:abstractNumId w:val="40"/>
+    <w:abstractNumId w:val="42"/>
   </w:num>
   <w:num w:numId="57" w16cid:durableId="820270538">
     <w:abstractNumId w:val="1"/>
   </w:num>
   <w:num w:numId="58" w16cid:durableId="433135565">
-    <w:abstractNumId w:val="45"/>
+    <w:abstractNumId w:val="47"/>
   </w:num>
   <w:num w:numId="59" w16cid:durableId="1891763306">
-    <w:abstractNumId w:val="95"/>
+    <w:abstractNumId w:val="100"/>
   </w:num>
   <w:num w:numId="60" w16cid:durableId="252595352">
-    <w:abstractNumId w:val="35"/>
+    <w:abstractNumId w:val="36"/>
   </w:num>
   <w:num w:numId="61" w16cid:durableId="43599653">
-    <w:abstractNumId w:val="23"/>
+    <w:abstractNumId w:val="24"/>
   </w:num>
   <w:num w:numId="62" w16cid:durableId="1724282809">
-    <w:abstractNumId w:val="66"/>
+    <w:abstractNumId w:val="68"/>
   </w:num>
   <w:num w:numId="63" w16cid:durableId="1221207068">
     <w:abstractNumId w:val="3"/>
   </w:num>
   <w:num w:numId="64" w16cid:durableId="1494025353">
-    <w:abstractNumId w:val="41"/>
+    <w:abstractNumId w:val="43"/>
   </w:num>
   <w:num w:numId="65" w16cid:durableId="869296667">
-    <w:abstractNumId w:val="65"/>
+    <w:abstractNumId w:val="67"/>
   </w:num>
   <w:num w:numId="66" w16cid:durableId="91706771">
-    <w:abstractNumId w:val="21"/>
+    <w:abstractNumId w:val="22"/>
   </w:num>
   <w:num w:numId="67" w16cid:durableId="2083485411">
-    <w:abstractNumId w:val="29"/>
+    <w:abstractNumId w:val="30"/>
   </w:num>
   <w:num w:numId="68" w16cid:durableId="34044173">
-    <w:abstractNumId w:val="42"/>
+    <w:abstractNumId w:val="44"/>
   </w:num>
   <w:num w:numId="69" w16cid:durableId="1958246351">
-    <w:abstractNumId w:val="15"/>
+    <w:abstractNumId w:val="16"/>
   </w:num>
   <w:num w:numId="70" w16cid:durableId="1597665370">
-    <w:abstractNumId w:val="9"/>
+    <w:abstractNumId w:val="10"/>
   </w:num>
   <w:num w:numId="71" w16cid:durableId="389354266">
-    <w:abstractNumId w:val="92"/>
+    <w:abstractNumId w:val="97"/>
   </w:num>
   <w:num w:numId="72" w16cid:durableId="1195070258">
-    <w:abstractNumId w:val="90"/>
+    <w:abstractNumId w:val="95"/>
   </w:num>
   <w:num w:numId="73" w16cid:durableId="1972049655">
-    <w:abstractNumId w:val="48"/>
+    <w:abstractNumId w:val="50"/>
   </w:num>
   <w:num w:numId="74" w16cid:durableId="1499272371">
-    <w:abstractNumId w:val="68"/>
+    <w:abstractNumId w:val="70"/>
   </w:num>
   <w:num w:numId="75" w16cid:durableId="1796026856">
-    <w:abstractNumId w:val="75"/>
+    <w:abstractNumId w:val="78"/>
   </w:num>
   <w:num w:numId="76" w16cid:durableId="1229995767">
-    <w:abstractNumId w:val="77"/>
+    <w:abstractNumId w:val="81"/>
   </w:num>
   <w:num w:numId="77" w16cid:durableId="1817409612">
-    <w:abstractNumId w:val="72"/>
+    <w:abstractNumId w:val="74"/>
   </w:num>
   <w:num w:numId="78" w16cid:durableId="1134832258">
-    <w:abstractNumId w:val="96"/>
+    <w:abstractNumId w:val="101"/>
   </w:num>
   <w:num w:numId="79" w16cid:durableId="1911575055">
-    <w:abstractNumId w:val="50"/>
+    <w:abstractNumId w:val="52"/>
   </w:num>
   <w:num w:numId="80" w16cid:durableId="1638756930">
-    <w:abstractNumId w:val="31"/>
+    <w:abstractNumId w:val="32"/>
   </w:num>
   <w:num w:numId="81" w16cid:durableId="427506740">
-    <w:abstractNumId w:val="80"/>
+    <w:abstractNumId w:val="85"/>
   </w:num>
   <w:num w:numId="82" w16cid:durableId="513149297">
-    <w:abstractNumId w:val="71"/>
+    <w:abstractNumId w:val="73"/>
   </w:num>
   <w:num w:numId="83" w16cid:durableId="548422958">
-    <w:abstractNumId w:val="36"/>
+    <w:abstractNumId w:val="37"/>
   </w:num>
   <w:num w:numId="84" w16cid:durableId="931205951">
-    <w:abstractNumId w:val="88"/>
+    <w:abstractNumId w:val="93"/>
   </w:num>
   <w:num w:numId="85" w16cid:durableId="1261450898">
     <w:abstractNumId w:val="0"/>
   </w:num>
   <w:num w:numId="86" w16cid:durableId="470248295">
-    <w:abstractNumId w:val="59"/>
+    <w:abstractNumId w:val="61"/>
   </w:num>
   <w:num w:numId="87" w16cid:durableId="982394239">
-    <w:abstractNumId w:val="78"/>
+    <w:abstractNumId w:val="82"/>
   </w:num>
   <w:num w:numId="88" w16cid:durableId="2041782596">
-    <w:abstractNumId w:val="20"/>
+    <w:abstractNumId w:val="21"/>
   </w:num>
   <w:num w:numId="89" w16cid:durableId="558440056">
-    <w:abstractNumId w:val="27"/>
+    <w:abstractNumId w:val="28"/>
   </w:num>
   <w:num w:numId="90" w16cid:durableId="1366632968">
     <w:abstractNumId w:val="5"/>
   </w:num>
   <w:num w:numId="91" w16cid:durableId="329143539">
-    <w:abstractNumId w:val="46"/>
+    <w:abstractNumId w:val="48"/>
   </w:num>
   <w:num w:numId="92" w16cid:durableId="1194732434">
-    <w:abstractNumId w:val="91"/>
+    <w:abstractNumId w:val="96"/>
   </w:num>
   <w:num w:numId="93" w16cid:durableId="1126509868">
-    <w:abstractNumId w:val="39"/>
+    <w:abstractNumId w:val="41"/>
   </w:num>
   <w:num w:numId="94" w16cid:durableId="1586915427">
-    <w:abstractNumId w:val="101"/>
+    <w:abstractNumId w:val="106"/>
   </w:num>
   <w:num w:numId="95" w16cid:durableId="1985424155">
-    <w:abstractNumId w:val="63"/>
+    <w:abstractNumId w:val="65"/>
   </w:num>
   <w:num w:numId="96" w16cid:durableId="1503928418">
-    <w:abstractNumId w:val="100"/>
+    <w:abstractNumId w:val="105"/>
   </w:num>
   <w:num w:numId="97" w16cid:durableId="1523935396">
-    <w:abstractNumId w:val="32"/>
+    <w:abstractNumId w:val="33"/>
   </w:num>
   <w:num w:numId="98" w16cid:durableId="918711878">
-    <w:abstractNumId w:val="82"/>
+    <w:abstractNumId w:val="87"/>
   </w:num>
   <w:num w:numId="99" w16cid:durableId="1606887394">
+    <w:abstractNumId w:val="88"/>
+  </w:num>
+  <w:num w:numId="100" w16cid:durableId="1027754377">
+    <w:abstractNumId w:val="71"/>
+  </w:num>
+  <w:num w:numId="101" w16cid:durableId="826559138">
+    <w:abstractNumId w:val="75"/>
+  </w:num>
+  <w:num w:numId="102" w16cid:durableId="442727970">
     <w:abstractNumId w:val="83"/>
   </w:num>
-  <w:num w:numId="100" w16cid:durableId="1027754377">
-    <w:abstractNumId w:val="69"/>
+  <w:num w:numId="103" w16cid:durableId="1562517256">
+    <w:abstractNumId w:val="84"/>
   </w:num>
-  <w:num w:numId="101" w16cid:durableId="826559138">
-    <w:abstractNumId w:val="73"/>
+  <w:num w:numId="104" w16cid:durableId="89352316">
+    <w:abstractNumId w:val="6"/>
   </w:num>
-  <w:num w:numId="102" w16cid:durableId="442727970">
-    <w:abstractNumId w:val="79"/>
+  <w:num w:numId="105" w16cid:durableId="844444982">
+    <w:abstractNumId w:val="38"/>
+  </w:num>
+  <w:num w:numId="106" w16cid:durableId="1434743620">
+    <w:abstractNumId w:val="77"/>
+  </w:num>
+  <w:num w:numId="107" w16cid:durableId="2108646521">
+    <w:abstractNumId w:val="80"/>
   </w:num>
   <w:numIdMacAtCleanup w:val="102"/>
 </w:numbering>

</xml_diff>

<commit_message>
Improve site performance for slow devices and older browsers.
Defer search index loading, batch encyclopedia card rendering, dedupe i18n JSON fetches, add catalog content-visibility and Apache cache headers, and refresh the deployment package.

Co-authored-by: Cursor <cursoragent@cursor.com>
</commit_message>
<xml_diff>
--- a/documents/docx/Prompts.docx
+++ b/documents/docx/Prompts.docx
@@ -16747,6 +16747,54 @@
       </w:pPr>
       <w:r>
         <w:t>Ana səhifə → Xəzinə → Görkəmli şəxsiyyətlər</w:t>
+      </w:r>
+    </w:p>
+    <w:p>
+      <w:pPr>
+        <w:pBdr>
+          <w:bottom w:val="single" w:sz="6" w:space="1" w:color="auto"/>
+        </w:pBdr>
+        <w:spacing w:after="0" w:line="240" w:lineRule="auto"/>
+        <w:ind w:left="360"/>
+        <w:rPr>
+          <w:lang w:val="az-Latn-AZ"/>
+        </w:rPr>
+      </w:pPr>
+    </w:p>
+    <w:p>
+      <w:pPr>
+        <w:spacing w:after="0" w:line="240" w:lineRule="auto"/>
+        <w:ind w:left="360"/>
+        <w:rPr>
+          <w:lang w:val="az-Latn-AZ"/>
+        </w:rPr>
+      </w:pPr>
+    </w:p>
+    <w:p>
+      <w:pPr>
+        <w:spacing w:after="0" w:line="240" w:lineRule="auto"/>
+        <w:ind w:left="360"/>
+      </w:pPr>
+      <w:r>
+        <w:t>Please ensure that the website is fully optimized for performance on all devices, including older PCs and slower hardware.</w:t>
+      </w:r>
+    </w:p>
+    <w:p>
+      <w:pPr>
+        <w:spacing w:after="0" w:line="240" w:lineRule="auto"/>
+        <w:ind w:left="360"/>
+      </w:pPr>
+      <w:r>
+        <w:t>Pay special attention to memory management, page loading speed, image optimization, script efficiency, caching, and any other factors that may affect responsiveness.</w:t>
+      </w:r>
+    </w:p>
+    <w:p>
+      <w:pPr>
+        <w:spacing w:after="0" w:line="240" w:lineRule="auto"/>
+        <w:ind w:left="360"/>
+      </w:pPr>
+      <w:r>
+        <w:t>The goal is to prevent lagging, delays, freezing, or poor user experience, so that visitors can use the site smoothly and comfortably without frustration.</w:t>
       </w:r>
     </w:p>
     <w:p>

</xml_diff>

<commit_message>
Reorganize Forum 2024 hub and refresh navigation across the bilingual site.
Restructure the forum hub layout and labels (Academicians/Akademiklər, photo gallery), keep the participants panel on the hub only, add a scientists list preview close button, regenerate embedded nav and i18n, and include related sponsors and catalog updates.

Co-authored-by: Cursor <cursoragent@cursor.com>
</commit_message>
<xml_diff>
--- a/documents/docx/Prompts.docx
+++ b/documents/docx/Prompts.docx
@@ -16799,12 +16799,201 @@
     </w:p>
     <w:p>
       <w:pPr>
+        <w:pBdr>
+          <w:bottom w:val="single" w:sz="6" w:space="1" w:color="auto"/>
+        </w:pBdr>
         <w:spacing w:after="0" w:line="240" w:lineRule="auto"/>
         <w:ind w:left="360"/>
         <w:rPr>
           <w:lang w:val="az-Latn-AZ"/>
         </w:rPr>
       </w:pPr>
+    </w:p>
+    <w:p>
+      <w:pPr>
+        <w:spacing w:after="0" w:line="240" w:lineRule="auto"/>
+        <w:ind w:left="360"/>
+        <w:rPr>
+          <w:lang w:val="az-Latn-AZ"/>
+        </w:rPr>
+      </w:pPr>
+    </w:p>
+    <w:p>
+      <w:pPr>
+        <w:spacing w:after="0" w:line="240" w:lineRule="auto"/>
+        <w:ind w:left="360"/>
+      </w:pPr>
+      <w:r>
+        <w:t>Please conduct a thorough review of the entire project codebase, including all HTML, CSS, JavaScript, assets, configuration files, internal links, navigation elements, and page structures.</w:t>
+      </w:r>
+    </w:p>
+    <w:p>
+      <w:pPr>
+        <w:spacing w:after="0" w:line="240" w:lineRule="auto"/>
+        <w:ind w:left="360"/>
+      </w:pPr>
+      <w:r>
+        <w:t>The purpose of this review is to identify and document any discrepancies, inconsistencies, broken links, duplicated or unused code, styling conflicts, layout issues, responsiveness problems, accessibility gaps, multilingual inconsistencies, naming inconsistencies, missing assets, incorrect file paths, and any other technical or UI/UX issues that may affect the quality, maintainability, or user experience of the website.</w:t>
+      </w:r>
+    </w:p>
+    <w:p>
+      <w:pPr>
+        <w:spacing w:after="0" w:line="240" w:lineRule="auto"/>
+        <w:ind w:left="360"/>
+      </w:pPr>
+      <w:r>
+        <w:t>Please provide a clear report of all identified issues, grouped by category, and include specific recommendations for how each issue should be corrected.</w:t>
+      </w:r>
+    </w:p>
+    <w:p>
+      <w:pPr>
+        <w:pBdr>
+          <w:bottom w:val="single" w:sz="6" w:space="1" w:color="auto"/>
+        </w:pBdr>
+        <w:spacing w:after="0" w:line="240" w:lineRule="auto"/>
+        <w:ind w:left="360"/>
+        <w:rPr>
+          <w:lang w:val="az-Latn-AZ"/>
+        </w:rPr>
+      </w:pPr>
+    </w:p>
+    <w:p>
+      <w:pPr>
+        <w:spacing w:after="0" w:line="240" w:lineRule="auto"/>
+        <w:ind w:left="360"/>
+        <w:rPr>
+          <w:lang w:val="az-Latn-AZ"/>
+        </w:rPr>
+      </w:pPr>
+    </w:p>
+    <w:p>
+      <w:pPr>
+        <w:spacing w:after="0" w:line="240" w:lineRule="auto"/>
+        <w:ind w:left="360"/>
+      </w:pPr>
+      <w:r>
+        <w:t>Please generate a Word document that includes a clear report of all issues identified during the project codebase review, together with recommended strategies for fixing each issue.</w:t>
+      </w:r>
+    </w:p>
+    <w:p>
+      <w:pPr>
+        <w:spacing w:after="0" w:line="240" w:lineRule="auto"/>
+        <w:ind w:left="360"/>
+      </w:pPr>
+      <w:r>
+        <w:t>The document should group the findings by category, such as HTML structure, CSS and styling, JavaScript functionality, navigation, internal links, multilingual consistency, responsiveness, accessibility, performance, security, content quality, and UI/UX consistency.</w:t>
+      </w:r>
+    </w:p>
+    <w:p>
+      <w:pPr>
+        <w:spacing w:after="0" w:line="240" w:lineRule="auto"/>
+        <w:ind w:left="360"/>
+      </w:pPr>
+      <w:r>
+        <w:t>For each issue, please include:</w:t>
+      </w:r>
+    </w:p>
+    <w:p>
+      <w:pPr>
+        <w:numPr>
+          <w:ilvl w:val="0"/>
+          <w:numId w:val="109"/>
+        </w:numPr>
+        <w:spacing w:after="0" w:line="240" w:lineRule="auto"/>
+      </w:pPr>
+      <w:r>
+        <w:t>a brief description of the problem;</w:t>
+      </w:r>
+    </w:p>
+    <w:p>
+      <w:pPr>
+        <w:numPr>
+          <w:ilvl w:val="0"/>
+          <w:numId w:val="109"/>
+        </w:numPr>
+        <w:spacing w:after="0" w:line="240" w:lineRule="auto"/>
+      </w:pPr>
+      <w:r>
+        <w:t>the affected file, page, or component;</w:t>
+      </w:r>
+    </w:p>
+    <w:p>
+      <w:pPr>
+        <w:numPr>
+          <w:ilvl w:val="0"/>
+          <w:numId w:val="109"/>
+        </w:numPr>
+        <w:spacing w:after="0" w:line="240" w:lineRule="auto"/>
+      </w:pPr>
+      <w:r>
+        <w:t>the severity level;</w:t>
+      </w:r>
+    </w:p>
+    <w:p>
+      <w:pPr>
+        <w:numPr>
+          <w:ilvl w:val="0"/>
+          <w:numId w:val="109"/>
+        </w:numPr>
+        <w:spacing w:after="0" w:line="240" w:lineRule="auto"/>
+      </w:pPr>
+      <w:r>
+        <w:t>the recommended fix or improvement strategy;</w:t>
+      </w:r>
+    </w:p>
+    <w:p>
+      <w:pPr>
+        <w:numPr>
+          <w:ilvl w:val="0"/>
+          <w:numId w:val="109"/>
+        </w:numPr>
+        <w:spacing w:after="0" w:line="240" w:lineRule="auto"/>
+      </w:pPr>
+      <w:r>
+        <w:t>the expected result after correction.</w:t>
+      </w:r>
+    </w:p>
+    <w:p>
+      <w:pPr>
+        <w:spacing w:after="0" w:line="240" w:lineRule="auto"/>
+        <w:ind w:left="360"/>
+      </w:pPr>
+      <w:r>
+        <w:t>Please also include the date and time when the issues were identified.</w:t>
+      </w:r>
+    </w:p>
+    <w:p>
+      <w:pPr>
+        <w:pBdr>
+          <w:bottom w:val="single" w:sz="6" w:space="1" w:color="auto"/>
+        </w:pBdr>
+        <w:spacing w:after="0" w:line="240" w:lineRule="auto"/>
+        <w:ind w:left="360"/>
+        <w:rPr>
+          <w:lang w:val="az-Latn-AZ"/>
+        </w:rPr>
+      </w:pPr>
+    </w:p>
+    <w:p>
+      <w:pPr>
+        <w:spacing w:after="0" w:line="240" w:lineRule="auto"/>
+        <w:ind w:left="360"/>
+        <w:rPr>
+          <w:lang w:val="az-Latn-AZ"/>
+        </w:rPr>
+      </w:pPr>
+    </w:p>
+    <w:p>
+      <w:pPr>
+        <w:spacing w:after="0" w:line="240" w:lineRule="auto"/>
+        <w:ind w:left="360"/>
+        <w:rPr>
+          <w:lang w:val="az-Latn-AZ"/>
+        </w:rPr>
+      </w:pPr>
+      <w:r>
+        <w:t>I need your recommendation on how to organize all Forum 2024-related content and functionality in the website menu. Specifically, I would like to place these items under the top-level menu item ‘Forum 2024’, using a hierarchical submenu structure with multiple levels where appropriate. Please suggest the most logical, intuitive, and user-friendly menu architecture.</w:t>
+      </w:r>
     </w:p>
     <w:sectPr>
       <w:pgSz w:w="12240" w:h="15840"/>
@@ -28351,6 +28540,155 @@
     </w:lvl>
   </w:abstractNum>
   <w:abstractNum w:abstractNumId="94" w15:restartNumberingAfterBreak="0">
+    <w:nsid w:val="6C3D39F9"/>
+    <w:multiLevelType w:val="multilevel"/>
+    <w:tmpl w:val="AD68E6B4"/>
+    <w:lvl w:ilvl="0">
+      <w:start w:val="1"/>
+      <w:numFmt w:val="bullet"/>
+      <w:lvlText w:val=""/>
+      <w:lvlJc w:val="left"/>
+      <w:pPr>
+        <w:tabs>
+          <w:tab w:val="num" w:pos="720"/>
+        </w:tabs>
+        <w:ind w:left="720" w:hanging="360"/>
+      </w:pPr>
+      <w:rPr>
+        <w:rFonts w:ascii="Symbol" w:hAnsi="Symbol" w:hint="default"/>
+        <w:sz w:val="20"/>
+      </w:rPr>
+    </w:lvl>
+    <w:lvl w:ilvl="1" w:tentative="1">
+      <w:start w:val="1"/>
+      <w:numFmt w:val="bullet"/>
+      <w:lvlText w:val="o"/>
+      <w:lvlJc w:val="left"/>
+      <w:pPr>
+        <w:tabs>
+          <w:tab w:val="num" w:pos="1440"/>
+        </w:tabs>
+        <w:ind w:left="1440" w:hanging="360"/>
+      </w:pPr>
+      <w:rPr>
+        <w:rFonts w:ascii="Courier New" w:hAnsi="Courier New" w:hint="default"/>
+        <w:sz w:val="20"/>
+      </w:rPr>
+    </w:lvl>
+    <w:lvl w:ilvl="2" w:tentative="1">
+      <w:start w:val="1"/>
+      <w:numFmt w:val="bullet"/>
+      <w:lvlText w:val=""/>
+      <w:lvlJc w:val="left"/>
+      <w:pPr>
+        <w:tabs>
+          <w:tab w:val="num" w:pos="2160"/>
+        </w:tabs>
+        <w:ind w:left="2160" w:hanging="360"/>
+      </w:pPr>
+      <w:rPr>
+        <w:rFonts w:ascii="Wingdings" w:hAnsi="Wingdings" w:hint="default"/>
+        <w:sz w:val="20"/>
+      </w:rPr>
+    </w:lvl>
+    <w:lvl w:ilvl="3" w:tentative="1">
+      <w:start w:val="1"/>
+      <w:numFmt w:val="bullet"/>
+      <w:lvlText w:val=""/>
+      <w:lvlJc w:val="left"/>
+      <w:pPr>
+        <w:tabs>
+          <w:tab w:val="num" w:pos="2880"/>
+        </w:tabs>
+        <w:ind w:left="2880" w:hanging="360"/>
+      </w:pPr>
+      <w:rPr>
+        <w:rFonts w:ascii="Wingdings" w:hAnsi="Wingdings" w:hint="default"/>
+        <w:sz w:val="20"/>
+      </w:rPr>
+    </w:lvl>
+    <w:lvl w:ilvl="4" w:tentative="1">
+      <w:start w:val="1"/>
+      <w:numFmt w:val="bullet"/>
+      <w:lvlText w:val=""/>
+      <w:lvlJc w:val="left"/>
+      <w:pPr>
+        <w:tabs>
+          <w:tab w:val="num" w:pos="3600"/>
+        </w:tabs>
+        <w:ind w:left="3600" w:hanging="360"/>
+      </w:pPr>
+      <w:rPr>
+        <w:rFonts w:ascii="Wingdings" w:hAnsi="Wingdings" w:hint="default"/>
+        <w:sz w:val="20"/>
+      </w:rPr>
+    </w:lvl>
+    <w:lvl w:ilvl="5" w:tentative="1">
+      <w:start w:val="1"/>
+      <w:numFmt w:val="bullet"/>
+      <w:lvlText w:val=""/>
+      <w:lvlJc w:val="left"/>
+      <w:pPr>
+        <w:tabs>
+          <w:tab w:val="num" w:pos="4320"/>
+        </w:tabs>
+        <w:ind w:left="4320" w:hanging="360"/>
+      </w:pPr>
+      <w:rPr>
+        <w:rFonts w:ascii="Wingdings" w:hAnsi="Wingdings" w:hint="default"/>
+        <w:sz w:val="20"/>
+      </w:rPr>
+    </w:lvl>
+    <w:lvl w:ilvl="6" w:tentative="1">
+      <w:start w:val="1"/>
+      <w:numFmt w:val="bullet"/>
+      <w:lvlText w:val=""/>
+      <w:lvlJc w:val="left"/>
+      <w:pPr>
+        <w:tabs>
+          <w:tab w:val="num" w:pos="5040"/>
+        </w:tabs>
+        <w:ind w:left="5040" w:hanging="360"/>
+      </w:pPr>
+      <w:rPr>
+        <w:rFonts w:ascii="Wingdings" w:hAnsi="Wingdings" w:hint="default"/>
+        <w:sz w:val="20"/>
+      </w:rPr>
+    </w:lvl>
+    <w:lvl w:ilvl="7" w:tentative="1">
+      <w:start w:val="1"/>
+      <w:numFmt w:val="bullet"/>
+      <w:lvlText w:val=""/>
+      <w:lvlJc w:val="left"/>
+      <w:pPr>
+        <w:tabs>
+          <w:tab w:val="num" w:pos="5760"/>
+        </w:tabs>
+        <w:ind w:left="5760" w:hanging="360"/>
+      </w:pPr>
+      <w:rPr>
+        <w:rFonts w:ascii="Wingdings" w:hAnsi="Wingdings" w:hint="default"/>
+        <w:sz w:val="20"/>
+      </w:rPr>
+    </w:lvl>
+    <w:lvl w:ilvl="8" w:tentative="1">
+      <w:start w:val="1"/>
+      <w:numFmt w:val="bullet"/>
+      <w:lvlText w:val=""/>
+      <w:lvlJc w:val="left"/>
+      <w:pPr>
+        <w:tabs>
+          <w:tab w:val="num" w:pos="6480"/>
+        </w:tabs>
+        <w:ind w:left="6480" w:hanging="360"/>
+      </w:pPr>
+      <w:rPr>
+        <w:rFonts w:ascii="Wingdings" w:hAnsi="Wingdings" w:hint="default"/>
+        <w:sz w:val="20"/>
+      </w:rPr>
+    </w:lvl>
+  </w:abstractNum>
+  <w:abstractNum w:abstractNumId="95" w15:restartNumberingAfterBreak="0">
     <w:nsid w:val="6C52622C"/>
     <w:multiLevelType w:val="multilevel"/>
     <w:tmpl w:val="F8B03172"/>
@@ -28499,7 +28837,7 @@
       </w:rPr>
     </w:lvl>
   </w:abstractNum>
-  <w:abstractNum w:abstractNumId="95" w15:restartNumberingAfterBreak="0">
+  <w:abstractNum w:abstractNumId="96" w15:restartNumberingAfterBreak="0">
     <w:nsid w:val="6D674DC7"/>
     <w:multiLevelType w:val="multilevel"/>
     <w:tmpl w:val="4342CC68"/>
@@ -28648,7 +28986,7 @@
       </w:rPr>
     </w:lvl>
   </w:abstractNum>
-  <w:abstractNum w:abstractNumId="96" w15:restartNumberingAfterBreak="0">
+  <w:abstractNum w:abstractNumId="97" w15:restartNumberingAfterBreak="0">
     <w:nsid w:val="6E08011E"/>
     <w:multiLevelType w:val="hybridMultilevel"/>
     <w:tmpl w:val="33DE4EDC"/>
@@ -28760,7 +29098,7 @@
       </w:rPr>
     </w:lvl>
   </w:abstractNum>
-  <w:abstractNum w:abstractNumId="97" w15:restartNumberingAfterBreak="0">
+  <w:abstractNum w:abstractNumId="98" w15:restartNumberingAfterBreak="0">
     <w:nsid w:val="71C01D39"/>
     <w:multiLevelType w:val="multilevel"/>
     <w:tmpl w:val="7C4E5656"/>
@@ -28909,7 +29247,7 @@
       </w:rPr>
     </w:lvl>
   </w:abstractNum>
-  <w:abstractNum w:abstractNumId="98" w15:restartNumberingAfterBreak="0">
+  <w:abstractNum w:abstractNumId="99" w15:restartNumberingAfterBreak="0">
     <w:nsid w:val="722717AC"/>
     <w:multiLevelType w:val="hybridMultilevel"/>
     <w:tmpl w:val="935CC4B6"/>
@@ -29021,7 +29359,7 @@
       </w:rPr>
     </w:lvl>
   </w:abstractNum>
-  <w:abstractNum w:abstractNumId="99" w15:restartNumberingAfterBreak="0">
+  <w:abstractNum w:abstractNumId="100" w15:restartNumberingAfterBreak="0">
     <w:nsid w:val="7266168E"/>
     <w:multiLevelType w:val="hybridMultilevel"/>
     <w:tmpl w:val="163AFB96"/>
@@ -29133,7 +29471,7 @@
       </w:rPr>
     </w:lvl>
   </w:abstractNum>
-  <w:abstractNum w:abstractNumId="100" w15:restartNumberingAfterBreak="0">
+  <w:abstractNum w:abstractNumId="101" w15:restartNumberingAfterBreak="0">
     <w:nsid w:val="743E3484"/>
     <w:multiLevelType w:val="hybridMultilevel"/>
     <w:tmpl w:val="F148EE2C"/>
@@ -29246,7 +29584,7 @@
       </w:rPr>
     </w:lvl>
   </w:abstractNum>
-  <w:abstractNum w:abstractNumId="101" w15:restartNumberingAfterBreak="0">
+  <w:abstractNum w:abstractNumId="102" w15:restartNumberingAfterBreak="0">
     <w:nsid w:val="777C1D77"/>
     <w:multiLevelType w:val="hybridMultilevel"/>
     <w:tmpl w:val="2D0210B8"/>
@@ -29358,7 +29696,7 @@
       </w:rPr>
     </w:lvl>
   </w:abstractNum>
-  <w:abstractNum w:abstractNumId="102" w15:restartNumberingAfterBreak="0">
+  <w:abstractNum w:abstractNumId="103" w15:restartNumberingAfterBreak="0">
     <w:nsid w:val="79033895"/>
     <w:multiLevelType w:val="hybridMultilevel"/>
     <w:tmpl w:val="D0EC68D0"/>
@@ -29470,7 +29808,7 @@
       </w:rPr>
     </w:lvl>
   </w:abstractNum>
-  <w:abstractNum w:abstractNumId="103" w15:restartNumberingAfterBreak="0">
+  <w:abstractNum w:abstractNumId="104" w15:restartNumberingAfterBreak="0">
     <w:nsid w:val="79254661"/>
     <w:multiLevelType w:val="multilevel"/>
     <w:tmpl w:val="577EED92"/>
@@ -29619,7 +29957,7 @@
       </w:rPr>
     </w:lvl>
   </w:abstractNum>
-  <w:abstractNum w:abstractNumId="104" w15:restartNumberingAfterBreak="0">
+  <w:abstractNum w:abstractNumId="105" w15:restartNumberingAfterBreak="0">
     <w:nsid w:val="7A8751EA"/>
     <w:multiLevelType w:val="multilevel"/>
     <w:tmpl w:val="ADFE54B8"/>
@@ -29768,7 +30106,7 @@
       </w:rPr>
     </w:lvl>
   </w:abstractNum>
-  <w:abstractNum w:abstractNumId="105" w15:restartNumberingAfterBreak="0">
+  <w:abstractNum w:abstractNumId="106" w15:restartNumberingAfterBreak="0">
     <w:nsid w:val="7BB76968"/>
     <w:multiLevelType w:val="hybridMultilevel"/>
     <w:tmpl w:val="F1945E5E"/>
@@ -29880,7 +30218,7 @@
       </w:rPr>
     </w:lvl>
   </w:abstractNum>
-  <w:abstractNum w:abstractNumId="106" w15:restartNumberingAfterBreak="0">
+  <w:abstractNum w:abstractNumId="107" w15:restartNumberingAfterBreak="0">
     <w:nsid w:val="7D0F73BE"/>
     <w:multiLevelType w:val="multilevel"/>
     <w:tmpl w:val="283CE29A"/>
@@ -30029,7 +30367,7 @@
       </w:rPr>
     </w:lvl>
   </w:abstractNum>
-  <w:abstractNum w:abstractNumId="107" w15:restartNumberingAfterBreak="0">
+  <w:abstractNum w:abstractNumId="108" w15:restartNumberingAfterBreak="0">
     <w:nsid w:val="7E1427B3"/>
     <w:multiLevelType w:val="multilevel"/>
     <w:tmpl w:val="760E8CDE"/>
@@ -30191,7 +30529,7 @@
     <w:abstractNumId w:val="27"/>
   </w:num>
   <w:num w:numId="5" w16cid:durableId="1356880465">
-    <w:abstractNumId w:val="103"/>
+    <w:abstractNumId w:val="104"/>
   </w:num>
   <w:num w:numId="6" w16cid:durableId="1210613002">
     <w:abstractNumId w:val="19"/>
@@ -30203,13 +30541,13 @@
     <w:abstractNumId w:val="35"/>
   </w:num>
   <w:num w:numId="9" w16cid:durableId="523247384">
-    <w:abstractNumId w:val="95"/>
+    <w:abstractNumId w:val="96"/>
   </w:num>
   <w:num w:numId="10" w16cid:durableId="261114341">
     <w:abstractNumId w:val="15"/>
   </w:num>
   <w:num w:numId="11" w16cid:durableId="987244375">
-    <w:abstractNumId w:val="104"/>
+    <w:abstractNumId w:val="105"/>
   </w:num>
   <w:num w:numId="12" w16cid:durableId="1765805581">
     <w:abstractNumId w:val="9"/>
@@ -30257,7 +30595,7 @@
     <w:abstractNumId w:val="23"/>
   </w:num>
   <w:num w:numId="27" w16cid:durableId="827793205">
-    <w:abstractNumId w:val="100"/>
+    <w:abstractNumId w:val="101"/>
   </w:num>
   <w:num w:numId="28" w16cid:durableId="1275989163">
     <w:abstractNumId w:val="51"/>
@@ -30296,10 +30634,10 @@
     <w:abstractNumId w:val="18"/>
   </w:num>
   <w:num w:numId="40" w16cid:durableId="1202018679">
-    <w:abstractNumId w:val="99"/>
+    <w:abstractNumId w:val="100"/>
   </w:num>
   <w:num w:numId="41" w16cid:durableId="696003112">
-    <w:abstractNumId w:val="105"/>
+    <w:abstractNumId w:val="106"/>
   </w:num>
   <w:num w:numId="42" w16cid:durableId="1488278798">
     <w:abstractNumId w:val="60"/>
@@ -30353,7 +30691,7 @@
     <w:abstractNumId w:val="47"/>
   </w:num>
   <w:num w:numId="59" w16cid:durableId="1891763306">
-    <w:abstractNumId w:val="101"/>
+    <w:abstractNumId w:val="102"/>
   </w:num>
   <w:num w:numId="60" w16cid:durableId="252595352">
     <w:abstractNumId w:val="36"/>
@@ -30389,10 +30727,10 @@
     <w:abstractNumId w:val="10"/>
   </w:num>
   <w:num w:numId="71" w16cid:durableId="389354266">
-    <w:abstractNumId w:val="98"/>
+    <w:abstractNumId w:val="99"/>
   </w:num>
   <w:num w:numId="72" w16cid:durableId="1195070258">
-    <w:abstractNumId w:val="96"/>
+    <w:abstractNumId w:val="97"/>
   </w:num>
   <w:num w:numId="73" w16cid:durableId="1972049655">
     <w:abstractNumId w:val="50"/>
@@ -30410,7 +30748,7 @@
     <w:abstractNumId w:val="75"/>
   </w:num>
   <w:num w:numId="78" w16cid:durableId="1134832258">
-    <w:abstractNumId w:val="102"/>
+    <w:abstractNumId w:val="103"/>
   </w:num>
   <w:num w:numId="79" w16cid:durableId="1911575055">
     <w:abstractNumId w:val="52"/>
@@ -30428,7 +30766,7 @@
     <w:abstractNumId w:val="37"/>
   </w:num>
   <w:num w:numId="84" w16cid:durableId="931205951">
-    <w:abstractNumId w:val="94"/>
+    <w:abstractNumId w:val="95"/>
   </w:num>
   <w:num w:numId="85" w16cid:durableId="1261450898">
     <w:abstractNumId w:val="0"/>
@@ -30452,19 +30790,19 @@
     <w:abstractNumId w:val="48"/>
   </w:num>
   <w:num w:numId="92" w16cid:durableId="1194732434">
-    <w:abstractNumId w:val="97"/>
+    <w:abstractNumId w:val="98"/>
   </w:num>
   <w:num w:numId="93" w16cid:durableId="1126509868">
     <w:abstractNumId w:val="41"/>
   </w:num>
   <w:num w:numId="94" w16cid:durableId="1586915427">
-    <w:abstractNumId w:val="107"/>
+    <w:abstractNumId w:val="108"/>
   </w:num>
   <w:num w:numId="95" w16cid:durableId="1985424155">
     <w:abstractNumId w:val="66"/>
   </w:num>
   <w:num w:numId="96" w16cid:durableId="1503928418">
-    <w:abstractNumId w:val="106"/>
+    <w:abstractNumId w:val="107"/>
   </w:num>
   <w:num w:numId="97" w16cid:durableId="1523935396">
     <w:abstractNumId w:val="33"/>
@@ -30501,6 +30839,9 @@
   </w:num>
   <w:num w:numId="108" w16cid:durableId="590892086">
     <w:abstractNumId w:val="54"/>
+  </w:num>
+  <w:num w:numId="109" w16cid:durableId="357900316">
+    <w:abstractNumId w:val="94"/>
   </w:num>
   <w:numIdMacAtCleanup w:val="102"/>
 </w:numbering>

</xml_diff>

<commit_message>
Add Home and Activities breadcrumbs and refine Forums mega navigation.
Enable breadcrumb trails on hub pages, restructure Forums with 2024 mega menu and 2026 entry, polish mega panel layout and hover behavior, add performance assets, and sync site-wide HTML and Deployment package.

Co-authored-by: Cursor <cursoragent@cursor.com>
</commit_message>
<xml_diff>
--- a/documents/docx/Prompts.docx
+++ b/documents/docx/Prompts.docx
@@ -16822,8 +16822,14 @@
       <w:pPr>
         <w:spacing w:after="0" w:line="240" w:lineRule="auto"/>
         <w:ind w:left="360"/>
-      </w:pPr>
-      <w:r>
+        <w:rPr>
+          <w:highlight w:val="yellow"/>
+        </w:rPr>
+      </w:pPr>
+      <w:r>
+        <w:rPr>
+          <w:highlight w:val="yellow"/>
+        </w:rPr>
         <w:t>Please conduct a thorough review of the entire project codebase, including all HTML, CSS, JavaScript, assets, configuration files, internal links, navigation elements, and page structures.</w:t>
       </w:r>
     </w:p>
@@ -16833,15 +16839,21 @@
         <w:ind w:left="360"/>
       </w:pPr>
       <w:r>
+        <w:rPr>
+          <w:highlight w:val="yellow"/>
+        </w:rPr>
         <w:t>The purpose of this review is to identify and document any discrepancies, inconsistencies, broken links, duplicated or unused code, styling conflicts, layout issues, responsiveness problems, accessibility gaps, multilingual inconsistencies, naming inconsistencies, missing assets, incorrect file paths, and any other technical or UI/UX issues that may affect the quality, maintainability, or user experience of the website.</w:t>
       </w:r>
-    </w:p>
-    <w:p>
-      <w:pPr>
-        <w:spacing w:after="0" w:line="240" w:lineRule="auto"/>
-        <w:ind w:left="360"/>
-      </w:pPr>
-      <w:r>
+      <w:r>
+        <w:rPr>
+          <w:highlight w:val="yellow"/>
+        </w:rPr>
+        <w:t xml:space="preserve"> </w:t>
+      </w:r>
+      <w:r>
+        <w:rPr>
+          <w:highlight w:val="yellow"/>
+        </w:rPr>
         <w:t>Please provide a clear report of all identified issues, grouped by category, and include specific recommendations for how each issue should be corrected.</w:t>
       </w:r>
     </w:p>
@@ -16987,13 +16999,160 @@
       <w:pPr>
         <w:spacing w:after="0" w:line="240" w:lineRule="auto"/>
         <w:ind w:left="360"/>
+      </w:pPr>
+      <w:r>
+        <w:t>I need your recommendation on how to organize all Forum 2024-related content and functionality in the website menu. Specifically, I would like to place these items under the top-level menu item ‘Forum 2024’, using a hierarchical submenu structure with multiple levels where appropriate. Please suggest the most logical, intuitive, and user-friendly menu architecture.</w:t>
+      </w:r>
+    </w:p>
+    <w:p>
+      <w:pPr>
+        <w:pBdr>
+          <w:bottom w:val="single" w:sz="6" w:space="1" w:color="auto"/>
+        </w:pBdr>
+        <w:spacing w:after="0" w:line="240" w:lineRule="auto"/>
+        <w:ind w:left="360"/>
+      </w:pPr>
+    </w:p>
+    <w:p>
+      <w:pPr>
+        <w:spacing w:after="0" w:line="240" w:lineRule="auto"/>
+        <w:ind w:left="360"/>
+      </w:pPr>
+    </w:p>
+    <w:p>
+      <w:pPr>
+        <w:spacing w:after="0" w:line="240" w:lineRule="auto"/>
+        <w:ind w:left="360"/>
+      </w:pPr>
+      <w:r>
+        <w:lastRenderedPageBreak/>
+        <w:t>Some pages currently include in-page navigation bars. Please review whether these are still necessary, especially where the same or equivalent navigation functionality is already available through the main menu items.</w:t>
+      </w:r>
+    </w:p>
+    <w:p>
+      <w:pPr>
+        <w:spacing w:after="0" w:line="240" w:lineRule="auto"/>
+        <w:ind w:left="360"/>
+      </w:pPr>
+    </w:p>
+    <w:p>
+      <w:pPr>
+        <w:spacing w:after="0" w:line="240" w:lineRule="auto"/>
+        <w:ind w:left="360"/>
+      </w:pPr>
+      <w:r>
+        <w:t>If the in-page navigation bars duplicate the main menu functionality, consider removing them to avoid redundancy, improve usability, and keep the page layout cleaner.</w:t>
+      </w:r>
+    </w:p>
+    <w:p>
+      <w:pPr>
+        <w:pBdr>
+          <w:bottom w:val="single" w:sz="6" w:space="1" w:color="auto"/>
+        </w:pBdr>
+        <w:spacing w:after="0" w:line="240" w:lineRule="auto"/>
+        <w:ind w:left="360"/>
         <w:rPr>
           <w:lang w:val="az-Latn-AZ"/>
         </w:rPr>
       </w:pPr>
-      <w:r>
-        <w:t>I need your recommendation on how to organize all Forum 2024-related content and functionality in the website menu. Specifically, I would like to place these items under the top-level menu item ‘Forum 2024’, using a hierarchical submenu structure with multiple levels where appropriate. Please suggest the most logical, intuitive, and user-friendly menu architecture.</w:t>
-      </w:r>
+    </w:p>
+    <w:p>
+      <w:pPr>
+        <w:spacing w:after="0" w:line="240" w:lineRule="auto"/>
+        <w:ind w:left="360"/>
+        <w:rPr>
+          <w:lang w:val="az-Latn-AZ"/>
+        </w:rPr>
+      </w:pPr>
+    </w:p>
+    <w:p>
+      <w:pPr>
+        <w:spacing w:after="0" w:line="240" w:lineRule="auto"/>
+        <w:ind w:left="360"/>
+      </w:pPr>
+      <w:r>
+        <w:t xml:space="preserve">Currently, when the </w:t>
+      </w:r>
+      <w:r>
+        <w:rPr>
+          <w:b/>
+          <w:bCs/>
+        </w:rPr>
+        <w:t>“Forum 2024”</w:t>
+      </w:r>
+      <w:r>
+        <w:t xml:space="preserve"> menu item is clicked, all submenu items, including their nested submenu items, are displayed at once.</w:t>
+      </w:r>
+    </w:p>
+    <w:p>
+      <w:pPr>
+        <w:spacing w:after="0" w:line="240" w:lineRule="auto"/>
+        <w:ind w:left="360"/>
+      </w:pPr>
+      <w:r>
+        <w:t xml:space="preserve">Please adjust this behavior so that clicking </w:t>
+      </w:r>
+      <w:r>
+        <w:rPr>
+          <w:b/>
+          <w:bCs/>
+        </w:rPr>
+        <w:t>“Forum 2024”</w:t>
+      </w:r>
+      <w:r>
+        <w:t xml:space="preserve"> initially displays only the first-level submenu items. Nested submenu items should appear only when the user hovers over or clicks the corresponding first-level submenu item.</w:t>
+      </w:r>
+    </w:p>
+    <w:p>
+      <w:pPr>
+        <w:spacing w:after="0" w:line="240" w:lineRule="auto"/>
+        <w:ind w:left="360"/>
+      </w:pPr>
+      <w:r>
+        <w:t>This will make the menu cleaner, easier to navigate, and more consistent with standard hierarchical navigation behavior.</w:t>
+      </w:r>
+    </w:p>
+    <w:p>
+      <w:pPr>
+        <w:spacing w:after="0" w:line="240" w:lineRule="auto"/>
+        <w:ind w:left="360"/>
+      </w:pPr>
+    </w:p>
+    <w:p>
+      <w:pPr>
+        <w:spacing w:after="0" w:line="240" w:lineRule="auto"/>
+        <w:ind w:left="360"/>
+      </w:pPr>
+      <w:r>
+        <w:t>Ensure that this menu behavior is properly adapted for mobile devices and that responsive design principles are fully followed.</w:t>
+      </w:r>
+    </w:p>
+    <w:p>
+      <w:pPr>
+        <w:spacing w:after="0" w:line="240" w:lineRule="auto"/>
+        <w:ind w:left="360"/>
+      </w:pPr>
+      <w:r>
+        <w:t>On mobile screens, the submenu hierarchy should remain clear and easy to use. First-level submenu items should be displayed first, while nested submenu items should expand only when the corresponding parent item is tapped.</w:t>
+      </w:r>
+    </w:p>
+    <w:p>
+      <w:pPr>
+        <w:spacing w:after="0" w:line="240" w:lineRule="auto"/>
+        <w:ind w:left="360"/>
+      </w:pPr>
+      <w:r>
+        <w:t>Please make sure the implementation works smoothly across desktop, tablet, and mobile devices.</w:t>
+      </w:r>
+    </w:p>
+    <w:p>
+      <w:pPr>
+        <w:spacing w:after="0" w:line="240" w:lineRule="auto"/>
+        <w:ind w:left="360"/>
+        <w:rPr>
+          <w:lang w:val="az-Latn-AZ"/>
+        </w:rPr>
+      </w:pPr>
     </w:p>
     <w:sectPr>
       <w:pgSz w:w="12240" w:h="15840"/>

</xml_diff>

<commit_message>
Site quality pass, new forum pages, search redesign, and deployment sync.
Fix forum content CSS selectors and replace inline TOC scripts with shared sidebar timeline JS. Add SEO head tags, sitemap coverage for prominent figures, decorative emoji a11y, and profile heading hierarchy across ~470 pages. Redesign site search overlay; add logistics, sessions, and 2024-2026 work-done pages. Regenerate Deployment/ with full images and validated links.

Co-authored-by: Cursor <cursoragent@cursor.com>
</commit_message>
<xml_diff>
--- a/documents/docx/Prompts.docx
+++ b/documents/docx/Prompts.docx
@@ -17147,12 +17147,1808 @@
     </w:p>
     <w:p>
       <w:pPr>
+        <w:pBdr>
+          <w:bottom w:val="single" w:sz="6" w:space="1" w:color="auto"/>
+        </w:pBdr>
         <w:spacing w:after="0" w:line="240" w:lineRule="auto"/>
         <w:ind w:left="360"/>
         <w:rPr>
           <w:lang w:val="az-Latn-AZ"/>
         </w:rPr>
       </w:pPr>
+    </w:p>
+    <w:p>
+      <w:pPr>
+        <w:spacing w:after="0" w:line="240" w:lineRule="auto"/>
+        <w:ind w:left="360"/>
+        <w:rPr>
+          <w:lang w:val="az-Latn-AZ"/>
+        </w:rPr>
+      </w:pPr>
+    </w:p>
+    <w:p>
+      <w:pPr>
+        <w:spacing w:after="0" w:line="240" w:lineRule="auto"/>
+        <w:ind w:left="360"/>
+      </w:pPr>
+      <w:r>
+        <w:t xml:space="preserve">Build a comprehensive Microsoft Word document about </w:t>
+      </w:r>
+      <w:r>
+        <w:rPr>
+          <w:b/>
+          <w:bCs/>
+        </w:rPr>
+        <w:t>all four Industrial Revolutions</w:t>
+      </w:r>
+      <w:r>
+        <w:t>.</w:t>
+      </w:r>
+    </w:p>
+    <w:p>
+      <w:pPr>
+        <w:spacing w:after="0" w:line="240" w:lineRule="auto"/>
+        <w:ind w:left="360"/>
+      </w:pPr>
+      <w:r>
+        <w:t xml:space="preserve">The document should describe each Industrial Revolution in detail, using </w:t>
+      </w:r>
+      <w:r>
+        <w:rPr>
+          <w:b/>
+          <w:bCs/>
+        </w:rPr>
+        <w:t>simple, clear, and accessible language</w:t>
+      </w:r>
+      <w:r>
+        <w:t xml:space="preserve"> suitable for a broad audience.</w:t>
+      </w:r>
+    </w:p>
+    <w:p>
+      <w:pPr>
+        <w:spacing w:after="0" w:line="240" w:lineRule="auto"/>
+        <w:ind w:left="360"/>
+      </w:pPr>
+      <w:r>
+        <w:t>Please ensure that the document includes:</w:t>
+      </w:r>
+    </w:p>
+    <w:p>
+      <w:pPr>
+        <w:numPr>
+          <w:ilvl w:val="0"/>
+          <w:numId w:val="110"/>
+        </w:numPr>
+        <w:spacing w:after="0" w:line="240" w:lineRule="auto"/>
+      </w:pPr>
+      <w:r>
+        <w:t xml:space="preserve">A clear introduction explaining what an Industrial Revolution means. </w:t>
+      </w:r>
+    </w:p>
+    <w:p>
+      <w:pPr>
+        <w:numPr>
+          <w:ilvl w:val="0"/>
+          <w:numId w:val="110"/>
+        </w:numPr>
+        <w:spacing w:after="0" w:line="240" w:lineRule="auto"/>
+      </w:pPr>
+      <w:r>
+        <w:t xml:space="preserve">A detailed section on the </w:t>
+      </w:r>
+      <w:r>
+        <w:rPr>
+          <w:b/>
+          <w:bCs/>
+        </w:rPr>
+        <w:t>First Industrial Revolution</w:t>
+      </w:r>
+      <w:r>
+        <w:t xml:space="preserve">, including: </w:t>
+      </w:r>
+    </w:p>
+    <w:p>
+      <w:pPr>
+        <w:numPr>
+          <w:ilvl w:val="1"/>
+          <w:numId w:val="110"/>
+        </w:numPr>
+        <w:spacing w:after="0" w:line="240" w:lineRule="auto"/>
+      </w:pPr>
+      <w:r>
+        <w:t xml:space="preserve">historical period </w:t>
+      </w:r>
+    </w:p>
+    <w:p>
+      <w:pPr>
+        <w:numPr>
+          <w:ilvl w:val="1"/>
+          <w:numId w:val="110"/>
+        </w:numPr>
+        <w:spacing w:after="0" w:line="240" w:lineRule="auto"/>
+      </w:pPr>
+      <w:r>
+        <w:t xml:space="preserve">main causes </w:t>
+      </w:r>
+    </w:p>
+    <w:p>
+      <w:pPr>
+        <w:numPr>
+          <w:ilvl w:val="1"/>
+          <w:numId w:val="110"/>
+        </w:numPr>
+        <w:spacing w:after="0" w:line="240" w:lineRule="auto"/>
+      </w:pPr>
+      <w:r>
+        <w:t xml:space="preserve">key inventions </w:t>
+      </w:r>
+    </w:p>
+    <w:p>
+      <w:pPr>
+        <w:numPr>
+          <w:ilvl w:val="1"/>
+          <w:numId w:val="110"/>
+        </w:numPr>
+        <w:spacing w:after="0" w:line="240" w:lineRule="auto"/>
+      </w:pPr>
+      <w:r>
+        <w:t xml:space="preserve">steam power </w:t>
+      </w:r>
+    </w:p>
+    <w:p>
+      <w:pPr>
+        <w:numPr>
+          <w:ilvl w:val="1"/>
+          <w:numId w:val="110"/>
+        </w:numPr>
+        <w:spacing w:after="0" w:line="240" w:lineRule="auto"/>
+      </w:pPr>
+      <w:r>
+        <w:t xml:space="preserve">textile production </w:t>
+      </w:r>
+    </w:p>
+    <w:p>
+      <w:pPr>
+        <w:numPr>
+          <w:ilvl w:val="1"/>
+          <w:numId w:val="110"/>
+        </w:numPr>
+        <w:spacing w:after="0" w:line="240" w:lineRule="auto"/>
+      </w:pPr>
+      <w:r>
+        <w:t xml:space="preserve">coal and iron industries </w:t>
+      </w:r>
+    </w:p>
+    <w:p>
+      <w:pPr>
+        <w:numPr>
+          <w:ilvl w:val="1"/>
+          <w:numId w:val="110"/>
+        </w:numPr>
+        <w:spacing w:after="0" w:line="240" w:lineRule="auto"/>
+      </w:pPr>
+      <w:r>
+        <w:t xml:space="preserve">changes in agriculture, transport, and society </w:t>
+      </w:r>
+    </w:p>
+    <w:p>
+      <w:pPr>
+        <w:numPr>
+          <w:ilvl w:val="0"/>
+          <w:numId w:val="110"/>
+        </w:numPr>
+        <w:spacing w:after="0" w:line="240" w:lineRule="auto"/>
+      </w:pPr>
+      <w:r>
+        <w:t xml:space="preserve">A detailed section on the </w:t>
+      </w:r>
+      <w:r>
+        <w:rPr>
+          <w:b/>
+          <w:bCs/>
+        </w:rPr>
+        <w:t>Second Industrial Revolution</w:t>
+      </w:r>
+      <w:r>
+        <w:t xml:space="preserve">, including: </w:t>
+      </w:r>
+    </w:p>
+    <w:p>
+      <w:pPr>
+        <w:numPr>
+          <w:ilvl w:val="1"/>
+          <w:numId w:val="110"/>
+        </w:numPr>
+        <w:spacing w:after="0" w:line="240" w:lineRule="auto"/>
+      </w:pPr>
+      <w:r>
+        <w:t xml:space="preserve">historical period </w:t>
+      </w:r>
+    </w:p>
+    <w:p>
+      <w:pPr>
+        <w:numPr>
+          <w:ilvl w:val="1"/>
+          <w:numId w:val="110"/>
+        </w:numPr>
+        <w:spacing w:after="0" w:line="240" w:lineRule="auto"/>
+      </w:pPr>
+      <w:r>
+        <w:t xml:space="preserve">electricity </w:t>
+      </w:r>
+    </w:p>
+    <w:p>
+      <w:pPr>
+        <w:numPr>
+          <w:ilvl w:val="1"/>
+          <w:numId w:val="110"/>
+        </w:numPr>
+        <w:spacing w:after="0" w:line="240" w:lineRule="auto"/>
+      </w:pPr>
+      <w:r>
+        <w:t xml:space="preserve">mass production </w:t>
+      </w:r>
+    </w:p>
+    <w:p>
+      <w:pPr>
+        <w:numPr>
+          <w:ilvl w:val="1"/>
+          <w:numId w:val="110"/>
+        </w:numPr>
+        <w:spacing w:after="0" w:line="240" w:lineRule="auto"/>
+      </w:pPr>
+      <w:r>
+        <w:t xml:space="preserve">steel, chemicals, and oil industries </w:t>
+      </w:r>
+    </w:p>
+    <w:p>
+      <w:pPr>
+        <w:numPr>
+          <w:ilvl w:val="1"/>
+          <w:numId w:val="110"/>
+        </w:numPr>
+        <w:spacing w:after="0" w:line="240" w:lineRule="auto"/>
+      </w:pPr>
+      <w:r>
+        <w:t xml:space="preserve">railways, telegraph, telephone, and communication </w:t>
+      </w:r>
+    </w:p>
+    <w:p>
+      <w:pPr>
+        <w:numPr>
+          <w:ilvl w:val="1"/>
+          <w:numId w:val="110"/>
+        </w:numPr>
+        <w:spacing w:after="0" w:line="240" w:lineRule="auto"/>
+      </w:pPr>
+      <w:r>
+        <w:t xml:space="preserve">factories, urbanization, and global trade </w:t>
+      </w:r>
+    </w:p>
+    <w:p>
+      <w:pPr>
+        <w:numPr>
+          <w:ilvl w:val="0"/>
+          <w:numId w:val="110"/>
+        </w:numPr>
+        <w:spacing w:after="0" w:line="240" w:lineRule="auto"/>
+      </w:pPr>
+      <w:r>
+        <w:t xml:space="preserve">A detailed section on the </w:t>
+      </w:r>
+      <w:r>
+        <w:rPr>
+          <w:b/>
+          <w:bCs/>
+        </w:rPr>
+        <w:t>Third Industrial Revolution</w:t>
+      </w:r>
+      <w:r>
+        <w:t xml:space="preserve">, including: </w:t>
+      </w:r>
+    </w:p>
+    <w:p>
+      <w:pPr>
+        <w:numPr>
+          <w:ilvl w:val="1"/>
+          <w:numId w:val="110"/>
+        </w:numPr>
+        <w:spacing w:after="0" w:line="240" w:lineRule="auto"/>
+      </w:pPr>
+      <w:r>
+        <w:t xml:space="preserve">historical period </w:t>
+      </w:r>
+    </w:p>
+    <w:p>
+      <w:pPr>
+        <w:numPr>
+          <w:ilvl w:val="1"/>
+          <w:numId w:val="110"/>
+        </w:numPr>
+        <w:spacing w:after="0" w:line="240" w:lineRule="auto"/>
+      </w:pPr>
+      <w:r>
+        <w:t xml:space="preserve">electronics </w:t>
+      </w:r>
+    </w:p>
+    <w:p>
+      <w:pPr>
+        <w:numPr>
+          <w:ilvl w:val="1"/>
+          <w:numId w:val="110"/>
+        </w:numPr>
+        <w:spacing w:after="0" w:line="240" w:lineRule="auto"/>
+      </w:pPr>
+      <w:r>
+        <w:t xml:space="preserve">computers </w:t>
+      </w:r>
+    </w:p>
+    <w:p>
+      <w:pPr>
+        <w:numPr>
+          <w:ilvl w:val="1"/>
+          <w:numId w:val="110"/>
+        </w:numPr>
+        <w:spacing w:after="0" w:line="240" w:lineRule="auto"/>
+      </w:pPr>
+      <w:r>
+        <w:lastRenderedPageBreak/>
+        <w:t xml:space="preserve">automation </w:t>
+      </w:r>
+    </w:p>
+    <w:p>
+      <w:pPr>
+        <w:numPr>
+          <w:ilvl w:val="1"/>
+          <w:numId w:val="110"/>
+        </w:numPr>
+        <w:spacing w:after="0" w:line="240" w:lineRule="auto"/>
+      </w:pPr>
+      <w:r>
+        <w:t xml:space="preserve">the internet </w:t>
+      </w:r>
+    </w:p>
+    <w:p>
+      <w:pPr>
+        <w:numPr>
+          <w:ilvl w:val="1"/>
+          <w:numId w:val="110"/>
+        </w:numPr>
+        <w:spacing w:after="0" w:line="240" w:lineRule="auto"/>
+      </w:pPr>
+      <w:r>
+        <w:t xml:space="preserve">information technologies </w:t>
+      </w:r>
+    </w:p>
+    <w:p>
+      <w:pPr>
+        <w:numPr>
+          <w:ilvl w:val="1"/>
+          <w:numId w:val="110"/>
+        </w:numPr>
+        <w:spacing w:after="0" w:line="240" w:lineRule="auto"/>
+      </w:pPr>
+      <w:r>
+        <w:t xml:space="preserve">digital communication and globalization </w:t>
+      </w:r>
+    </w:p>
+    <w:p>
+      <w:pPr>
+        <w:numPr>
+          <w:ilvl w:val="0"/>
+          <w:numId w:val="110"/>
+        </w:numPr>
+        <w:spacing w:after="0" w:line="240" w:lineRule="auto"/>
+      </w:pPr>
+      <w:r>
+        <w:t xml:space="preserve">A detailed section on the </w:t>
+      </w:r>
+      <w:r>
+        <w:rPr>
+          <w:b/>
+          <w:bCs/>
+        </w:rPr>
+        <w:t>Fourth Industrial Revolution</w:t>
+      </w:r>
+      <w:r>
+        <w:t xml:space="preserve">, including: </w:t>
+      </w:r>
+    </w:p>
+    <w:p>
+      <w:pPr>
+        <w:numPr>
+          <w:ilvl w:val="1"/>
+          <w:numId w:val="110"/>
+        </w:numPr>
+        <w:spacing w:after="0" w:line="240" w:lineRule="auto"/>
+      </w:pPr>
+      <w:r>
+        <w:t xml:space="preserve">artificial intelligence </w:t>
+      </w:r>
+    </w:p>
+    <w:p>
+      <w:pPr>
+        <w:numPr>
+          <w:ilvl w:val="1"/>
+          <w:numId w:val="110"/>
+        </w:numPr>
+        <w:spacing w:after="0" w:line="240" w:lineRule="auto"/>
+      </w:pPr>
+      <w:r>
+        <w:t xml:space="preserve">machine learning </w:t>
+      </w:r>
+    </w:p>
+    <w:p>
+      <w:pPr>
+        <w:numPr>
+          <w:ilvl w:val="1"/>
+          <w:numId w:val="110"/>
+        </w:numPr>
+        <w:spacing w:after="0" w:line="240" w:lineRule="auto"/>
+      </w:pPr>
+      <w:r>
+        <w:t xml:space="preserve">big data </w:t>
+      </w:r>
+    </w:p>
+    <w:p>
+      <w:pPr>
+        <w:numPr>
+          <w:ilvl w:val="1"/>
+          <w:numId w:val="110"/>
+        </w:numPr>
+        <w:spacing w:after="0" w:line="240" w:lineRule="auto"/>
+      </w:pPr>
+      <w:r>
+        <w:t xml:space="preserve">Internet of Things </w:t>
+      </w:r>
+    </w:p>
+    <w:p>
+      <w:pPr>
+        <w:numPr>
+          <w:ilvl w:val="1"/>
+          <w:numId w:val="110"/>
+        </w:numPr>
+        <w:spacing w:after="0" w:line="240" w:lineRule="auto"/>
+      </w:pPr>
+      <w:r>
+        <w:t xml:space="preserve">robotics </w:t>
+      </w:r>
+    </w:p>
+    <w:p>
+      <w:pPr>
+        <w:numPr>
+          <w:ilvl w:val="1"/>
+          <w:numId w:val="110"/>
+        </w:numPr>
+        <w:spacing w:after="0" w:line="240" w:lineRule="auto"/>
+      </w:pPr>
+      <w:r>
+        <w:t xml:space="preserve">cloud computing </w:t>
+      </w:r>
+    </w:p>
+    <w:p>
+      <w:pPr>
+        <w:numPr>
+          <w:ilvl w:val="1"/>
+          <w:numId w:val="110"/>
+        </w:numPr>
+        <w:spacing w:after="0" w:line="240" w:lineRule="auto"/>
+      </w:pPr>
+      <w:r>
+        <w:t xml:space="preserve">cybersecurity </w:t>
+      </w:r>
+    </w:p>
+    <w:p>
+      <w:pPr>
+        <w:numPr>
+          <w:ilvl w:val="1"/>
+          <w:numId w:val="110"/>
+        </w:numPr>
+        <w:spacing w:after="0" w:line="240" w:lineRule="auto"/>
+      </w:pPr>
+      <w:r>
+        <w:t xml:space="preserve">blockchain </w:t>
+      </w:r>
+    </w:p>
+    <w:p>
+      <w:pPr>
+        <w:numPr>
+          <w:ilvl w:val="1"/>
+          <w:numId w:val="110"/>
+        </w:numPr>
+        <w:spacing w:after="0" w:line="240" w:lineRule="auto"/>
+      </w:pPr>
+      <w:r>
+        <w:t xml:space="preserve">3D printing </w:t>
+      </w:r>
+    </w:p>
+    <w:p>
+      <w:pPr>
+        <w:numPr>
+          <w:ilvl w:val="1"/>
+          <w:numId w:val="110"/>
+        </w:numPr>
+        <w:spacing w:after="0" w:line="240" w:lineRule="auto"/>
+      </w:pPr>
+      <w:r>
+        <w:t xml:space="preserve">biotechnology </w:t>
+      </w:r>
+    </w:p>
+    <w:p>
+      <w:pPr>
+        <w:numPr>
+          <w:ilvl w:val="1"/>
+          <w:numId w:val="110"/>
+        </w:numPr>
+        <w:spacing w:after="0" w:line="240" w:lineRule="auto"/>
+      </w:pPr>
+      <w:r>
+        <w:t xml:space="preserve">nanotechnology </w:t>
+      </w:r>
+    </w:p>
+    <w:p>
+      <w:pPr>
+        <w:numPr>
+          <w:ilvl w:val="1"/>
+          <w:numId w:val="110"/>
+        </w:numPr>
+        <w:spacing w:after="0" w:line="240" w:lineRule="auto"/>
+      </w:pPr>
+      <w:r>
+        <w:t xml:space="preserve">smart factories and autonomous systems </w:t>
+      </w:r>
+    </w:p>
+    <w:p>
+      <w:pPr>
+        <w:numPr>
+          <w:ilvl w:val="0"/>
+          <w:numId w:val="110"/>
+        </w:numPr>
+        <w:spacing w:after="0" w:line="240" w:lineRule="auto"/>
+      </w:pPr>
+      <w:r>
+        <w:t xml:space="preserve">A comparison of the four Industrial Revolutions, showing their main technologies, energy sources, economic effects, social changes, and global impact. </w:t>
+      </w:r>
+    </w:p>
+    <w:p>
+      <w:pPr>
+        <w:numPr>
+          <w:ilvl w:val="0"/>
+          <w:numId w:val="110"/>
+        </w:numPr>
+        <w:spacing w:after="0" w:line="240" w:lineRule="auto"/>
+      </w:pPr>
+      <w:r>
+        <w:t xml:space="preserve">Real-world examples showing how each revolution changed people’s daily lives, work, education, industry, transport, healthcare, communication, and science. </w:t>
+      </w:r>
+    </w:p>
+    <w:p>
+      <w:pPr>
+        <w:numPr>
+          <w:ilvl w:val="0"/>
+          <w:numId w:val="110"/>
+        </w:numPr>
+        <w:spacing w:after="0" w:line="240" w:lineRule="auto"/>
+      </w:pPr>
+      <w:r>
+        <w:t xml:space="preserve">A discussion of the benefits, risks, challenges, and ethical questions connected with industrial revolutions, especially the Fourth Industrial Revolution. </w:t>
+      </w:r>
+    </w:p>
+    <w:p>
+      <w:pPr>
+        <w:numPr>
+          <w:ilvl w:val="0"/>
+          <w:numId w:val="110"/>
+        </w:numPr>
+        <w:spacing w:after="0" w:line="240" w:lineRule="auto"/>
+      </w:pPr>
+      <w:r>
+        <w:t xml:space="preserve">Relevant images, diagrams, charts, timelines, and tables wherever they help explain the topic more clearly. </w:t>
+      </w:r>
+    </w:p>
+    <w:p>
+      <w:pPr>
+        <w:numPr>
+          <w:ilvl w:val="0"/>
+          <w:numId w:val="110"/>
+        </w:numPr>
+        <w:spacing w:after="0" w:line="240" w:lineRule="auto"/>
+      </w:pPr>
+      <w:r>
+        <w:t xml:space="preserve">Captions for all images and visuals. </w:t>
+      </w:r>
+    </w:p>
+    <w:p>
+      <w:pPr>
+        <w:numPr>
+          <w:ilvl w:val="0"/>
+          <w:numId w:val="110"/>
+        </w:numPr>
+        <w:spacing w:after="0" w:line="240" w:lineRule="auto"/>
+      </w:pPr>
+      <w:r>
+        <w:t xml:space="preserve">A final </w:t>
+      </w:r>
+      <w:r>
+        <w:rPr>
+          <w:b/>
+          <w:bCs/>
+        </w:rPr>
+        <w:t>References</w:t>
+      </w:r>
+      <w:r>
+        <w:t xml:space="preserve"> section listing all sources used to prepare the document. </w:t>
+      </w:r>
+    </w:p>
+    <w:p>
+      <w:pPr>
+        <w:spacing w:after="0" w:line="240" w:lineRule="auto"/>
+        <w:ind w:left="360"/>
+      </w:pPr>
+      <w:r>
+        <w:t>The references should include books, articles, reports, websites, images, videos, and other resources used during preparation. Online references should include the title, author or organization where available, publication date where available, and URL.</w:t>
+      </w:r>
+    </w:p>
+    <w:p>
+      <w:pPr>
+        <w:spacing w:after="0" w:line="240" w:lineRule="auto"/>
+        <w:ind w:left="360"/>
+      </w:pPr>
+      <w:r>
+        <w:t>The final Word document should be well-structured, professionally formatted, visually clear, easy to read, and suitable for educational or informational use.</w:t>
+      </w:r>
+    </w:p>
+    <w:p>
+      <w:pPr>
+        <w:spacing w:after="0" w:line="240" w:lineRule="auto"/>
+        <w:ind w:left="360"/>
+        <w:rPr>
+          <w:lang w:val="az-Latn-AZ"/>
+        </w:rPr>
+      </w:pPr>
+    </w:p>
+    <w:p>
+      <w:pPr>
+        <w:pBdr>
+          <w:bottom w:val="single" w:sz="6" w:space="1" w:color="auto"/>
+        </w:pBdr>
+        <w:spacing w:after="0" w:line="240" w:lineRule="auto"/>
+        <w:ind w:left="360"/>
+        <w:rPr>
+          <w:lang w:val="az-Latn-AZ"/>
+        </w:rPr>
+      </w:pPr>
+    </w:p>
+    <w:p>
+      <w:pPr>
+        <w:spacing w:after="0" w:line="240" w:lineRule="auto"/>
+        <w:ind w:left="360"/>
+        <w:rPr>
+          <w:lang w:val="az-Latn-AZ"/>
+        </w:rPr>
+      </w:pPr>
+    </w:p>
+    <w:p>
+      <w:pPr>
+        <w:spacing w:after="0" w:line="240" w:lineRule="auto"/>
+        <w:ind w:left="360"/>
+      </w:pPr>
+      <w:r>
+        <w:t xml:space="preserve">EN: </w:t>
+      </w:r>
+      <w:r>
+        <w:t>A</w:t>
+      </w:r>
+      <w:r>
+        <w:t xml:space="preserve">dd </w:t>
+      </w:r>
+      <w:r>
+        <w:t>this article</w:t>
+      </w:r>
+      <w:r>
+        <w:t xml:space="preserve"> </w:t>
+      </w:r>
+      <w:r>
+        <w:t>to the right panel and locate it on the top</w:t>
+      </w:r>
+      <w:r>
+        <w:t>:</w:t>
+      </w:r>
+    </w:p>
+    <w:p>
+      <w:pPr>
+        <w:spacing w:after="0" w:line="240" w:lineRule="auto"/>
+        <w:ind w:left="360"/>
+      </w:pPr>
+      <w:r>
+        <w:t>"Born in Miyana, Vahid Garuslu writes from personal experience as much as from analysis. Raised with Mugham, the qarmon, and the Lezginka, and shaped by roots in northern Azerbaijan and formative years in the south, he sees Azerbaijan as one people whose lived identity is both shared and split. Although his career is in IT and software engineering, he has turned that curiosity toward his homeland and toward a central question: how one people can carry more than one identity at once.</w:t>
+      </w:r>
+    </w:p>
+    <w:p>
+      <w:pPr>
+        <w:spacing w:after="0" w:line="240" w:lineRule="auto"/>
+        <w:ind w:left="360"/>
+      </w:pPr>
+    </w:p>
+    <w:p>
+      <w:pPr>
+        <w:spacing w:after="0" w:line="240" w:lineRule="auto"/>
+        <w:ind w:left="360"/>
+      </w:pPr>
+      <w:r>
+        <w:t xml:space="preserve">The book traces how Azerbaijanis north and south of the Araz River, separated for more than two centuries by different states, education, language policy, and geopolitics, have developed distinct but still connected identities. It goes beyond simple north–south narratives by treating identity as a dynamic spectrum—especially in South Azerbaijan—shaped by institutions, pressure, assimilation, drift, cultural persistence, and reawakening. Drawing on long observation and structured analysis, and placing the Azerbaijani case alongside other divided </w:t>
+      </w:r>
+      <w:r>
+        <w:lastRenderedPageBreak/>
+        <w:t xml:space="preserve">societies, Garuslu argues that separation can slowly reshape how people see themselves, even as language, music, memory, and everyday culture keep deeper ties alive across generations." </w:t>
+      </w:r>
+    </w:p>
+    <w:p>
+      <w:pPr>
+        <w:spacing w:after="0" w:line="240" w:lineRule="auto"/>
+        <w:ind w:left="360"/>
+      </w:pPr>
+      <w:r>
+        <w:t xml:space="preserve">The book is available on </w:t>
+      </w:r>
+      <w:r>
+        <w:t xml:space="preserve">Amazon platform: </w:t>
+      </w:r>
+      <w:hyperlink r:id="rId5" w:history="1">
+        <w:r>
+          <w:rPr>
+            <w:rStyle w:val="Hyperlink"/>
+          </w:rPr>
+          <w:t>Azerbaijan, North and South: One People, Two Centuries of Separation, Shaped by Two Systems, Partial Assimilation, and Identity Spectrums (Azerbaijan: Pragmatic Analysis): Amazon.co.uk: Gəruslu, Vəhid: 9798195362652: Books</w:t>
+        </w:r>
+      </w:hyperlink>
+    </w:p>
+    <w:p>
+      <w:pPr>
+        <w:spacing w:after="0" w:line="240" w:lineRule="auto"/>
+        <w:ind w:left="360"/>
+      </w:pPr>
+    </w:p>
+    <w:p>
+      <w:pPr>
+        <w:spacing w:after="0" w:line="240" w:lineRule="auto"/>
+        <w:ind w:left="360"/>
+      </w:pPr>
+      <w:r>
+        <w:t xml:space="preserve">AZ: Add this text </w:t>
+      </w:r>
+      <w:r>
+        <w:t>A</w:t>
+      </w:r>
+      <w:r>
+        <w:t xml:space="preserve">dd </w:t>
+      </w:r>
+      <w:r>
+        <w:t>this article</w:t>
+      </w:r>
+      <w:r>
+        <w:t xml:space="preserve"> to the right panel and locate it on the top</w:t>
+      </w:r>
+      <w:r>
+        <w:t>:</w:t>
+      </w:r>
+    </w:p>
+    <w:p>
+      <w:pPr>
+        <w:spacing w:after="0" w:line="240" w:lineRule="auto"/>
+        <w:ind w:left="360"/>
+      </w:pPr>
+      <w:r>
+        <w:t>“</w:t>
+      </w:r>
+      <w:r>
+        <w:t>Miyanada anadan olmuş Vəhid Gərüslu bu əsərdə həm şəxsi həyat təcrübəsinə, həm də analitik müşahidələrinə əsaslanır. Muğam, qarmon və ləzginka mühitində böyümüş, Azərbaycanın şimalındakı kökləri və cənubda keçən formalaşma illəri ilə yoğrulmuş müəllif Azərbaycanı ortaq, lakin eyni zamanda parçalanmış tarixi kimliyə malik vahid bir xalq kimi görür. Peşəkar fəaliyyəti informasiya texnologiyaları və proqram mühəndisliyi sahəsi ilə bağlı olsa da, o, bu araşdırma marağını doğma Vətəninə və əsas bir suala yönəldir: bir xalq eyni zamanda birdən çox kimliyi necə daşıya bilər?</w:t>
+      </w:r>
+    </w:p>
+    <w:p>
+      <w:pPr>
+        <w:spacing w:after="0" w:line="240" w:lineRule="auto"/>
+        <w:ind w:left="360"/>
+      </w:pPr>
+      <w:r>
+        <w:t>Kitab Araz çayının şimalında və cənubunda yaşayan azərbaycanlıların iki əsrdən artıq müddətdə müxtəlif dövlətlər, təhsil sistemləri, dil siyasətləri və geosiyasi reallıqlar şəraitində necə fərqli, lakin hələ də bir-biri ilə bağlı kimliklər formalaşdırdığını araşdırır. Əsər sadə şimal–cənub müqayisəsindən kənara çıxaraq kimliyi dinamik bir spektr kimi təqdim edir. Bu yanaşma xüsusilə Cənubi Azərbaycan kontekstində institutların, siyasi və mədəni təzyiqlərin, assimilyasiya proseslərinin, tədrici uzaqlaşmanın, mədəni davamlılığın və milli oyanışın kimlik üzərində təsirini izah edir.</w:t>
+      </w:r>
+    </w:p>
+    <w:p>
+      <w:pPr>
+        <w:spacing w:after="0" w:line="240" w:lineRule="auto"/>
+        <w:ind w:left="360"/>
+      </w:pPr>
+      <w:r>
+        <w:t>Uzunmüddətli müşahidələrə və sistemli təhlilə əsaslanan, həmçinin Azərbaycan məsələsini digər bölünmüş cəmiyyətlərin təcrübəsi ilə müqayisəli şəkildə dəyərləndirən Vəhid Gərüslu göstərir ki, uzunmüddətli ayrılıq insanların özlərini necə dərk etməsinə tədricən təsir göstərə bilər. Bununla belə, dil, musiqi, tarixi yaddaş və gündəlik mədəni həyat nəsillər boyunca daha dərin bağları yaşatmaqda davam edir.</w:t>
+      </w:r>
+      <w:r>
+        <w:t xml:space="preserve"> “ in the relevant section of AZ version.</w:t>
+      </w:r>
+    </w:p>
+    <w:p>
+      <w:pPr>
+        <w:spacing w:after="0" w:line="240" w:lineRule="auto"/>
+        <w:ind w:left="360"/>
+      </w:pPr>
+      <w:r>
+        <w:t xml:space="preserve">Kitabı Amazon platformasından əldə edə bilərsiniz: </w:t>
+      </w:r>
+      <w:hyperlink r:id="rId6" w:history="1">
+        <w:r>
+          <w:rPr>
+            <w:rStyle w:val="Hyperlink"/>
+          </w:rPr>
+          <w:t>Azerbaijan, North and South: One People, Two Centuries of Separation, Shaped by Two Systems, Parti</w:t>
+        </w:r>
+        <w:r>
+          <w:rPr>
+            <w:rStyle w:val="Hyperlink"/>
+          </w:rPr>
+          <w:t>a</w:t>
+        </w:r>
+        <w:r>
+          <w:rPr>
+            <w:rStyle w:val="Hyperlink"/>
+          </w:rPr>
+          <w:t>l Assimilation, and Identity Spectrums (Azerbaijan: Pragmatic Analysis): Amazon.co.uk: Gəruslu, Vəhid: 9798195362652: Books</w:t>
+        </w:r>
+      </w:hyperlink>
+    </w:p>
+    <w:p>
+      <w:pPr>
+        <w:spacing w:after="0" w:line="240" w:lineRule="auto"/>
+        <w:ind w:left="360"/>
+        <w:rPr>
+          <w:lang w:val="az-Latn-AZ"/>
+        </w:rPr>
+      </w:pPr>
+    </w:p>
+    <w:p>
+      <w:pPr>
+        <w:spacing w:after="0" w:line="240" w:lineRule="auto"/>
+        <w:ind w:left="360"/>
+      </w:pPr>
+    </w:p>
+    <w:p>
+      <w:pPr>
+        <w:spacing w:after="0" w:line="240" w:lineRule="auto"/>
+        <w:ind w:left="360"/>
+        <w:rPr>
+          <w:lang w:val="az-Latn-AZ"/>
+        </w:rPr>
+      </w:pPr>
+      <w:r>
+        <w:t>The header of this section will be “</w:t>
+      </w:r>
+      <w:r>
+        <w:rPr>
+          <w:b/>
+          <w:bCs/>
+        </w:rPr>
+        <w:t xml:space="preserve">DAAB üzvü </w:t>
+      </w:r>
+      <w:r>
+        <w:t xml:space="preserve"> “</w:t>
+      </w:r>
+      <w:r>
+        <w:rPr>
+          <w:b/>
+          <w:bCs/>
+        </w:rPr>
+        <w:t>Az</w:t>
+      </w:r>
+      <w:r>
+        <w:rPr>
+          <w:b/>
+          <w:bCs/>
+        </w:rPr>
+        <w:t>ə</w:t>
+      </w:r>
+      <w:r>
+        <w:rPr>
+          <w:b/>
+          <w:bCs/>
+        </w:rPr>
+        <w:t>rba</w:t>
+      </w:r>
+      <w:r>
+        <w:rPr>
+          <w:b/>
+          <w:bCs/>
+        </w:rPr>
+        <w:t>yc</w:t>
+      </w:r>
+      <w:r>
+        <w:rPr>
+          <w:b/>
+          <w:bCs/>
+        </w:rPr>
+        <w:t>an</w:t>
+      </w:r>
+      <w:r>
+        <w:rPr>
+          <w:b/>
+          <w:bCs/>
+        </w:rPr>
+        <w:t>,</w:t>
+      </w:r>
+      <w:r>
+        <w:rPr>
+          <w:b/>
+          <w:bCs/>
+        </w:rPr>
+        <w:t xml:space="preserve"> </w:t>
+      </w:r>
+      <w:r>
+        <w:rPr>
+          <w:b/>
+          <w:bCs/>
+        </w:rPr>
+        <w:t>Guzey və Güney</w:t>
+      </w:r>
+      <w:r>
+        <w:t xml:space="preserve">” </w:t>
+      </w:r>
+      <w:r>
+        <w:rPr>
+          <w:b/>
+          <w:bCs/>
+        </w:rPr>
+        <w:t xml:space="preserve"> adlı kitab nəşr etdirmişdir</w:t>
+      </w:r>
+      <w:r>
+        <w:t xml:space="preserve">”.  </w:t>
+      </w:r>
+    </w:p>
+    <w:p>
+      <w:pPr>
+        <w:spacing w:after="0" w:line="240" w:lineRule="auto"/>
+        <w:ind w:left="360"/>
+        <w:rPr>
+          <w:lang w:val="az-Latn-AZ"/>
+        </w:rPr>
+      </w:pPr>
+    </w:p>
+    <w:p>
+      <w:pPr>
+        <w:spacing w:after="0" w:line="240" w:lineRule="auto"/>
+        <w:ind w:left="360"/>
+      </w:pPr>
+      <w:r>
+        <w:t xml:space="preserve">Add a corresponding link on the left side panel. </w:t>
+      </w:r>
+    </w:p>
+    <w:p>
+      <w:pPr>
+        <w:pBdr>
+          <w:bottom w:val="single" w:sz="6" w:space="1" w:color="auto"/>
+        </w:pBdr>
+        <w:spacing w:after="0" w:line="240" w:lineRule="auto"/>
+        <w:ind w:left="360"/>
+      </w:pPr>
+    </w:p>
+    <w:p>
+      <w:pPr>
+        <w:spacing w:after="0" w:line="240" w:lineRule="auto"/>
+        <w:ind w:left="360"/>
+        <w:rPr>
+          <w:lang w:val="az-Latn-AZ"/>
+        </w:rPr>
+      </w:pPr>
+    </w:p>
+    <w:p>
+      <w:pPr>
+        <w:spacing w:after="0" w:line="240" w:lineRule="auto"/>
+        <w:ind w:left="360"/>
+      </w:pPr>
+      <w:r>
+        <w:rPr>
+          <w:lang w:val="az-Latn-AZ"/>
+        </w:rPr>
+        <w:t xml:space="preserve">Add a new submenu item under the 2024 </w:t>
+      </w:r>
+      <w:r>
+        <w:rPr>
+          <w:lang w:val="az-Latn-AZ"/>
+        </w:rPr>
+        <w:t xml:space="preserve">submenu </w:t>
+      </w:r>
+      <w:r>
+        <w:rPr>
+          <w:lang w:val="az-Latn-AZ"/>
+        </w:rPr>
+        <w:t xml:space="preserve">within the Overview group. Place it under “Progamme” / “Proqram” and name it “Sessions” </w:t>
+      </w:r>
+      <w:r>
+        <w:t>in</w:t>
+      </w:r>
+      <w:r>
+        <w:rPr>
+          <w:lang w:val="el-GR"/>
+        </w:rPr>
+        <w:t xml:space="preserve"> ΕΝ </w:t>
+      </w:r>
+      <w:r>
+        <w:t xml:space="preserve">and </w:t>
+      </w:r>
+      <w:r>
+        <w:rPr>
+          <w:lang w:val="az-Latn-AZ"/>
+        </w:rPr>
+        <w:t xml:space="preserve"> “Sessiyalar” in A</w:t>
+      </w:r>
+      <w:r>
+        <w:rPr>
+          <w:lang w:val="el-GR"/>
+        </w:rPr>
+        <w:t>Ζ</w:t>
+      </w:r>
+    </w:p>
+    <w:p>
+      <w:pPr>
+        <w:spacing w:after="0" w:line="240" w:lineRule="auto"/>
+        <w:ind w:left="360"/>
+      </w:pPr>
+    </w:p>
+    <w:p>
+      <w:pPr>
+        <w:spacing w:after="0" w:line="240" w:lineRule="auto"/>
+        <w:ind w:left="360"/>
+      </w:pPr>
+      <w:r>
+        <w:t xml:space="preserve">Forumun 10 sentyabr proqramında səhər QARIŞIQ, nahardan sonra isə İXTİSAS qrupları üzrə beyin fırtınası </w:t>
+      </w:r>
+      <w:r>
+        <w:t xml:space="preserve">prinsipi əsasında təşkil edilmiş </w:t>
+      </w:r>
+      <w:r>
+        <w:t>sessiyalar</w:t>
+      </w:r>
+      <w:r>
+        <w:t xml:space="preserve"> haqqında ətraflı məlumat verilir</w:t>
+      </w:r>
+      <w:r>
+        <w:t>, masa</w:t>
+      </w:r>
+      <w:r>
+        <w:t>lar ətrafında</w:t>
+      </w:r>
+      <w:r>
+        <w:t xml:space="preserve"> iştirakçıları</w:t>
+      </w:r>
+      <w:r>
+        <w:t>n yerləşdirilməsi və moderatırların vəzifələri ilə bağlı informasiya paylaşılır</w:t>
+      </w:r>
+      <w:r>
+        <w:t>.</w:t>
+      </w:r>
+    </w:p>
+    <w:p>
+      <w:pPr>
+        <w:pBdr>
+          <w:bottom w:val="single" w:sz="6" w:space="1" w:color="auto"/>
+        </w:pBdr>
+        <w:spacing w:after="0" w:line="240" w:lineRule="auto"/>
+        <w:ind w:left="360"/>
+      </w:pPr>
+    </w:p>
+    <w:p>
+      <w:pPr>
+        <w:spacing w:after="0" w:line="240" w:lineRule="auto"/>
+        <w:ind w:left="360"/>
+      </w:pPr>
+    </w:p>
+    <w:p>
+      <w:pPr>
+        <w:spacing w:after="0" w:line="240" w:lineRule="auto"/>
+        <w:ind w:left="360"/>
+        <w:rPr>
+          <w:highlight w:val="yellow"/>
+        </w:rPr>
+      </w:pPr>
+      <w:r>
+        <w:rPr>
+          <w:highlight w:val="yellow"/>
+        </w:rPr>
+        <w:lastRenderedPageBreak/>
+        <w:t>You, Cursor, are responsible for generating the project’s code, including HTML, CSS, JavaScript, and all related project artefacts. Therefore, many of the issues that later appear in the project may also be introduced during code generation.</w:t>
+      </w:r>
+    </w:p>
+    <w:p>
+      <w:pPr>
+        <w:spacing w:after="0" w:line="240" w:lineRule="auto"/>
+        <w:ind w:left="360"/>
+        <w:rPr>
+          <w:highlight w:val="yellow"/>
+        </w:rPr>
+      </w:pPr>
+      <w:r>
+        <w:rPr>
+          <w:highlight w:val="yellow"/>
+        </w:rPr>
+        <w:t>Please be more careful, thoughtful, and systematic when generating or modifying project files. The goal should not be to create code quickly and then fix the problems afterward, but to produce clean, reliable, and well-tested code from the beginning.</w:t>
+      </w:r>
+    </w:p>
+    <w:p>
+      <w:pPr>
+        <w:spacing w:after="0" w:line="240" w:lineRule="auto"/>
+        <w:ind w:left="360"/>
+        <w:rPr>
+          <w:highlight w:val="yellow"/>
+        </w:rPr>
+      </w:pPr>
+      <w:r>
+        <w:rPr>
+          <w:highlight w:val="yellow"/>
+        </w:rPr>
+        <w:t>Going forward, please ensure that:</w:t>
+      </w:r>
+    </w:p>
+    <w:p>
+      <w:pPr>
+        <w:numPr>
+          <w:ilvl w:val="0"/>
+          <w:numId w:val="111"/>
+        </w:numPr>
+        <w:spacing w:after="0" w:line="240" w:lineRule="auto"/>
+        <w:rPr>
+          <w:highlight w:val="yellow"/>
+        </w:rPr>
+      </w:pPr>
+      <w:r>
+        <w:rPr>
+          <w:highlight w:val="yellow"/>
+        </w:rPr>
+        <w:t xml:space="preserve">every change is made carefully and only where necessary; </w:t>
+      </w:r>
+    </w:p>
+    <w:p>
+      <w:pPr>
+        <w:numPr>
+          <w:ilvl w:val="0"/>
+          <w:numId w:val="111"/>
+        </w:numPr>
+        <w:spacing w:after="0" w:line="240" w:lineRule="auto"/>
+        <w:rPr>
+          <w:highlight w:val="yellow"/>
+        </w:rPr>
+      </w:pPr>
+      <w:r>
+        <w:rPr>
+          <w:highlight w:val="yellow"/>
+        </w:rPr>
+        <w:t xml:space="preserve">existing functionality is not broken while implementing new features; </w:t>
+      </w:r>
+    </w:p>
+    <w:p>
+      <w:pPr>
+        <w:numPr>
+          <w:ilvl w:val="0"/>
+          <w:numId w:val="111"/>
+        </w:numPr>
+        <w:spacing w:after="0" w:line="240" w:lineRule="auto"/>
+        <w:rPr>
+          <w:highlight w:val="yellow"/>
+        </w:rPr>
+      </w:pPr>
+      <w:r>
+        <w:rPr>
+          <w:highlight w:val="yellow"/>
+        </w:rPr>
+        <w:t xml:space="preserve">HTML structure remains valid and semantic; </w:t>
+      </w:r>
+    </w:p>
+    <w:p>
+      <w:pPr>
+        <w:numPr>
+          <w:ilvl w:val="0"/>
+          <w:numId w:val="111"/>
+        </w:numPr>
+        <w:spacing w:after="0" w:line="240" w:lineRule="auto"/>
+        <w:rPr>
+          <w:highlight w:val="yellow"/>
+        </w:rPr>
+      </w:pPr>
+      <w:r>
+        <w:rPr>
+          <w:highlight w:val="yellow"/>
+        </w:rPr>
+        <w:t xml:space="preserve">CSS changes do not unintentionally affect unrelated pages or components; </w:t>
+      </w:r>
+    </w:p>
+    <w:p>
+      <w:pPr>
+        <w:numPr>
+          <w:ilvl w:val="0"/>
+          <w:numId w:val="111"/>
+        </w:numPr>
+        <w:spacing w:after="0" w:line="240" w:lineRule="auto"/>
+        <w:rPr>
+          <w:highlight w:val="yellow"/>
+        </w:rPr>
+      </w:pPr>
+      <w:r>
+        <w:rPr>
+          <w:highlight w:val="yellow"/>
+        </w:rPr>
+        <w:t xml:space="preserve">JavaScript is written defensively and does not introduce conflicts; </w:t>
+      </w:r>
+    </w:p>
+    <w:p>
+      <w:pPr>
+        <w:numPr>
+          <w:ilvl w:val="0"/>
+          <w:numId w:val="111"/>
+        </w:numPr>
+        <w:spacing w:after="0" w:line="240" w:lineRule="auto"/>
+        <w:rPr>
+          <w:highlight w:val="yellow"/>
+        </w:rPr>
+      </w:pPr>
+      <w:r>
+        <w:rPr>
+          <w:highlight w:val="yellow"/>
+        </w:rPr>
+        <w:t xml:space="preserve">responsive behavior is checked for desktop, tablet, and mobile views; </w:t>
+      </w:r>
+    </w:p>
+    <w:p>
+      <w:pPr>
+        <w:numPr>
+          <w:ilvl w:val="0"/>
+          <w:numId w:val="111"/>
+        </w:numPr>
+        <w:spacing w:after="0" w:line="240" w:lineRule="auto"/>
+        <w:rPr>
+          <w:highlight w:val="yellow"/>
+        </w:rPr>
+      </w:pPr>
+      <w:r>
+        <w:rPr>
+          <w:highlight w:val="yellow"/>
+        </w:rPr>
+        <w:t xml:space="preserve">navigation, dropdowns, sticky panels, anchors, language switches, and internal links continue to work correctly; </w:t>
+      </w:r>
+    </w:p>
+    <w:p>
+      <w:pPr>
+        <w:numPr>
+          <w:ilvl w:val="0"/>
+          <w:numId w:val="111"/>
+        </w:numPr>
+        <w:spacing w:after="0" w:line="240" w:lineRule="auto"/>
+        <w:rPr>
+          <w:highlight w:val="yellow"/>
+        </w:rPr>
+      </w:pPr>
+      <w:r>
+        <w:rPr>
+          <w:highlight w:val="yellow"/>
+        </w:rPr>
+        <w:t xml:space="preserve">changes are consistent with the project’s existing DAAB UI/UX standards; </w:t>
+      </w:r>
+    </w:p>
+    <w:p>
+      <w:pPr>
+        <w:numPr>
+          <w:ilvl w:val="0"/>
+          <w:numId w:val="111"/>
+        </w:numPr>
+        <w:spacing w:after="0" w:line="240" w:lineRule="auto"/>
+        <w:rPr>
+          <w:highlight w:val="yellow"/>
+        </w:rPr>
+      </w:pPr>
+      <w:r>
+        <w:rPr>
+          <w:highlight w:val="yellow"/>
+        </w:rPr>
+        <w:t xml:space="preserve">duplicated, unused, or conflicting code is avoided; </w:t>
+      </w:r>
+    </w:p>
+    <w:p>
+      <w:pPr>
+        <w:numPr>
+          <w:ilvl w:val="0"/>
+          <w:numId w:val="111"/>
+        </w:numPr>
+        <w:spacing w:after="0" w:line="240" w:lineRule="auto"/>
+        <w:rPr>
+          <w:highlight w:val="yellow"/>
+        </w:rPr>
+      </w:pPr>
+      <w:r>
+        <w:rPr>
+          <w:highlight w:val="yellow"/>
+        </w:rPr>
+        <w:t xml:space="preserve">all affected pages are reviewed after each modification. </w:t>
+      </w:r>
+    </w:p>
+    <w:p>
+      <w:pPr>
+        <w:spacing w:after="0" w:line="240" w:lineRule="auto"/>
+        <w:ind w:left="360"/>
+        <w:rPr>
+          <w:highlight w:val="yellow"/>
+        </w:rPr>
+      </w:pPr>
+      <w:r>
+        <w:rPr>
+          <w:highlight w:val="yellow"/>
+        </w:rPr>
+        <w:t>Please adopt a more disciplined development approach: analyze the existing structure first, understand dependencies, make minimal and precise changes, and verify the result before considering the task complete.</w:t>
+      </w:r>
+    </w:p>
+    <w:p>
+      <w:pPr>
+        <w:spacing w:after="0" w:line="240" w:lineRule="auto"/>
+        <w:ind w:left="360"/>
+      </w:pPr>
+      <w:r>
+        <w:rPr>
+          <w:highlight w:val="yellow"/>
+        </w:rPr>
+        <w:t>In short, program carefully and responsibly so that new issues are not introduced while solving existing ones.</w:t>
+      </w:r>
+    </w:p>
+    <w:p>
+      <w:pPr>
+        <w:pBdr>
+          <w:bottom w:val="single" w:sz="6" w:space="1" w:color="auto"/>
+        </w:pBdr>
+        <w:spacing w:after="0" w:line="240" w:lineRule="auto"/>
+        <w:ind w:left="360"/>
+      </w:pPr>
+    </w:p>
+    <w:p>
+      <w:pPr>
+        <w:spacing w:after="0" w:line="240" w:lineRule="auto"/>
+        <w:ind w:left="360"/>
+      </w:pPr>
+    </w:p>
+    <w:p>
+      <w:pPr>
+        <w:spacing w:after="0" w:line="240" w:lineRule="auto"/>
+        <w:ind w:left="360"/>
+      </w:pPr>
+      <w:r>
+        <w:t>I would like to create a new web project dedicated to collecting and presenting the most influential scientific discoveries, inventions, innovations, and other valuable knowledge from different fields of human activity throughout history — from ancient times to the present day.</w:t>
+      </w:r>
+    </w:p>
+    <w:p>
+      <w:pPr>
+        <w:spacing w:after="0" w:line="240" w:lineRule="auto"/>
+        <w:ind w:left="360"/>
+      </w:pPr>
+      <w:r>
+        <w:t>The main goal of this project is to make this information available to users in a very simple, accessible, well-structured, and easy-to-understand way. The website should serve as a knowledge platform where visitors can explore important achievements of human civilization across science, technology, medicine, engineering, culture, education, and other areas.</w:t>
+      </w:r>
+    </w:p>
+    <w:p>
+      <w:pPr>
+        <w:spacing w:after="0" w:line="240" w:lineRule="auto"/>
+        <w:ind w:left="360"/>
+      </w:pPr>
+      <w:r>
+        <w:t xml:space="preserve">I intend to name the new website </w:t>
+      </w:r>
+      <w:r>
+        <w:rPr>
+          <w:b/>
+          <w:bCs/>
+        </w:rPr>
+        <w:t>“Bilik xəzinəsi”</w:t>
+      </w:r>
+      <w:r>
+        <w:t xml:space="preserve"> in Azerbaijani and </w:t>
+      </w:r>
+      <w:r>
+        <w:rPr>
+          <w:b/>
+          <w:bCs/>
+        </w:rPr>
+        <w:t>“Knowledge Treasury”</w:t>
+      </w:r>
+      <w:r>
+        <w:t xml:space="preserve"> in English.</w:t>
+      </w:r>
+    </w:p>
+    <w:p>
+      <w:pPr>
+        <w:spacing w:after="0" w:line="240" w:lineRule="auto"/>
+        <w:ind w:left="360"/>
+      </w:pPr>
+      <w:r>
+        <w:t xml:space="preserve">To avoid starting the project from scratch, please first identify and move the existing artefacts related to the </w:t>
+      </w:r>
+      <w:r>
+        <w:rPr>
+          <w:b/>
+          <w:bCs/>
+        </w:rPr>
+        <w:t>Treasury</w:t>
+      </w:r>
+      <w:r>
+        <w:t xml:space="preserve"> functionality that we previously created within the DAAB website. Use these materials as the initial foundation for the new independent project.</w:t>
+      </w:r>
+    </w:p>
+    <w:p>
+      <w:pPr>
+        <w:spacing w:after="0" w:line="240" w:lineRule="auto"/>
+        <w:ind w:left="360"/>
+      </w:pPr>
+      <w:r>
+        <w:t>Please create the homepage of the new website and add the existing Treasury-related data to it.</w:t>
+      </w:r>
+    </w:p>
+    <w:p>
+      <w:pPr>
+        <w:spacing w:after="0" w:line="240" w:lineRule="auto"/>
+        <w:ind w:left="360"/>
+      </w:pPr>
+      <w:r>
+        <w:t>Ensure that:</w:t>
+      </w:r>
+    </w:p>
+    <w:p>
+      <w:pPr>
+        <w:numPr>
+          <w:ilvl w:val="0"/>
+          <w:numId w:val="112"/>
+        </w:numPr>
+        <w:spacing w:after="0" w:line="240" w:lineRule="auto"/>
+      </w:pPr>
+      <w:r>
+        <w:t>the new project has its own clear structure, separate from the DAAB website;</w:t>
+      </w:r>
+    </w:p>
+    <w:p>
+      <w:pPr>
+        <w:numPr>
+          <w:ilvl w:val="0"/>
+          <w:numId w:val="112"/>
+        </w:numPr>
+        <w:spacing w:after="0" w:line="240" w:lineRule="auto"/>
+      </w:pPr>
+      <w:r>
+        <w:t xml:space="preserve">the homepage introduces the purpose and vision of </w:t>
+      </w:r>
+      <w:r>
+        <w:rPr>
+          <w:b/>
+          <w:bCs/>
+        </w:rPr>
+        <w:t>“Bilik xəzinəsi” / “Knowledge Treasury”</w:t>
+      </w:r>
+      <w:r>
+        <w:t>;</w:t>
+      </w:r>
+    </w:p>
+    <w:p>
+      <w:pPr>
+        <w:numPr>
+          <w:ilvl w:val="0"/>
+          <w:numId w:val="112"/>
+        </w:numPr>
+        <w:spacing w:after="0" w:line="240" w:lineRule="auto"/>
+      </w:pPr>
+      <w:r>
+        <w:t>the existing Treasury-related pages, data, cards, links, scripts, styles, and media files are moved or adapted carefully;</w:t>
+      </w:r>
+    </w:p>
+    <w:p>
+      <w:pPr>
+        <w:numPr>
+          <w:ilvl w:val="0"/>
+          <w:numId w:val="112"/>
+        </w:numPr>
+        <w:spacing w:after="0" w:line="240" w:lineRule="auto"/>
+      </w:pPr>
+      <w:r>
+        <w:t>unnecessary DAAB-specific references are removed unless they are still relevant;</w:t>
+      </w:r>
+    </w:p>
+    <w:p>
+      <w:pPr>
+        <w:numPr>
+          <w:ilvl w:val="0"/>
+          <w:numId w:val="112"/>
+        </w:numPr>
+        <w:spacing w:after="0" w:line="240" w:lineRule="auto"/>
+      </w:pPr>
+      <w:r>
+        <w:t>the design is modern, clean, responsive, and suitable for an educational knowledge platform;</w:t>
+      </w:r>
+    </w:p>
+    <w:p>
+      <w:pPr>
+        <w:numPr>
+          <w:ilvl w:val="0"/>
+          <w:numId w:val="112"/>
+        </w:numPr>
+        <w:spacing w:after="0" w:line="240" w:lineRule="auto"/>
+      </w:pPr>
+      <w:r>
+        <w:t>the content is organized into meaningful categories such as discoveries, inventions, innovations, scientists, historical periods, and fields of knowledge;</w:t>
+      </w:r>
+    </w:p>
+    <w:p>
+      <w:pPr>
+        <w:numPr>
+          <w:ilvl w:val="0"/>
+          <w:numId w:val="112"/>
+        </w:numPr>
+        <w:spacing w:after="0" w:line="240" w:lineRule="auto"/>
+      </w:pPr>
+      <w:r>
+        <w:t>both Azerbaijani and English versions are considered in the project structure;</w:t>
+      </w:r>
+    </w:p>
+    <w:p>
+      <w:pPr>
+        <w:numPr>
+          <w:ilvl w:val="0"/>
+          <w:numId w:val="112"/>
+        </w:numPr>
+        <w:spacing w:after="0" w:line="240" w:lineRule="auto"/>
+      </w:pPr>
+      <w:r>
+        <w:lastRenderedPageBreak/>
+        <w:t>all internal links, navigation items, language-switch links, images, and references work correctly;</w:t>
+      </w:r>
+    </w:p>
+    <w:p>
+      <w:pPr>
+        <w:numPr>
+          <w:ilvl w:val="0"/>
+          <w:numId w:val="112"/>
+        </w:numPr>
+        <w:spacing w:after="0" w:line="240" w:lineRule="auto"/>
+      </w:pPr>
+      <w:r>
+        <w:t>the code is clean, maintainable, and does not introduce broken links, layout issues, or duplicated/conflicting files.</w:t>
+      </w:r>
+    </w:p>
+    <w:p>
+      <w:pPr>
+        <w:spacing w:after="0" w:line="240" w:lineRule="auto"/>
+        <w:ind w:left="360"/>
+      </w:pPr>
+    </w:p>
+    <w:p>
+      <w:pPr>
+        <w:pBdr>
+          <w:bottom w:val="single" w:sz="6" w:space="1" w:color="auto"/>
+        </w:pBdr>
+        <w:spacing w:after="0" w:line="240" w:lineRule="auto"/>
+        <w:ind w:left="360"/>
+      </w:pPr>
+    </w:p>
+    <w:p>
+      <w:pPr>
+        <w:spacing w:after="0" w:line="240" w:lineRule="auto"/>
+        <w:ind w:left="360"/>
+      </w:pPr>
+    </w:p>
+    <w:p>
+      <w:pPr>
+        <w:spacing w:after="0" w:line="240" w:lineRule="auto"/>
+        <w:ind w:left="360"/>
+      </w:pPr>
+      <w:r>
+        <w:t xml:space="preserve">Right now you're probably deploying to Hostinger </w:t>
+      </w:r>
+      <w:r>
+        <w:rPr>
+          <w:b/>
+          <w:bCs/>
+        </w:rPr>
+        <w:t>manually</w:t>
+      </w:r>
+      <w:r>
+        <w:t xml:space="preserve"> — downloading files and uploading via hPanel File Manager or FTP. This works but gets tedious.</w:t>
+      </w:r>
+    </w:p>
+    <w:p>
+      <w:pPr>
+        <w:spacing w:after="0" w:line="240" w:lineRule="auto"/>
+        <w:ind w:left="360"/>
+      </w:pPr>
+      <w:r>
+        <w:t xml:space="preserve">The upgrade worth making is </w:t>
+      </w:r>
+      <w:r>
+        <w:rPr>
+          <w:b/>
+          <w:bCs/>
+        </w:rPr>
+        <w:t>automating the deployment</w:t>
+      </w:r>
+      <w:r>
+        <w:t xml:space="preserve"> so that every time you push to GitHub, Hostinger automatically pulls and publishes the latest version. This is done with </w:t>
+      </w:r>
+      <w:r>
+        <w:rPr>
+          <w:b/>
+          <w:bCs/>
+        </w:rPr>
+        <w:t>GitHub Actions</w:t>
+      </w:r>
+      <w:r>
+        <w:t xml:space="preserve"> — a free feature of GitHub.</w:t>
+      </w:r>
+    </w:p>
+    <w:p>
+      <w:pPr>
+        <w:spacing w:after="0" w:line="240" w:lineRule="auto"/>
+        <w:ind w:left="360"/>
+      </w:pPr>
+      <w:r>
+        <w:t>The basic setup looks like this:</w:t>
+      </w:r>
+    </w:p>
+    <w:p>
+      <w:pPr>
+        <w:spacing w:after="0" w:line="240" w:lineRule="auto"/>
+        <w:ind w:left="360"/>
+      </w:pPr>
+    </w:p>
+    <w:p>
+      <w:pPr>
+        <w:spacing w:after="0" w:line="240" w:lineRule="auto"/>
+        <w:ind w:left="360"/>
+      </w:pPr>
+      <w:r>
+        <w:t># .github/workflows/deploy.yml</w:t>
+      </w:r>
+    </w:p>
+    <w:p>
+      <w:pPr>
+        <w:spacing w:after="0" w:line="240" w:lineRule="auto"/>
+        <w:ind w:left="360"/>
+      </w:pPr>
+      <w:r>
+        <w:t>name: Deploy to Hostinger</w:t>
+      </w:r>
+    </w:p>
+    <w:p>
+      <w:pPr>
+        <w:spacing w:after="0" w:line="240" w:lineRule="auto"/>
+        <w:ind w:left="360"/>
+      </w:pPr>
+    </w:p>
+    <w:p>
+      <w:pPr>
+        <w:spacing w:after="0" w:line="240" w:lineRule="auto"/>
+        <w:ind w:left="360"/>
+      </w:pPr>
+      <w:r>
+        <w:t>on:</w:t>
+      </w:r>
+    </w:p>
+    <w:p>
+      <w:pPr>
+        <w:spacing w:after="0" w:line="240" w:lineRule="auto"/>
+        <w:ind w:left="360"/>
+      </w:pPr>
+      <w:r>
+        <w:t xml:space="preserve">  push:</w:t>
+      </w:r>
+    </w:p>
+    <w:p>
+      <w:pPr>
+        <w:spacing w:after="0" w:line="240" w:lineRule="auto"/>
+        <w:ind w:left="360"/>
+      </w:pPr>
+      <w:r>
+        <w:t xml:space="preserve">    branches: [main]</w:t>
+      </w:r>
+    </w:p>
+    <w:p>
+      <w:pPr>
+        <w:spacing w:after="0" w:line="240" w:lineRule="auto"/>
+        <w:ind w:left="360"/>
+      </w:pPr>
+    </w:p>
+    <w:p>
+      <w:pPr>
+        <w:spacing w:after="0" w:line="240" w:lineRule="auto"/>
+        <w:ind w:left="360"/>
+      </w:pPr>
+      <w:r>
+        <w:t>jobs:</w:t>
+      </w:r>
+    </w:p>
+    <w:p>
+      <w:pPr>
+        <w:spacing w:after="0" w:line="240" w:lineRule="auto"/>
+        <w:ind w:left="360"/>
+      </w:pPr>
+      <w:r>
+        <w:t xml:space="preserve">  deploy:</w:t>
+      </w:r>
+    </w:p>
+    <w:p>
+      <w:pPr>
+        <w:spacing w:after="0" w:line="240" w:lineRule="auto"/>
+        <w:ind w:left="360"/>
+      </w:pPr>
+      <w:r>
+        <w:t xml:space="preserve">    runs-on: ubuntu-latest</w:t>
+      </w:r>
+    </w:p>
+    <w:p>
+      <w:pPr>
+        <w:spacing w:after="0" w:line="240" w:lineRule="auto"/>
+        <w:ind w:left="360"/>
+      </w:pPr>
+      <w:r>
+        <w:t xml:space="preserve">    steps:</w:t>
+      </w:r>
+    </w:p>
+    <w:p>
+      <w:pPr>
+        <w:spacing w:after="0" w:line="240" w:lineRule="auto"/>
+        <w:ind w:left="360"/>
+      </w:pPr>
+      <w:r>
+        <w:t xml:space="preserve">      - uses: actions/checkout@v3</w:t>
+      </w:r>
+    </w:p>
+    <w:p>
+      <w:pPr>
+        <w:spacing w:after="0" w:line="240" w:lineRule="auto"/>
+        <w:ind w:left="360"/>
+      </w:pPr>
+      <w:r>
+        <w:t xml:space="preserve">      - name: Deploy via FTP</w:t>
+      </w:r>
+    </w:p>
+    <w:p>
+      <w:pPr>
+        <w:spacing w:after="0" w:line="240" w:lineRule="auto"/>
+        <w:ind w:left="360"/>
+      </w:pPr>
+      <w:r>
+        <w:t xml:space="preserve">        uses: SamKirkland/FTP-Deploy-Action@v4</w:t>
+      </w:r>
+    </w:p>
+    <w:p>
+      <w:pPr>
+        <w:spacing w:after="0" w:line="240" w:lineRule="auto"/>
+        <w:ind w:left="360"/>
+      </w:pPr>
+      <w:r>
+        <w:t xml:space="preserve">        with:</w:t>
+      </w:r>
+    </w:p>
+    <w:p>
+      <w:pPr>
+        <w:spacing w:after="0" w:line="240" w:lineRule="auto"/>
+        <w:ind w:left="360"/>
+      </w:pPr>
+      <w:r>
+        <w:t xml:space="preserve">          server: ${{ secrets.FTP_SERVER }}</w:t>
+      </w:r>
+    </w:p>
+    <w:p>
+      <w:pPr>
+        <w:spacing w:after="0" w:line="240" w:lineRule="auto"/>
+        <w:ind w:left="360"/>
+      </w:pPr>
+      <w:r>
+        <w:t xml:space="preserve">          username: ${{ secrets.FTP_USER }}</w:t>
+      </w:r>
+    </w:p>
+    <w:p>
+      <w:pPr>
+        <w:spacing w:after="0" w:line="240" w:lineRule="auto"/>
+        <w:ind w:left="360"/>
+      </w:pPr>
+      <w:r>
+        <w:t xml:space="preserve">          password: ${{ secrets.FTP_PASSWORD }}</w:t>
+      </w:r>
     </w:p>
     <w:sectPr>
       <w:pgSz w:w="12240" w:h="15840"/>
@@ -19298,6 +21094,155 @@
     </w:lvl>
   </w:abstractNum>
   <w:abstractNum w:abstractNumId="17" w15:restartNumberingAfterBreak="0">
+    <w:nsid w:val="192550B1"/>
+    <w:multiLevelType w:val="multilevel"/>
+    <w:tmpl w:val="D65C2010"/>
+    <w:lvl w:ilvl="0">
+      <w:start w:val="1"/>
+      <w:numFmt w:val="bullet"/>
+      <w:lvlText w:val=""/>
+      <w:lvlJc w:val="left"/>
+      <w:pPr>
+        <w:tabs>
+          <w:tab w:val="num" w:pos="720"/>
+        </w:tabs>
+        <w:ind w:left="720" w:hanging="360"/>
+      </w:pPr>
+      <w:rPr>
+        <w:rFonts w:ascii="Symbol" w:hAnsi="Symbol" w:hint="default"/>
+        <w:sz w:val="20"/>
+      </w:rPr>
+    </w:lvl>
+    <w:lvl w:ilvl="1" w:tentative="1">
+      <w:start w:val="1"/>
+      <w:numFmt w:val="bullet"/>
+      <w:lvlText w:val="o"/>
+      <w:lvlJc w:val="left"/>
+      <w:pPr>
+        <w:tabs>
+          <w:tab w:val="num" w:pos="1440"/>
+        </w:tabs>
+        <w:ind w:left="1440" w:hanging="360"/>
+      </w:pPr>
+      <w:rPr>
+        <w:rFonts w:ascii="Courier New" w:hAnsi="Courier New" w:hint="default"/>
+        <w:sz w:val="20"/>
+      </w:rPr>
+    </w:lvl>
+    <w:lvl w:ilvl="2" w:tentative="1">
+      <w:start w:val="1"/>
+      <w:numFmt w:val="bullet"/>
+      <w:lvlText w:val=""/>
+      <w:lvlJc w:val="left"/>
+      <w:pPr>
+        <w:tabs>
+          <w:tab w:val="num" w:pos="2160"/>
+        </w:tabs>
+        <w:ind w:left="2160" w:hanging="360"/>
+      </w:pPr>
+      <w:rPr>
+        <w:rFonts w:ascii="Wingdings" w:hAnsi="Wingdings" w:hint="default"/>
+        <w:sz w:val="20"/>
+      </w:rPr>
+    </w:lvl>
+    <w:lvl w:ilvl="3" w:tentative="1">
+      <w:start w:val="1"/>
+      <w:numFmt w:val="bullet"/>
+      <w:lvlText w:val=""/>
+      <w:lvlJc w:val="left"/>
+      <w:pPr>
+        <w:tabs>
+          <w:tab w:val="num" w:pos="2880"/>
+        </w:tabs>
+        <w:ind w:left="2880" w:hanging="360"/>
+      </w:pPr>
+      <w:rPr>
+        <w:rFonts w:ascii="Wingdings" w:hAnsi="Wingdings" w:hint="default"/>
+        <w:sz w:val="20"/>
+      </w:rPr>
+    </w:lvl>
+    <w:lvl w:ilvl="4" w:tentative="1">
+      <w:start w:val="1"/>
+      <w:numFmt w:val="bullet"/>
+      <w:lvlText w:val=""/>
+      <w:lvlJc w:val="left"/>
+      <w:pPr>
+        <w:tabs>
+          <w:tab w:val="num" w:pos="3600"/>
+        </w:tabs>
+        <w:ind w:left="3600" w:hanging="360"/>
+      </w:pPr>
+      <w:rPr>
+        <w:rFonts w:ascii="Wingdings" w:hAnsi="Wingdings" w:hint="default"/>
+        <w:sz w:val="20"/>
+      </w:rPr>
+    </w:lvl>
+    <w:lvl w:ilvl="5" w:tentative="1">
+      <w:start w:val="1"/>
+      <w:numFmt w:val="bullet"/>
+      <w:lvlText w:val=""/>
+      <w:lvlJc w:val="left"/>
+      <w:pPr>
+        <w:tabs>
+          <w:tab w:val="num" w:pos="4320"/>
+        </w:tabs>
+        <w:ind w:left="4320" w:hanging="360"/>
+      </w:pPr>
+      <w:rPr>
+        <w:rFonts w:ascii="Wingdings" w:hAnsi="Wingdings" w:hint="default"/>
+        <w:sz w:val="20"/>
+      </w:rPr>
+    </w:lvl>
+    <w:lvl w:ilvl="6" w:tentative="1">
+      <w:start w:val="1"/>
+      <w:numFmt w:val="bullet"/>
+      <w:lvlText w:val=""/>
+      <w:lvlJc w:val="left"/>
+      <w:pPr>
+        <w:tabs>
+          <w:tab w:val="num" w:pos="5040"/>
+        </w:tabs>
+        <w:ind w:left="5040" w:hanging="360"/>
+      </w:pPr>
+      <w:rPr>
+        <w:rFonts w:ascii="Wingdings" w:hAnsi="Wingdings" w:hint="default"/>
+        <w:sz w:val="20"/>
+      </w:rPr>
+    </w:lvl>
+    <w:lvl w:ilvl="7" w:tentative="1">
+      <w:start w:val="1"/>
+      <w:numFmt w:val="bullet"/>
+      <w:lvlText w:val=""/>
+      <w:lvlJc w:val="left"/>
+      <w:pPr>
+        <w:tabs>
+          <w:tab w:val="num" w:pos="5760"/>
+        </w:tabs>
+        <w:ind w:left="5760" w:hanging="360"/>
+      </w:pPr>
+      <w:rPr>
+        <w:rFonts w:ascii="Wingdings" w:hAnsi="Wingdings" w:hint="default"/>
+        <w:sz w:val="20"/>
+      </w:rPr>
+    </w:lvl>
+    <w:lvl w:ilvl="8" w:tentative="1">
+      <w:start w:val="1"/>
+      <w:numFmt w:val="bullet"/>
+      <w:lvlText w:val=""/>
+      <w:lvlJc w:val="left"/>
+      <w:pPr>
+        <w:tabs>
+          <w:tab w:val="num" w:pos="6480"/>
+        </w:tabs>
+        <w:ind w:left="6480" w:hanging="360"/>
+      </w:pPr>
+      <w:rPr>
+        <w:rFonts w:ascii="Wingdings" w:hAnsi="Wingdings" w:hint="default"/>
+        <w:sz w:val="20"/>
+      </w:rPr>
+    </w:lvl>
+  </w:abstractNum>
+  <w:abstractNum w:abstractNumId="18" w15:restartNumberingAfterBreak="0">
     <w:nsid w:val="19E06C2D"/>
     <w:multiLevelType w:val="hybridMultilevel"/>
     <w:tmpl w:val="79E4B8F4"/>
@@ -19410,7 +21355,7 @@
       </w:rPr>
     </w:lvl>
   </w:abstractNum>
-  <w:abstractNum w:abstractNumId="18" w15:restartNumberingAfterBreak="0">
+  <w:abstractNum w:abstractNumId="19" w15:restartNumberingAfterBreak="0">
     <w:nsid w:val="1ABB3A53"/>
     <w:multiLevelType w:val="hybridMultilevel"/>
     <w:tmpl w:val="63F04ED8"/>
@@ -19522,7 +21467,7 @@
       </w:rPr>
     </w:lvl>
   </w:abstractNum>
-  <w:abstractNum w:abstractNumId="19" w15:restartNumberingAfterBreak="0">
+  <w:abstractNum w:abstractNumId="20" w15:restartNumberingAfterBreak="0">
     <w:nsid w:val="1B0B2056"/>
     <w:multiLevelType w:val="multilevel"/>
     <w:tmpl w:val="70AA8958"/>
@@ -19671,7 +21616,7 @@
       </w:rPr>
     </w:lvl>
   </w:abstractNum>
-  <w:abstractNum w:abstractNumId="20" w15:restartNumberingAfterBreak="0">
+  <w:abstractNum w:abstractNumId="21" w15:restartNumberingAfterBreak="0">
     <w:nsid w:val="1E0977E0"/>
     <w:multiLevelType w:val="hybridMultilevel"/>
     <w:tmpl w:val="549675B6"/>
@@ -19783,7 +21728,7 @@
       </w:rPr>
     </w:lvl>
   </w:abstractNum>
-  <w:abstractNum w:abstractNumId="21" w15:restartNumberingAfterBreak="0">
+  <w:abstractNum w:abstractNumId="22" w15:restartNumberingAfterBreak="0">
     <w:nsid w:val="1E5D0B16"/>
     <w:multiLevelType w:val="multilevel"/>
     <w:tmpl w:val="DDD27F94"/>
@@ -19932,7 +21877,7 @@
       </w:rPr>
     </w:lvl>
   </w:abstractNum>
-  <w:abstractNum w:abstractNumId="22" w15:restartNumberingAfterBreak="0">
+  <w:abstractNum w:abstractNumId="23" w15:restartNumberingAfterBreak="0">
     <w:nsid w:val="1FF82639"/>
     <w:multiLevelType w:val="hybridMultilevel"/>
     <w:tmpl w:val="3D58A3A4"/>
@@ -20044,7 +21989,7 @@
       </w:rPr>
     </w:lvl>
   </w:abstractNum>
-  <w:abstractNum w:abstractNumId="23" w15:restartNumberingAfterBreak="0">
+  <w:abstractNum w:abstractNumId="24" w15:restartNumberingAfterBreak="0">
     <w:nsid w:val="21561542"/>
     <w:multiLevelType w:val="hybridMultilevel"/>
     <w:tmpl w:val="5A365C6E"/>
@@ -20157,7 +22102,7 @@
       </w:rPr>
     </w:lvl>
   </w:abstractNum>
-  <w:abstractNum w:abstractNumId="24" w15:restartNumberingAfterBreak="0">
+  <w:abstractNum w:abstractNumId="25" w15:restartNumberingAfterBreak="0">
     <w:nsid w:val="229E3A8A"/>
     <w:multiLevelType w:val="hybridMultilevel"/>
     <w:tmpl w:val="F9A0F2D6"/>
@@ -20269,7 +22214,7 @@
       </w:rPr>
     </w:lvl>
   </w:abstractNum>
-  <w:abstractNum w:abstractNumId="25" w15:restartNumberingAfterBreak="0">
+  <w:abstractNum w:abstractNumId="26" w15:restartNumberingAfterBreak="0">
     <w:nsid w:val="24F04132"/>
     <w:multiLevelType w:val="hybridMultilevel"/>
     <w:tmpl w:val="D9763222"/>
@@ -20381,7 +22326,7 @@
       </w:rPr>
     </w:lvl>
   </w:abstractNum>
-  <w:abstractNum w:abstractNumId="26" w15:restartNumberingAfterBreak="0">
+  <w:abstractNum w:abstractNumId="27" w15:restartNumberingAfterBreak="0">
     <w:nsid w:val="25A03424"/>
     <w:multiLevelType w:val="hybridMultilevel"/>
     <w:tmpl w:val="01D22A8A"/>
@@ -20494,7 +22439,7 @@
       </w:rPr>
     </w:lvl>
   </w:abstractNum>
-  <w:abstractNum w:abstractNumId="27" w15:restartNumberingAfterBreak="0">
+  <w:abstractNum w:abstractNumId="28" w15:restartNumberingAfterBreak="0">
     <w:nsid w:val="25C95C75"/>
     <w:multiLevelType w:val="multilevel"/>
     <w:tmpl w:val="8C681C84"/>
@@ -20643,7 +22588,7 @@
       </w:rPr>
     </w:lvl>
   </w:abstractNum>
-  <w:abstractNum w:abstractNumId="28" w15:restartNumberingAfterBreak="0">
+  <w:abstractNum w:abstractNumId="29" w15:restartNumberingAfterBreak="0">
     <w:nsid w:val="26A95B53"/>
     <w:multiLevelType w:val="multilevel"/>
     <w:tmpl w:val="8E6E75B0"/>
@@ -20760,7 +22705,7 @@
       </w:pPr>
     </w:lvl>
   </w:abstractNum>
-  <w:abstractNum w:abstractNumId="29" w15:restartNumberingAfterBreak="0">
+  <w:abstractNum w:abstractNumId="30" w15:restartNumberingAfterBreak="0">
     <w:nsid w:val="27D37713"/>
     <w:multiLevelType w:val="hybridMultilevel"/>
     <w:tmpl w:val="DCFC50E8"/>
@@ -20873,7 +22818,7 @@
       </w:rPr>
     </w:lvl>
   </w:abstractNum>
-  <w:abstractNum w:abstractNumId="30" w15:restartNumberingAfterBreak="0">
+  <w:abstractNum w:abstractNumId="31" w15:restartNumberingAfterBreak="0">
     <w:nsid w:val="298F11E7"/>
     <w:multiLevelType w:val="hybridMultilevel"/>
     <w:tmpl w:val="1108B76C"/>
@@ -20985,7 +22930,7 @@
       </w:rPr>
     </w:lvl>
   </w:abstractNum>
-  <w:abstractNum w:abstractNumId="31" w15:restartNumberingAfterBreak="0">
+  <w:abstractNum w:abstractNumId="32" w15:restartNumberingAfterBreak="0">
     <w:nsid w:val="29B23F98"/>
     <w:multiLevelType w:val="hybridMultilevel"/>
     <w:tmpl w:val="DF880AF0"/>
@@ -21098,7 +23043,7 @@
       </w:rPr>
     </w:lvl>
   </w:abstractNum>
-  <w:abstractNum w:abstractNumId="32" w15:restartNumberingAfterBreak="0">
+  <w:abstractNum w:abstractNumId="33" w15:restartNumberingAfterBreak="0">
     <w:nsid w:val="2A535D37"/>
     <w:multiLevelType w:val="hybridMultilevel"/>
     <w:tmpl w:val="7FECFCC0"/>
@@ -21210,7 +23155,7 @@
       </w:rPr>
     </w:lvl>
   </w:abstractNum>
-  <w:abstractNum w:abstractNumId="33" w15:restartNumberingAfterBreak="0">
+  <w:abstractNum w:abstractNumId="34" w15:restartNumberingAfterBreak="0">
     <w:nsid w:val="2AFF4127"/>
     <w:multiLevelType w:val="multilevel"/>
     <w:tmpl w:val="5CF69D86"/>
@@ -21359,7 +23304,7 @@
       </w:rPr>
     </w:lvl>
   </w:abstractNum>
-  <w:abstractNum w:abstractNumId="34" w15:restartNumberingAfterBreak="0">
+  <w:abstractNum w:abstractNumId="35" w15:restartNumberingAfterBreak="0">
     <w:nsid w:val="2B087E4A"/>
     <w:multiLevelType w:val="hybridMultilevel"/>
     <w:tmpl w:val="5BA2AE44"/>
@@ -21472,7 +23417,7 @@
       </w:rPr>
     </w:lvl>
   </w:abstractNum>
-  <w:abstractNum w:abstractNumId="35" w15:restartNumberingAfterBreak="0">
+  <w:abstractNum w:abstractNumId="36" w15:restartNumberingAfterBreak="0">
     <w:nsid w:val="2B687FD7"/>
     <w:multiLevelType w:val="multilevel"/>
     <w:tmpl w:val="4D4478B0"/>
@@ -21621,7 +23566,7 @@
       </w:rPr>
     </w:lvl>
   </w:abstractNum>
-  <w:abstractNum w:abstractNumId="36" w15:restartNumberingAfterBreak="0">
+  <w:abstractNum w:abstractNumId="37" w15:restartNumberingAfterBreak="0">
     <w:nsid w:val="2CBB2E60"/>
     <w:multiLevelType w:val="hybridMultilevel"/>
     <w:tmpl w:val="B20AB142"/>
@@ -21733,7 +23678,7 @@
       </w:rPr>
     </w:lvl>
   </w:abstractNum>
-  <w:abstractNum w:abstractNumId="37" w15:restartNumberingAfterBreak="0">
+  <w:abstractNum w:abstractNumId="38" w15:restartNumberingAfterBreak="0">
     <w:nsid w:val="2D682597"/>
     <w:multiLevelType w:val="hybridMultilevel"/>
     <w:tmpl w:val="8AEE5F66"/>
@@ -21845,7 +23790,7 @@
       </w:rPr>
     </w:lvl>
   </w:abstractNum>
-  <w:abstractNum w:abstractNumId="38" w15:restartNumberingAfterBreak="0">
+  <w:abstractNum w:abstractNumId="39" w15:restartNumberingAfterBreak="0">
     <w:nsid w:val="2E82781B"/>
     <w:multiLevelType w:val="multilevel"/>
     <w:tmpl w:val="F360605E"/>
@@ -21994,7 +23939,7 @@
       </w:rPr>
     </w:lvl>
   </w:abstractNum>
-  <w:abstractNum w:abstractNumId="39" w15:restartNumberingAfterBreak="0">
+  <w:abstractNum w:abstractNumId="40" w15:restartNumberingAfterBreak="0">
     <w:nsid w:val="2F0D491F"/>
     <w:multiLevelType w:val="hybridMultilevel"/>
     <w:tmpl w:val="D7D0F52A"/>
@@ -22107,7 +24052,7 @@
       </w:rPr>
     </w:lvl>
   </w:abstractNum>
-  <w:abstractNum w:abstractNumId="40" w15:restartNumberingAfterBreak="0">
+  <w:abstractNum w:abstractNumId="41" w15:restartNumberingAfterBreak="0">
     <w:nsid w:val="309C07EC"/>
     <w:multiLevelType w:val="hybridMultilevel"/>
     <w:tmpl w:val="43E654DC"/>
@@ -22220,7 +24165,7 @@
       </w:rPr>
     </w:lvl>
   </w:abstractNum>
-  <w:abstractNum w:abstractNumId="41" w15:restartNumberingAfterBreak="0">
+  <w:abstractNum w:abstractNumId="42" w15:restartNumberingAfterBreak="0">
     <w:nsid w:val="3122254E"/>
     <w:multiLevelType w:val="multilevel"/>
     <w:tmpl w:val="B470B2CA"/>
@@ -22369,7 +24314,7 @@
       </w:rPr>
     </w:lvl>
   </w:abstractNum>
-  <w:abstractNum w:abstractNumId="42" w15:restartNumberingAfterBreak="0">
+  <w:abstractNum w:abstractNumId="43" w15:restartNumberingAfterBreak="0">
     <w:nsid w:val="31D20FF2"/>
     <w:multiLevelType w:val="hybridMultilevel"/>
     <w:tmpl w:val="EA3CB86A"/>
@@ -22481,7 +24426,156 @@
       </w:rPr>
     </w:lvl>
   </w:abstractNum>
-  <w:abstractNum w:abstractNumId="43" w15:restartNumberingAfterBreak="0">
+  <w:abstractNum w:abstractNumId="44" w15:restartNumberingAfterBreak="0">
+    <w:nsid w:val="350F2D66"/>
+    <w:multiLevelType w:val="multilevel"/>
+    <w:tmpl w:val="B88A184E"/>
+    <w:lvl w:ilvl="0">
+      <w:start w:val="1"/>
+      <w:numFmt w:val="bullet"/>
+      <w:lvlText w:val=""/>
+      <w:lvlJc w:val="left"/>
+      <w:pPr>
+        <w:tabs>
+          <w:tab w:val="num" w:pos="720"/>
+        </w:tabs>
+        <w:ind w:left="720" w:hanging="360"/>
+      </w:pPr>
+      <w:rPr>
+        <w:rFonts w:ascii="Symbol" w:hAnsi="Symbol" w:hint="default"/>
+        <w:sz w:val="20"/>
+      </w:rPr>
+    </w:lvl>
+    <w:lvl w:ilvl="1">
+      <w:start w:val="1"/>
+      <w:numFmt w:val="bullet"/>
+      <w:lvlText w:val="o"/>
+      <w:lvlJc w:val="left"/>
+      <w:pPr>
+        <w:tabs>
+          <w:tab w:val="num" w:pos="1440"/>
+        </w:tabs>
+        <w:ind w:left="1440" w:hanging="360"/>
+      </w:pPr>
+      <w:rPr>
+        <w:rFonts w:ascii="Courier New" w:hAnsi="Courier New" w:hint="default"/>
+        <w:sz w:val="20"/>
+      </w:rPr>
+    </w:lvl>
+    <w:lvl w:ilvl="2" w:tentative="1">
+      <w:start w:val="1"/>
+      <w:numFmt w:val="bullet"/>
+      <w:lvlText w:val=""/>
+      <w:lvlJc w:val="left"/>
+      <w:pPr>
+        <w:tabs>
+          <w:tab w:val="num" w:pos="2160"/>
+        </w:tabs>
+        <w:ind w:left="2160" w:hanging="360"/>
+      </w:pPr>
+      <w:rPr>
+        <w:rFonts w:ascii="Wingdings" w:hAnsi="Wingdings" w:hint="default"/>
+        <w:sz w:val="20"/>
+      </w:rPr>
+    </w:lvl>
+    <w:lvl w:ilvl="3" w:tentative="1">
+      <w:start w:val="1"/>
+      <w:numFmt w:val="bullet"/>
+      <w:lvlText w:val=""/>
+      <w:lvlJc w:val="left"/>
+      <w:pPr>
+        <w:tabs>
+          <w:tab w:val="num" w:pos="2880"/>
+        </w:tabs>
+        <w:ind w:left="2880" w:hanging="360"/>
+      </w:pPr>
+      <w:rPr>
+        <w:rFonts w:ascii="Wingdings" w:hAnsi="Wingdings" w:hint="default"/>
+        <w:sz w:val="20"/>
+      </w:rPr>
+    </w:lvl>
+    <w:lvl w:ilvl="4" w:tentative="1">
+      <w:start w:val="1"/>
+      <w:numFmt w:val="bullet"/>
+      <w:lvlText w:val=""/>
+      <w:lvlJc w:val="left"/>
+      <w:pPr>
+        <w:tabs>
+          <w:tab w:val="num" w:pos="3600"/>
+        </w:tabs>
+        <w:ind w:left="3600" w:hanging="360"/>
+      </w:pPr>
+      <w:rPr>
+        <w:rFonts w:ascii="Wingdings" w:hAnsi="Wingdings" w:hint="default"/>
+        <w:sz w:val="20"/>
+      </w:rPr>
+    </w:lvl>
+    <w:lvl w:ilvl="5" w:tentative="1">
+      <w:start w:val="1"/>
+      <w:numFmt w:val="bullet"/>
+      <w:lvlText w:val=""/>
+      <w:lvlJc w:val="left"/>
+      <w:pPr>
+        <w:tabs>
+          <w:tab w:val="num" w:pos="4320"/>
+        </w:tabs>
+        <w:ind w:left="4320" w:hanging="360"/>
+      </w:pPr>
+      <w:rPr>
+        <w:rFonts w:ascii="Wingdings" w:hAnsi="Wingdings" w:hint="default"/>
+        <w:sz w:val="20"/>
+      </w:rPr>
+    </w:lvl>
+    <w:lvl w:ilvl="6" w:tentative="1">
+      <w:start w:val="1"/>
+      <w:numFmt w:val="bullet"/>
+      <w:lvlText w:val=""/>
+      <w:lvlJc w:val="left"/>
+      <w:pPr>
+        <w:tabs>
+          <w:tab w:val="num" w:pos="5040"/>
+        </w:tabs>
+        <w:ind w:left="5040" w:hanging="360"/>
+      </w:pPr>
+      <w:rPr>
+        <w:rFonts w:ascii="Wingdings" w:hAnsi="Wingdings" w:hint="default"/>
+        <w:sz w:val="20"/>
+      </w:rPr>
+    </w:lvl>
+    <w:lvl w:ilvl="7" w:tentative="1">
+      <w:start w:val="1"/>
+      <w:numFmt w:val="bullet"/>
+      <w:lvlText w:val=""/>
+      <w:lvlJc w:val="left"/>
+      <w:pPr>
+        <w:tabs>
+          <w:tab w:val="num" w:pos="5760"/>
+        </w:tabs>
+        <w:ind w:left="5760" w:hanging="360"/>
+      </w:pPr>
+      <w:rPr>
+        <w:rFonts w:ascii="Wingdings" w:hAnsi="Wingdings" w:hint="default"/>
+        <w:sz w:val="20"/>
+      </w:rPr>
+    </w:lvl>
+    <w:lvl w:ilvl="8" w:tentative="1">
+      <w:start w:val="1"/>
+      <w:numFmt w:val="bullet"/>
+      <w:lvlText w:val=""/>
+      <w:lvlJc w:val="left"/>
+      <w:pPr>
+        <w:tabs>
+          <w:tab w:val="num" w:pos="6480"/>
+        </w:tabs>
+        <w:ind w:left="6480" w:hanging="360"/>
+      </w:pPr>
+      <w:rPr>
+        <w:rFonts w:ascii="Wingdings" w:hAnsi="Wingdings" w:hint="default"/>
+        <w:sz w:val="20"/>
+      </w:rPr>
+    </w:lvl>
+  </w:abstractNum>
+  <w:abstractNum w:abstractNumId="45" w15:restartNumberingAfterBreak="0">
     <w:nsid w:val="35E55AC7"/>
     <w:multiLevelType w:val="hybridMultilevel"/>
     <w:tmpl w:val="BCFCACC6"/>
@@ -22593,7 +24687,7 @@
       </w:rPr>
     </w:lvl>
   </w:abstractNum>
-  <w:abstractNum w:abstractNumId="44" w15:restartNumberingAfterBreak="0">
+  <w:abstractNum w:abstractNumId="46" w15:restartNumberingAfterBreak="0">
     <w:nsid w:val="380E36DB"/>
     <w:multiLevelType w:val="hybridMultilevel"/>
     <w:tmpl w:val="7B3E5C58"/>
@@ -22705,7 +24799,7 @@
       </w:rPr>
     </w:lvl>
   </w:abstractNum>
-  <w:abstractNum w:abstractNumId="45" w15:restartNumberingAfterBreak="0">
+  <w:abstractNum w:abstractNumId="47" w15:restartNumberingAfterBreak="0">
     <w:nsid w:val="38530E13"/>
     <w:multiLevelType w:val="hybridMultilevel"/>
     <w:tmpl w:val="263AC0D6"/>
@@ -22818,7 +24912,7 @@
       </w:rPr>
     </w:lvl>
   </w:abstractNum>
-  <w:abstractNum w:abstractNumId="46" w15:restartNumberingAfterBreak="0">
+  <w:abstractNum w:abstractNumId="48" w15:restartNumberingAfterBreak="0">
     <w:nsid w:val="39DB4418"/>
     <w:multiLevelType w:val="hybridMultilevel"/>
     <w:tmpl w:val="1C843710"/>
@@ -22930,7 +25024,7 @@
       </w:rPr>
     </w:lvl>
   </w:abstractNum>
-  <w:abstractNum w:abstractNumId="47" w15:restartNumberingAfterBreak="0">
+  <w:abstractNum w:abstractNumId="49" w15:restartNumberingAfterBreak="0">
     <w:nsid w:val="3A2445DB"/>
     <w:multiLevelType w:val="hybridMultilevel"/>
     <w:tmpl w:val="629C8E56"/>
@@ -23042,7 +25136,7 @@
       </w:rPr>
     </w:lvl>
   </w:abstractNum>
-  <w:abstractNum w:abstractNumId="48" w15:restartNumberingAfterBreak="0">
+  <w:abstractNum w:abstractNumId="50" w15:restartNumberingAfterBreak="0">
     <w:nsid w:val="3A2A15F0"/>
     <w:multiLevelType w:val="multilevel"/>
     <w:tmpl w:val="8EC800BA"/>
@@ -23191,7 +25285,7 @@
       </w:rPr>
     </w:lvl>
   </w:abstractNum>
-  <w:abstractNum w:abstractNumId="49" w15:restartNumberingAfterBreak="0">
+  <w:abstractNum w:abstractNumId="51" w15:restartNumberingAfterBreak="0">
     <w:nsid w:val="3C6C2C33"/>
     <w:multiLevelType w:val="hybridMultilevel"/>
     <w:tmpl w:val="D8EA41E8"/>
@@ -23303,7 +25397,7 @@
       </w:rPr>
     </w:lvl>
   </w:abstractNum>
-  <w:abstractNum w:abstractNumId="50" w15:restartNumberingAfterBreak="0">
+  <w:abstractNum w:abstractNumId="52" w15:restartNumberingAfterBreak="0">
     <w:nsid w:val="3E017A65"/>
     <w:multiLevelType w:val="hybridMultilevel"/>
     <w:tmpl w:val="7DC43054"/>
@@ -23415,7 +25509,7 @@
       </w:rPr>
     </w:lvl>
   </w:abstractNum>
-  <w:abstractNum w:abstractNumId="51" w15:restartNumberingAfterBreak="0">
+  <w:abstractNum w:abstractNumId="53" w15:restartNumberingAfterBreak="0">
     <w:nsid w:val="3F2F2766"/>
     <w:multiLevelType w:val="hybridMultilevel"/>
     <w:tmpl w:val="4502E290"/>
@@ -23528,7 +25622,7 @@
       </w:rPr>
     </w:lvl>
   </w:abstractNum>
-  <w:abstractNum w:abstractNumId="52" w15:restartNumberingAfterBreak="0">
+  <w:abstractNum w:abstractNumId="54" w15:restartNumberingAfterBreak="0">
     <w:nsid w:val="3F670876"/>
     <w:multiLevelType w:val="hybridMultilevel"/>
     <w:tmpl w:val="87CAC3F6"/>
@@ -23640,7 +25734,7 @@
       </w:rPr>
     </w:lvl>
   </w:abstractNum>
-  <w:abstractNum w:abstractNumId="53" w15:restartNumberingAfterBreak="0">
+  <w:abstractNum w:abstractNumId="55" w15:restartNumberingAfterBreak="0">
     <w:nsid w:val="3FEE4530"/>
     <w:multiLevelType w:val="hybridMultilevel"/>
     <w:tmpl w:val="EFB48A48"/>
@@ -23753,7 +25847,7 @@
       </w:rPr>
     </w:lvl>
   </w:abstractNum>
-  <w:abstractNum w:abstractNumId="54" w15:restartNumberingAfterBreak="0">
+  <w:abstractNum w:abstractNumId="56" w15:restartNumberingAfterBreak="0">
     <w:nsid w:val="41562F53"/>
     <w:multiLevelType w:val="multilevel"/>
     <w:tmpl w:val="8FA65326"/>
@@ -23902,7 +25996,7 @@
       </w:rPr>
     </w:lvl>
   </w:abstractNum>
-  <w:abstractNum w:abstractNumId="55" w15:restartNumberingAfterBreak="0">
+  <w:abstractNum w:abstractNumId="57" w15:restartNumberingAfterBreak="0">
     <w:nsid w:val="42516CF2"/>
     <w:multiLevelType w:val="multilevel"/>
     <w:tmpl w:val="B0706E5A"/>
@@ -24051,7 +26145,7 @@
       </w:rPr>
     </w:lvl>
   </w:abstractNum>
-  <w:abstractNum w:abstractNumId="56" w15:restartNumberingAfterBreak="0">
+  <w:abstractNum w:abstractNumId="58" w15:restartNumberingAfterBreak="0">
     <w:nsid w:val="42545CBC"/>
     <w:multiLevelType w:val="hybridMultilevel"/>
     <w:tmpl w:val="A6D487CC"/>
@@ -24163,7 +26257,7 @@
       </w:rPr>
     </w:lvl>
   </w:abstractNum>
-  <w:abstractNum w:abstractNumId="57" w15:restartNumberingAfterBreak="0">
+  <w:abstractNum w:abstractNumId="59" w15:restartNumberingAfterBreak="0">
     <w:nsid w:val="444A7F9A"/>
     <w:multiLevelType w:val="hybridMultilevel"/>
     <w:tmpl w:val="FC3C1540"/>
@@ -24275,7 +26369,7 @@
       </w:rPr>
     </w:lvl>
   </w:abstractNum>
-  <w:abstractNum w:abstractNumId="58" w15:restartNumberingAfterBreak="0">
+  <w:abstractNum w:abstractNumId="60" w15:restartNumberingAfterBreak="0">
     <w:nsid w:val="445D654F"/>
     <w:multiLevelType w:val="hybridMultilevel"/>
     <w:tmpl w:val="C8920D36"/>
@@ -24388,7 +26482,7 @@
       </w:rPr>
     </w:lvl>
   </w:abstractNum>
-  <w:abstractNum w:abstractNumId="59" w15:restartNumberingAfterBreak="0">
+  <w:abstractNum w:abstractNumId="61" w15:restartNumberingAfterBreak="0">
     <w:nsid w:val="451619A4"/>
     <w:multiLevelType w:val="hybridMultilevel"/>
     <w:tmpl w:val="D3B8B1B0"/>
@@ -24500,7 +26594,7 @@
       </w:rPr>
     </w:lvl>
   </w:abstractNum>
-  <w:abstractNum w:abstractNumId="60" w15:restartNumberingAfterBreak="0">
+  <w:abstractNum w:abstractNumId="62" w15:restartNumberingAfterBreak="0">
     <w:nsid w:val="45867B90"/>
     <w:multiLevelType w:val="hybridMultilevel"/>
     <w:tmpl w:val="47BA1232"/>
@@ -24612,7 +26706,156 @@
       </w:rPr>
     </w:lvl>
   </w:abstractNum>
-  <w:abstractNum w:abstractNumId="61" w15:restartNumberingAfterBreak="0">
+  <w:abstractNum w:abstractNumId="63" w15:restartNumberingAfterBreak="0">
+    <w:nsid w:val="460A25AE"/>
+    <w:multiLevelType w:val="multilevel"/>
+    <w:tmpl w:val="61C8A5C8"/>
+    <w:lvl w:ilvl="0">
+      <w:start w:val="1"/>
+      <w:numFmt w:val="bullet"/>
+      <w:lvlText w:val=""/>
+      <w:lvlJc w:val="left"/>
+      <w:pPr>
+        <w:tabs>
+          <w:tab w:val="num" w:pos="720"/>
+        </w:tabs>
+        <w:ind w:left="720" w:hanging="360"/>
+      </w:pPr>
+      <w:rPr>
+        <w:rFonts w:ascii="Symbol" w:hAnsi="Symbol" w:hint="default"/>
+        <w:sz w:val="20"/>
+      </w:rPr>
+    </w:lvl>
+    <w:lvl w:ilvl="1" w:tentative="1">
+      <w:start w:val="1"/>
+      <w:numFmt w:val="bullet"/>
+      <w:lvlText w:val="o"/>
+      <w:lvlJc w:val="left"/>
+      <w:pPr>
+        <w:tabs>
+          <w:tab w:val="num" w:pos="1440"/>
+        </w:tabs>
+        <w:ind w:left="1440" w:hanging="360"/>
+      </w:pPr>
+      <w:rPr>
+        <w:rFonts w:ascii="Courier New" w:hAnsi="Courier New" w:hint="default"/>
+        <w:sz w:val="20"/>
+      </w:rPr>
+    </w:lvl>
+    <w:lvl w:ilvl="2" w:tentative="1">
+      <w:start w:val="1"/>
+      <w:numFmt w:val="bullet"/>
+      <w:lvlText w:val=""/>
+      <w:lvlJc w:val="left"/>
+      <w:pPr>
+        <w:tabs>
+          <w:tab w:val="num" w:pos="2160"/>
+        </w:tabs>
+        <w:ind w:left="2160" w:hanging="360"/>
+      </w:pPr>
+      <w:rPr>
+        <w:rFonts w:ascii="Wingdings" w:hAnsi="Wingdings" w:hint="default"/>
+        <w:sz w:val="20"/>
+      </w:rPr>
+    </w:lvl>
+    <w:lvl w:ilvl="3" w:tentative="1">
+      <w:start w:val="1"/>
+      <w:numFmt w:val="bullet"/>
+      <w:lvlText w:val=""/>
+      <w:lvlJc w:val="left"/>
+      <w:pPr>
+        <w:tabs>
+          <w:tab w:val="num" w:pos="2880"/>
+        </w:tabs>
+        <w:ind w:left="2880" w:hanging="360"/>
+      </w:pPr>
+      <w:rPr>
+        <w:rFonts w:ascii="Wingdings" w:hAnsi="Wingdings" w:hint="default"/>
+        <w:sz w:val="20"/>
+      </w:rPr>
+    </w:lvl>
+    <w:lvl w:ilvl="4" w:tentative="1">
+      <w:start w:val="1"/>
+      <w:numFmt w:val="bullet"/>
+      <w:lvlText w:val=""/>
+      <w:lvlJc w:val="left"/>
+      <w:pPr>
+        <w:tabs>
+          <w:tab w:val="num" w:pos="3600"/>
+        </w:tabs>
+        <w:ind w:left="3600" w:hanging="360"/>
+      </w:pPr>
+      <w:rPr>
+        <w:rFonts w:ascii="Wingdings" w:hAnsi="Wingdings" w:hint="default"/>
+        <w:sz w:val="20"/>
+      </w:rPr>
+    </w:lvl>
+    <w:lvl w:ilvl="5" w:tentative="1">
+      <w:start w:val="1"/>
+      <w:numFmt w:val="bullet"/>
+      <w:lvlText w:val=""/>
+      <w:lvlJc w:val="left"/>
+      <w:pPr>
+        <w:tabs>
+          <w:tab w:val="num" w:pos="4320"/>
+        </w:tabs>
+        <w:ind w:left="4320" w:hanging="360"/>
+      </w:pPr>
+      <w:rPr>
+        <w:rFonts w:ascii="Wingdings" w:hAnsi="Wingdings" w:hint="default"/>
+        <w:sz w:val="20"/>
+      </w:rPr>
+    </w:lvl>
+    <w:lvl w:ilvl="6" w:tentative="1">
+      <w:start w:val="1"/>
+      <w:numFmt w:val="bullet"/>
+      <w:lvlText w:val=""/>
+      <w:lvlJc w:val="left"/>
+      <w:pPr>
+        <w:tabs>
+          <w:tab w:val="num" w:pos="5040"/>
+        </w:tabs>
+        <w:ind w:left="5040" w:hanging="360"/>
+      </w:pPr>
+      <w:rPr>
+        <w:rFonts w:ascii="Wingdings" w:hAnsi="Wingdings" w:hint="default"/>
+        <w:sz w:val="20"/>
+      </w:rPr>
+    </w:lvl>
+    <w:lvl w:ilvl="7" w:tentative="1">
+      <w:start w:val="1"/>
+      <w:numFmt w:val="bullet"/>
+      <w:lvlText w:val=""/>
+      <w:lvlJc w:val="left"/>
+      <w:pPr>
+        <w:tabs>
+          <w:tab w:val="num" w:pos="5760"/>
+        </w:tabs>
+        <w:ind w:left="5760" w:hanging="360"/>
+      </w:pPr>
+      <w:rPr>
+        <w:rFonts w:ascii="Wingdings" w:hAnsi="Wingdings" w:hint="default"/>
+        <w:sz w:val="20"/>
+      </w:rPr>
+    </w:lvl>
+    <w:lvl w:ilvl="8" w:tentative="1">
+      <w:start w:val="1"/>
+      <w:numFmt w:val="bullet"/>
+      <w:lvlText w:val=""/>
+      <w:lvlJc w:val="left"/>
+      <w:pPr>
+        <w:tabs>
+          <w:tab w:val="num" w:pos="6480"/>
+        </w:tabs>
+        <w:ind w:left="6480" w:hanging="360"/>
+      </w:pPr>
+      <w:rPr>
+        <w:rFonts w:ascii="Wingdings" w:hAnsi="Wingdings" w:hint="default"/>
+        <w:sz w:val="20"/>
+      </w:rPr>
+    </w:lvl>
+  </w:abstractNum>
+  <w:abstractNum w:abstractNumId="64" w15:restartNumberingAfterBreak="0">
     <w:nsid w:val="470C54C3"/>
     <w:multiLevelType w:val="hybridMultilevel"/>
     <w:tmpl w:val="0A827D10"/>
@@ -24725,7 +26968,7 @@
       </w:rPr>
     </w:lvl>
   </w:abstractNum>
-  <w:abstractNum w:abstractNumId="62" w15:restartNumberingAfterBreak="0">
+  <w:abstractNum w:abstractNumId="65" w15:restartNumberingAfterBreak="0">
     <w:nsid w:val="48691879"/>
     <w:multiLevelType w:val="multilevel"/>
     <w:tmpl w:val="24FA03BA"/>
@@ -24874,7 +27117,7 @@
       </w:rPr>
     </w:lvl>
   </w:abstractNum>
-  <w:abstractNum w:abstractNumId="63" w15:restartNumberingAfterBreak="0">
+  <w:abstractNum w:abstractNumId="66" w15:restartNumberingAfterBreak="0">
     <w:nsid w:val="4A136C87"/>
     <w:multiLevelType w:val="hybridMultilevel"/>
     <w:tmpl w:val="78608C6C"/>
@@ -24986,7 +27229,7 @@
       </w:rPr>
     </w:lvl>
   </w:abstractNum>
-  <w:abstractNum w:abstractNumId="64" w15:restartNumberingAfterBreak="0">
+  <w:abstractNum w:abstractNumId="67" w15:restartNumberingAfterBreak="0">
     <w:nsid w:val="4A236E9D"/>
     <w:multiLevelType w:val="hybridMultilevel"/>
     <w:tmpl w:val="9F9812D0"/>
@@ -25098,7 +27341,7 @@
       </w:rPr>
     </w:lvl>
   </w:abstractNum>
-  <w:abstractNum w:abstractNumId="65" w15:restartNumberingAfterBreak="0">
+  <w:abstractNum w:abstractNumId="68" w15:restartNumberingAfterBreak="0">
     <w:nsid w:val="4A5F55A9"/>
     <w:multiLevelType w:val="hybridMultilevel"/>
     <w:tmpl w:val="0D3AC080"/>
@@ -25210,7 +27453,7 @@
       </w:rPr>
     </w:lvl>
   </w:abstractNum>
-  <w:abstractNum w:abstractNumId="66" w15:restartNumberingAfterBreak="0">
+  <w:abstractNum w:abstractNumId="69" w15:restartNumberingAfterBreak="0">
     <w:nsid w:val="4A753E2F"/>
     <w:multiLevelType w:val="multilevel"/>
     <w:tmpl w:val="AABC8488"/>
@@ -25359,7 +27602,7 @@
       </w:rPr>
     </w:lvl>
   </w:abstractNum>
-  <w:abstractNum w:abstractNumId="67" w15:restartNumberingAfterBreak="0">
+  <w:abstractNum w:abstractNumId="70" w15:restartNumberingAfterBreak="0">
     <w:nsid w:val="4BB76C74"/>
     <w:multiLevelType w:val="hybridMultilevel"/>
     <w:tmpl w:val="D5303D68"/>
@@ -25471,7 +27714,7 @@
       </w:rPr>
     </w:lvl>
   </w:abstractNum>
-  <w:abstractNum w:abstractNumId="68" w15:restartNumberingAfterBreak="0">
+  <w:abstractNum w:abstractNumId="71" w15:restartNumberingAfterBreak="0">
     <w:nsid w:val="4DA617C0"/>
     <w:multiLevelType w:val="hybridMultilevel"/>
     <w:tmpl w:val="CBB6B620"/>
@@ -25583,7 +27826,7 @@
       </w:rPr>
     </w:lvl>
   </w:abstractNum>
-  <w:abstractNum w:abstractNumId="69" w15:restartNumberingAfterBreak="0">
+  <w:abstractNum w:abstractNumId="72" w15:restartNumberingAfterBreak="0">
     <w:nsid w:val="4E3A3B25"/>
     <w:multiLevelType w:val="hybridMultilevel"/>
     <w:tmpl w:val="99AA89AC"/>
@@ -25695,7 +27938,7 @@
       </w:rPr>
     </w:lvl>
   </w:abstractNum>
-  <w:abstractNum w:abstractNumId="70" w15:restartNumberingAfterBreak="0">
+  <w:abstractNum w:abstractNumId="73" w15:restartNumberingAfterBreak="0">
     <w:nsid w:val="4F2C133C"/>
     <w:multiLevelType w:val="multilevel"/>
     <w:tmpl w:val="25603220"/>
@@ -25844,7 +28087,7 @@
       </w:rPr>
     </w:lvl>
   </w:abstractNum>
-  <w:abstractNum w:abstractNumId="71" w15:restartNumberingAfterBreak="0">
+  <w:abstractNum w:abstractNumId="74" w15:restartNumberingAfterBreak="0">
     <w:nsid w:val="50256ADE"/>
     <w:multiLevelType w:val="hybridMultilevel"/>
     <w:tmpl w:val="0818EA64"/>
@@ -25956,7 +28199,7 @@
       </w:rPr>
     </w:lvl>
   </w:abstractNum>
-  <w:abstractNum w:abstractNumId="72" w15:restartNumberingAfterBreak="0">
+  <w:abstractNum w:abstractNumId="75" w15:restartNumberingAfterBreak="0">
     <w:nsid w:val="51713097"/>
     <w:multiLevelType w:val="multilevel"/>
     <w:tmpl w:val="AB2C4482"/>
@@ -26105,7 +28348,7 @@
       </w:rPr>
     </w:lvl>
   </w:abstractNum>
-  <w:abstractNum w:abstractNumId="73" w15:restartNumberingAfterBreak="0">
+  <w:abstractNum w:abstractNumId="76" w15:restartNumberingAfterBreak="0">
     <w:nsid w:val="51975149"/>
     <w:multiLevelType w:val="hybridMultilevel"/>
     <w:tmpl w:val="2EF4D1CA"/>
@@ -26218,7 +28461,7 @@
       </w:rPr>
     </w:lvl>
   </w:abstractNum>
-  <w:abstractNum w:abstractNumId="74" w15:restartNumberingAfterBreak="0">
+  <w:abstractNum w:abstractNumId="77" w15:restartNumberingAfterBreak="0">
     <w:nsid w:val="522764ED"/>
     <w:multiLevelType w:val="hybridMultilevel"/>
     <w:tmpl w:val="DAFA377A"/>
@@ -26307,7 +28550,7 @@
       </w:pPr>
     </w:lvl>
   </w:abstractNum>
-  <w:abstractNum w:abstractNumId="75" w15:restartNumberingAfterBreak="0">
+  <w:abstractNum w:abstractNumId="78" w15:restartNumberingAfterBreak="0">
     <w:nsid w:val="53FB0753"/>
     <w:multiLevelType w:val="hybridMultilevel"/>
     <w:tmpl w:val="36C23286"/>
@@ -26419,7 +28662,7 @@
       </w:rPr>
     </w:lvl>
   </w:abstractNum>
-  <w:abstractNum w:abstractNumId="76" w15:restartNumberingAfterBreak="0">
+  <w:abstractNum w:abstractNumId="79" w15:restartNumberingAfterBreak="0">
     <w:nsid w:val="54CD7F04"/>
     <w:multiLevelType w:val="multilevel"/>
     <w:tmpl w:val="020E20BE"/>
@@ -26532,7 +28775,7 @@
       </w:pPr>
     </w:lvl>
   </w:abstractNum>
-  <w:abstractNum w:abstractNumId="77" w15:restartNumberingAfterBreak="0">
+  <w:abstractNum w:abstractNumId="80" w15:restartNumberingAfterBreak="0">
     <w:nsid w:val="56A967D5"/>
     <w:multiLevelType w:val="hybridMultilevel"/>
     <w:tmpl w:val="4AD2C76C"/>
@@ -26644,7 +28887,7 @@
       </w:rPr>
     </w:lvl>
   </w:abstractNum>
-  <w:abstractNum w:abstractNumId="78" w15:restartNumberingAfterBreak="0">
+  <w:abstractNum w:abstractNumId="81" w15:restartNumberingAfterBreak="0">
     <w:nsid w:val="578F4A30"/>
     <w:multiLevelType w:val="multilevel"/>
     <w:tmpl w:val="AA3C5686"/>
@@ -26793,7 +29036,7 @@
       </w:rPr>
     </w:lvl>
   </w:abstractNum>
-  <w:abstractNum w:abstractNumId="79" w15:restartNumberingAfterBreak="0">
+  <w:abstractNum w:abstractNumId="82" w15:restartNumberingAfterBreak="0">
     <w:nsid w:val="57F8144A"/>
     <w:multiLevelType w:val="hybridMultilevel"/>
     <w:tmpl w:val="1F8208A2"/>
@@ -26905,7 +29148,7 @@
       </w:rPr>
     </w:lvl>
   </w:abstractNum>
-  <w:abstractNum w:abstractNumId="80" w15:restartNumberingAfterBreak="0">
+  <w:abstractNum w:abstractNumId="83" w15:restartNumberingAfterBreak="0">
     <w:nsid w:val="57FA4B86"/>
     <w:multiLevelType w:val="hybridMultilevel"/>
     <w:tmpl w:val="24E2749A"/>
@@ -27017,7 +29260,7 @@
       </w:rPr>
     </w:lvl>
   </w:abstractNum>
-  <w:abstractNum w:abstractNumId="81" w15:restartNumberingAfterBreak="0">
+  <w:abstractNum w:abstractNumId="84" w15:restartNumberingAfterBreak="0">
     <w:nsid w:val="59A37E1D"/>
     <w:multiLevelType w:val="multilevel"/>
     <w:tmpl w:val="C77A0876"/>
@@ -27166,7 +29409,7 @@
       </w:rPr>
     </w:lvl>
   </w:abstractNum>
-  <w:abstractNum w:abstractNumId="82" w15:restartNumberingAfterBreak="0">
+  <w:abstractNum w:abstractNumId="85" w15:restartNumberingAfterBreak="0">
     <w:nsid w:val="5AC635B5"/>
     <w:multiLevelType w:val="hybridMultilevel"/>
     <w:tmpl w:val="51A0E17A"/>
@@ -27278,7 +29521,7 @@
       </w:rPr>
     </w:lvl>
   </w:abstractNum>
-  <w:abstractNum w:abstractNumId="83" w15:restartNumberingAfterBreak="0">
+  <w:abstractNum w:abstractNumId="86" w15:restartNumberingAfterBreak="0">
     <w:nsid w:val="5D3D35B1"/>
     <w:multiLevelType w:val="multilevel"/>
     <w:tmpl w:val="1DB64FCA"/>
@@ -27427,7 +29670,7 @@
       </w:rPr>
     </w:lvl>
   </w:abstractNum>
-  <w:abstractNum w:abstractNumId="84" w15:restartNumberingAfterBreak="0">
+  <w:abstractNum w:abstractNumId="87" w15:restartNumberingAfterBreak="0">
     <w:nsid w:val="5D751E17"/>
     <w:multiLevelType w:val="multilevel"/>
     <w:tmpl w:val="02722D60"/>
@@ -27576,7 +29819,7 @@
       </w:rPr>
     </w:lvl>
   </w:abstractNum>
-  <w:abstractNum w:abstractNumId="85" w15:restartNumberingAfterBreak="0">
+  <w:abstractNum w:abstractNumId="88" w15:restartNumberingAfterBreak="0">
     <w:nsid w:val="5DCE038E"/>
     <w:multiLevelType w:val="multilevel"/>
     <w:tmpl w:val="15907428"/>
@@ -27725,7 +29968,7 @@
       </w:rPr>
     </w:lvl>
   </w:abstractNum>
-  <w:abstractNum w:abstractNumId="86" w15:restartNumberingAfterBreak="0">
+  <w:abstractNum w:abstractNumId="89" w15:restartNumberingAfterBreak="0">
     <w:nsid w:val="5E8562F4"/>
     <w:multiLevelType w:val="multilevel"/>
     <w:tmpl w:val="E0D01132"/>
@@ -27874,7 +30117,7 @@
       </w:rPr>
     </w:lvl>
   </w:abstractNum>
-  <w:abstractNum w:abstractNumId="87" w15:restartNumberingAfterBreak="0">
+  <w:abstractNum w:abstractNumId="90" w15:restartNumberingAfterBreak="0">
     <w:nsid w:val="5E9D7FF9"/>
     <w:multiLevelType w:val="hybridMultilevel"/>
     <w:tmpl w:val="9FEC9846"/>
@@ -27987,7 +30230,7 @@
       </w:rPr>
     </w:lvl>
   </w:abstractNum>
-  <w:abstractNum w:abstractNumId="88" w15:restartNumberingAfterBreak="0">
+  <w:abstractNum w:abstractNumId="91" w15:restartNumberingAfterBreak="0">
     <w:nsid w:val="5FC668DA"/>
     <w:multiLevelType w:val="multilevel"/>
     <w:tmpl w:val="684224A0"/>
@@ -28136,7 +30379,7 @@
       </w:rPr>
     </w:lvl>
   </w:abstractNum>
-  <w:abstractNum w:abstractNumId="89" w15:restartNumberingAfterBreak="0">
+  <w:abstractNum w:abstractNumId="92" w15:restartNumberingAfterBreak="0">
     <w:nsid w:val="641534EF"/>
     <w:multiLevelType w:val="multilevel"/>
     <w:tmpl w:val="D9F652B8"/>
@@ -28249,7 +30492,7 @@
       </w:pPr>
     </w:lvl>
   </w:abstractNum>
-  <w:abstractNum w:abstractNumId="90" w15:restartNumberingAfterBreak="0">
+  <w:abstractNum w:abstractNumId="93" w15:restartNumberingAfterBreak="0">
     <w:nsid w:val="66C01D91"/>
     <w:multiLevelType w:val="hybridMultilevel"/>
     <w:tmpl w:val="056EB786"/>
@@ -28362,7 +30605,7 @@
       </w:rPr>
     </w:lvl>
   </w:abstractNum>
-  <w:abstractNum w:abstractNumId="91" w15:restartNumberingAfterBreak="0">
+  <w:abstractNum w:abstractNumId="94" w15:restartNumberingAfterBreak="0">
     <w:nsid w:val="68FF3E14"/>
     <w:multiLevelType w:val="hybridMultilevel"/>
     <w:tmpl w:val="852ED156"/>
@@ -28474,7 +30717,7 @@
       </w:rPr>
     </w:lvl>
   </w:abstractNum>
-  <w:abstractNum w:abstractNumId="92" w15:restartNumberingAfterBreak="0">
+  <w:abstractNum w:abstractNumId="95" w15:restartNumberingAfterBreak="0">
     <w:nsid w:val="6B531966"/>
     <w:multiLevelType w:val="hybridMultilevel"/>
     <w:tmpl w:val="2758CFC0"/>
@@ -28586,7 +30829,7 @@
       </w:rPr>
     </w:lvl>
   </w:abstractNum>
-  <w:abstractNum w:abstractNumId="93" w15:restartNumberingAfterBreak="0">
+  <w:abstractNum w:abstractNumId="96" w15:restartNumberingAfterBreak="0">
     <w:nsid w:val="6C181A8F"/>
     <w:multiLevelType w:val="hybridMultilevel"/>
     <w:tmpl w:val="AE1A9754"/>
@@ -28698,7 +30941,7 @@
       </w:rPr>
     </w:lvl>
   </w:abstractNum>
-  <w:abstractNum w:abstractNumId="94" w15:restartNumberingAfterBreak="0">
+  <w:abstractNum w:abstractNumId="97" w15:restartNumberingAfterBreak="0">
     <w:nsid w:val="6C3D39F9"/>
     <w:multiLevelType w:val="multilevel"/>
     <w:tmpl w:val="AD68E6B4"/>
@@ -28847,7 +31090,7 @@
       </w:rPr>
     </w:lvl>
   </w:abstractNum>
-  <w:abstractNum w:abstractNumId="95" w15:restartNumberingAfterBreak="0">
+  <w:abstractNum w:abstractNumId="98" w15:restartNumberingAfterBreak="0">
     <w:nsid w:val="6C52622C"/>
     <w:multiLevelType w:val="multilevel"/>
     <w:tmpl w:val="F8B03172"/>
@@ -28996,7 +31239,7 @@
       </w:rPr>
     </w:lvl>
   </w:abstractNum>
-  <w:abstractNum w:abstractNumId="96" w15:restartNumberingAfterBreak="0">
+  <w:abstractNum w:abstractNumId="99" w15:restartNumberingAfterBreak="0">
     <w:nsid w:val="6D674DC7"/>
     <w:multiLevelType w:val="multilevel"/>
     <w:tmpl w:val="4342CC68"/>
@@ -29145,7 +31388,7 @@
       </w:rPr>
     </w:lvl>
   </w:abstractNum>
-  <w:abstractNum w:abstractNumId="97" w15:restartNumberingAfterBreak="0">
+  <w:abstractNum w:abstractNumId="100" w15:restartNumberingAfterBreak="0">
     <w:nsid w:val="6E08011E"/>
     <w:multiLevelType w:val="hybridMultilevel"/>
     <w:tmpl w:val="33DE4EDC"/>
@@ -29257,7 +31500,7 @@
       </w:rPr>
     </w:lvl>
   </w:abstractNum>
-  <w:abstractNum w:abstractNumId="98" w15:restartNumberingAfterBreak="0">
+  <w:abstractNum w:abstractNumId="101" w15:restartNumberingAfterBreak="0">
     <w:nsid w:val="71C01D39"/>
     <w:multiLevelType w:val="multilevel"/>
     <w:tmpl w:val="7C4E5656"/>
@@ -29406,7 +31649,7 @@
       </w:rPr>
     </w:lvl>
   </w:abstractNum>
-  <w:abstractNum w:abstractNumId="99" w15:restartNumberingAfterBreak="0">
+  <w:abstractNum w:abstractNumId="102" w15:restartNumberingAfterBreak="0">
     <w:nsid w:val="722717AC"/>
     <w:multiLevelType w:val="hybridMultilevel"/>
     <w:tmpl w:val="935CC4B6"/>
@@ -29518,7 +31761,7 @@
       </w:rPr>
     </w:lvl>
   </w:abstractNum>
-  <w:abstractNum w:abstractNumId="100" w15:restartNumberingAfterBreak="0">
+  <w:abstractNum w:abstractNumId="103" w15:restartNumberingAfterBreak="0">
     <w:nsid w:val="7266168E"/>
     <w:multiLevelType w:val="hybridMultilevel"/>
     <w:tmpl w:val="163AFB96"/>
@@ -29630,7 +31873,7 @@
       </w:rPr>
     </w:lvl>
   </w:abstractNum>
-  <w:abstractNum w:abstractNumId="101" w15:restartNumberingAfterBreak="0">
+  <w:abstractNum w:abstractNumId="104" w15:restartNumberingAfterBreak="0">
     <w:nsid w:val="743E3484"/>
     <w:multiLevelType w:val="hybridMultilevel"/>
     <w:tmpl w:val="F148EE2C"/>
@@ -29743,7 +31986,7 @@
       </w:rPr>
     </w:lvl>
   </w:abstractNum>
-  <w:abstractNum w:abstractNumId="102" w15:restartNumberingAfterBreak="0">
+  <w:abstractNum w:abstractNumId="105" w15:restartNumberingAfterBreak="0">
     <w:nsid w:val="777C1D77"/>
     <w:multiLevelType w:val="hybridMultilevel"/>
     <w:tmpl w:val="2D0210B8"/>
@@ -29855,7 +32098,7 @@
       </w:rPr>
     </w:lvl>
   </w:abstractNum>
-  <w:abstractNum w:abstractNumId="103" w15:restartNumberingAfterBreak="0">
+  <w:abstractNum w:abstractNumId="106" w15:restartNumberingAfterBreak="0">
     <w:nsid w:val="79033895"/>
     <w:multiLevelType w:val="hybridMultilevel"/>
     <w:tmpl w:val="D0EC68D0"/>
@@ -29967,7 +32210,7 @@
       </w:rPr>
     </w:lvl>
   </w:abstractNum>
-  <w:abstractNum w:abstractNumId="104" w15:restartNumberingAfterBreak="0">
+  <w:abstractNum w:abstractNumId="107" w15:restartNumberingAfterBreak="0">
     <w:nsid w:val="79254661"/>
     <w:multiLevelType w:val="multilevel"/>
     <w:tmpl w:val="577EED92"/>
@@ -30116,7 +32359,7 @@
       </w:rPr>
     </w:lvl>
   </w:abstractNum>
-  <w:abstractNum w:abstractNumId="105" w15:restartNumberingAfterBreak="0">
+  <w:abstractNum w:abstractNumId="108" w15:restartNumberingAfterBreak="0">
     <w:nsid w:val="7A8751EA"/>
     <w:multiLevelType w:val="multilevel"/>
     <w:tmpl w:val="ADFE54B8"/>
@@ -30265,7 +32508,7 @@
       </w:rPr>
     </w:lvl>
   </w:abstractNum>
-  <w:abstractNum w:abstractNumId="106" w15:restartNumberingAfterBreak="0">
+  <w:abstractNum w:abstractNumId="109" w15:restartNumberingAfterBreak="0">
     <w:nsid w:val="7BB76968"/>
     <w:multiLevelType w:val="hybridMultilevel"/>
     <w:tmpl w:val="F1945E5E"/>
@@ -30377,7 +32620,7 @@
       </w:rPr>
     </w:lvl>
   </w:abstractNum>
-  <w:abstractNum w:abstractNumId="107" w15:restartNumberingAfterBreak="0">
+  <w:abstractNum w:abstractNumId="110" w15:restartNumberingAfterBreak="0">
     <w:nsid w:val="7D0F73BE"/>
     <w:multiLevelType w:val="multilevel"/>
     <w:tmpl w:val="283CE29A"/>
@@ -30526,7 +32769,7 @@
       </w:rPr>
     </w:lvl>
   </w:abstractNum>
-  <w:abstractNum w:abstractNumId="108" w15:restartNumberingAfterBreak="0">
+  <w:abstractNum w:abstractNumId="111" w15:restartNumberingAfterBreak="0">
     <w:nsid w:val="7E1427B3"/>
     <w:multiLevelType w:val="multilevel"/>
     <w:tmpl w:val="760E8CDE"/>
@@ -30682,202 +32925,202 @@
     <w:abstractNumId w:val="8"/>
   </w:num>
   <w:num w:numId="3" w16cid:durableId="1080636982">
-    <w:abstractNumId w:val="70"/>
+    <w:abstractNumId w:val="73"/>
   </w:num>
   <w:num w:numId="4" w16cid:durableId="716128754">
-    <w:abstractNumId w:val="27"/>
+    <w:abstractNumId w:val="28"/>
   </w:num>
   <w:num w:numId="5" w16cid:durableId="1356880465">
-    <w:abstractNumId w:val="104"/>
+    <w:abstractNumId w:val="107"/>
   </w:num>
   <w:num w:numId="6" w16cid:durableId="1210613002">
-    <w:abstractNumId w:val="19"/>
+    <w:abstractNumId w:val="20"/>
   </w:num>
   <w:num w:numId="7" w16cid:durableId="2002191770">
-    <w:abstractNumId w:val="55"/>
+    <w:abstractNumId w:val="57"/>
   </w:num>
   <w:num w:numId="8" w16cid:durableId="998534124">
-    <w:abstractNumId w:val="35"/>
+    <w:abstractNumId w:val="36"/>
   </w:num>
   <w:num w:numId="9" w16cid:durableId="523247384">
-    <w:abstractNumId w:val="96"/>
+    <w:abstractNumId w:val="99"/>
   </w:num>
   <w:num w:numId="10" w16cid:durableId="261114341">
     <w:abstractNumId w:val="15"/>
   </w:num>
   <w:num w:numId="11" w16cid:durableId="987244375">
-    <w:abstractNumId w:val="105"/>
+    <w:abstractNumId w:val="108"/>
   </w:num>
   <w:num w:numId="12" w16cid:durableId="1765805581">
     <w:abstractNumId w:val="9"/>
   </w:num>
   <w:num w:numId="13" w16cid:durableId="820117559">
-    <w:abstractNumId w:val="90"/>
+    <w:abstractNumId w:val="93"/>
   </w:num>
   <w:num w:numId="14" w16cid:durableId="452291802">
-    <w:abstractNumId w:val="39"/>
+    <w:abstractNumId w:val="40"/>
   </w:num>
   <w:num w:numId="15" w16cid:durableId="71853967">
-    <w:abstractNumId w:val="26"/>
+    <w:abstractNumId w:val="27"/>
   </w:num>
   <w:num w:numId="16" w16cid:durableId="1587035945">
-    <w:abstractNumId w:val="53"/>
+    <w:abstractNumId w:val="55"/>
   </w:num>
   <w:num w:numId="17" w16cid:durableId="1439452709">
-    <w:abstractNumId w:val="45"/>
+    <w:abstractNumId w:val="47"/>
   </w:num>
   <w:num w:numId="18" w16cid:durableId="1627157179">
-    <w:abstractNumId w:val="73"/>
+    <w:abstractNumId w:val="76"/>
   </w:num>
   <w:num w:numId="19" w16cid:durableId="1214316601">
-    <w:abstractNumId w:val="58"/>
+    <w:abstractNumId w:val="60"/>
   </w:num>
   <w:num w:numId="20" w16cid:durableId="1685471909">
     <w:abstractNumId w:val="2"/>
   </w:num>
   <w:num w:numId="21" w16cid:durableId="914435209">
-    <w:abstractNumId w:val="40"/>
+    <w:abstractNumId w:val="41"/>
   </w:num>
   <w:num w:numId="22" w16cid:durableId="1255505909">
-    <w:abstractNumId w:val="34"/>
+    <w:abstractNumId w:val="35"/>
   </w:num>
   <w:num w:numId="23" w16cid:durableId="529799065">
     <w:abstractNumId w:val="11"/>
   </w:num>
   <w:num w:numId="24" w16cid:durableId="1664163106">
-    <w:abstractNumId w:val="87"/>
+    <w:abstractNumId w:val="90"/>
   </w:num>
   <w:num w:numId="25" w16cid:durableId="1714576960">
-    <w:abstractNumId w:val="17"/>
+    <w:abstractNumId w:val="18"/>
   </w:num>
   <w:num w:numId="26" w16cid:durableId="2121341683">
-    <w:abstractNumId w:val="23"/>
+    <w:abstractNumId w:val="24"/>
   </w:num>
   <w:num w:numId="27" w16cid:durableId="827793205">
-    <w:abstractNumId w:val="101"/>
+    <w:abstractNumId w:val="104"/>
   </w:num>
   <w:num w:numId="28" w16cid:durableId="1275989163">
-    <w:abstractNumId w:val="51"/>
+    <w:abstractNumId w:val="53"/>
   </w:num>
   <w:num w:numId="29" w16cid:durableId="621544332">
-    <w:abstractNumId w:val="61"/>
+    <w:abstractNumId w:val="64"/>
   </w:num>
   <w:num w:numId="30" w16cid:durableId="1089692455">
     <w:abstractNumId w:val="12"/>
   </w:num>
   <w:num w:numId="31" w16cid:durableId="1926265000">
-    <w:abstractNumId w:val="29"/>
+    <w:abstractNumId w:val="30"/>
   </w:num>
   <w:num w:numId="32" w16cid:durableId="2092268856">
     <w:abstractNumId w:val="13"/>
   </w:num>
   <w:num w:numId="33" w16cid:durableId="46222972">
-    <w:abstractNumId w:val="31"/>
+    <w:abstractNumId w:val="32"/>
   </w:num>
   <w:num w:numId="34" w16cid:durableId="721440043">
+    <w:abstractNumId w:val="70"/>
+  </w:num>
+  <w:num w:numId="35" w16cid:durableId="1074085621">
+    <w:abstractNumId w:val="96"/>
+  </w:num>
+  <w:num w:numId="36" w16cid:durableId="164785594">
+    <w:abstractNumId w:val="66"/>
+  </w:num>
+  <w:num w:numId="37" w16cid:durableId="1690908687">
     <w:abstractNumId w:val="67"/>
   </w:num>
-  <w:num w:numId="35" w16cid:durableId="1074085621">
-    <w:abstractNumId w:val="93"/>
-  </w:num>
-  <w:num w:numId="36" w16cid:durableId="164785594">
-    <w:abstractNumId w:val="63"/>
-  </w:num>
-  <w:num w:numId="37" w16cid:durableId="1690908687">
-    <w:abstractNumId w:val="64"/>
-  </w:num>
   <w:num w:numId="38" w16cid:durableId="1494486041">
-    <w:abstractNumId w:val="49"/>
+    <w:abstractNumId w:val="51"/>
   </w:num>
   <w:num w:numId="39" w16cid:durableId="301084558">
-    <w:abstractNumId w:val="18"/>
+    <w:abstractNumId w:val="19"/>
   </w:num>
   <w:num w:numId="40" w16cid:durableId="1202018679">
-    <w:abstractNumId w:val="100"/>
+    <w:abstractNumId w:val="103"/>
   </w:num>
   <w:num w:numId="41" w16cid:durableId="696003112">
-    <w:abstractNumId w:val="106"/>
+    <w:abstractNumId w:val="109"/>
   </w:num>
   <w:num w:numId="42" w16cid:durableId="1488278798">
-    <w:abstractNumId w:val="60"/>
+    <w:abstractNumId w:val="62"/>
   </w:num>
   <w:num w:numId="43" w16cid:durableId="630794293">
-    <w:abstractNumId w:val="59"/>
+    <w:abstractNumId w:val="61"/>
   </w:num>
   <w:num w:numId="44" w16cid:durableId="170145410">
-    <w:abstractNumId w:val="77"/>
+    <w:abstractNumId w:val="80"/>
   </w:num>
   <w:num w:numId="45" w16cid:durableId="127862477">
-    <w:abstractNumId w:val="20"/>
+    <w:abstractNumId w:val="21"/>
   </w:num>
   <w:num w:numId="46" w16cid:durableId="105513983">
-    <w:abstractNumId w:val="92"/>
+    <w:abstractNumId w:val="95"/>
   </w:num>
   <w:num w:numId="47" w16cid:durableId="1514762862">
-    <w:abstractNumId w:val="25"/>
+    <w:abstractNumId w:val="26"/>
   </w:num>
   <w:num w:numId="48" w16cid:durableId="2091274094">
     <w:abstractNumId w:val="4"/>
   </w:num>
   <w:num w:numId="49" w16cid:durableId="1099376477">
-    <w:abstractNumId w:val="57"/>
+    <w:abstractNumId w:val="59"/>
   </w:num>
   <w:num w:numId="50" w16cid:durableId="1000231748">
     <w:abstractNumId w:val="14"/>
   </w:num>
   <w:num w:numId="51" w16cid:durableId="1626617711">
-    <w:abstractNumId w:val="65"/>
+    <w:abstractNumId w:val="68"/>
   </w:num>
   <w:num w:numId="52" w16cid:durableId="853420226">
-    <w:abstractNumId w:val="80"/>
+    <w:abstractNumId w:val="83"/>
   </w:num>
   <w:num w:numId="53" w16cid:durableId="1519540791">
-    <w:abstractNumId w:val="56"/>
+    <w:abstractNumId w:val="58"/>
   </w:num>
   <w:num w:numId="54" w16cid:durableId="1148135894">
-    <w:abstractNumId w:val="46"/>
+    <w:abstractNumId w:val="48"/>
   </w:num>
   <w:num w:numId="55" w16cid:durableId="1808281118">
-    <w:abstractNumId w:val="91"/>
+    <w:abstractNumId w:val="94"/>
   </w:num>
   <w:num w:numId="56" w16cid:durableId="1758408107">
-    <w:abstractNumId w:val="42"/>
+    <w:abstractNumId w:val="43"/>
   </w:num>
   <w:num w:numId="57" w16cid:durableId="820270538">
     <w:abstractNumId w:val="1"/>
   </w:num>
   <w:num w:numId="58" w16cid:durableId="433135565">
-    <w:abstractNumId w:val="47"/>
+    <w:abstractNumId w:val="49"/>
   </w:num>
   <w:num w:numId="59" w16cid:durableId="1891763306">
-    <w:abstractNumId w:val="102"/>
+    <w:abstractNumId w:val="105"/>
   </w:num>
   <w:num w:numId="60" w16cid:durableId="252595352">
-    <w:abstractNumId w:val="36"/>
+    <w:abstractNumId w:val="37"/>
   </w:num>
   <w:num w:numId="61" w16cid:durableId="43599653">
-    <w:abstractNumId w:val="24"/>
+    <w:abstractNumId w:val="25"/>
   </w:num>
   <w:num w:numId="62" w16cid:durableId="1724282809">
-    <w:abstractNumId w:val="69"/>
+    <w:abstractNumId w:val="72"/>
   </w:num>
   <w:num w:numId="63" w16cid:durableId="1221207068">
     <w:abstractNumId w:val="3"/>
   </w:num>
   <w:num w:numId="64" w16cid:durableId="1494025353">
-    <w:abstractNumId w:val="43"/>
+    <w:abstractNumId w:val="45"/>
   </w:num>
   <w:num w:numId="65" w16cid:durableId="869296667">
-    <w:abstractNumId w:val="68"/>
+    <w:abstractNumId w:val="71"/>
   </w:num>
   <w:num w:numId="66" w16cid:durableId="91706771">
-    <w:abstractNumId w:val="22"/>
+    <w:abstractNumId w:val="23"/>
   </w:num>
   <w:num w:numId="67" w16cid:durableId="2083485411">
-    <w:abstractNumId w:val="30"/>
+    <w:abstractNumId w:val="31"/>
   </w:num>
   <w:num w:numId="68" w16cid:durableId="34044173">
-    <w:abstractNumId w:val="44"/>
+    <w:abstractNumId w:val="46"/>
   </w:num>
   <w:num w:numId="69" w16cid:durableId="1958246351">
     <w:abstractNumId w:val="16"/>
@@ -30886,121 +33129,130 @@
     <w:abstractNumId w:val="10"/>
   </w:num>
   <w:num w:numId="71" w16cid:durableId="389354266">
-    <w:abstractNumId w:val="99"/>
+    <w:abstractNumId w:val="102"/>
   </w:num>
   <w:num w:numId="72" w16cid:durableId="1195070258">
-    <w:abstractNumId w:val="97"/>
+    <w:abstractNumId w:val="100"/>
   </w:num>
   <w:num w:numId="73" w16cid:durableId="1972049655">
-    <w:abstractNumId w:val="50"/>
+    <w:abstractNumId w:val="52"/>
   </w:num>
   <w:num w:numId="74" w16cid:durableId="1499272371">
-    <w:abstractNumId w:val="71"/>
+    <w:abstractNumId w:val="74"/>
   </w:num>
   <w:num w:numId="75" w16cid:durableId="1796026856">
-    <w:abstractNumId w:val="79"/>
+    <w:abstractNumId w:val="82"/>
   </w:num>
   <w:num w:numId="76" w16cid:durableId="1229995767">
-    <w:abstractNumId w:val="82"/>
+    <w:abstractNumId w:val="85"/>
   </w:num>
   <w:num w:numId="77" w16cid:durableId="1817409612">
-    <w:abstractNumId w:val="75"/>
+    <w:abstractNumId w:val="78"/>
   </w:num>
   <w:num w:numId="78" w16cid:durableId="1134832258">
-    <w:abstractNumId w:val="103"/>
+    <w:abstractNumId w:val="106"/>
   </w:num>
   <w:num w:numId="79" w16cid:durableId="1911575055">
-    <w:abstractNumId w:val="52"/>
+    <w:abstractNumId w:val="54"/>
   </w:num>
   <w:num w:numId="80" w16cid:durableId="1638756930">
-    <w:abstractNumId w:val="32"/>
+    <w:abstractNumId w:val="33"/>
   </w:num>
   <w:num w:numId="81" w16cid:durableId="427506740">
-    <w:abstractNumId w:val="86"/>
+    <w:abstractNumId w:val="89"/>
   </w:num>
   <w:num w:numId="82" w16cid:durableId="513149297">
-    <w:abstractNumId w:val="74"/>
+    <w:abstractNumId w:val="77"/>
   </w:num>
   <w:num w:numId="83" w16cid:durableId="548422958">
-    <w:abstractNumId w:val="37"/>
+    <w:abstractNumId w:val="38"/>
   </w:num>
   <w:num w:numId="84" w16cid:durableId="931205951">
-    <w:abstractNumId w:val="95"/>
+    <w:abstractNumId w:val="98"/>
   </w:num>
   <w:num w:numId="85" w16cid:durableId="1261450898">
     <w:abstractNumId w:val="0"/>
   </w:num>
   <w:num w:numId="86" w16cid:durableId="470248295">
-    <w:abstractNumId w:val="62"/>
+    <w:abstractNumId w:val="65"/>
   </w:num>
   <w:num w:numId="87" w16cid:durableId="982394239">
-    <w:abstractNumId w:val="83"/>
+    <w:abstractNumId w:val="86"/>
   </w:num>
   <w:num w:numId="88" w16cid:durableId="2041782596">
-    <w:abstractNumId w:val="21"/>
+    <w:abstractNumId w:val="22"/>
   </w:num>
   <w:num w:numId="89" w16cid:durableId="558440056">
-    <w:abstractNumId w:val="28"/>
+    <w:abstractNumId w:val="29"/>
   </w:num>
   <w:num w:numId="90" w16cid:durableId="1366632968">
     <w:abstractNumId w:val="5"/>
   </w:num>
   <w:num w:numId="91" w16cid:durableId="329143539">
-    <w:abstractNumId w:val="48"/>
+    <w:abstractNumId w:val="50"/>
   </w:num>
   <w:num w:numId="92" w16cid:durableId="1194732434">
-    <w:abstractNumId w:val="98"/>
+    <w:abstractNumId w:val="101"/>
   </w:num>
   <w:num w:numId="93" w16cid:durableId="1126509868">
-    <w:abstractNumId w:val="41"/>
+    <w:abstractNumId w:val="42"/>
   </w:num>
   <w:num w:numId="94" w16cid:durableId="1586915427">
-    <w:abstractNumId w:val="108"/>
+    <w:abstractNumId w:val="111"/>
   </w:num>
   <w:num w:numId="95" w16cid:durableId="1985424155">
-    <w:abstractNumId w:val="66"/>
+    <w:abstractNumId w:val="69"/>
   </w:num>
   <w:num w:numId="96" w16cid:durableId="1503928418">
-    <w:abstractNumId w:val="107"/>
+    <w:abstractNumId w:val="110"/>
   </w:num>
   <w:num w:numId="97" w16cid:durableId="1523935396">
-    <w:abstractNumId w:val="33"/>
+    <w:abstractNumId w:val="34"/>
   </w:num>
   <w:num w:numId="98" w16cid:durableId="918711878">
-    <w:abstractNumId w:val="88"/>
+    <w:abstractNumId w:val="91"/>
   </w:num>
   <w:num w:numId="99" w16cid:durableId="1606887394">
-    <w:abstractNumId w:val="89"/>
+    <w:abstractNumId w:val="92"/>
   </w:num>
   <w:num w:numId="100" w16cid:durableId="1027754377">
-    <w:abstractNumId w:val="72"/>
+    <w:abstractNumId w:val="75"/>
   </w:num>
   <w:num w:numId="101" w16cid:durableId="826559138">
-    <w:abstractNumId w:val="76"/>
+    <w:abstractNumId w:val="79"/>
   </w:num>
   <w:num w:numId="102" w16cid:durableId="442727970">
-    <w:abstractNumId w:val="84"/>
+    <w:abstractNumId w:val="87"/>
   </w:num>
   <w:num w:numId="103" w16cid:durableId="1562517256">
-    <w:abstractNumId w:val="85"/>
+    <w:abstractNumId w:val="88"/>
   </w:num>
   <w:num w:numId="104" w16cid:durableId="89352316">
     <w:abstractNumId w:val="6"/>
   </w:num>
   <w:num w:numId="105" w16cid:durableId="844444982">
-    <w:abstractNumId w:val="38"/>
+    <w:abstractNumId w:val="39"/>
   </w:num>
   <w:num w:numId="106" w16cid:durableId="1434743620">
-    <w:abstractNumId w:val="78"/>
+    <w:abstractNumId w:val="81"/>
   </w:num>
   <w:num w:numId="107" w16cid:durableId="2108646521">
-    <w:abstractNumId w:val="81"/>
+    <w:abstractNumId w:val="84"/>
   </w:num>
   <w:num w:numId="108" w16cid:durableId="590892086">
-    <w:abstractNumId w:val="54"/>
+    <w:abstractNumId w:val="56"/>
   </w:num>
   <w:num w:numId="109" w16cid:durableId="357900316">
-    <w:abstractNumId w:val="94"/>
+    <w:abstractNumId w:val="97"/>
+  </w:num>
+  <w:num w:numId="110" w16cid:durableId="1764102689">
+    <w:abstractNumId w:val="44"/>
+  </w:num>
+  <w:num w:numId="111" w16cid:durableId="912198173">
+    <w:abstractNumId w:val="17"/>
+  </w:num>
+  <w:num w:numId="112" w16cid:durableId="1241789548">
+    <w:abstractNumId w:val="63"/>
   </w:num>
   <w:numIdMacAtCleanup w:val="102"/>
 </w:numbering>
@@ -31406,7 +33658,7 @@
   <w:style w:type="paragraph" w:default="1" w:styleId="Normal">
     <w:name w:val="Normal"/>
     <w:qFormat/>
-    <w:rsid w:val="005F7EC7"/>
+    <w:rsid w:val="00B86DD7"/>
   </w:style>
   <w:style w:type="paragraph" w:styleId="Heading1">
     <w:name w:val="heading 1"/>
@@ -31923,6 +34175,41 @@
       <w:spacing w:val="5"/>
     </w:rPr>
   </w:style>
+  <w:style w:type="character" w:styleId="Hyperlink">
+    <w:name w:val="Hyperlink"/>
+    <w:basedOn w:val="DefaultParagraphFont"/>
+    <w:uiPriority w:val="99"/>
+    <w:unhideWhenUsed/>
+    <w:rsid w:val="00AB2C02"/>
+    <w:rPr>
+      <w:color w:val="467886" w:themeColor="hyperlink"/>
+      <w:u w:val="single"/>
+    </w:rPr>
+  </w:style>
+  <w:style w:type="character" w:styleId="UnresolvedMention">
+    <w:name w:val="Unresolved Mention"/>
+    <w:basedOn w:val="DefaultParagraphFont"/>
+    <w:uiPriority w:val="99"/>
+    <w:semiHidden/>
+    <w:unhideWhenUsed/>
+    <w:rsid w:val="00AB2C02"/>
+    <w:rPr>
+      <w:color w:val="605E5C"/>
+      <w:shd w:val="clear" w:color="auto" w:fill="E1DFDD"/>
+    </w:rPr>
+  </w:style>
+  <w:style w:type="character" w:styleId="FollowedHyperlink">
+    <w:name w:val="FollowedHyperlink"/>
+    <w:basedOn w:val="DefaultParagraphFont"/>
+    <w:uiPriority w:val="99"/>
+    <w:semiHidden/>
+    <w:unhideWhenUsed/>
+    <w:rsid w:val="002F4E45"/>
+    <w:rPr>
+      <w:color w:val="96607D" w:themeColor="followedHyperlink"/>
+      <w:u w:val="single"/>
+    </w:rPr>
+  </w:style>
 </w:styles>
 </file>
 

</xml_diff>

<commit_message>
Sort EN rectors A-Z, harmonize Executive Board terms, and apply site audit fixes; rebuild Deployment.
Co-authored-by: Cursor <cursoragent@cursor.com>
</commit_message>
<xml_diff>
--- a/documents/docx/Prompts.docx
+++ b/documents/docx/Prompts.docx
@@ -24554,8 +24554,1342 @@
       <w:pPr>
         <w:spacing w:after="0" w:line="240" w:lineRule="auto"/>
         <w:ind w:left="360"/>
+      </w:pPr>
+    </w:p>
+    <w:p>
+      <w:pPr>
+        <w:spacing w:after="0" w:line="240" w:lineRule="auto"/>
+        <w:ind w:left="360"/>
+      </w:pPr>
+    </w:p>
+    <w:p>
+      <w:pPr>
+        <w:spacing w:after="0" w:line="240" w:lineRule="auto"/>
+        <w:ind w:left="360"/>
+      </w:pPr>
+      <w:r>
+        <w:t>Make the toggle button captions dynamic so that they always reflect the action that will be performed when clicked.</w:t>
+      </w:r>
+    </w:p>
+    <w:p>
+      <w:pPr>
+        <w:spacing w:after="0" w:line="240" w:lineRule="auto"/>
+        <w:ind w:left="360"/>
+      </w:pPr>
+      <w:r>
+        <w:t>Specifically:</w:t>
+      </w:r>
+    </w:p>
+    <w:p>
+      <w:pPr>
+        <w:numPr>
+          <w:ilvl w:val="0"/>
+          <w:numId w:val="140"/>
+        </w:numPr>
+        <w:spacing w:after="0" w:line="240" w:lineRule="auto"/>
+      </w:pPr>
+      <w:r>
+        <w:t xml:space="preserve">When all relevant items are currently </w:t>
+      </w:r>
+      <w:r>
+        <w:rPr>
+          <w:b/>
+          <w:bCs/>
+        </w:rPr>
+        <w:t>expanded</w:t>
+      </w:r>
+      <w:r>
+        <w:t xml:space="preserve">, the button caption should change to </w:t>
+      </w:r>
+      <w:r>
+        <w:rPr>
+          <w:b/>
+          <w:bCs/>
+        </w:rPr>
+        <w:t>"Collapse All Articles"</w:t>
+      </w:r>
+      <w:r>
+        <w:t xml:space="preserve"> or </w:t>
+      </w:r>
+      <w:r>
+        <w:rPr>
+          <w:b/>
+          <w:bCs/>
+        </w:rPr>
+        <w:t>"Collapse All Categories"</w:t>
+      </w:r>
+      <w:r>
+        <w:t>, indicating that clicking the button will collapse them.</w:t>
+      </w:r>
+    </w:p>
+    <w:p>
+      <w:pPr>
+        <w:numPr>
+          <w:ilvl w:val="0"/>
+          <w:numId w:val="140"/>
+        </w:numPr>
+        <w:spacing w:after="0" w:line="240" w:lineRule="auto"/>
+      </w:pPr>
+      <w:r>
+        <w:t xml:space="preserve">When all relevant items are currently </w:t>
+      </w:r>
+      <w:r>
+        <w:rPr>
+          <w:b/>
+          <w:bCs/>
+        </w:rPr>
+        <w:t>collapsed</w:t>
+      </w:r>
+      <w:r>
+        <w:t xml:space="preserve">, the button caption should change to </w:t>
+      </w:r>
+      <w:r>
+        <w:rPr>
+          <w:b/>
+          <w:bCs/>
+        </w:rPr>
+        <w:t>"Expand All Articles"</w:t>
+      </w:r>
+      <w:r>
+        <w:t xml:space="preserve"> or </w:t>
+      </w:r>
+      <w:r>
+        <w:rPr>
+          <w:b/>
+          <w:bCs/>
+        </w:rPr>
+        <w:t>"Expand All Categories"</w:t>
+      </w:r>
+      <w:r>
+        <w:t>, indicating that clicking the button will expand them.</w:t>
+      </w:r>
+    </w:p>
+    <w:p>
+      <w:pPr>
+        <w:numPr>
+          <w:ilvl w:val="0"/>
+          <w:numId w:val="140"/>
+        </w:numPr>
+        <w:spacing w:after="0" w:line="240" w:lineRule="auto"/>
+      </w:pPr>
+      <w:r>
+        <w:t>The button labels should update immediately after each action and always remain synchronized with the current state of the corresponding items.</w:t>
+      </w:r>
+    </w:p>
+    <w:p>
+      <w:pPr>
+        <w:numPr>
+          <w:ilvl w:val="0"/>
+          <w:numId w:val="140"/>
+        </w:numPr>
+        <w:spacing w:after="0" w:line="240" w:lineRule="auto"/>
+      </w:pPr>
+      <w:r>
+        <w:t>If a mixed state exists (some items expanded and some collapsed), determine a clear and consistent behavior and ensure the button caption accurately reflects the next action that will be performed.</w:t>
+      </w:r>
+    </w:p>
+    <w:p>
+      <w:pPr>
+        <w:numPr>
+          <w:ilvl w:val="0"/>
+          <w:numId w:val="140"/>
+        </w:numPr>
+        <w:spacing w:after="0" w:line="240" w:lineRule="auto"/>
+      </w:pPr>
+      <w:r>
+        <w:t>Update any associated icons, tooltips, accessibility labels, and ARIA attributes to match the current button state.</w:t>
+      </w:r>
+    </w:p>
+    <w:p>
+      <w:pPr>
+        <w:numPr>
+          <w:ilvl w:val="0"/>
+          <w:numId w:val="140"/>
+        </w:numPr>
+        <w:spacing w:after="0" w:line="240" w:lineRule="auto"/>
+      </w:pPr>
+      <w:r>
+        <w:t>Ensure the behavior is consistent across desktop, tablet, and mobile devices.</w:t>
+      </w:r>
+    </w:p>
+    <w:p>
+      <w:pPr>
+        <w:spacing w:after="0" w:line="240" w:lineRule="auto"/>
+        <w:ind w:left="360"/>
+      </w:pPr>
+      <w:r>
+        <w:t>The goal is to provide clear, intuitive controls that always communicate the action that will occur when the user clicks the button.</w:t>
+      </w:r>
+    </w:p>
+    <w:p>
+      <w:pPr>
+        <w:spacing w:after="0" w:line="240" w:lineRule="auto"/>
+        <w:ind w:left="360"/>
+      </w:pPr>
+    </w:p>
+    <w:p>
+      <w:pPr>
+        <w:spacing w:after="0" w:line="240" w:lineRule="auto"/>
+        <w:ind w:left="360"/>
+      </w:pPr>
+    </w:p>
+    <w:p>
+      <w:pPr>
+        <w:spacing w:after="0" w:line="240" w:lineRule="auto"/>
+        <w:ind w:left="360"/>
+      </w:pPr>
+      <w:r>
+        <w:t>Add descriptive labels to the two control panels to clearly indicate their purpose:</w:t>
+      </w:r>
+    </w:p>
+    <w:p>
+      <w:pPr>
+        <w:numPr>
+          <w:ilvl w:val="0"/>
+          <w:numId w:val="141"/>
+        </w:numPr>
+        <w:spacing w:after="0" w:line="240" w:lineRule="auto"/>
+      </w:pPr>
+      <w:r>
+        <w:rPr>
+          <w:b/>
+          <w:bCs/>
+        </w:rPr>
+        <w:t>Search and Filter</w:t>
+      </w:r>
+    </w:p>
+    <w:p>
+      <w:pPr>
+        <w:numPr>
+          <w:ilvl w:val="0"/>
+          <w:numId w:val="141"/>
+        </w:numPr>
+        <w:spacing w:after="0" w:line="240" w:lineRule="auto"/>
+      </w:pPr>
+      <w:r>
+        <w:rPr>
+          <w:b/>
+          <w:bCs/>
+        </w:rPr>
+        <w:t>View, Group, Sort</w:t>
+      </w:r>
+    </w:p>
+    <w:p>
+      <w:pPr>
+        <w:spacing w:after="0" w:line="240" w:lineRule="auto"/>
+        <w:ind w:left="360"/>
+      </w:pPr>
+      <w:r>
+        <w:t xml:space="preserve">Place each label at the </w:t>
+      </w:r>
+      <w:r>
+        <w:rPr>
+          <w:b/>
+          <w:bCs/>
+        </w:rPr>
+        <w:t>upper-left corner of its respective panel</w:t>
+      </w:r>
+      <w:r>
+        <w:t xml:space="preserve">, integrated into the </w:t>
+      </w:r>
+      <w:r>
+        <w:rPr>
+          <w:b/>
+          <w:bCs/>
+        </w:rPr>
+        <w:t>top border</w:t>
+      </w:r>
+      <w:r>
+        <w:t xml:space="preserve"> of the panel in a manner similar to a fieldset/legend design.</w:t>
+      </w:r>
+    </w:p>
+    <w:p>
+      <w:pPr>
+        <w:spacing w:after="0" w:line="240" w:lineRule="auto"/>
+        <w:ind w:left="360"/>
+      </w:pPr>
+      <w:r>
+        <w:t>Ensure that:</w:t>
+      </w:r>
+    </w:p>
+    <w:p>
+      <w:pPr>
+        <w:numPr>
+          <w:ilvl w:val="0"/>
+          <w:numId w:val="142"/>
+        </w:numPr>
+        <w:spacing w:after="0" w:line="240" w:lineRule="auto"/>
+      </w:pPr>
+      <w:r>
+        <w:t>The labels are visually attached to the panel borders rather than placed inside the panel content area.</w:t>
+      </w:r>
+    </w:p>
+    <w:p>
+      <w:pPr>
+        <w:numPr>
+          <w:ilvl w:val="0"/>
+          <w:numId w:val="142"/>
+        </w:numPr>
+        <w:spacing w:after="0" w:line="240" w:lineRule="auto"/>
+      </w:pPr>
+      <w:r>
+        <w:t>Typography, size, color, and styling are consistent with the overall UI/UX design.</w:t>
+      </w:r>
+    </w:p>
+    <w:p>
+      <w:pPr>
+        <w:numPr>
+          <w:ilvl w:val="0"/>
+          <w:numId w:val="142"/>
+        </w:numPr>
+        <w:spacing w:after="0" w:line="240" w:lineRule="auto"/>
+      </w:pPr>
+      <w:r>
+        <w:t>The labels remain clearly visible and readable without consuming excessive space.</w:t>
+      </w:r>
+    </w:p>
+    <w:p>
+      <w:pPr>
+        <w:numPr>
+          <w:ilvl w:val="0"/>
+          <w:numId w:val="142"/>
+        </w:numPr>
+        <w:spacing w:after="0" w:line="240" w:lineRule="auto"/>
+      </w:pPr>
+      <w:r>
+        <w:t>The panel borders adapt cleanly around the labels, creating a professional and polished appearance.</w:t>
+      </w:r>
+    </w:p>
+    <w:p>
+      <w:pPr>
+        <w:numPr>
+          <w:ilvl w:val="0"/>
+          <w:numId w:val="142"/>
+        </w:numPr>
+        <w:spacing w:after="0" w:line="240" w:lineRule="auto"/>
+      </w:pPr>
+      <w:r>
+        <w:t>The layout remains fully responsive across desktop, tablet, and mobile devices.</w:t>
+      </w:r>
+    </w:p>
+    <w:p>
+      <w:pPr>
+        <w:numPr>
+          <w:ilvl w:val="0"/>
+          <w:numId w:val="142"/>
+        </w:numPr>
+        <w:spacing w:after="0" w:line="240" w:lineRule="auto"/>
+      </w:pPr>
+      <w:r>
+        <w:lastRenderedPageBreak/>
+        <w:t>The addition of the labels does not affect the alignment or functionality of the controls contained within the panels.</w:t>
+      </w:r>
+    </w:p>
+    <w:p>
+      <w:pPr>
+        <w:spacing w:after="0" w:line="240" w:lineRule="auto"/>
+        <w:ind w:left="360"/>
+      </w:pPr>
+      <w:r>
+        <w:t>The goal is to improve usability and visual organization by making the purpose of each control panel immediately clear to users while maintaining a clean and modern design.</w:t>
+      </w:r>
+    </w:p>
+    <w:p>
+      <w:pPr>
+        <w:spacing w:after="0" w:line="240" w:lineRule="auto"/>
+        <w:ind w:left="360"/>
+      </w:pPr>
+    </w:p>
+    <w:p>
+      <w:pPr>
+        <w:spacing w:after="0" w:line="240" w:lineRule="auto"/>
+        <w:ind w:left="360"/>
+      </w:pPr>
+    </w:p>
+    <w:p>
+      <w:pPr>
+        <w:spacing w:after="0" w:line="240" w:lineRule="auto"/>
+        <w:ind w:left="360"/>
+      </w:pPr>
+    </w:p>
+    <w:p>
+      <w:pPr>
+        <w:spacing w:after="0" w:line="240" w:lineRule="auto"/>
+        <w:ind w:left="360"/>
+      </w:pPr>
+      <w:r>
+        <w:t xml:space="preserve">Add an </w:t>
+      </w:r>
+      <w:r>
+        <w:rPr>
+          <w:b/>
+          <w:bCs/>
+        </w:rPr>
+        <w:t>in-page search box and search functionality</w:t>
+      </w:r>
+      <w:r>
+        <w:t xml:space="preserve"> to the pages </w:t>
+      </w:r>
+      <w:r>
+        <w:rPr>
+          <w:b/>
+          <w:bCs/>
+        </w:rPr>
+        <w:t>activities.html</w:t>
+      </w:r>
+      <w:r>
+        <w:t xml:space="preserve"> and </w:t>
+      </w:r>
+      <w:r>
+        <w:rPr>
+          <w:b/>
+          <w:bCs/>
+        </w:rPr>
+        <w:t>work_done_2024_2026.html</w:t>
+      </w:r>
+      <w:r>
+        <w:t xml:space="preserve">, using the search implementation on </w:t>
+      </w:r>
+      <w:r>
+        <w:rPr>
+          <w:b/>
+          <w:bCs/>
+        </w:rPr>
+        <w:t>scientists/list.html</w:t>
+      </w:r>
+      <w:r>
+        <w:t xml:space="preserve"> as the reference model.</w:t>
+      </w:r>
+    </w:p>
+    <w:p>
+      <w:pPr>
+        <w:spacing w:after="0" w:line="240" w:lineRule="auto"/>
+        <w:ind w:left="360"/>
+      </w:pPr>
+      <w:r>
+        <w:t xml:space="preserve">The new search feature should provide the same general look, placement, interaction style, and user experience as the search box on </w:t>
+      </w:r>
+      <w:r>
+        <w:rPr>
+          <w:b/>
+          <w:bCs/>
+        </w:rPr>
+        <w:t>scientists/list.html</w:t>
+      </w:r>
+      <w:r>
+        <w:t>, but it should not include any filtering functionality.</w:t>
+      </w:r>
+    </w:p>
+    <w:p>
+      <w:pPr>
+        <w:spacing w:after="0" w:line="240" w:lineRule="auto"/>
+        <w:ind w:left="360"/>
+      </w:pPr>
+      <w:r>
+        <w:t>Ensure that:</w:t>
+      </w:r>
+    </w:p>
+    <w:p>
+      <w:pPr>
+        <w:numPr>
+          <w:ilvl w:val="0"/>
+          <w:numId w:val="143"/>
+        </w:numPr>
+        <w:spacing w:after="0" w:line="240" w:lineRule="auto"/>
+      </w:pPr>
+      <w:r>
+        <w:t>A clearly visible search box is added to both pages.</w:t>
+      </w:r>
+    </w:p>
+    <w:p>
+      <w:pPr>
+        <w:numPr>
+          <w:ilvl w:val="0"/>
+          <w:numId w:val="143"/>
+        </w:numPr>
+        <w:spacing w:after="0" w:line="240" w:lineRule="auto"/>
+      </w:pPr>
+      <w:r>
+        <w:t>Users can search within the visible page content.</w:t>
+      </w:r>
+    </w:p>
+    <w:p>
+      <w:pPr>
+        <w:numPr>
+          <w:ilvl w:val="0"/>
+          <w:numId w:val="143"/>
+        </w:numPr>
+        <w:spacing w:after="0" w:line="240" w:lineRule="auto"/>
+      </w:pPr>
+      <w:r>
+        <w:t>Search results are updated dynamically as the user types.</w:t>
+      </w:r>
+    </w:p>
+    <w:p>
+      <w:pPr>
+        <w:numPr>
+          <w:ilvl w:val="0"/>
+          <w:numId w:val="143"/>
+        </w:numPr>
+        <w:spacing w:after="0" w:line="240" w:lineRule="auto"/>
+      </w:pPr>
+      <w:r>
+        <w:t>Matching text or relevant content blocks are highlighted or clearly displayed.</w:t>
+      </w:r>
+    </w:p>
+    <w:p>
+      <w:pPr>
+        <w:numPr>
+          <w:ilvl w:val="0"/>
+          <w:numId w:val="143"/>
+        </w:numPr>
+        <w:spacing w:after="0" w:line="240" w:lineRule="auto"/>
+      </w:pPr>
+      <w:r>
+        <w:t>Non-matching content is hidden or visually de-emphasized, depending on the existing page design.</w:t>
+      </w:r>
+    </w:p>
+    <w:p>
+      <w:pPr>
+        <w:numPr>
+          <w:ilvl w:val="0"/>
+          <w:numId w:val="143"/>
+        </w:numPr>
+        <w:spacing w:after="0" w:line="240" w:lineRule="auto"/>
+      </w:pPr>
+      <w:r>
+        <w:t>The search should be case-insensitive and support partial keyword matches.</w:t>
+      </w:r>
+    </w:p>
+    <w:p>
+      <w:pPr>
+        <w:numPr>
+          <w:ilvl w:val="0"/>
+          <w:numId w:val="143"/>
+        </w:numPr>
+        <w:spacing w:after="0" w:line="240" w:lineRule="auto"/>
+      </w:pPr>
+      <w:r>
+        <w:t>A clear/reset option is available to remove the current search query and restore the full page content.</w:t>
+      </w:r>
+    </w:p>
+    <w:p>
+      <w:pPr>
+        <w:numPr>
+          <w:ilvl w:val="0"/>
+          <w:numId w:val="143"/>
+        </w:numPr>
+        <w:spacing w:after="0" w:line="240" w:lineRule="auto"/>
+      </w:pPr>
+      <w:r>
+        <w:t>If no results are found, an appropriate “No results found” message is displayed.</w:t>
+      </w:r>
+    </w:p>
+    <w:p>
+      <w:pPr>
+        <w:numPr>
+          <w:ilvl w:val="0"/>
+          <w:numId w:val="143"/>
+        </w:numPr>
+        <w:spacing w:after="0" w:line="240" w:lineRule="auto"/>
+      </w:pPr>
+      <w:r>
+        <w:t xml:space="preserve">The design, spacing, typography, icons, and behavior remain consistent with the existing implementation on </w:t>
+      </w:r>
+      <w:r>
+        <w:rPr>
+          <w:b/>
+          <w:bCs/>
+        </w:rPr>
+        <w:t>scientists/list.html</w:t>
+      </w:r>
+      <w:r>
+        <w:t>.</w:t>
+      </w:r>
+    </w:p>
+    <w:p>
+      <w:pPr>
+        <w:numPr>
+          <w:ilvl w:val="0"/>
+          <w:numId w:val="143"/>
+        </w:numPr>
+        <w:spacing w:after="0" w:line="240" w:lineRule="auto"/>
+      </w:pPr>
+      <w:r>
+        <w:t>The functionality works correctly on desktop, tablet, and mobile devices.</w:t>
+      </w:r>
+    </w:p>
+    <w:p>
+      <w:pPr>
+        <w:numPr>
+          <w:ilvl w:val="0"/>
+          <w:numId w:val="143"/>
+        </w:numPr>
+        <w:spacing w:after="0" w:line="240" w:lineRule="auto"/>
+      </w:pPr>
+      <w:r>
+        <w:t>Existing page layout, navigation, links, animations, and content structure remain unaffected.</w:t>
+      </w:r>
+    </w:p>
+    <w:p>
+      <w:pPr>
+        <w:spacing w:after="0" w:line="240" w:lineRule="auto"/>
+        <w:ind w:left="360"/>
+      </w:pPr>
+      <w:r>
+        <w:t>After implementation, test the search functionality on both pages to confirm that users can quickly find relevant activities and completed work items without using filters.</w:t>
+      </w:r>
+    </w:p>
+    <w:p>
+      <w:pPr>
+        <w:pBdr>
+          <w:bottom w:val="double" w:sz="6" w:space="1" w:color="auto"/>
+        </w:pBdr>
+        <w:spacing w:after="0" w:line="240" w:lineRule="auto"/>
+        <w:ind w:left="360"/>
+        <w:rPr>
+          <w:lang w:val="az-Latn-AZ"/>
+        </w:rPr>
+      </w:pPr>
+    </w:p>
+    <w:p>
+      <w:pPr>
+        <w:spacing w:after="0" w:line="240" w:lineRule="auto"/>
+        <w:ind w:left="360"/>
+        <w:rPr>
+          <w:lang w:val="az-Latn-AZ"/>
+        </w:rPr>
+      </w:pPr>
+    </w:p>
+    <w:p>
+      <w:pPr>
+        <w:pBdr>
+          <w:bottom w:val="double" w:sz="6" w:space="1" w:color="auto"/>
+        </w:pBdr>
+        <w:spacing w:after="0" w:line="240" w:lineRule="auto"/>
+        <w:ind w:left="360"/>
+      </w:pPr>
+      <w:r>
+        <w:t>&lt;!-- Google tag (gtag.js) --&gt; &lt;script async src="https://www.googletagmanager.com/gtag/js?id=G-K778896NSH"&gt;&lt;/script&gt; &lt;script&gt; window.dataLayer = window.dataLayer || []; function gtag(){dataLayer.push(arguments);} gtag('js', new Date()); gtag('config', 'G-K778896NSH'); &lt;/script&gt;</w:t>
+      </w:r>
+    </w:p>
+    <w:p>
+      <w:pPr>
+        <w:spacing w:after="0" w:line="240" w:lineRule="auto"/>
+        <w:ind w:left="360"/>
+      </w:pPr>
+    </w:p>
+    <w:p>
+      <w:pPr>
+        <w:spacing w:after="0" w:line="240" w:lineRule="auto"/>
+        <w:ind w:left="360"/>
+      </w:pPr>
+    </w:p>
+    <w:p>
+      <w:pPr>
+        <w:spacing w:after="0" w:line="240" w:lineRule="auto"/>
+        <w:ind w:left="360"/>
+      </w:pPr>
+    </w:p>
+    <w:p>
+      <w:pPr>
+        <w:spacing w:after="0" w:line="240" w:lineRule="auto"/>
+        <w:ind w:left="360"/>
+        <w:rPr>
+          <w:b/>
+          <w:bCs/>
+        </w:rPr>
+      </w:pPr>
+      <w:r>
+        <w:rPr>
+          <w:b/>
+          <w:bCs/>
+        </w:rPr>
+        <w:t>What was added</w:t>
+      </w:r>
+    </w:p>
+    <w:tbl>
+      <w:tblPr>
+        <w:tblW w:w="0" w:type="auto"/>
+        <w:tblCellMar>
+          <w:top w:w="15" w:type="dxa"/>
+          <w:left w:w="15" w:type="dxa"/>
+          <w:bottom w:w="15" w:type="dxa"/>
+          <w:right w:w="15" w:type="dxa"/>
+        </w:tblCellMar>
+        <w:tblLook w:val="04A0" w:firstRow="1" w:lastRow="0" w:firstColumn="1" w:lastColumn="0" w:noHBand="0" w:noVBand="1"/>
+      </w:tblPr>
+      <w:tblGrid>
+        <w:gridCol w:w="3138"/>
+        <w:gridCol w:w="5127"/>
+      </w:tblGrid>
+      <w:tr>
+        <w:trPr>
+          <w:tblHeader/>
+        </w:trPr>
+        <w:tc>
+          <w:tcPr>
+            <w:tcW w:w="0" w:type="auto"/>
+            <w:noWrap/>
+            <w:tcMar>
+              <w:top w:w="75" w:type="dxa"/>
+              <w:left w:w="135" w:type="dxa"/>
+              <w:bottom w:w="75" w:type="dxa"/>
+              <w:right w:w="135" w:type="dxa"/>
+            </w:tcMar>
+            <w:hideMark/>
+          </w:tcPr>
+          <w:p>
+            <w:pPr>
+              <w:spacing w:after="0" w:line="240" w:lineRule="auto"/>
+              <w:ind w:left="360"/>
+              <w:rPr>
+                <w:b/>
+                <w:bCs/>
+              </w:rPr>
+            </w:pPr>
+            <w:r>
+              <w:rPr>
+                <w:b/>
+                <w:bCs/>
+              </w:rPr>
+              <w:t>File</w:t>
+            </w:r>
+          </w:p>
+        </w:tc>
+        <w:tc>
+          <w:tcPr>
+            <w:tcW w:w="0" w:type="auto"/>
+            <w:noWrap/>
+            <w:tcMar>
+              <w:top w:w="75" w:type="dxa"/>
+              <w:left w:w="135" w:type="dxa"/>
+              <w:bottom w:w="75" w:type="dxa"/>
+              <w:right w:w="135" w:type="dxa"/>
+            </w:tcMar>
+            <w:hideMark/>
+          </w:tcPr>
+          <w:p>
+            <w:pPr>
+              <w:spacing w:after="0" w:line="240" w:lineRule="auto"/>
+              <w:ind w:left="360"/>
+              <w:rPr>
+                <w:b/>
+                <w:bCs/>
+              </w:rPr>
+            </w:pPr>
+            <w:r>
+              <w:rPr>
+                <w:b/>
+                <w:bCs/>
+              </w:rPr>
+              <w:t>Purpose</w:t>
+            </w:r>
+          </w:p>
+        </w:tc>
+      </w:tr>
+      <w:tr>
+        <w:tc>
+          <w:tcPr>
+            <w:tcW w:w="0" w:type="auto"/>
+            <w:tcMar>
+              <w:top w:w="75" w:type="dxa"/>
+              <w:left w:w="135" w:type="dxa"/>
+              <w:bottom w:w="75" w:type="dxa"/>
+              <w:right w:w="135" w:type="dxa"/>
+            </w:tcMar>
+            <w:hideMark/>
+          </w:tcPr>
+          <w:p>
+            <w:pPr>
+              <w:spacing w:after="0" w:line="240" w:lineRule="auto"/>
+              <w:ind w:left="360"/>
+            </w:pPr>
+            <w:r>
+              <w:t>js/daab-analytics.js</w:t>
+            </w:r>
+          </w:p>
+        </w:tc>
+        <w:tc>
+          <w:tcPr>
+            <w:tcW w:w="0" w:type="auto"/>
+            <w:tcMar>
+              <w:top w:w="75" w:type="dxa"/>
+              <w:left w:w="135" w:type="dxa"/>
+              <w:bottom w:w="75" w:type="dxa"/>
+              <w:right w:w="135" w:type="dxa"/>
+            </w:tcMar>
+            <w:hideMark/>
+          </w:tcPr>
+          <w:p>
+            <w:pPr>
+              <w:spacing w:after="0" w:line="240" w:lineRule="auto"/>
+              <w:ind w:left="360"/>
+            </w:pPr>
+            <w:r>
+              <w:t>Loads GA4 only on production (daab-waas.com)</w:t>
+            </w:r>
+          </w:p>
+        </w:tc>
+      </w:tr>
+      <w:tr>
+        <w:tc>
+          <w:tcPr>
+            <w:tcW w:w="0" w:type="auto"/>
+            <w:tcMar>
+              <w:top w:w="75" w:type="dxa"/>
+              <w:left w:w="135" w:type="dxa"/>
+              <w:bottom w:w="75" w:type="dxa"/>
+              <w:right w:w="135" w:type="dxa"/>
+            </w:tcMar>
+            <w:hideMark/>
+          </w:tcPr>
+          <w:p>
+            <w:pPr>
+              <w:spacing w:after="0" w:line="240" w:lineRule="auto"/>
+              <w:ind w:left="360"/>
+            </w:pPr>
+            <w:r>
+              <w:t>i18n/analytics.json</w:t>
+            </w:r>
+          </w:p>
+        </w:tc>
+        <w:tc>
+          <w:tcPr>
+            <w:tcW w:w="0" w:type="auto"/>
+            <w:tcMar>
+              <w:top w:w="75" w:type="dxa"/>
+              <w:left w:w="135" w:type="dxa"/>
+              <w:bottom w:w="75" w:type="dxa"/>
+              <w:right w:w="135" w:type="dxa"/>
+            </w:tcMar>
+            <w:hideMark/>
+          </w:tcPr>
+          <w:p>
+            <w:pPr>
+              <w:spacing w:after="0" w:line="240" w:lineRule="auto"/>
+              <w:ind w:left="360"/>
+            </w:pPr>
+            <w:r>
+              <w:t>Config — you add your Measurement ID here</w:t>
+            </w:r>
+          </w:p>
+        </w:tc>
+      </w:tr>
+      <w:tr>
+        <w:tc>
+          <w:tcPr>
+            <w:tcW w:w="0" w:type="auto"/>
+            <w:tcMar>
+              <w:top w:w="75" w:type="dxa"/>
+              <w:left w:w="135" w:type="dxa"/>
+              <w:bottom w:w="75" w:type="dxa"/>
+              <w:right w:w="135" w:type="dxa"/>
+            </w:tcMar>
+            <w:hideMark/>
+          </w:tcPr>
+          <w:p>
+            <w:pPr>
+              <w:spacing w:after="0" w:line="240" w:lineRule="auto"/>
+              <w:ind w:left="360"/>
+            </w:pPr>
+            <w:r>
+              <w:t>helpers/_wire_analytics.py</w:t>
+            </w:r>
+          </w:p>
+        </w:tc>
+        <w:tc>
+          <w:tcPr>
+            <w:tcW w:w="0" w:type="auto"/>
+            <w:tcMar>
+              <w:top w:w="75" w:type="dxa"/>
+              <w:left w:w="135" w:type="dxa"/>
+              <w:bottom w:w="75" w:type="dxa"/>
+              <w:right w:w="135" w:type="dxa"/>
+            </w:tcMar>
+            <w:hideMark/>
+          </w:tcPr>
+          <w:p>
+            <w:pPr>
+              <w:spacing w:after="0" w:line="240" w:lineRule="auto"/>
+              <w:ind w:left="360"/>
+            </w:pPr>
+            <w:r>
+              <w:t>Injects the script on all main pages</w:t>
+            </w:r>
+          </w:p>
+        </w:tc>
+      </w:tr>
+    </w:tbl>
+    <w:p>
+      <w:pPr>
+        <w:spacing w:after="0" w:line="240" w:lineRule="auto"/>
+        <w:ind w:left="360"/>
+      </w:pPr>
+      <w:r>
+        <w:t>The script is on </w:t>
+      </w:r>
+      <w:r>
+        <w:rPr>
+          <w:b/>
+          <w:bCs/>
+        </w:rPr>
+        <w:t>62 pages</w:t>
+      </w:r>
+      <w:r>
+        <w:t> (all main AZ/EN pages + gateway + 404). Legacy redirect stubs (membership.html) were skipped on purpose.</w:t>
+      </w:r>
+    </w:p>
+    <w:p>
+      <w:pPr>
+        <w:spacing w:after="0" w:line="240" w:lineRule="auto"/>
+        <w:ind w:left="360"/>
+        <w:rPr>
+          <w:b/>
+          <w:bCs/>
+        </w:rPr>
+      </w:pPr>
+      <w:r>
+        <w:rPr>
+          <w:b/>
+          <w:bCs/>
+        </w:rPr>
+        <w:t>Behaviour</w:t>
+      </w:r>
+    </w:p>
+    <w:p>
+      <w:pPr>
+        <w:numPr>
+          <w:ilvl w:val="0"/>
+          <w:numId w:val="144"/>
+        </w:numPr>
+        <w:spacing w:after="0" w:line="240" w:lineRule="auto"/>
+      </w:pPr>
+      <w:r>
+        <w:lastRenderedPageBreak/>
+        <w:t>Runs </w:t>
+      </w:r>
+      <w:r>
+        <w:rPr>
+          <w:b/>
+          <w:bCs/>
+        </w:rPr>
+        <w:t>only</w:t>
+      </w:r>
+      <w:r>
+        <w:t> on daab-waas.com / www.daab-waas.com — not on localhost or 127.0.0.1</w:t>
+      </w:r>
+    </w:p>
+    <w:p>
+      <w:pPr>
+        <w:numPr>
+          <w:ilvl w:val="0"/>
+          <w:numId w:val="144"/>
+        </w:numPr>
+        <w:spacing w:after="0" w:line="240" w:lineRule="auto"/>
+      </w:pPr>
+      <w:r>
+        <w:rPr>
+          <w:b/>
+          <w:bCs/>
+        </w:rPr>
+        <w:t>Disabled</w:t>
+      </w:r>
+      <w:r>
+        <w:t> until you set a valid G-XXXXXXXXXX ID</w:t>
+      </w:r>
+    </w:p>
+    <w:p>
+      <w:pPr>
+        <w:numPr>
+          <w:ilvl w:val="0"/>
+          <w:numId w:val="144"/>
+        </w:numPr>
+        <w:spacing w:after="0" w:line="240" w:lineRule="auto"/>
+      </w:pPr>
+      <w:r>
+        <w:t>Sends standard page path plus daab_page_id and daab_lang (from your existing HTML attributes)</w:t>
+      </w:r>
+    </w:p>
+    <w:p>
+      <w:pPr>
+        <w:numPr>
+          <w:ilvl w:val="0"/>
+          <w:numId w:val="144"/>
+        </w:numPr>
+        <w:spacing w:after="0" w:line="240" w:lineRule="auto"/>
+      </w:pPr>
+      <w:r>
+        <w:t>Add ?noanalytics=1 to any URL to skip tracking during testing on production</w:t>
+      </w:r>
+    </w:p>
+    <w:p>
+      <w:pPr>
+        <w:spacing w:after="0" w:line="240" w:lineRule="auto"/>
+        <w:ind w:left="360"/>
+        <w:rPr>
+          <w:b/>
+          <w:bCs/>
+        </w:rPr>
+      </w:pPr>
+      <w:r>
+        <w:rPr>
+          <w:b/>
+          <w:bCs/>
+        </w:rPr>
+        <w:t>What you need to do (one-time)</w:t>
+      </w:r>
+    </w:p>
+    <w:p>
+      <w:pPr>
+        <w:numPr>
+          <w:ilvl w:val="0"/>
+          <w:numId w:val="145"/>
+        </w:numPr>
+        <w:spacing w:after="0" w:line="240" w:lineRule="auto"/>
+      </w:pPr>
+      <w:r>
+        <w:rPr>
+          <w:b/>
+          <w:bCs/>
+        </w:rPr>
+        <w:t>Create a GA4 property</w:t>
+      </w:r>
+      <w:r>
+        <w:t> at </w:t>
+      </w:r>
+      <w:hyperlink r:id="rId8" w:tgtFrame="_blank" w:history="1">
+        <w:r>
+          <w:rPr>
+            <w:rStyle w:val="Hyperlink"/>
+          </w:rPr>
+          <w:t>analytics.google.com</w:t>
+        </w:r>
+      </w:hyperlink>
+    </w:p>
+    <w:p>
+      <w:pPr>
+        <w:numPr>
+          <w:ilvl w:val="1"/>
+          <w:numId w:val="145"/>
+        </w:numPr>
+        <w:spacing w:after="0" w:line="240" w:lineRule="auto"/>
+      </w:pPr>
+      <w:r>
+        <w:t>Property name: e.g. DAAB Website</w:t>
+      </w:r>
+    </w:p>
+    <w:p>
+      <w:pPr>
+        <w:numPr>
+          <w:ilvl w:val="1"/>
+          <w:numId w:val="145"/>
+        </w:numPr>
+        <w:spacing w:after="0" w:line="240" w:lineRule="auto"/>
+      </w:pPr>
+      <w:r>
+        <w:t>Data stream: </w:t>
+      </w:r>
+      <w:r>
+        <w:rPr>
+          <w:b/>
+          <w:bCs/>
+        </w:rPr>
+        <w:t>Web</w:t>
+      </w:r>
+      <w:r>
+        <w:t> → URL https://daab-waas.com</w:t>
+      </w:r>
+    </w:p>
+    <w:p>
+      <w:pPr>
+        <w:numPr>
+          <w:ilvl w:val="0"/>
+          <w:numId w:val="145"/>
+        </w:numPr>
+        <w:spacing w:after="0" w:line="240" w:lineRule="auto"/>
+      </w:pPr>
+      <w:r>
+        <w:rPr>
+          <w:b/>
+          <w:bCs/>
+        </w:rPr>
+        <w:t>Copy the Measurement ID</w:t>
+      </w:r>
+      <w:r>
+        <w:t> (format G-XXXXXXXXXX)</w:t>
+      </w:r>
+    </w:p>
+    <w:p>
+      <w:pPr>
+        <w:numPr>
+          <w:ilvl w:val="0"/>
+          <w:numId w:val="145"/>
+        </w:numPr>
+        <w:spacing w:after="0" w:line="240" w:lineRule="auto"/>
+      </w:pPr>
+      <w:r>
+        <w:rPr>
+          <w:b/>
+          <w:bCs/>
+        </w:rPr>
+        <w:t>Edit</w:t>
+      </w:r>
+      <w:r>
+        <w:t> i18n/analytics.json:</w:t>
+      </w:r>
+    </w:p>
+    <w:p>
+      <w:pPr>
+        <w:spacing w:after="0" w:line="240" w:lineRule="auto"/>
+        <w:ind w:left="360"/>
+      </w:pPr>
+      <w:r>
+        <w:t>{</w:t>
+      </w:r>
+    </w:p>
+    <w:p>
+      <w:pPr>
+        <w:spacing w:after="0" w:line="240" w:lineRule="auto"/>
+        <w:ind w:left="360"/>
+      </w:pPr>
+      <w:r>
+        <w:t xml:space="preserve">  "provider": "ga4",</w:t>
+      </w:r>
+    </w:p>
+    <w:p>
+      <w:pPr>
+        <w:spacing w:after="0" w:line="240" w:lineRule="auto"/>
+        <w:ind w:left="360"/>
+      </w:pPr>
+      <w:r>
+        <w:t xml:space="preserve">  "measurementId": "G-XXXXXXXXXX",</w:t>
+      </w:r>
+    </w:p>
+    <w:p>
+      <w:pPr>
+        <w:spacing w:after="0" w:line="240" w:lineRule="auto"/>
+        <w:ind w:left="360"/>
+      </w:pPr>
+      <w:r>
+        <w:t xml:space="preserve">  ...</w:t>
+      </w:r>
+    </w:p>
+    <w:p>
+      <w:pPr>
+        <w:spacing w:after="0" w:line="240" w:lineRule="auto"/>
+        <w:ind w:left="360"/>
+      </w:pPr>
+      <w:r>
+        <w:t>}</w:t>
+      </w:r>
+    </w:p>
+    <w:p>
+      <w:pPr>
+        <w:numPr>
+          <w:ilvl w:val="0"/>
+          <w:numId w:val="146"/>
+        </w:numPr>
+        <w:spacing w:after="0" w:line="240" w:lineRule="auto"/>
+      </w:pPr>
+      <w:r>
+        <w:rPr>
+          <w:b/>
+          <w:bCs/>
+        </w:rPr>
+        <w:t>Deploy</w:t>
+      </w:r>
+      <w:r>
+        <w:t> to Hostinger: upload js/daab-analytics.js, i18n/analytics.json, and the updated HTML files (or run your usual deploy).</w:t>
+      </w:r>
+    </w:p>
+    <w:p>
+      <w:pPr>
+        <w:numPr>
+          <w:ilvl w:val="0"/>
+          <w:numId w:val="146"/>
+        </w:numPr>
+        <w:spacing w:after="0" w:line="240" w:lineRule="auto"/>
+      </w:pPr>
+      <w:r>
+        <w:rPr>
+          <w:b/>
+          <w:bCs/>
+        </w:rPr>
+        <w:t>Verify</w:t>
+      </w:r>
+      <w:r>
+        <w:t> (after deploy): open the live site → GA4 → </w:t>
+      </w:r>
+      <w:r>
+        <w:rPr>
+          <w:b/>
+          <w:bCs/>
+        </w:rPr>
+        <w:t>Reports → Realtime</w:t>
+      </w:r>
+      <w:r>
+        <w:t> — you should see yourself as an active user.</w:t>
+      </w:r>
+    </w:p>
+    <w:p>
+      <w:pPr>
+        <w:numPr>
+          <w:ilvl w:val="0"/>
+          <w:numId w:val="146"/>
+        </w:numPr>
+        <w:spacing w:after="0" w:line="240" w:lineRule="auto"/>
+      </w:pPr>
+      <w:r>
+        <w:rPr>
+          <w:b/>
+          <w:bCs/>
+        </w:rPr>
+        <w:t>Per-page stats</w:t>
+      </w:r>
+      <w:r>
+        <w:t> (after ~24 hours): </w:t>
+      </w:r>
+      <w:r>
+        <w:rPr>
+          <w:b/>
+          <w:bCs/>
+        </w:rPr>
+        <w:t>Reports → Engagement → Pages and screens</w:t>
+      </w:r>
+    </w:p>
+    <w:p>
+      <w:pPr>
+        <w:spacing w:after="0" w:line="240" w:lineRule="auto"/>
+        <w:ind w:left="360"/>
+        <w:rPr>
+          <w:b/>
+          <w:bCs/>
+        </w:rPr>
+      </w:pPr>
+      <w:r>
+        <w:rPr>
+          <w:b/>
+          <w:bCs/>
+        </w:rPr>
+        <w:t>Optional: group by logical page</w:t>
+      </w:r>
+    </w:p>
+    <w:p>
+      <w:pPr>
+        <w:spacing w:after="0" w:line="240" w:lineRule="auto"/>
+        <w:ind w:left="360"/>
+      </w:pPr>
+      <w:r>
+        <w:t>In GA4 → </w:t>
+      </w:r>
+      <w:r>
+        <w:rPr>
+          <w:b/>
+          <w:bCs/>
+        </w:rPr>
+        <w:t>Admin → Custom definitions</w:t>
+      </w:r>
+      <w:r>
+        <w:t>, register event parameters:</w:t>
+      </w:r>
+    </w:p>
+    <w:p>
+      <w:pPr>
+        <w:numPr>
+          <w:ilvl w:val="0"/>
+          <w:numId w:val="147"/>
+        </w:numPr>
+        <w:spacing w:after="0" w:line="240" w:lineRule="auto"/>
+      </w:pPr>
+      <w:r>
+        <w:t>daab_page_id (e.g. home, scientists-list, forum-logistics)</w:t>
+      </w:r>
+    </w:p>
+    <w:p>
+      <w:pPr>
+        <w:numPr>
+          <w:ilvl w:val="0"/>
+          <w:numId w:val="147"/>
+        </w:numPr>
+        <w:spacing w:after="0" w:line="240" w:lineRule="auto"/>
+      </w:pPr>
+      <w:r>
+        <w:t>daab_lang (az / en)</w:t>
+      </w:r>
+    </w:p>
+    <w:p>
+      <w:pPr>
+        <w:spacing w:after="0" w:line="240" w:lineRule="auto"/>
+        <w:ind w:left="360"/>
+      </w:pPr>
+      <w:r>
+        <w:t>Then you can filter AZ vs EN and forum sections beyond raw URLs.</w:t>
+      </w:r>
+    </w:p>
+    <w:p>
+      <w:pPr>
+        <w:spacing w:after="0" w:line="240" w:lineRule="auto"/>
+        <w:ind w:left="360"/>
+        <w:rPr>
+          <w:b/>
+          <w:bCs/>
+        </w:rPr>
+      </w:pPr>
+      <w:r>
+        <w:rPr>
+          <w:b/>
+          <w:bCs/>
+        </w:rPr>
+        <w:t>Hostinger (supplementary)</w:t>
+      </w:r>
+    </w:p>
+    <w:p>
+      <w:pPr>
+        <w:spacing w:after="0" w:line="240" w:lineRule="auto"/>
+        <w:ind w:left="360"/>
+      </w:pPr>
+      <w:r>
+        <w:t>Keep using </w:t>
+      </w:r>
+      <w:r>
+        <w:rPr>
+          <w:b/>
+          <w:bCs/>
+        </w:rPr>
+        <w:t>hPanel → Analytics</w:t>
+      </w:r>
+      <w:r>
+        <w:t> for server requests and the last 7 days of access logs. GA4 is better for long-term per-page trends.</w:t>
+      </w:r>
+    </w:p>
+    <w:p>
+      <w:pPr>
+        <w:spacing w:after="0" w:line="240" w:lineRule="auto"/>
+        <w:ind w:left="360"/>
+      </w:pPr>
+      <w:r>
+        <w:pict w14:anchorId="1F1CAF8F">
+          <v:rect id="_x0000_i1039" style="width:0;height:1.5pt" o:hralign="center" o:hrstd="t" o:hr="t" fillcolor="#a0a0a0" stroked="f"/>
+        </w:pict>
+      </w:r>
+    </w:p>
+    <w:p>
+      <w:pPr>
+        <w:spacing w:after="0" w:line="240" w:lineRule="auto"/>
+        <w:ind w:left="360"/>
+      </w:pPr>
+      <w:r>
+        <w:t>Until you add the Measurement ID, the script loads but does nothing — safe to deploy now and enable tracking when the GA4 property is ready. If you share the G-… ID, I can drop it into analytics.json for you.</w:t>
+      </w:r>
+    </w:p>
+    <w:p>
+      <w:pPr>
+        <w:spacing w:after="0" w:line="240" w:lineRule="auto"/>
+        <w:ind w:left="360"/>
         <w:rPr>
           <w:vanish/>
+          <w:lang w:val="az-Latn-AZ"/>
         </w:rPr>
       </w:pPr>
     </w:p>
@@ -24967,6 +26301,119 @@
     </w:lvl>
   </w:abstractNum>
   <w:abstractNum w:abstractNumId="3" w15:restartNumberingAfterBreak="0">
+    <w:nsid w:val="02291DB4"/>
+    <w:multiLevelType w:val="multilevel"/>
+    <w:tmpl w:val="7A8AA324"/>
+    <w:lvl w:ilvl="0">
+      <w:start w:val="4"/>
+      <w:numFmt w:val="decimal"/>
+      <w:lvlText w:val="%1."/>
+      <w:lvlJc w:val="left"/>
+      <w:pPr>
+        <w:tabs>
+          <w:tab w:val="num" w:pos="720"/>
+        </w:tabs>
+        <w:ind w:left="720" w:hanging="360"/>
+      </w:pPr>
+    </w:lvl>
+    <w:lvl w:ilvl="1" w:tentative="1">
+      <w:start w:val="1"/>
+      <w:numFmt w:val="decimal"/>
+      <w:lvlText w:val="%2."/>
+      <w:lvlJc w:val="left"/>
+      <w:pPr>
+        <w:tabs>
+          <w:tab w:val="num" w:pos="1440"/>
+        </w:tabs>
+        <w:ind w:left="1440" w:hanging="360"/>
+      </w:pPr>
+    </w:lvl>
+    <w:lvl w:ilvl="2" w:tentative="1">
+      <w:start w:val="1"/>
+      <w:numFmt w:val="decimal"/>
+      <w:lvlText w:val="%3."/>
+      <w:lvlJc w:val="left"/>
+      <w:pPr>
+        <w:tabs>
+          <w:tab w:val="num" w:pos="2160"/>
+        </w:tabs>
+        <w:ind w:left="2160" w:hanging="360"/>
+      </w:pPr>
+    </w:lvl>
+    <w:lvl w:ilvl="3" w:tentative="1">
+      <w:start w:val="1"/>
+      <w:numFmt w:val="decimal"/>
+      <w:lvlText w:val="%4."/>
+      <w:lvlJc w:val="left"/>
+      <w:pPr>
+        <w:tabs>
+          <w:tab w:val="num" w:pos="2880"/>
+        </w:tabs>
+        <w:ind w:left="2880" w:hanging="360"/>
+      </w:pPr>
+    </w:lvl>
+    <w:lvl w:ilvl="4" w:tentative="1">
+      <w:start w:val="1"/>
+      <w:numFmt w:val="decimal"/>
+      <w:lvlText w:val="%5."/>
+      <w:lvlJc w:val="left"/>
+      <w:pPr>
+        <w:tabs>
+          <w:tab w:val="num" w:pos="3600"/>
+        </w:tabs>
+        <w:ind w:left="3600" w:hanging="360"/>
+      </w:pPr>
+    </w:lvl>
+    <w:lvl w:ilvl="5" w:tentative="1">
+      <w:start w:val="1"/>
+      <w:numFmt w:val="decimal"/>
+      <w:lvlText w:val="%6."/>
+      <w:lvlJc w:val="left"/>
+      <w:pPr>
+        <w:tabs>
+          <w:tab w:val="num" w:pos="4320"/>
+        </w:tabs>
+        <w:ind w:left="4320" w:hanging="360"/>
+      </w:pPr>
+    </w:lvl>
+    <w:lvl w:ilvl="6" w:tentative="1">
+      <w:start w:val="1"/>
+      <w:numFmt w:val="decimal"/>
+      <w:lvlText w:val="%7."/>
+      <w:lvlJc w:val="left"/>
+      <w:pPr>
+        <w:tabs>
+          <w:tab w:val="num" w:pos="5040"/>
+        </w:tabs>
+        <w:ind w:left="5040" w:hanging="360"/>
+      </w:pPr>
+    </w:lvl>
+    <w:lvl w:ilvl="7" w:tentative="1">
+      <w:start w:val="1"/>
+      <w:numFmt w:val="decimal"/>
+      <w:lvlText w:val="%8."/>
+      <w:lvlJc w:val="left"/>
+      <w:pPr>
+        <w:tabs>
+          <w:tab w:val="num" w:pos="5760"/>
+        </w:tabs>
+        <w:ind w:left="5760" w:hanging="360"/>
+      </w:pPr>
+    </w:lvl>
+    <w:lvl w:ilvl="8" w:tentative="1">
+      <w:start w:val="1"/>
+      <w:numFmt w:val="decimal"/>
+      <w:lvlText w:val="%9."/>
+      <w:lvlJc w:val="left"/>
+      <w:pPr>
+        <w:tabs>
+          <w:tab w:val="num" w:pos="6480"/>
+        </w:tabs>
+        <w:ind w:left="6480" w:hanging="360"/>
+      </w:pPr>
+    </w:lvl>
+  </w:abstractNum>
+  <w:abstractNum w:abstractNumId="4" w15:restartNumberingAfterBreak="0">
     <w:nsid w:val="025C25F5"/>
     <w:multiLevelType w:val="hybridMultilevel"/>
     <w:tmpl w:val="D556DFE0"/>
@@ -25078,7 +26525,7 @@
       </w:rPr>
     </w:lvl>
   </w:abstractNum>
-  <w:abstractNum w:abstractNumId="4" w15:restartNumberingAfterBreak="0">
+  <w:abstractNum w:abstractNumId="5" w15:restartNumberingAfterBreak="0">
     <w:nsid w:val="027629A7"/>
     <w:multiLevelType w:val="hybridMultilevel"/>
     <w:tmpl w:val="71B0D270"/>
@@ -25190,7 +26637,7 @@
       </w:rPr>
     </w:lvl>
   </w:abstractNum>
-  <w:abstractNum w:abstractNumId="5" w15:restartNumberingAfterBreak="0">
+  <w:abstractNum w:abstractNumId="6" w15:restartNumberingAfterBreak="0">
     <w:nsid w:val="02BB7D62"/>
     <w:multiLevelType w:val="multilevel"/>
     <w:tmpl w:val="B8EEF4EC"/>
@@ -25339,7 +26786,7 @@
       </w:rPr>
     </w:lvl>
   </w:abstractNum>
-  <w:abstractNum w:abstractNumId="6" w15:restartNumberingAfterBreak="0">
+  <w:abstractNum w:abstractNumId="7" w15:restartNumberingAfterBreak="0">
     <w:nsid w:val="030454D8"/>
     <w:multiLevelType w:val="multilevel"/>
     <w:tmpl w:val="5460399E"/>
@@ -25488,7 +26935,7 @@
       </w:rPr>
     </w:lvl>
   </w:abstractNum>
-  <w:abstractNum w:abstractNumId="7" w15:restartNumberingAfterBreak="0">
+  <w:abstractNum w:abstractNumId="8" w15:restartNumberingAfterBreak="0">
     <w:nsid w:val="04B37D57"/>
     <w:multiLevelType w:val="multilevel"/>
     <w:tmpl w:val="969C7DB4"/>
@@ -25601,7 +27048,7 @@
       </w:pPr>
     </w:lvl>
   </w:abstractNum>
-  <w:abstractNum w:abstractNumId="8" w15:restartNumberingAfterBreak="0">
+  <w:abstractNum w:abstractNumId="9" w15:restartNumberingAfterBreak="0">
     <w:nsid w:val="04B71142"/>
     <w:multiLevelType w:val="multilevel"/>
     <w:tmpl w:val="8862BA3A"/>
@@ -25750,7 +27197,7 @@
       </w:rPr>
     </w:lvl>
   </w:abstractNum>
-  <w:abstractNum w:abstractNumId="9" w15:restartNumberingAfterBreak="0">
+  <w:abstractNum w:abstractNumId="10" w15:restartNumberingAfterBreak="0">
     <w:nsid w:val="073E74EB"/>
     <w:multiLevelType w:val="multilevel"/>
     <w:tmpl w:val="3B20A420"/>
@@ -25899,7 +27346,156 @@
       </w:rPr>
     </w:lvl>
   </w:abstractNum>
-  <w:abstractNum w:abstractNumId="10" w15:restartNumberingAfterBreak="0">
+  <w:abstractNum w:abstractNumId="11" w15:restartNumberingAfterBreak="0">
+    <w:nsid w:val="079A4F07"/>
+    <w:multiLevelType w:val="multilevel"/>
+    <w:tmpl w:val="E8522DD4"/>
+    <w:lvl w:ilvl="0">
+      <w:start w:val="1"/>
+      <w:numFmt w:val="bullet"/>
+      <w:lvlText w:val=""/>
+      <w:lvlJc w:val="left"/>
+      <w:pPr>
+        <w:tabs>
+          <w:tab w:val="num" w:pos="720"/>
+        </w:tabs>
+        <w:ind w:left="720" w:hanging="360"/>
+      </w:pPr>
+      <w:rPr>
+        <w:rFonts w:ascii="Symbol" w:hAnsi="Symbol" w:hint="default"/>
+        <w:sz w:val="20"/>
+      </w:rPr>
+    </w:lvl>
+    <w:lvl w:ilvl="1" w:tentative="1">
+      <w:start w:val="1"/>
+      <w:numFmt w:val="bullet"/>
+      <w:lvlText w:val="o"/>
+      <w:lvlJc w:val="left"/>
+      <w:pPr>
+        <w:tabs>
+          <w:tab w:val="num" w:pos="1440"/>
+        </w:tabs>
+        <w:ind w:left="1440" w:hanging="360"/>
+      </w:pPr>
+      <w:rPr>
+        <w:rFonts w:ascii="Courier New" w:hAnsi="Courier New" w:hint="default"/>
+        <w:sz w:val="20"/>
+      </w:rPr>
+    </w:lvl>
+    <w:lvl w:ilvl="2" w:tentative="1">
+      <w:start w:val="1"/>
+      <w:numFmt w:val="bullet"/>
+      <w:lvlText w:val=""/>
+      <w:lvlJc w:val="left"/>
+      <w:pPr>
+        <w:tabs>
+          <w:tab w:val="num" w:pos="2160"/>
+        </w:tabs>
+        <w:ind w:left="2160" w:hanging="360"/>
+      </w:pPr>
+      <w:rPr>
+        <w:rFonts w:ascii="Wingdings" w:hAnsi="Wingdings" w:hint="default"/>
+        <w:sz w:val="20"/>
+      </w:rPr>
+    </w:lvl>
+    <w:lvl w:ilvl="3" w:tentative="1">
+      <w:start w:val="1"/>
+      <w:numFmt w:val="bullet"/>
+      <w:lvlText w:val=""/>
+      <w:lvlJc w:val="left"/>
+      <w:pPr>
+        <w:tabs>
+          <w:tab w:val="num" w:pos="2880"/>
+        </w:tabs>
+        <w:ind w:left="2880" w:hanging="360"/>
+      </w:pPr>
+      <w:rPr>
+        <w:rFonts w:ascii="Wingdings" w:hAnsi="Wingdings" w:hint="default"/>
+        <w:sz w:val="20"/>
+      </w:rPr>
+    </w:lvl>
+    <w:lvl w:ilvl="4" w:tentative="1">
+      <w:start w:val="1"/>
+      <w:numFmt w:val="bullet"/>
+      <w:lvlText w:val=""/>
+      <w:lvlJc w:val="left"/>
+      <w:pPr>
+        <w:tabs>
+          <w:tab w:val="num" w:pos="3600"/>
+        </w:tabs>
+        <w:ind w:left="3600" w:hanging="360"/>
+      </w:pPr>
+      <w:rPr>
+        <w:rFonts w:ascii="Wingdings" w:hAnsi="Wingdings" w:hint="default"/>
+        <w:sz w:val="20"/>
+      </w:rPr>
+    </w:lvl>
+    <w:lvl w:ilvl="5" w:tentative="1">
+      <w:start w:val="1"/>
+      <w:numFmt w:val="bullet"/>
+      <w:lvlText w:val=""/>
+      <w:lvlJc w:val="left"/>
+      <w:pPr>
+        <w:tabs>
+          <w:tab w:val="num" w:pos="4320"/>
+        </w:tabs>
+        <w:ind w:left="4320" w:hanging="360"/>
+      </w:pPr>
+      <w:rPr>
+        <w:rFonts w:ascii="Wingdings" w:hAnsi="Wingdings" w:hint="default"/>
+        <w:sz w:val="20"/>
+      </w:rPr>
+    </w:lvl>
+    <w:lvl w:ilvl="6" w:tentative="1">
+      <w:start w:val="1"/>
+      <w:numFmt w:val="bullet"/>
+      <w:lvlText w:val=""/>
+      <w:lvlJc w:val="left"/>
+      <w:pPr>
+        <w:tabs>
+          <w:tab w:val="num" w:pos="5040"/>
+        </w:tabs>
+        <w:ind w:left="5040" w:hanging="360"/>
+      </w:pPr>
+      <w:rPr>
+        <w:rFonts w:ascii="Wingdings" w:hAnsi="Wingdings" w:hint="default"/>
+        <w:sz w:val="20"/>
+      </w:rPr>
+    </w:lvl>
+    <w:lvl w:ilvl="7" w:tentative="1">
+      <w:start w:val="1"/>
+      <w:numFmt w:val="bullet"/>
+      <w:lvlText w:val=""/>
+      <w:lvlJc w:val="left"/>
+      <w:pPr>
+        <w:tabs>
+          <w:tab w:val="num" w:pos="5760"/>
+        </w:tabs>
+        <w:ind w:left="5760" w:hanging="360"/>
+      </w:pPr>
+      <w:rPr>
+        <w:rFonts w:ascii="Wingdings" w:hAnsi="Wingdings" w:hint="default"/>
+        <w:sz w:val="20"/>
+      </w:rPr>
+    </w:lvl>
+    <w:lvl w:ilvl="8" w:tentative="1">
+      <w:start w:val="1"/>
+      <w:numFmt w:val="bullet"/>
+      <w:lvlText w:val=""/>
+      <w:lvlJc w:val="left"/>
+      <w:pPr>
+        <w:tabs>
+          <w:tab w:val="num" w:pos="6480"/>
+        </w:tabs>
+        <w:ind w:left="6480" w:hanging="360"/>
+      </w:pPr>
+      <w:rPr>
+        <w:rFonts w:ascii="Wingdings" w:hAnsi="Wingdings" w:hint="default"/>
+        <w:sz w:val="20"/>
+      </w:rPr>
+    </w:lvl>
+  </w:abstractNum>
+  <w:abstractNum w:abstractNumId="12" w15:restartNumberingAfterBreak="0">
     <w:nsid w:val="087A6398"/>
     <w:multiLevelType w:val="multilevel"/>
     <w:tmpl w:val="208636DC"/>
@@ -26048,7 +27644,156 @@
       </w:rPr>
     </w:lvl>
   </w:abstractNum>
-  <w:abstractNum w:abstractNumId="11" w15:restartNumberingAfterBreak="0">
+  <w:abstractNum w:abstractNumId="13" w15:restartNumberingAfterBreak="0">
+    <w:nsid w:val="092E69DD"/>
+    <w:multiLevelType w:val="multilevel"/>
+    <w:tmpl w:val="1C08CBCA"/>
+    <w:lvl w:ilvl="0">
+      <w:start w:val="1"/>
+      <w:numFmt w:val="bullet"/>
+      <w:lvlText w:val=""/>
+      <w:lvlJc w:val="left"/>
+      <w:pPr>
+        <w:tabs>
+          <w:tab w:val="num" w:pos="720"/>
+        </w:tabs>
+        <w:ind w:left="720" w:hanging="360"/>
+      </w:pPr>
+      <w:rPr>
+        <w:rFonts w:ascii="Symbol" w:hAnsi="Symbol" w:hint="default"/>
+        <w:sz w:val="20"/>
+      </w:rPr>
+    </w:lvl>
+    <w:lvl w:ilvl="1" w:tentative="1">
+      <w:start w:val="1"/>
+      <w:numFmt w:val="bullet"/>
+      <w:lvlText w:val="o"/>
+      <w:lvlJc w:val="left"/>
+      <w:pPr>
+        <w:tabs>
+          <w:tab w:val="num" w:pos="1440"/>
+        </w:tabs>
+        <w:ind w:left="1440" w:hanging="360"/>
+      </w:pPr>
+      <w:rPr>
+        <w:rFonts w:ascii="Courier New" w:hAnsi="Courier New" w:hint="default"/>
+        <w:sz w:val="20"/>
+      </w:rPr>
+    </w:lvl>
+    <w:lvl w:ilvl="2" w:tentative="1">
+      <w:start w:val="1"/>
+      <w:numFmt w:val="bullet"/>
+      <w:lvlText w:val=""/>
+      <w:lvlJc w:val="left"/>
+      <w:pPr>
+        <w:tabs>
+          <w:tab w:val="num" w:pos="2160"/>
+        </w:tabs>
+        <w:ind w:left="2160" w:hanging="360"/>
+      </w:pPr>
+      <w:rPr>
+        <w:rFonts w:ascii="Wingdings" w:hAnsi="Wingdings" w:hint="default"/>
+        <w:sz w:val="20"/>
+      </w:rPr>
+    </w:lvl>
+    <w:lvl w:ilvl="3" w:tentative="1">
+      <w:start w:val="1"/>
+      <w:numFmt w:val="bullet"/>
+      <w:lvlText w:val=""/>
+      <w:lvlJc w:val="left"/>
+      <w:pPr>
+        <w:tabs>
+          <w:tab w:val="num" w:pos="2880"/>
+        </w:tabs>
+        <w:ind w:left="2880" w:hanging="360"/>
+      </w:pPr>
+      <w:rPr>
+        <w:rFonts w:ascii="Wingdings" w:hAnsi="Wingdings" w:hint="default"/>
+        <w:sz w:val="20"/>
+      </w:rPr>
+    </w:lvl>
+    <w:lvl w:ilvl="4" w:tentative="1">
+      <w:start w:val="1"/>
+      <w:numFmt w:val="bullet"/>
+      <w:lvlText w:val=""/>
+      <w:lvlJc w:val="left"/>
+      <w:pPr>
+        <w:tabs>
+          <w:tab w:val="num" w:pos="3600"/>
+        </w:tabs>
+        <w:ind w:left="3600" w:hanging="360"/>
+      </w:pPr>
+      <w:rPr>
+        <w:rFonts w:ascii="Wingdings" w:hAnsi="Wingdings" w:hint="default"/>
+        <w:sz w:val="20"/>
+      </w:rPr>
+    </w:lvl>
+    <w:lvl w:ilvl="5" w:tentative="1">
+      <w:start w:val="1"/>
+      <w:numFmt w:val="bullet"/>
+      <w:lvlText w:val=""/>
+      <w:lvlJc w:val="left"/>
+      <w:pPr>
+        <w:tabs>
+          <w:tab w:val="num" w:pos="4320"/>
+        </w:tabs>
+        <w:ind w:left="4320" w:hanging="360"/>
+      </w:pPr>
+      <w:rPr>
+        <w:rFonts w:ascii="Wingdings" w:hAnsi="Wingdings" w:hint="default"/>
+        <w:sz w:val="20"/>
+      </w:rPr>
+    </w:lvl>
+    <w:lvl w:ilvl="6" w:tentative="1">
+      <w:start w:val="1"/>
+      <w:numFmt w:val="bullet"/>
+      <w:lvlText w:val=""/>
+      <w:lvlJc w:val="left"/>
+      <w:pPr>
+        <w:tabs>
+          <w:tab w:val="num" w:pos="5040"/>
+        </w:tabs>
+        <w:ind w:left="5040" w:hanging="360"/>
+      </w:pPr>
+      <w:rPr>
+        <w:rFonts w:ascii="Wingdings" w:hAnsi="Wingdings" w:hint="default"/>
+        <w:sz w:val="20"/>
+      </w:rPr>
+    </w:lvl>
+    <w:lvl w:ilvl="7" w:tentative="1">
+      <w:start w:val="1"/>
+      <w:numFmt w:val="bullet"/>
+      <w:lvlText w:val=""/>
+      <w:lvlJc w:val="left"/>
+      <w:pPr>
+        <w:tabs>
+          <w:tab w:val="num" w:pos="5760"/>
+        </w:tabs>
+        <w:ind w:left="5760" w:hanging="360"/>
+      </w:pPr>
+      <w:rPr>
+        <w:rFonts w:ascii="Wingdings" w:hAnsi="Wingdings" w:hint="default"/>
+        <w:sz w:val="20"/>
+      </w:rPr>
+    </w:lvl>
+    <w:lvl w:ilvl="8" w:tentative="1">
+      <w:start w:val="1"/>
+      <w:numFmt w:val="bullet"/>
+      <w:lvlText w:val=""/>
+      <w:lvlJc w:val="left"/>
+      <w:pPr>
+        <w:tabs>
+          <w:tab w:val="num" w:pos="6480"/>
+        </w:tabs>
+        <w:ind w:left="6480" w:hanging="360"/>
+      </w:pPr>
+      <w:rPr>
+        <w:rFonts w:ascii="Wingdings" w:hAnsi="Wingdings" w:hint="default"/>
+        <w:sz w:val="20"/>
+      </w:rPr>
+    </w:lvl>
+  </w:abstractNum>
+  <w:abstractNum w:abstractNumId="14" w15:restartNumberingAfterBreak="0">
     <w:nsid w:val="0BD52D5A"/>
     <w:multiLevelType w:val="multilevel"/>
     <w:tmpl w:val="41FCE4E6"/>
@@ -26161,7 +27906,7 @@
       </w:pPr>
     </w:lvl>
   </w:abstractNum>
-  <w:abstractNum w:abstractNumId="12" w15:restartNumberingAfterBreak="0">
+  <w:abstractNum w:abstractNumId="15" w15:restartNumberingAfterBreak="0">
     <w:nsid w:val="0C0C6A1D"/>
     <w:multiLevelType w:val="multilevel"/>
     <w:tmpl w:val="38DA8C0E"/>
@@ -26310,7 +28055,7 @@
       </w:rPr>
     </w:lvl>
   </w:abstractNum>
-  <w:abstractNum w:abstractNumId="13" w15:restartNumberingAfterBreak="0">
+  <w:abstractNum w:abstractNumId="16" w15:restartNumberingAfterBreak="0">
     <w:nsid w:val="0D7856B1"/>
     <w:multiLevelType w:val="hybridMultilevel"/>
     <w:tmpl w:val="2898D4BA"/>
@@ -26422,7 +28167,7 @@
       </w:rPr>
     </w:lvl>
   </w:abstractNum>
-  <w:abstractNum w:abstractNumId="14" w15:restartNumberingAfterBreak="0">
+  <w:abstractNum w:abstractNumId="17" w15:restartNumberingAfterBreak="0">
     <w:nsid w:val="0DB217EE"/>
     <w:multiLevelType w:val="multilevel"/>
     <w:tmpl w:val="6AB6649E"/>
@@ -26571,7 +28316,7 @@
       </w:rPr>
     </w:lvl>
   </w:abstractNum>
-  <w:abstractNum w:abstractNumId="15" w15:restartNumberingAfterBreak="0">
+  <w:abstractNum w:abstractNumId="18" w15:restartNumberingAfterBreak="0">
     <w:nsid w:val="0EF628C1"/>
     <w:multiLevelType w:val="hybridMultilevel"/>
     <w:tmpl w:val="3FECA2B0"/>
@@ -26684,7 +28429,7 @@
       </w:rPr>
     </w:lvl>
   </w:abstractNum>
-  <w:abstractNum w:abstractNumId="16" w15:restartNumberingAfterBreak="0">
+  <w:abstractNum w:abstractNumId="19" w15:restartNumberingAfterBreak="0">
     <w:nsid w:val="0F1374D0"/>
     <w:multiLevelType w:val="multilevel"/>
     <w:tmpl w:val="207EC83C"/>
@@ -26833,7 +28578,7 @@
       </w:rPr>
     </w:lvl>
   </w:abstractNum>
-  <w:abstractNum w:abstractNumId="17" w15:restartNumberingAfterBreak="0">
+  <w:abstractNum w:abstractNumId="20" w15:restartNumberingAfterBreak="0">
     <w:nsid w:val="0FE04871"/>
     <w:multiLevelType w:val="hybridMultilevel"/>
     <w:tmpl w:val="D1565958"/>
@@ -26946,7 +28691,7 @@
       </w:rPr>
     </w:lvl>
   </w:abstractNum>
-  <w:abstractNum w:abstractNumId="18" w15:restartNumberingAfterBreak="0">
+  <w:abstractNum w:abstractNumId="21" w15:restartNumberingAfterBreak="0">
     <w:nsid w:val="10523C97"/>
     <w:multiLevelType w:val="hybridMultilevel"/>
     <w:tmpl w:val="5244902C"/>
@@ -27059,7 +28804,7 @@
       </w:rPr>
     </w:lvl>
   </w:abstractNum>
-  <w:abstractNum w:abstractNumId="19" w15:restartNumberingAfterBreak="0">
+  <w:abstractNum w:abstractNumId="22" w15:restartNumberingAfterBreak="0">
     <w:nsid w:val="11552863"/>
     <w:multiLevelType w:val="hybridMultilevel"/>
     <w:tmpl w:val="42AC51D2"/>
@@ -27171,7 +28916,7 @@
       </w:rPr>
     </w:lvl>
   </w:abstractNum>
-  <w:abstractNum w:abstractNumId="20" w15:restartNumberingAfterBreak="0">
+  <w:abstractNum w:abstractNumId="23" w15:restartNumberingAfterBreak="0">
     <w:nsid w:val="14831279"/>
     <w:multiLevelType w:val="multilevel"/>
     <w:tmpl w:val="B02AD528"/>
@@ -27320,7 +29065,7 @@
       </w:rPr>
     </w:lvl>
   </w:abstractNum>
-  <w:abstractNum w:abstractNumId="21" w15:restartNumberingAfterBreak="0">
+  <w:abstractNum w:abstractNumId="24" w15:restartNumberingAfterBreak="0">
     <w:nsid w:val="168B796C"/>
     <w:multiLevelType w:val="hybridMultilevel"/>
     <w:tmpl w:val="DA50B3A8"/>
@@ -27432,7 +29177,7 @@
       </w:rPr>
     </w:lvl>
   </w:abstractNum>
-  <w:abstractNum w:abstractNumId="22" w15:restartNumberingAfterBreak="0">
+  <w:abstractNum w:abstractNumId="25" w15:restartNumberingAfterBreak="0">
     <w:nsid w:val="192550B1"/>
     <w:multiLevelType w:val="multilevel"/>
     <w:tmpl w:val="D65C2010"/>
@@ -27581,7 +29326,7 @@
       </w:rPr>
     </w:lvl>
   </w:abstractNum>
-  <w:abstractNum w:abstractNumId="23" w15:restartNumberingAfterBreak="0">
+  <w:abstractNum w:abstractNumId="26" w15:restartNumberingAfterBreak="0">
     <w:nsid w:val="19E06C2D"/>
     <w:multiLevelType w:val="hybridMultilevel"/>
     <w:tmpl w:val="79E4B8F4"/>
@@ -27694,7 +29439,7 @@
       </w:rPr>
     </w:lvl>
   </w:abstractNum>
-  <w:abstractNum w:abstractNumId="24" w15:restartNumberingAfterBreak="0">
+  <w:abstractNum w:abstractNumId="27" w15:restartNumberingAfterBreak="0">
     <w:nsid w:val="19EA681A"/>
     <w:multiLevelType w:val="multilevel"/>
     <w:tmpl w:val="0F3A5FEC"/>
@@ -27843,7 +29588,7 @@
       </w:rPr>
     </w:lvl>
   </w:abstractNum>
-  <w:abstractNum w:abstractNumId="25" w15:restartNumberingAfterBreak="0">
+  <w:abstractNum w:abstractNumId="28" w15:restartNumberingAfterBreak="0">
     <w:nsid w:val="1ABB3A53"/>
     <w:multiLevelType w:val="hybridMultilevel"/>
     <w:tmpl w:val="63F04ED8"/>
@@ -27955,7 +29700,7 @@
       </w:rPr>
     </w:lvl>
   </w:abstractNum>
-  <w:abstractNum w:abstractNumId="26" w15:restartNumberingAfterBreak="0">
+  <w:abstractNum w:abstractNumId="29" w15:restartNumberingAfterBreak="0">
     <w:nsid w:val="1B0B2056"/>
     <w:multiLevelType w:val="multilevel"/>
     <w:tmpl w:val="70AA8958"/>
@@ -28104,7 +29849,7 @@
       </w:rPr>
     </w:lvl>
   </w:abstractNum>
-  <w:abstractNum w:abstractNumId="27" w15:restartNumberingAfterBreak="0">
+  <w:abstractNum w:abstractNumId="30" w15:restartNumberingAfterBreak="0">
     <w:nsid w:val="1E0977E0"/>
     <w:multiLevelType w:val="hybridMultilevel"/>
     <w:tmpl w:val="549675B6"/>
@@ -28216,7 +29961,7 @@
       </w:rPr>
     </w:lvl>
   </w:abstractNum>
-  <w:abstractNum w:abstractNumId="28" w15:restartNumberingAfterBreak="0">
+  <w:abstractNum w:abstractNumId="31" w15:restartNumberingAfterBreak="0">
     <w:nsid w:val="1E5D0B16"/>
     <w:multiLevelType w:val="multilevel"/>
     <w:tmpl w:val="DDD27F94"/>
@@ -28365,7 +30110,7 @@
       </w:rPr>
     </w:lvl>
   </w:abstractNum>
-  <w:abstractNum w:abstractNumId="29" w15:restartNumberingAfterBreak="0">
+  <w:abstractNum w:abstractNumId="32" w15:restartNumberingAfterBreak="0">
     <w:nsid w:val="1FF82639"/>
     <w:multiLevelType w:val="hybridMultilevel"/>
     <w:tmpl w:val="3D58A3A4"/>
@@ -28477,7 +30222,7 @@
       </w:rPr>
     </w:lvl>
   </w:abstractNum>
-  <w:abstractNum w:abstractNumId="30" w15:restartNumberingAfterBreak="0">
+  <w:abstractNum w:abstractNumId="33" w15:restartNumberingAfterBreak="0">
     <w:nsid w:val="21561542"/>
     <w:multiLevelType w:val="hybridMultilevel"/>
     <w:tmpl w:val="5A365C6E"/>
@@ -28590,7 +30335,7 @@
       </w:rPr>
     </w:lvl>
   </w:abstractNum>
-  <w:abstractNum w:abstractNumId="31" w15:restartNumberingAfterBreak="0">
+  <w:abstractNum w:abstractNumId="34" w15:restartNumberingAfterBreak="0">
     <w:nsid w:val="229E3A8A"/>
     <w:multiLevelType w:val="hybridMultilevel"/>
     <w:tmpl w:val="F9A0F2D6"/>
@@ -28702,7 +30447,7 @@
       </w:rPr>
     </w:lvl>
   </w:abstractNum>
-  <w:abstractNum w:abstractNumId="32" w15:restartNumberingAfterBreak="0">
+  <w:abstractNum w:abstractNumId="35" w15:restartNumberingAfterBreak="0">
     <w:nsid w:val="24BF75FE"/>
     <w:multiLevelType w:val="multilevel"/>
     <w:tmpl w:val="D1A08D72"/>
@@ -28851,7 +30596,7 @@
       </w:rPr>
     </w:lvl>
   </w:abstractNum>
-  <w:abstractNum w:abstractNumId="33" w15:restartNumberingAfterBreak="0">
+  <w:abstractNum w:abstractNumId="36" w15:restartNumberingAfterBreak="0">
     <w:nsid w:val="24F04132"/>
     <w:multiLevelType w:val="hybridMultilevel"/>
     <w:tmpl w:val="D9763222"/>
@@ -28963,7 +30708,7 @@
       </w:rPr>
     </w:lvl>
   </w:abstractNum>
-  <w:abstractNum w:abstractNumId="34" w15:restartNumberingAfterBreak="0">
+  <w:abstractNum w:abstractNumId="37" w15:restartNumberingAfterBreak="0">
     <w:nsid w:val="25A03424"/>
     <w:multiLevelType w:val="hybridMultilevel"/>
     <w:tmpl w:val="01D22A8A"/>
@@ -29076,7 +30821,7 @@
       </w:rPr>
     </w:lvl>
   </w:abstractNum>
-  <w:abstractNum w:abstractNumId="35" w15:restartNumberingAfterBreak="0">
+  <w:abstractNum w:abstractNumId="38" w15:restartNumberingAfterBreak="0">
     <w:nsid w:val="25C95C75"/>
     <w:multiLevelType w:val="multilevel"/>
     <w:tmpl w:val="8C681C84"/>
@@ -29225,7 +30970,7 @@
       </w:rPr>
     </w:lvl>
   </w:abstractNum>
-  <w:abstractNum w:abstractNumId="36" w15:restartNumberingAfterBreak="0">
+  <w:abstractNum w:abstractNumId="39" w15:restartNumberingAfterBreak="0">
     <w:nsid w:val="26A95B53"/>
     <w:multiLevelType w:val="multilevel"/>
     <w:tmpl w:val="8E6E75B0"/>
@@ -29342,7 +31087,7 @@
       </w:pPr>
     </w:lvl>
   </w:abstractNum>
-  <w:abstractNum w:abstractNumId="37" w15:restartNumberingAfterBreak="0">
+  <w:abstractNum w:abstractNumId="40" w15:restartNumberingAfterBreak="0">
     <w:nsid w:val="27D37713"/>
     <w:multiLevelType w:val="hybridMultilevel"/>
     <w:tmpl w:val="DCFC50E8"/>
@@ -29455,7 +31200,7 @@
       </w:rPr>
     </w:lvl>
   </w:abstractNum>
-  <w:abstractNum w:abstractNumId="38" w15:restartNumberingAfterBreak="0">
+  <w:abstractNum w:abstractNumId="41" w15:restartNumberingAfterBreak="0">
     <w:nsid w:val="298F11E7"/>
     <w:multiLevelType w:val="hybridMultilevel"/>
     <w:tmpl w:val="1108B76C"/>
@@ -29567,7 +31312,7 @@
       </w:rPr>
     </w:lvl>
   </w:abstractNum>
-  <w:abstractNum w:abstractNumId="39" w15:restartNumberingAfterBreak="0">
+  <w:abstractNum w:abstractNumId="42" w15:restartNumberingAfterBreak="0">
     <w:nsid w:val="29B23F98"/>
     <w:multiLevelType w:val="hybridMultilevel"/>
     <w:tmpl w:val="DF880AF0"/>
@@ -29680,7 +31425,7 @@
       </w:rPr>
     </w:lvl>
   </w:abstractNum>
-  <w:abstractNum w:abstractNumId="40" w15:restartNumberingAfterBreak="0">
+  <w:abstractNum w:abstractNumId="43" w15:restartNumberingAfterBreak="0">
     <w:nsid w:val="2A535D37"/>
     <w:multiLevelType w:val="hybridMultilevel"/>
     <w:tmpl w:val="7FECFCC0"/>
@@ -29792,7 +31537,7 @@
       </w:rPr>
     </w:lvl>
   </w:abstractNum>
-  <w:abstractNum w:abstractNumId="41" w15:restartNumberingAfterBreak="0">
+  <w:abstractNum w:abstractNumId="44" w15:restartNumberingAfterBreak="0">
     <w:nsid w:val="2AFF4127"/>
     <w:multiLevelType w:val="multilevel"/>
     <w:tmpl w:val="5CF69D86"/>
@@ -29941,7 +31686,7 @@
       </w:rPr>
     </w:lvl>
   </w:abstractNum>
-  <w:abstractNum w:abstractNumId="42" w15:restartNumberingAfterBreak="0">
+  <w:abstractNum w:abstractNumId="45" w15:restartNumberingAfterBreak="0">
     <w:nsid w:val="2B087E4A"/>
     <w:multiLevelType w:val="hybridMultilevel"/>
     <w:tmpl w:val="5BA2AE44"/>
@@ -30054,7 +31799,7 @@
       </w:rPr>
     </w:lvl>
   </w:abstractNum>
-  <w:abstractNum w:abstractNumId="43" w15:restartNumberingAfterBreak="0">
+  <w:abstractNum w:abstractNumId="46" w15:restartNumberingAfterBreak="0">
     <w:nsid w:val="2B687FD7"/>
     <w:multiLevelType w:val="multilevel"/>
     <w:tmpl w:val="4D4478B0"/>
@@ -30203,7 +31948,7 @@
       </w:rPr>
     </w:lvl>
   </w:abstractNum>
-  <w:abstractNum w:abstractNumId="44" w15:restartNumberingAfterBreak="0">
+  <w:abstractNum w:abstractNumId="47" w15:restartNumberingAfterBreak="0">
     <w:nsid w:val="2CBB2E60"/>
     <w:multiLevelType w:val="hybridMultilevel"/>
     <w:tmpl w:val="B20AB142"/>
@@ -30315,7 +32060,7 @@
       </w:rPr>
     </w:lvl>
   </w:abstractNum>
-  <w:abstractNum w:abstractNumId="45" w15:restartNumberingAfterBreak="0">
+  <w:abstractNum w:abstractNumId="48" w15:restartNumberingAfterBreak="0">
     <w:nsid w:val="2D682597"/>
     <w:multiLevelType w:val="hybridMultilevel"/>
     <w:tmpl w:val="8AEE5F66"/>
@@ -30427,7 +32172,7 @@
       </w:rPr>
     </w:lvl>
   </w:abstractNum>
-  <w:abstractNum w:abstractNumId="46" w15:restartNumberingAfterBreak="0">
+  <w:abstractNum w:abstractNumId="49" w15:restartNumberingAfterBreak="0">
     <w:nsid w:val="2E82781B"/>
     <w:multiLevelType w:val="multilevel"/>
     <w:tmpl w:val="F360605E"/>
@@ -30576,7 +32321,7 @@
       </w:rPr>
     </w:lvl>
   </w:abstractNum>
-  <w:abstractNum w:abstractNumId="47" w15:restartNumberingAfterBreak="0">
+  <w:abstractNum w:abstractNumId="50" w15:restartNumberingAfterBreak="0">
     <w:nsid w:val="2EBC15C4"/>
     <w:multiLevelType w:val="multilevel"/>
     <w:tmpl w:val="881CFCCC"/>
@@ -30725,7 +32470,7 @@
       </w:rPr>
     </w:lvl>
   </w:abstractNum>
-  <w:abstractNum w:abstractNumId="48" w15:restartNumberingAfterBreak="0">
+  <w:abstractNum w:abstractNumId="51" w15:restartNumberingAfterBreak="0">
     <w:nsid w:val="2F0D491F"/>
     <w:multiLevelType w:val="hybridMultilevel"/>
     <w:tmpl w:val="D7D0F52A"/>
@@ -30838,7 +32583,7 @@
       </w:rPr>
     </w:lvl>
   </w:abstractNum>
-  <w:abstractNum w:abstractNumId="49" w15:restartNumberingAfterBreak="0">
+  <w:abstractNum w:abstractNumId="52" w15:restartNumberingAfterBreak="0">
     <w:nsid w:val="309C07EC"/>
     <w:multiLevelType w:val="hybridMultilevel"/>
     <w:tmpl w:val="43E654DC"/>
@@ -30951,7 +32696,7 @@
       </w:rPr>
     </w:lvl>
   </w:abstractNum>
-  <w:abstractNum w:abstractNumId="50" w15:restartNumberingAfterBreak="0">
+  <w:abstractNum w:abstractNumId="53" w15:restartNumberingAfterBreak="0">
     <w:nsid w:val="3122254E"/>
     <w:multiLevelType w:val="multilevel"/>
     <w:tmpl w:val="B470B2CA"/>
@@ -31100,7 +32845,7 @@
       </w:rPr>
     </w:lvl>
   </w:abstractNum>
-  <w:abstractNum w:abstractNumId="51" w15:restartNumberingAfterBreak="0">
+  <w:abstractNum w:abstractNumId="54" w15:restartNumberingAfterBreak="0">
     <w:nsid w:val="31D20FF2"/>
     <w:multiLevelType w:val="hybridMultilevel"/>
     <w:tmpl w:val="EA3CB86A"/>
@@ -31212,7 +32957,7 @@
       </w:rPr>
     </w:lvl>
   </w:abstractNum>
-  <w:abstractNum w:abstractNumId="52" w15:restartNumberingAfterBreak="0">
+  <w:abstractNum w:abstractNumId="55" w15:restartNumberingAfterBreak="0">
     <w:nsid w:val="344A2B21"/>
     <w:multiLevelType w:val="multilevel"/>
     <w:tmpl w:val="98D218B4"/>
@@ -31361,7 +33106,7 @@
       </w:rPr>
     </w:lvl>
   </w:abstractNum>
-  <w:abstractNum w:abstractNumId="53" w15:restartNumberingAfterBreak="0">
+  <w:abstractNum w:abstractNumId="56" w15:restartNumberingAfterBreak="0">
     <w:nsid w:val="34E20BF5"/>
     <w:multiLevelType w:val="multilevel"/>
     <w:tmpl w:val="EB129BB0"/>
@@ -31510,7 +33255,7 @@
       </w:rPr>
     </w:lvl>
   </w:abstractNum>
-  <w:abstractNum w:abstractNumId="54" w15:restartNumberingAfterBreak="0">
+  <w:abstractNum w:abstractNumId="57" w15:restartNumberingAfterBreak="0">
     <w:nsid w:val="350F2D66"/>
     <w:multiLevelType w:val="multilevel"/>
     <w:tmpl w:val="B88A184E"/>
@@ -31659,7 +33404,7 @@
       </w:rPr>
     </w:lvl>
   </w:abstractNum>
-  <w:abstractNum w:abstractNumId="55" w15:restartNumberingAfterBreak="0">
+  <w:abstractNum w:abstractNumId="58" w15:restartNumberingAfterBreak="0">
     <w:nsid w:val="35E55AC7"/>
     <w:multiLevelType w:val="hybridMultilevel"/>
     <w:tmpl w:val="BCFCACC6"/>
@@ -31771,7 +33516,7 @@
       </w:rPr>
     </w:lvl>
   </w:abstractNum>
-  <w:abstractNum w:abstractNumId="56" w15:restartNumberingAfterBreak="0">
+  <w:abstractNum w:abstractNumId="59" w15:restartNumberingAfterBreak="0">
     <w:nsid w:val="380E36DB"/>
     <w:multiLevelType w:val="hybridMultilevel"/>
     <w:tmpl w:val="7B3E5C58"/>
@@ -31883,7 +33628,7 @@
       </w:rPr>
     </w:lvl>
   </w:abstractNum>
-  <w:abstractNum w:abstractNumId="57" w15:restartNumberingAfterBreak="0">
+  <w:abstractNum w:abstractNumId="60" w15:restartNumberingAfterBreak="0">
     <w:nsid w:val="38530E13"/>
     <w:multiLevelType w:val="hybridMultilevel"/>
     <w:tmpl w:val="263AC0D6"/>
@@ -31996,7 +33741,7 @@
       </w:rPr>
     </w:lvl>
   </w:abstractNum>
-  <w:abstractNum w:abstractNumId="58" w15:restartNumberingAfterBreak="0">
+  <w:abstractNum w:abstractNumId="61" w15:restartNumberingAfterBreak="0">
     <w:nsid w:val="38623CC4"/>
     <w:multiLevelType w:val="multilevel"/>
     <w:tmpl w:val="CB0C2EF4"/>
@@ -32145,7 +33890,7 @@
       </w:rPr>
     </w:lvl>
   </w:abstractNum>
-  <w:abstractNum w:abstractNumId="59" w15:restartNumberingAfterBreak="0">
+  <w:abstractNum w:abstractNumId="62" w15:restartNumberingAfterBreak="0">
     <w:nsid w:val="39DB4418"/>
     <w:multiLevelType w:val="hybridMultilevel"/>
     <w:tmpl w:val="1C843710"/>
@@ -32257,7 +34002,7 @@
       </w:rPr>
     </w:lvl>
   </w:abstractNum>
-  <w:abstractNum w:abstractNumId="60" w15:restartNumberingAfterBreak="0">
+  <w:abstractNum w:abstractNumId="63" w15:restartNumberingAfterBreak="0">
     <w:nsid w:val="39F93B55"/>
     <w:multiLevelType w:val="multilevel"/>
     <w:tmpl w:val="DC567D38"/>
@@ -32406,7 +34151,7 @@
       </w:rPr>
     </w:lvl>
   </w:abstractNum>
-  <w:abstractNum w:abstractNumId="61" w15:restartNumberingAfterBreak="0">
+  <w:abstractNum w:abstractNumId="64" w15:restartNumberingAfterBreak="0">
     <w:nsid w:val="3A2445DB"/>
     <w:multiLevelType w:val="hybridMultilevel"/>
     <w:tmpl w:val="629C8E56"/>
@@ -32518,7 +34263,7 @@
       </w:rPr>
     </w:lvl>
   </w:abstractNum>
-  <w:abstractNum w:abstractNumId="62" w15:restartNumberingAfterBreak="0">
+  <w:abstractNum w:abstractNumId="65" w15:restartNumberingAfterBreak="0">
     <w:nsid w:val="3A2A15F0"/>
     <w:multiLevelType w:val="multilevel"/>
     <w:tmpl w:val="8EC800BA"/>
@@ -32667,7 +34412,7 @@
       </w:rPr>
     </w:lvl>
   </w:abstractNum>
-  <w:abstractNum w:abstractNumId="63" w15:restartNumberingAfterBreak="0">
+  <w:abstractNum w:abstractNumId="66" w15:restartNumberingAfterBreak="0">
     <w:nsid w:val="3B5B61CA"/>
     <w:multiLevelType w:val="multilevel"/>
     <w:tmpl w:val="83281F28"/>
@@ -32816,7 +34561,7 @@
       </w:rPr>
     </w:lvl>
   </w:abstractNum>
-  <w:abstractNum w:abstractNumId="64" w15:restartNumberingAfterBreak="0">
+  <w:abstractNum w:abstractNumId="67" w15:restartNumberingAfterBreak="0">
     <w:nsid w:val="3C6C2C33"/>
     <w:multiLevelType w:val="hybridMultilevel"/>
     <w:tmpl w:val="D8EA41E8"/>
@@ -32928,7 +34673,7 @@
       </w:rPr>
     </w:lvl>
   </w:abstractNum>
-  <w:abstractNum w:abstractNumId="65" w15:restartNumberingAfterBreak="0">
+  <w:abstractNum w:abstractNumId="68" w15:restartNumberingAfterBreak="0">
     <w:nsid w:val="3E017A65"/>
     <w:multiLevelType w:val="hybridMultilevel"/>
     <w:tmpl w:val="7DC43054"/>
@@ -33040,7 +34785,7 @@
       </w:rPr>
     </w:lvl>
   </w:abstractNum>
-  <w:abstractNum w:abstractNumId="66" w15:restartNumberingAfterBreak="0">
+  <w:abstractNum w:abstractNumId="69" w15:restartNumberingAfterBreak="0">
     <w:nsid w:val="3F2F2766"/>
     <w:multiLevelType w:val="hybridMultilevel"/>
     <w:tmpl w:val="4502E290"/>
@@ -33153,7 +34898,7 @@
       </w:rPr>
     </w:lvl>
   </w:abstractNum>
-  <w:abstractNum w:abstractNumId="67" w15:restartNumberingAfterBreak="0">
+  <w:abstractNum w:abstractNumId="70" w15:restartNumberingAfterBreak="0">
     <w:nsid w:val="3F670876"/>
     <w:multiLevelType w:val="hybridMultilevel"/>
     <w:tmpl w:val="87CAC3F6"/>
@@ -33265,7 +35010,7 @@
       </w:rPr>
     </w:lvl>
   </w:abstractNum>
-  <w:abstractNum w:abstractNumId="68" w15:restartNumberingAfterBreak="0">
+  <w:abstractNum w:abstractNumId="71" w15:restartNumberingAfterBreak="0">
     <w:nsid w:val="3FEE4530"/>
     <w:multiLevelType w:val="hybridMultilevel"/>
     <w:tmpl w:val="EFB48A48"/>
@@ -33378,7 +35123,7 @@
       </w:rPr>
     </w:lvl>
   </w:abstractNum>
-  <w:abstractNum w:abstractNumId="69" w15:restartNumberingAfterBreak="0">
+  <w:abstractNum w:abstractNumId="72" w15:restartNumberingAfterBreak="0">
     <w:nsid w:val="41562F53"/>
     <w:multiLevelType w:val="multilevel"/>
     <w:tmpl w:val="8FA65326"/>
@@ -33527,7 +35272,7 @@
       </w:rPr>
     </w:lvl>
   </w:abstractNum>
-  <w:abstractNum w:abstractNumId="70" w15:restartNumberingAfterBreak="0">
+  <w:abstractNum w:abstractNumId="73" w15:restartNumberingAfterBreak="0">
     <w:nsid w:val="417D0AB1"/>
     <w:multiLevelType w:val="multilevel"/>
     <w:tmpl w:val="C83643F8"/>
@@ -33676,7 +35421,7 @@
       </w:rPr>
     </w:lvl>
   </w:abstractNum>
-  <w:abstractNum w:abstractNumId="71" w15:restartNumberingAfterBreak="0">
+  <w:abstractNum w:abstractNumId="74" w15:restartNumberingAfterBreak="0">
     <w:nsid w:val="42516CF2"/>
     <w:multiLevelType w:val="multilevel"/>
     <w:tmpl w:val="B0706E5A"/>
@@ -33825,7 +35570,7 @@
       </w:rPr>
     </w:lvl>
   </w:abstractNum>
-  <w:abstractNum w:abstractNumId="72" w15:restartNumberingAfterBreak="0">
+  <w:abstractNum w:abstractNumId="75" w15:restartNumberingAfterBreak="0">
     <w:nsid w:val="42545CBC"/>
     <w:multiLevelType w:val="hybridMultilevel"/>
     <w:tmpl w:val="A6D487CC"/>
@@ -33937,7 +35682,7 @@
       </w:rPr>
     </w:lvl>
   </w:abstractNum>
-  <w:abstractNum w:abstractNumId="73" w15:restartNumberingAfterBreak="0">
+  <w:abstractNum w:abstractNumId="76" w15:restartNumberingAfterBreak="0">
     <w:nsid w:val="444A7F9A"/>
     <w:multiLevelType w:val="hybridMultilevel"/>
     <w:tmpl w:val="FC3C1540"/>
@@ -34049,7 +35794,7 @@
       </w:rPr>
     </w:lvl>
   </w:abstractNum>
-  <w:abstractNum w:abstractNumId="74" w15:restartNumberingAfterBreak="0">
+  <w:abstractNum w:abstractNumId="77" w15:restartNumberingAfterBreak="0">
     <w:nsid w:val="445D654F"/>
     <w:multiLevelType w:val="hybridMultilevel"/>
     <w:tmpl w:val="C8920D36"/>
@@ -34162,7 +35907,7 @@
       </w:rPr>
     </w:lvl>
   </w:abstractNum>
-  <w:abstractNum w:abstractNumId="75" w15:restartNumberingAfterBreak="0">
+  <w:abstractNum w:abstractNumId="78" w15:restartNumberingAfterBreak="0">
     <w:nsid w:val="451619A4"/>
     <w:multiLevelType w:val="hybridMultilevel"/>
     <w:tmpl w:val="D3B8B1B0"/>
@@ -34274,7 +36019,7 @@
       </w:rPr>
     </w:lvl>
   </w:abstractNum>
-  <w:abstractNum w:abstractNumId="76" w15:restartNumberingAfterBreak="0">
+  <w:abstractNum w:abstractNumId="79" w15:restartNumberingAfterBreak="0">
     <w:nsid w:val="45867B90"/>
     <w:multiLevelType w:val="hybridMultilevel"/>
     <w:tmpl w:val="47BA1232"/>
@@ -34386,7 +36131,7 @@
       </w:rPr>
     </w:lvl>
   </w:abstractNum>
-  <w:abstractNum w:abstractNumId="77" w15:restartNumberingAfterBreak="0">
+  <w:abstractNum w:abstractNumId="80" w15:restartNumberingAfterBreak="0">
     <w:nsid w:val="45906D68"/>
     <w:multiLevelType w:val="multilevel"/>
     <w:tmpl w:val="D7184B2A"/>
@@ -34535,7 +36280,7 @@
       </w:rPr>
     </w:lvl>
   </w:abstractNum>
-  <w:abstractNum w:abstractNumId="78" w15:restartNumberingAfterBreak="0">
+  <w:abstractNum w:abstractNumId="81" w15:restartNumberingAfterBreak="0">
     <w:nsid w:val="460A25AE"/>
     <w:multiLevelType w:val="multilevel"/>
     <w:tmpl w:val="61C8A5C8"/>
@@ -34684,7 +36429,7 @@
       </w:rPr>
     </w:lvl>
   </w:abstractNum>
-  <w:abstractNum w:abstractNumId="79" w15:restartNumberingAfterBreak="0">
+  <w:abstractNum w:abstractNumId="82" w15:restartNumberingAfterBreak="0">
     <w:nsid w:val="470C54C3"/>
     <w:multiLevelType w:val="hybridMultilevel"/>
     <w:tmpl w:val="0A827D10"/>
@@ -34797,7 +36542,7 @@
       </w:rPr>
     </w:lvl>
   </w:abstractNum>
-  <w:abstractNum w:abstractNumId="80" w15:restartNumberingAfterBreak="0">
+  <w:abstractNum w:abstractNumId="83" w15:restartNumberingAfterBreak="0">
     <w:nsid w:val="48691879"/>
     <w:multiLevelType w:val="multilevel"/>
     <w:tmpl w:val="24FA03BA"/>
@@ -34946,7 +36691,7 @@
       </w:rPr>
     </w:lvl>
   </w:abstractNum>
-  <w:abstractNum w:abstractNumId="81" w15:restartNumberingAfterBreak="0">
+  <w:abstractNum w:abstractNumId="84" w15:restartNumberingAfterBreak="0">
     <w:nsid w:val="4A136C87"/>
     <w:multiLevelType w:val="hybridMultilevel"/>
     <w:tmpl w:val="78608C6C"/>
@@ -35058,7 +36803,7 @@
       </w:rPr>
     </w:lvl>
   </w:abstractNum>
-  <w:abstractNum w:abstractNumId="82" w15:restartNumberingAfterBreak="0">
+  <w:abstractNum w:abstractNumId="85" w15:restartNumberingAfterBreak="0">
     <w:nsid w:val="4A236E9D"/>
     <w:multiLevelType w:val="hybridMultilevel"/>
     <w:tmpl w:val="9F9812D0"/>
@@ -35170,7 +36915,7 @@
       </w:rPr>
     </w:lvl>
   </w:abstractNum>
-  <w:abstractNum w:abstractNumId="83" w15:restartNumberingAfterBreak="0">
+  <w:abstractNum w:abstractNumId="86" w15:restartNumberingAfterBreak="0">
     <w:nsid w:val="4A5F55A9"/>
     <w:multiLevelType w:val="hybridMultilevel"/>
     <w:tmpl w:val="0D3AC080"/>
@@ -35282,7 +37027,7 @@
       </w:rPr>
     </w:lvl>
   </w:abstractNum>
-  <w:abstractNum w:abstractNumId="84" w15:restartNumberingAfterBreak="0">
+  <w:abstractNum w:abstractNumId="87" w15:restartNumberingAfterBreak="0">
     <w:nsid w:val="4A753E2F"/>
     <w:multiLevelType w:val="multilevel"/>
     <w:tmpl w:val="AABC8488"/>
@@ -35431,7 +37176,124 @@
       </w:rPr>
     </w:lvl>
   </w:abstractNum>
-  <w:abstractNum w:abstractNumId="85" w15:restartNumberingAfterBreak="0">
+  <w:abstractNum w:abstractNumId="88" w15:restartNumberingAfterBreak="0">
+    <w:nsid w:val="4A945CB1"/>
+    <w:multiLevelType w:val="multilevel"/>
+    <w:tmpl w:val="8D92B19C"/>
+    <w:lvl w:ilvl="0">
+      <w:start w:val="1"/>
+      <w:numFmt w:val="decimal"/>
+      <w:lvlText w:val="%1."/>
+      <w:lvlJc w:val="left"/>
+      <w:pPr>
+        <w:tabs>
+          <w:tab w:val="num" w:pos="720"/>
+        </w:tabs>
+        <w:ind w:left="720" w:hanging="360"/>
+      </w:pPr>
+    </w:lvl>
+    <w:lvl w:ilvl="1">
+      <w:start w:val="1"/>
+      <w:numFmt w:val="bullet"/>
+      <w:lvlText w:val="o"/>
+      <w:lvlJc w:val="left"/>
+      <w:pPr>
+        <w:tabs>
+          <w:tab w:val="num" w:pos="1440"/>
+        </w:tabs>
+        <w:ind w:left="1440" w:hanging="360"/>
+      </w:pPr>
+      <w:rPr>
+        <w:rFonts w:ascii="Courier New" w:hAnsi="Courier New" w:hint="default"/>
+        <w:sz w:val="20"/>
+      </w:rPr>
+    </w:lvl>
+    <w:lvl w:ilvl="2" w:tentative="1">
+      <w:start w:val="1"/>
+      <w:numFmt w:val="decimal"/>
+      <w:lvlText w:val="%3."/>
+      <w:lvlJc w:val="left"/>
+      <w:pPr>
+        <w:tabs>
+          <w:tab w:val="num" w:pos="2160"/>
+        </w:tabs>
+        <w:ind w:left="2160" w:hanging="360"/>
+      </w:pPr>
+    </w:lvl>
+    <w:lvl w:ilvl="3" w:tentative="1">
+      <w:start w:val="1"/>
+      <w:numFmt w:val="decimal"/>
+      <w:lvlText w:val="%4."/>
+      <w:lvlJc w:val="left"/>
+      <w:pPr>
+        <w:tabs>
+          <w:tab w:val="num" w:pos="2880"/>
+        </w:tabs>
+        <w:ind w:left="2880" w:hanging="360"/>
+      </w:pPr>
+    </w:lvl>
+    <w:lvl w:ilvl="4" w:tentative="1">
+      <w:start w:val="1"/>
+      <w:numFmt w:val="decimal"/>
+      <w:lvlText w:val="%5."/>
+      <w:lvlJc w:val="left"/>
+      <w:pPr>
+        <w:tabs>
+          <w:tab w:val="num" w:pos="3600"/>
+        </w:tabs>
+        <w:ind w:left="3600" w:hanging="360"/>
+      </w:pPr>
+    </w:lvl>
+    <w:lvl w:ilvl="5" w:tentative="1">
+      <w:start w:val="1"/>
+      <w:numFmt w:val="decimal"/>
+      <w:lvlText w:val="%6."/>
+      <w:lvlJc w:val="left"/>
+      <w:pPr>
+        <w:tabs>
+          <w:tab w:val="num" w:pos="4320"/>
+        </w:tabs>
+        <w:ind w:left="4320" w:hanging="360"/>
+      </w:pPr>
+    </w:lvl>
+    <w:lvl w:ilvl="6" w:tentative="1">
+      <w:start w:val="1"/>
+      <w:numFmt w:val="decimal"/>
+      <w:lvlText w:val="%7."/>
+      <w:lvlJc w:val="left"/>
+      <w:pPr>
+        <w:tabs>
+          <w:tab w:val="num" w:pos="5040"/>
+        </w:tabs>
+        <w:ind w:left="5040" w:hanging="360"/>
+      </w:pPr>
+    </w:lvl>
+    <w:lvl w:ilvl="7" w:tentative="1">
+      <w:start w:val="1"/>
+      <w:numFmt w:val="decimal"/>
+      <w:lvlText w:val="%8."/>
+      <w:lvlJc w:val="left"/>
+      <w:pPr>
+        <w:tabs>
+          <w:tab w:val="num" w:pos="5760"/>
+        </w:tabs>
+        <w:ind w:left="5760" w:hanging="360"/>
+      </w:pPr>
+    </w:lvl>
+    <w:lvl w:ilvl="8" w:tentative="1">
+      <w:start w:val="1"/>
+      <w:numFmt w:val="decimal"/>
+      <w:lvlText w:val="%9."/>
+      <w:lvlJc w:val="left"/>
+      <w:pPr>
+        <w:tabs>
+          <w:tab w:val="num" w:pos="6480"/>
+        </w:tabs>
+        <w:ind w:left="6480" w:hanging="360"/>
+      </w:pPr>
+    </w:lvl>
+  </w:abstractNum>
+  <w:abstractNum w:abstractNumId="89" w15:restartNumberingAfterBreak="0">
     <w:nsid w:val="4BB76C74"/>
     <w:multiLevelType w:val="hybridMultilevel"/>
     <w:tmpl w:val="D5303D68"/>
@@ -35543,7 +37405,7 @@
       </w:rPr>
     </w:lvl>
   </w:abstractNum>
-  <w:abstractNum w:abstractNumId="86" w15:restartNumberingAfterBreak="0">
+  <w:abstractNum w:abstractNumId="90" w15:restartNumberingAfterBreak="0">
     <w:nsid w:val="4DA617C0"/>
     <w:multiLevelType w:val="hybridMultilevel"/>
     <w:tmpl w:val="CBB6B620"/>
@@ -35655,7 +37517,7 @@
       </w:rPr>
     </w:lvl>
   </w:abstractNum>
-  <w:abstractNum w:abstractNumId="87" w15:restartNumberingAfterBreak="0">
+  <w:abstractNum w:abstractNumId="91" w15:restartNumberingAfterBreak="0">
     <w:nsid w:val="4E3A3B25"/>
     <w:multiLevelType w:val="hybridMultilevel"/>
     <w:tmpl w:val="99AA89AC"/>
@@ -35767,7 +37629,7 @@
       </w:rPr>
     </w:lvl>
   </w:abstractNum>
-  <w:abstractNum w:abstractNumId="88" w15:restartNumberingAfterBreak="0">
+  <w:abstractNum w:abstractNumId="92" w15:restartNumberingAfterBreak="0">
     <w:nsid w:val="4F2C133C"/>
     <w:multiLevelType w:val="multilevel"/>
     <w:tmpl w:val="25603220"/>
@@ -35916,7 +37778,7 @@
       </w:rPr>
     </w:lvl>
   </w:abstractNum>
-  <w:abstractNum w:abstractNumId="89" w15:restartNumberingAfterBreak="0">
+  <w:abstractNum w:abstractNumId="93" w15:restartNumberingAfterBreak="0">
     <w:nsid w:val="50256ADE"/>
     <w:multiLevelType w:val="hybridMultilevel"/>
     <w:tmpl w:val="0818EA64"/>
@@ -36028,7 +37890,7 @@
       </w:rPr>
     </w:lvl>
   </w:abstractNum>
-  <w:abstractNum w:abstractNumId="90" w15:restartNumberingAfterBreak="0">
+  <w:abstractNum w:abstractNumId="94" w15:restartNumberingAfterBreak="0">
     <w:nsid w:val="5079065A"/>
     <w:multiLevelType w:val="multilevel"/>
     <w:tmpl w:val="D6A2BC4E"/>
@@ -36177,7 +38039,7 @@
       </w:rPr>
     </w:lvl>
   </w:abstractNum>
-  <w:abstractNum w:abstractNumId="91" w15:restartNumberingAfterBreak="0">
+  <w:abstractNum w:abstractNumId="95" w15:restartNumberingAfterBreak="0">
     <w:nsid w:val="50BB6A1A"/>
     <w:multiLevelType w:val="multilevel"/>
     <w:tmpl w:val="51DE0E7E"/>
@@ -36326,7 +38188,7 @@
       </w:rPr>
     </w:lvl>
   </w:abstractNum>
-  <w:abstractNum w:abstractNumId="92" w15:restartNumberingAfterBreak="0">
+  <w:abstractNum w:abstractNumId="96" w15:restartNumberingAfterBreak="0">
     <w:nsid w:val="51713097"/>
     <w:multiLevelType w:val="multilevel"/>
     <w:tmpl w:val="AB2C4482"/>
@@ -36475,7 +38337,7 @@
       </w:rPr>
     </w:lvl>
   </w:abstractNum>
-  <w:abstractNum w:abstractNumId="93" w15:restartNumberingAfterBreak="0">
+  <w:abstractNum w:abstractNumId="97" w15:restartNumberingAfterBreak="0">
     <w:nsid w:val="51975149"/>
     <w:multiLevelType w:val="hybridMultilevel"/>
     <w:tmpl w:val="2EF4D1CA"/>
@@ -36588,7 +38450,7 @@
       </w:rPr>
     </w:lvl>
   </w:abstractNum>
-  <w:abstractNum w:abstractNumId="94" w15:restartNumberingAfterBreak="0">
+  <w:abstractNum w:abstractNumId="98" w15:restartNumberingAfterBreak="0">
     <w:nsid w:val="522764ED"/>
     <w:multiLevelType w:val="hybridMultilevel"/>
     <w:tmpl w:val="DAFA377A"/>
@@ -36677,7 +38539,7 @@
       </w:pPr>
     </w:lvl>
   </w:abstractNum>
-  <w:abstractNum w:abstractNumId="95" w15:restartNumberingAfterBreak="0">
+  <w:abstractNum w:abstractNumId="99" w15:restartNumberingAfterBreak="0">
     <w:nsid w:val="53FB0753"/>
     <w:multiLevelType w:val="hybridMultilevel"/>
     <w:tmpl w:val="36C23286"/>
@@ -36789,7 +38651,7 @@
       </w:rPr>
     </w:lvl>
   </w:abstractNum>
-  <w:abstractNum w:abstractNumId="96" w15:restartNumberingAfterBreak="0">
+  <w:abstractNum w:abstractNumId="100" w15:restartNumberingAfterBreak="0">
     <w:nsid w:val="54417D81"/>
     <w:multiLevelType w:val="multilevel"/>
     <w:tmpl w:val="340ADC2A"/>
@@ -36938,7 +38800,7 @@
       </w:rPr>
     </w:lvl>
   </w:abstractNum>
-  <w:abstractNum w:abstractNumId="97" w15:restartNumberingAfterBreak="0">
+  <w:abstractNum w:abstractNumId="101" w15:restartNumberingAfterBreak="0">
     <w:nsid w:val="54CD7F04"/>
     <w:multiLevelType w:val="multilevel"/>
     <w:tmpl w:val="020E20BE"/>
@@ -37051,7 +38913,156 @@
       </w:pPr>
     </w:lvl>
   </w:abstractNum>
-  <w:abstractNum w:abstractNumId="98" w15:restartNumberingAfterBreak="0">
+  <w:abstractNum w:abstractNumId="102" w15:restartNumberingAfterBreak="0">
+    <w:nsid w:val="56611736"/>
+    <w:multiLevelType w:val="multilevel"/>
+    <w:tmpl w:val="43769628"/>
+    <w:lvl w:ilvl="0">
+      <w:start w:val="1"/>
+      <w:numFmt w:val="bullet"/>
+      <w:lvlText w:val=""/>
+      <w:lvlJc w:val="left"/>
+      <w:pPr>
+        <w:tabs>
+          <w:tab w:val="num" w:pos="720"/>
+        </w:tabs>
+        <w:ind w:left="720" w:hanging="360"/>
+      </w:pPr>
+      <w:rPr>
+        <w:rFonts w:ascii="Symbol" w:hAnsi="Symbol" w:hint="default"/>
+        <w:sz w:val="20"/>
+      </w:rPr>
+    </w:lvl>
+    <w:lvl w:ilvl="1" w:tentative="1">
+      <w:start w:val="1"/>
+      <w:numFmt w:val="bullet"/>
+      <w:lvlText w:val="o"/>
+      <w:lvlJc w:val="left"/>
+      <w:pPr>
+        <w:tabs>
+          <w:tab w:val="num" w:pos="1440"/>
+        </w:tabs>
+        <w:ind w:left="1440" w:hanging="360"/>
+      </w:pPr>
+      <w:rPr>
+        <w:rFonts w:ascii="Courier New" w:hAnsi="Courier New" w:hint="default"/>
+        <w:sz w:val="20"/>
+      </w:rPr>
+    </w:lvl>
+    <w:lvl w:ilvl="2" w:tentative="1">
+      <w:start w:val="1"/>
+      <w:numFmt w:val="bullet"/>
+      <w:lvlText w:val=""/>
+      <w:lvlJc w:val="left"/>
+      <w:pPr>
+        <w:tabs>
+          <w:tab w:val="num" w:pos="2160"/>
+        </w:tabs>
+        <w:ind w:left="2160" w:hanging="360"/>
+      </w:pPr>
+      <w:rPr>
+        <w:rFonts w:ascii="Wingdings" w:hAnsi="Wingdings" w:hint="default"/>
+        <w:sz w:val="20"/>
+      </w:rPr>
+    </w:lvl>
+    <w:lvl w:ilvl="3" w:tentative="1">
+      <w:start w:val="1"/>
+      <w:numFmt w:val="bullet"/>
+      <w:lvlText w:val=""/>
+      <w:lvlJc w:val="left"/>
+      <w:pPr>
+        <w:tabs>
+          <w:tab w:val="num" w:pos="2880"/>
+        </w:tabs>
+        <w:ind w:left="2880" w:hanging="360"/>
+      </w:pPr>
+      <w:rPr>
+        <w:rFonts w:ascii="Wingdings" w:hAnsi="Wingdings" w:hint="default"/>
+        <w:sz w:val="20"/>
+      </w:rPr>
+    </w:lvl>
+    <w:lvl w:ilvl="4" w:tentative="1">
+      <w:start w:val="1"/>
+      <w:numFmt w:val="bullet"/>
+      <w:lvlText w:val=""/>
+      <w:lvlJc w:val="left"/>
+      <w:pPr>
+        <w:tabs>
+          <w:tab w:val="num" w:pos="3600"/>
+        </w:tabs>
+        <w:ind w:left="3600" w:hanging="360"/>
+      </w:pPr>
+      <w:rPr>
+        <w:rFonts w:ascii="Wingdings" w:hAnsi="Wingdings" w:hint="default"/>
+        <w:sz w:val="20"/>
+      </w:rPr>
+    </w:lvl>
+    <w:lvl w:ilvl="5" w:tentative="1">
+      <w:start w:val="1"/>
+      <w:numFmt w:val="bullet"/>
+      <w:lvlText w:val=""/>
+      <w:lvlJc w:val="left"/>
+      <w:pPr>
+        <w:tabs>
+          <w:tab w:val="num" w:pos="4320"/>
+        </w:tabs>
+        <w:ind w:left="4320" w:hanging="360"/>
+      </w:pPr>
+      <w:rPr>
+        <w:rFonts w:ascii="Wingdings" w:hAnsi="Wingdings" w:hint="default"/>
+        <w:sz w:val="20"/>
+      </w:rPr>
+    </w:lvl>
+    <w:lvl w:ilvl="6" w:tentative="1">
+      <w:start w:val="1"/>
+      <w:numFmt w:val="bullet"/>
+      <w:lvlText w:val=""/>
+      <w:lvlJc w:val="left"/>
+      <w:pPr>
+        <w:tabs>
+          <w:tab w:val="num" w:pos="5040"/>
+        </w:tabs>
+        <w:ind w:left="5040" w:hanging="360"/>
+      </w:pPr>
+      <w:rPr>
+        <w:rFonts w:ascii="Wingdings" w:hAnsi="Wingdings" w:hint="default"/>
+        <w:sz w:val="20"/>
+      </w:rPr>
+    </w:lvl>
+    <w:lvl w:ilvl="7" w:tentative="1">
+      <w:start w:val="1"/>
+      <w:numFmt w:val="bullet"/>
+      <w:lvlText w:val=""/>
+      <w:lvlJc w:val="left"/>
+      <w:pPr>
+        <w:tabs>
+          <w:tab w:val="num" w:pos="5760"/>
+        </w:tabs>
+        <w:ind w:left="5760" w:hanging="360"/>
+      </w:pPr>
+      <w:rPr>
+        <w:rFonts w:ascii="Wingdings" w:hAnsi="Wingdings" w:hint="default"/>
+        <w:sz w:val="20"/>
+      </w:rPr>
+    </w:lvl>
+    <w:lvl w:ilvl="8" w:tentative="1">
+      <w:start w:val="1"/>
+      <w:numFmt w:val="bullet"/>
+      <w:lvlText w:val=""/>
+      <w:lvlJc w:val="left"/>
+      <w:pPr>
+        <w:tabs>
+          <w:tab w:val="num" w:pos="6480"/>
+        </w:tabs>
+        <w:ind w:left="6480" w:hanging="360"/>
+      </w:pPr>
+      <w:rPr>
+        <w:rFonts w:ascii="Wingdings" w:hAnsi="Wingdings" w:hint="default"/>
+        <w:sz w:val="20"/>
+      </w:rPr>
+    </w:lvl>
+  </w:abstractNum>
+  <w:abstractNum w:abstractNumId="103" w15:restartNumberingAfterBreak="0">
     <w:nsid w:val="56A967D5"/>
     <w:multiLevelType w:val="hybridMultilevel"/>
     <w:tmpl w:val="4AD2C76C"/>
@@ -37163,7 +39174,156 @@
       </w:rPr>
     </w:lvl>
   </w:abstractNum>
-  <w:abstractNum w:abstractNumId="99" w15:restartNumberingAfterBreak="0">
+  <w:abstractNum w:abstractNumId="104" w15:restartNumberingAfterBreak="0">
+    <w:nsid w:val="572E4086"/>
+    <w:multiLevelType w:val="multilevel"/>
+    <w:tmpl w:val="45AEA662"/>
+    <w:lvl w:ilvl="0">
+      <w:start w:val="1"/>
+      <w:numFmt w:val="bullet"/>
+      <w:lvlText w:val=""/>
+      <w:lvlJc w:val="left"/>
+      <w:pPr>
+        <w:tabs>
+          <w:tab w:val="num" w:pos="720"/>
+        </w:tabs>
+        <w:ind w:left="720" w:hanging="360"/>
+      </w:pPr>
+      <w:rPr>
+        <w:rFonts w:ascii="Symbol" w:hAnsi="Symbol" w:hint="default"/>
+        <w:sz w:val="20"/>
+      </w:rPr>
+    </w:lvl>
+    <w:lvl w:ilvl="1" w:tentative="1">
+      <w:start w:val="1"/>
+      <w:numFmt w:val="bullet"/>
+      <w:lvlText w:val="o"/>
+      <w:lvlJc w:val="left"/>
+      <w:pPr>
+        <w:tabs>
+          <w:tab w:val="num" w:pos="1440"/>
+        </w:tabs>
+        <w:ind w:left="1440" w:hanging="360"/>
+      </w:pPr>
+      <w:rPr>
+        <w:rFonts w:ascii="Courier New" w:hAnsi="Courier New" w:hint="default"/>
+        <w:sz w:val="20"/>
+      </w:rPr>
+    </w:lvl>
+    <w:lvl w:ilvl="2" w:tentative="1">
+      <w:start w:val="1"/>
+      <w:numFmt w:val="bullet"/>
+      <w:lvlText w:val=""/>
+      <w:lvlJc w:val="left"/>
+      <w:pPr>
+        <w:tabs>
+          <w:tab w:val="num" w:pos="2160"/>
+        </w:tabs>
+        <w:ind w:left="2160" w:hanging="360"/>
+      </w:pPr>
+      <w:rPr>
+        <w:rFonts w:ascii="Wingdings" w:hAnsi="Wingdings" w:hint="default"/>
+        <w:sz w:val="20"/>
+      </w:rPr>
+    </w:lvl>
+    <w:lvl w:ilvl="3" w:tentative="1">
+      <w:start w:val="1"/>
+      <w:numFmt w:val="bullet"/>
+      <w:lvlText w:val=""/>
+      <w:lvlJc w:val="left"/>
+      <w:pPr>
+        <w:tabs>
+          <w:tab w:val="num" w:pos="2880"/>
+        </w:tabs>
+        <w:ind w:left="2880" w:hanging="360"/>
+      </w:pPr>
+      <w:rPr>
+        <w:rFonts w:ascii="Wingdings" w:hAnsi="Wingdings" w:hint="default"/>
+        <w:sz w:val="20"/>
+      </w:rPr>
+    </w:lvl>
+    <w:lvl w:ilvl="4" w:tentative="1">
+      <w:start w:val="1"/>
+      <w:numFmt w:val="bullet"/>
+      <w:lvlText w:val=""/>
+      <w:lvlJc w:val="left"/>
+      <w:pPr>
+        <w:tabs>
+          <w:tab w:val="num" w:pos="3600"/>
+        </w:tabs>
+        <w:ind w:left="3600" w:hanging="360"/>
+      </w:pPr>
+      <w:rPr>
+        <w:rFonts w:ascii="Wingdings" w:hAnsi="Wingdings" w:hint="default"/>
+        <w:sz w:val="20"/>
+      </w:rPr>
+    </w:lvl>
+    <w:lvl w:ilvl="5" w:tentative="1">
+      <w:start w:val="1"/>
+      <w:numFmt w:val="bullet"/>
+      <w:lvlText w:val=""/>
+      <w:lvlJc w:val="left"/>
+      <w:pPr>
+        <w:tabs>
+          <w:tab w:val="num" w:pos="4320"/>
+        </w:tabs>
+        <w:ind w:left="4320" w:hanging="360"/>
+      </w:pPr>
+      <w:rPr>
+        <w:rFonts w:ascii="Wingdings" w:hAnsi="Wingdings" w:hint="default"/>
+        <w:sz w:val="20"/>
+      </w:rPr>
+    </w:lvl>
+    <w:lvl w:ilvl="6" w:tentative="1">
+      <w:start w:val="1"/>
+      <w:numFmt w:val="bullet"/>
+      <w:lvlText w:val=""/>
+      <w:lvlJc w:val="left"/>
+      <w:pPr>
+        <w:tabs>
+          <w:tab w:val="num" w:pos="5040"/>
+        </w:tabs>
+        <w:ind w:left="5040" w:hanging="360"/>
+      </w:pPr>
+      <w:rPr>
+        <w:rFonts w:ascii="Wingdings" w:hAnsi="Wingdings" w:hint="default"/>
+        <w:sz w:val="20"/>
+      </w:rPr>
+    </w:lvl>
+    <w:lvl w:ilvl="7" w:tentative="1">
+      <w:start w:val="1"/>
+      <w:numFmt w:val="bullet"/>
+      <w:lvlText w:val=""/>
+      <w:lvlJc w:val="left"/>
+      <w:pPr>
+        <w:tabs>
+          <w:tab w:val="num" w:pos="5760"/>
+        </w:tabs>
+        <w:ind w:left="5760" w:hanging="360"/>
+      </w:pPr>
+      <w:rPr>
+        <w:rFonts w:ascii="Wingdings" w:hAnsi="Wingdings" w:hint="default"/>
+        <w:sz w:val="20"/>
+      </w:rPr>
+    </w:lvl>
+    <w:lvl w:ilvl="8" w:tentative="1">
+      <w:start w:val="1"/>
+      <w:numFmt w:val="bullet"/>
+      <w:lvlText w:val=""/>
+      <w:lvlJc w:val="left"/>
+      <w:pPr>
+        <w:tabs>
+          <w:tab w:val="num" w:pos="6480"/>
+        </w:tabs>
+        <w:ind w:left="6480" w:hanging="360"/>
+      </w:pPr>
+      <w:rPr>
+        <w:rFonts w:ascii="Wingdings" w:hAnsi="Wingdings" w:hint="default"/>
+        <w:sz w:val="20"/>
+      </w:rPr>
+    </w:lvl>
+  </w:abstractNum>
+  <w:abstractNum w:abstractNumId="105" w15:restartNumberingAfterBreak="0">
     <w:nsid w:val="578F4A30"/>
     <w:multiLevelType w:val="multilevel"/>
     <w:tmpl w:val="AA3C5686"/>
@@ -37312,7 +39472,7 @@
       </w:rPr>
     </w:lvl>
   </w:abstractNum>
-  <w:abstractNum w:abstractNumId="100" w15:restartNumberingAfterBreak="0">
+  <w:abstractNum w:abstractNumId="106" w15:restartNumberingAfterBreak="0">
     <w:nsid w:val="57F8144A"/>
     <w:multiLevelType w:val="hybridMultilevel"/>
     <w:tmpl w:val="1F8208A2"/>
@@ -37424,7 +39584,7 @@
       </w:rPr>
     </w:lvl>
   </w:abstractNum>
-  <w:abstractNum w:abstractNumId="101" w15:restartNumberingAfterBreak="0">
+  <w:abstractNum w:abstractNumId="107" w15:restartNumberingAfterBreak="0">
     <w:nsid w:val="57FA4B86"/>
     <w:multiLevelType w:val="hybridMultilevel"/>
     <w:tmpl w:val="24E2749A"/>
@@ -37536,7 +39696,7 @@
       </w:rPr>
     </w:lvl>
   </w:abstractNum>
-  <w:abstractNum w:abstractNumId="102" w15:restartNumberingAfterBreak="0">
+  <w:abstractNum w:abstractNumId="108" w15:restartNumberingAfterBreak="0">
     <w:nsid w:val="593E7476"/>
     <w:multiLevelType w:val="multilevel"/>
     <w:tmpl w:val="63A29348"/>
@@ -37685,7 +39845,7 @@
       </w:rPr>
     </w:lvl>
   </w:abstractNum>
-  <w:abstractNum w:abstractNumId="103" w15:restartNumberingAfterBreak="0">
+  <w:abstractNum w:abstractNumId="109" w15:restartNumberingAfterBreak="0">
     <w:nsid w:val="59560313"/>
     <w:multiLevelType w:val="multilevel"/>
     <w:tmpl w:val="5E9A8F6C"/>
@@ -37834,7 +39994,7 @@
       </w:rPr>
     </w:lvl>
   </w:abstractNum>
-  <w:abstractNum w:abstractNumId="104" w15:restartNumberingAfterBreak="0">
+  <w:abstractNum w:abstractNumId="110" w15:restartNumberingAfterBreak="0">
     <w:nsid w:val="59A37E1D"/>
     <w:multiLevelType w:val="multilevel"/>
     <w:tmpl w:val="C77A0876"/>
@@ -37983,7 +40143,7 @@
       </w:rPr>
     </w:lvl>
   </w:abstractNum>
-  <w:abstractNum w:abstractNumId="105" w15:restartNumberingAfterBreak="0">
+  <w:abstractNum w:abstractNumId="111" w15:restartNumberingAfterBreak="0">
     <w:nsid w:val="5AC635B5"/>
     <w:multiLevelType w:val="hybridMultilevel"/>
     <w:tmpl w:val="51A0E17A"/>
@@ -38095,7 +40255,7 @@
       </w:rPr>
     </w:lvl>
   </w:abstractNum>
-  <w:abstractNum w:abstractNumId="106" w15:restartNumberingAfterBreak="0">
+  <w:abstractNum w:abstractNumId="112" w15:restartNumberingAfterBreak="0">
     <w:nsid w:val="5D3D35B1"/>
     <w:multiLevelType w:val="multilevel"/>
     <w:tmpl w:val="1DB64FCA"/>
@@ -38244,7 +40404,7 @@
       </w:rPr>
     </w:lvl>
   </w:abstractNum>
-  <w:abstractNum w:abstractNumId="107" w15:restartNumberingAfterBreak="0">
+  <w:abstractNum w:abstractNumId="113" w15:restartNumberingAfterBreak="0">
     <w:nsid w:val="5D751E17"/>
     <w:multiLevelType w:val="multilevel"/>
     <w:tmpl w:val="02722D60"/>
@@ -38393,7 +40553,120 @@
       </w:rPr>
     </w:lvl>
   </w:abstractNum>
-  <w:abstractNum w:abstractNumId="108" w15:restartNumberingAfterBreak="0">
+  <w:abstractNum w:abstractNumId="114" w15:restartNumberingAfterBreak="0">
+    <w:nsid w:val="5DFB31F7"/>
+    <w:multiLevelType w:val="multilevel"/>
+    <w:tmpl w:val="FCA86AC8"/>
+    <w:lvl w:ilvl="0">
+      <w:start w:val="1"/>
+      <w:numFmt w:val="decimal"/>
+      <w:lvlText w:val="%1."/>
+      <w:lvlJc w:val="left"/>
+      <w:pPr>
+        <w:tabs>
+          <w:tab w:val="num" w:pos="720"/>
+        </w:tabs>
+        <w:ind w:left="720" w:hanging="360"/>
+      </w:pPr>
+    </w:lvl>
+    <w:lvl w:ilvl="1" w:tentative="1">
+      <w:start w:val="1"/>
+      <w:numFmt w:val="decimal"/>
+      <w:lvlText w:val="%2."/>
+      <w:lvlJc w:val="left"/>
+      <w:pPr>
+        <w:tabs>
+          <w:tab w:val="num" w:pos="1440"/>
+        </w:tabs>
+        <w:ind w:left="1440" w:hanging="360"/>
+      </w:pPr>
+    </w:lvl>
+    <w:lvl w:ilvl="2" w:tentative="1">
+      <w:start w:val="1"/>
+      <w:numFmt w:val="decimal"/>
+      <w:lvlText w:val="%3."/>
+      <w:lvlJc w:val="left"/>
+      <w:pPr>
+        <w:tabs>
+          <w:tab w:val="num" w:pos="2160"/>
+        </w:tabs>
+        <w:ind w:left="2160" w:hanging="360"/>
+      </w:pPr>
+    </w:lvl>
+    <w:lvl w:ilvl="3" w:tentative="1">
+      <w:start w:val="1"/>
+      <w:numFmt w:val="decimal"/>
+      <w:lvlText w:val="%4."/>
+      <w:lvlJc w:val="left"/>
+      <w:pPr>
+        <w:tabs>
+          <w:tab w:val="num" w:pos="2880"/>
+        </w:tabs>
+        <w:ind w:left="2880" w:hanging="360"/>
+      </w:pPr>
+    </w:lvl>
+    <w:lvl w:ilvl="4" w:tentative="1">
+      <w:start w:val="1"/>
+      <w:numFmt w:val="decimal"/>
+      <w:lvlText w:val="%5."/>
+      <w:lvlJc w:val="left"/>
+      <w:pPr>
+        <w:tabs>
+          <w:tab w:val="num" w:pos="3600"/>
+        </w:tabs>
+        <w:ind w:left="3600" w:hanging="360"/>
+      </w:pPr>
+    </w:lvl>
+    <w:lvl w:ilvl="5" w:tentative="1">
+      <w:start w:val="1"/>
+      <w:numFmt w:val="decimal"/>
+      <w:lvlText w:val="%6."/>
+      <w:lvlJc w:val="left"/>
+      <w:pPr>
+        <w:tabs>
+          <w:tab w:val="num" w:pos="4320"/>
+        </w:tabs>
+        <w:ind w:left="4320" w:hanging="360"/>
+      </w:pPr>
+    </w:lvl>
+    <w:lvl w:ilvl="6" w:tentative="1">
+      <w:start w:val="1"/>
+      <w:numFmt w:val="decimal"/>
+      <w:lvlText w:val="%7."/>
+      <w:lvlJc w:val="left"/>
+      <w:pPr>
+        <w:tabs>
+          <w:tab w:val="num" w:pos="5040"/>
+        </w:tabs>
+        <w:ind w:left="5040" w:hanging="360"/>
+      </w:pPr>
+    </w:lvl>
+    <w:lvl w:ilvl="7" w:tentative="1">
+      <w:start w:val="1"/>
+      <w:numFmt w:val="decimal"/>
+      <w:lvlText w:val="%8."/>
+      <w:lvlJc w:val="left"/>
+      <w:pPr>
+        <w:tabs>
+          <w:tab w:val="num" w:pos="5760"/>
+        </w:tabs>
+        <w:ind w:left="5760" w:hanging="360"/>
+      </w:pPr>
+    </w:lvl>
+    <w:lvl w:ilvl="8" w:tentative="1">
+      <w:start w:val="1"/>
+      <w:numFmt w:val="decimal"/>
+      <w:lvlText w:val="%9."/>
+      <w:lvlJc w:val="left"/>
+      <w:pPr>
+        <w:tabs>
+          <w:tab w:val="num" w:pos="6480"/>
+        </w:tabs>
+        <w:ind w:left="6480" w:hanging="360"/>
+      </w:pPr>
+    </w:lvl>
+  </w:abstractNum>
+  <w:abstractNum w:abstractNumId="115" w15:restartNumberingAfterBreak="0">
     <w:nsid w:val="5E8562F4"/>
     <w:multiLevelType w:val="multilevel"/>
     <w:tmpl w:val="E0D01132"/>
@@ -38542,7 +40815,7 @@
       </w:rPr>
     </w:lvl>
   </w:abstractNum>
-  <w:abstractNum w:abstractNumId="109" w15:restartNumberingAfterBreak="0">
+  <w:abstractNum w:abstractNumId="116" w15:restartNumberingAfterBreak="0">
     <w:nsid w:val="5E9D7FF9"/>
     <w:multiLevelType w:val="hybridMultilevel"/>
     <w:tmpl w:val="9FEC9846"/>
@@ -38655,7 +40928,7 @@
       </w:rPr>
     </w:lvl>
   </w:abstractNum>
-  <w:abstractNum w:abstractNumId="110" w15:restartNumberingAfterBreak="0">
+  <w:abstractNum w:abstractNumId="117" w15:restartNumberingAfterBreak="0">
     <w:nsid w:val="5FC668DA"/>
     <w:multiLevelType w:val="multilevel"/>
     <w:tmpl w:val="684224A0"/>
@@ -38804,7 +41077,7 @@
       </w:rPr>
     </w:lvl>
   </w:abstractNum>
-  <w:abstractNum w:abstractNumId="111" w15:restartNumberingAfterBreak="0">
+  <w:abstractNum w:abstractNumId="118" w15:restartNumberingAfterBreak="0">
     <w:nsid w:val="62801A7B"/>
     <w:multiLevelType w:val="multilevel"/>
     <w:tmpl w:val="295401CA"/>
@@ -38953,7 +41226,7 @@
       </w:rPr>
     </w:lvl>
   </w:abstractNum>
-  <w:abstractNum w:abstractNumId="112" w15:restartNumberingAfterBreak="0">
+  <w:abstractNum w:abstractNumId="119" w15:restartNumberingAfterBreak="0">
     <w:nsid w:val="62C72658"/>
     <w:multiLevelType w:val="multilevel"/>
     <w:tmpl w:val="4E78D272"/>
@@ -39102,7 +41375,7 @@
       </w:rPr>
     </w:lvl>
   </w:abstractNum>
-  <w:abstractNum w:abstractNumId="113" w15:restartNumberingAfterBreak="0">
+  <w:abstractNum w:abstractNumId="120" w15:restartNumberingAfterBreak="0">
     <w:nsid w:val="641534EF"/>
     <w:multiLevelType w:val="multilevel"/>
     <w:tmpl w:val="D9F652B8"/>
@@ -39215,7 +41488,7 @@
       </w:pPr>
     </w:lvl>
   </w:abstractNum>
-  <w:abstractNum w:abstractNumId="114" w15:restartNumberingAfterBreak="0">
+  <w:abstractNum w:abstractNumId="121" w15:restartNumberingAfterBreak="0">
     <w:nsid w:val="66C01D91"/>
     <w:multiLevelType w:val="hybridMultilevel"/>
     <w:tmpl w:val="056EB786"/>
@@ -39328,7 +41601,7 @@
       </w:rPr>
     </w:lvl>
   </w:abstractNum>
-  <w:abstractNum w:abstractNumId="115" w15:restartNumberingAfterBreak="0">
+  <w:abstractNum w:abstractNumId="122" w15:restartNumberingAfterBreak="0">
     <w:nsid w:val="686A07DC"/>
     <w:multiLevelType w:val="multilevel"/>
     <w:tmpl w:val="4EEADFAA"/>
@@ -39477,7 +41750,7 @@
       </w:rPr>
     </w:lvl>
   </w:abstractNum>
-  <w:abstractNum w:abstractNumId="116" w15:restartNumberingAfterBreak="0">
+  <w:abstractNum w:abstractNumId="123" w15:restartNumberingAfterBreak="0">
     <w:nsid w:val="68FF3E14"/>
     <w:multiLevelType w:val="hybridMultilevel"/>
     <w:tmpl w:val="852ED156"/>
@@ -39589,7 +41862,7 @@
       </w:rPr>
     </w:lvl>
   </w:abstractNum>
-  <w:abstractNum w:abstractNumId="117" w15:restartNumberingAfterBreak="0">
+  <w:abstractNum w:abstractNumId="124" w15:restartNumberingAfterBreak="0">
     <w:nsid w:val="69437F28"/>
     <w:multiLevelType w:val="multilevel"/>
     <w:tmpl w:val="0DFCEDBC"/>
@@ -39738,7 +42011,7 @@
       </w:rPr>
     </w:lvl>
   </w:abstractNum>
-  <w:abstractNum w:abstractNumId="118" w15:restartNumberingAfterBreak="0">
+  <w:abstractNum w:abstractNumId="125" w15:restartNumberingAfterBreak="0">
     <w:nsid w:val="6B531966"/>
     <w:multiLevelType w:val="hybridMultilevel"/>
     <w:tmpl w:val="2758CFC0"/>
@@ -39850,7 +42123,7 @@
       </w:rPr>
     </w:lvl>
   </w:abstractNum>
-  <w:abstractNum w:abstractNumId="119" w15:restartNumberingAfterBreak="0">
+  <w:abstractNum w:abstractNumId="126" w15:restartNumberingAfterBreak="0">
     <w:nsid w:val="6C181A8F"/>
     <w:multiLevelType w:val="hybridMultilevel"/>
     <w:tmpl w:val="AE1A9754"/>
@@ -39962,7 +42235,7 @@
       </w:rPr>
     </w:lvl>
   </w:abstractNum>
-  <w:abstractNum w:abstractNumId="120" w15:restartNumberingAfterBreak="0">
+  <w:abstractNum w:abstractNumId="127" w15:restartNumberingAfterBreak="0">
     <w:nsid w:val="6C3D39F9"/>
     <w:multiLevelType w:val="multilevel"/>
     <w:tmpl w:val="AD68E6B4"/>
@@ -40111,7 +42384,7 @@
       </w:rPr>
     </w:lvl>
   </w:abstractNum>
-  <w:abstractNum w:abstractNumId="121" w15:restartNumberingAfterBreak="0">
+  <w:abstractNum w:abstractNumId="128" w15:restartNumberingAfterBreak="0">
     <w:nsid w:val="6C52622C"/>
     <w:multiLevelType w:val="multilevel"/>
     <w:tmpl w:val="F8B03172"/>
@@ -40260,7 +42533,156 @@
       </w:rPr>
     </w:lvl>
   </w:abstractNum>
-  <w:abstractNum w:abstractNumId="122" w15:restartNumberingAfterBreak="0">
+  <w:abstractNum w:abstractNumId="129" w15:restartNumberingAfterBreak="0">
+    <w:nsid w:val="6C751930"/>
+    <w:multiLevelType w:val="multilevel"/>
+    <w:tmpl w:val="D61A4A92"/>
+    <w:lvl w:ilvl="0">
+      <w:start w:val="1"/>
+      <w:numFmt w:val="bullet"/>
+      <w:lvlText w:val=""/>
+      <w:lvlJc w:val="left"/>
+      <w:pPr>
+        <w:tabs>
+          <w:tab w:val="num" w:pos="720"/>
+        </w:tabs>
+        <w:ind w:left="720" w:hanging="360"/>
+      </w:pPr>
+      <w:rPr>
+        <w:rFonts w:ascii="Symbol" w:hAnsi="Symbol" w:hint="default"/>
+        <w:sz w:val="20"/>
+      </w:rPr>
+    </w:lvl>
+    <w:lvl w:ilvl="1" w:tentative="1">
+      <w:start w:val="1"/>
+      <w:numFmt w:val="bullet"/>
+      <w:lvlText w:val="o"/>
+      <w:lvlJc w:val="left"/>
+      <w:pPr>
+        <w:tabs>
+          <w:tab w:val="num" w:pos="1440"/>
+        </w:tabs>
+        <w:ind w:left="1440" w:hanging="360"/>
+      </w:pPr>
+      <w:rPr>
+        <w:rFonts w:ascii="Courier New" w:hAnsi="Courier New" w:hint="default"/>
+        <w:sz w:val="20"/>
+      </w:rPr>
+    </w:lvl>
+    <w:lvl w:ilvl="2" w:tentative="1">
+      <w:start w:val="1"/>
+      <w:numFmt w:val="bullet"/>
+      <w:lvlText w:val=""/>
+      <w:lvlJc w:val="left"/>
+      <w:pPr>
+        <w:tabs>
+          <w:tab w:val="num" w:pos="2160"/>
+        </w:tabs>
+        <w:ind w:left="2160" w:hanging="360"/>
+      </w:pPr>
+      <w:rPr>
+        <w:rFonts w:ascii="Wingdings" w:hAnsi="Wingdings" w:hint="default"/>
+        <w:sz w:val="20"/>
+      </w:rPr>
+    </w:lvl>
+    <w:lvl w:ilvl="3" w:tentative="1">
+      <w:start w:val="1"/>
+      <w:numFmt w:val="bullet"/>
+      <w:lvlText w:val=""/>
+      <w:lvlJc w:val="left"/>
+      <w:pPr>
+        <w:tabs>
+          <w:tab w:val="num" w:pos="2880"/>
+        </w:tabs>
+        <w:ind w:left="2880" w:hanging="360"/>
+      </w:pPr>
+      <w:rPr>
+        <w:rFonts w:ascii="Wingdings" w:hAnsi="Wingdings" w:hint="default"/>
+        <w:sz w:val="20"/>
+      </w:rPr>
+    </w:lvl>
+    <w:lvl w:ilvl="4" w:tentative="1">
+      <w:start w:val="1"/>
+      <w:numFmt w:val="bullet"/>
+      <w:lvlText w:val=""/>
+      <w:lvlJc w:val="left"/>
+      <w:pPr>
+        <w:tabs>
+          <w:tab w:val="num" w:pos="3600"/>
+        </w:tabs>
+        <w:ind w:left="3600" w:hanging="360"/>
+      </w:pPr>
+      <w:rPr>
+        <w:rFonts w:ascii="Wingdings" w:hAnsi="Wingdings" w:hint="default"/>
+        <w:sz w:val="20"/>
+      </w:rPr>
+    </w:lvl>
+    <w:lvl w:ilvl="5" w:tentative="1">
+      <w:start w:val="1"/>
+      <w:numFmt w:val="bullet"/>
+      <w:lvlText w:val=""/>
+      <w:lvlJc w:val="left"/>
+      <w:pPr>
+        <w:tabs>
+          <w:tab w:val="num" w:pos="4320"/>
+        </w:tabs>
+        <w:ind w:left="4320" w:hanging="360"/>
+      </w:pPr>
+      <w:rPr>
+        <w:rFonts w:ascii="Wingdings" w:hAnsi="Wingdings" w:hint="default"/>
+        <w:sz w:val="20"/>
+      </w:rPr>
+    </w:lvl>
+    <w:lvl w:ilvl="6" w:tentative="1">
+      <w:start w:val="1"/>
+      <w:numFmt w:val="bullet"/>
+      <w:lvlText w:val=""/>
+      <w:lvlJc w:val="left"/>
+      <w:pPr>
+        <w:tabs>
+          <w:tab w:val="num" w:pos="5040"/>
+        </w:tabs>
+        <w:ind w:left="5040" w:hanging="360"/>
+      </w:pPr>
+      <w:rPr>
+        <w:rFonts w:ascii="Wingdings" w:hAnsi="Wingdings" w:hint="default"/>
+        <w:sz w:val="20"/>
+      </w:rPr>
+    </w:lvl>
+    <w:lvl w:ilvl="7" w:tentative="1">
+      <w:start w:val="1"/>
+      <w:numFmt w:val="bullet"/>
+      <w:lvlText w:val=""/>
+      <w:lvlJc w:val="left"/>
+      <w:pPr>
+        <w:tabs>
+          <w:tab w:val="num" w:pos="5760"/>
+        </w:tabs>
+        <w:ind w:left="5760" w:hanging="360"/>
+      </w:pPr>
+      <w:rPr>
+        <w:rFonts w:ascii="Wingdings" w:hAnsi="Wingdings" w:hint="default"/>
+        <w:sz w:val="20"/>
+      </w:rPr>
+    </w:lvl>
+    <w:lvl w:ilvl="8" w:tentative="1">
+      <w:start w:val="1"/>
+      <w:numFmt w:val="bullet"/>
+      <w:lvlText w:val=""/>
+      <w:lvlJc w:val="left"/>
+      <w:pPr>
+        <w:tabs>
+          <w:tab w:val="num" w:pos="6480"/>
+        </w:tabs>
+        <w:ind w:left="6480" w:hanging="360"/>
+      </w:pPr>
+      <w:rPr>
+        <w:rFonts w:ascii="Wingdings" w:hAnsi="Wingdings" w:hint="default"/>
+        <w:sz w:val="20"/>
+      </w:rPr>
+    </w:lvl>
+  </w:abstractNum>
+  <w:abstractNum w:abstractNumId="130" w15:restartNumberingAfterBreak="0">
     <w:nsid w:val="6D674DC7"/>
     <w:multiLevelType w:val="multilevel"/>
     <w:tmpl w:val="4342CC68"/>
@@ -40409,7 +42831,7 @@
       </w:rPr>
     </w:lvl>
   </w:abstractNum>
-  <w:abstractNum w:abstractNumId="123" w15:restartNumberingAfterBreak="0">
+  <w:abstractNum w:abstractNumId="131" w15:restartNumberingAfterBreak="0">
     <w:nsid w:val="6E08011E"/>
     <w:multiLevelType w:val="hybridMultilevel"/>
     <w:tmpl w:val="33DE4EDC"/>
@@ -40521,7 +42943,7 @@
       </w:rPr>
     </w:lvl>
   </w:abstractNum>
-  <w:abstractNum w:abstractNumId="124" w15:restartNumberingAfterBreak="0">
+  <w:abstractNum w:abstractNumId="132" w15:restartNumberingAfterBreak="0">
     <w:nsid w:val="71C01D39"/>
     <w:multiLevelType w:val="multilevel"/>
     <w:tmpl w:val="7C4E5656"/>
@@ -40670,7 +43092,7 @@
       </w:rPr>
     </w:lvl>
   </w:abstractNum>
-  <w:abstractNum w:abstractNumId="125" w15:restartNumberingAfterBreak="0">
+  <w:abstractNum w:abstractNumId="133" w15:restartNumberingAfterBreak="0">
     <w:nsid w:val="71DA105D"/>
     <w:multiLevelType w:val="multilevel"/>
     <w:tmpl w:val="E3607C50"/>
@@ -40819,7 +43241,7 @@
       </w:rPr>
     </w:lvl>
   </w:abstractNum>
-  <w:abstractNum w:abstractNumId="126" w15:restartNumberingAfterBreak="0">
+  <w:abstractNum w:abstractNumId="134" w15:restartNumberingAfterBreak="0">
     <w:nsid w:val="720D4046"/>
     <w:multiLevelType w:val="multilevel"/>
     <w:tmpl w:val="FBF6B1EC"/>
@@ -40968,7 +43390,7 @@
       </w:rPr>
     </w:lvl>
   </w:abstractNum>
-  <w:abstractNum w:abstractNumId="127" w15:restartNumberingAfterBreak="0">
+  <w:abstractNum w:abstractNumId="135" w15:restartNumberingAfterBreak="0">
     <w:nsid w:val="722717AC"/>
     <w:multiLevelType w:val="hybridMultilevel"/>
     <w:tmpl w:val="935CC4B6"/>
@@ -41080,7 +43502,7 @@
       </w:rPr>
     </w:lvl>
   </w:abstractNum>
-  <w:abstractNum w:abstractNumId="128" w15:restartNumberingAfterBreak="0">
+  <w:abstractNum w:abstractNumId="136" w15:restartNumberingAfterBreak="0">
     <w:nsid w:val="7266168E"/>
     <w:multiLevelType w:val="hybridMultilevel"/>
     <w:tmpl w:val="163AFB96"/>
@@ -41192,7 +43614,7 @@
       </w:rPr>
     </w:lvl>
   </w:abstractNum>
-  <w:abstractNum w:abstractNumId="129" w15:restartNumberingAfterBreak="0">
+  <w:abstractNum w:abstractNumId="137" w15:restartNumberingAfterBreak="0">
     <w:nsid w:val="72922481"/>
     <w:multiLevelType w:val="multilevel"/>
     <w:tmpl w:val="4E744A08"/>
@@ -41341,7 +43763,7 @@
       </w:rPr>
     </w:lvl>
   </w:abstractNum>
-  <w:abstractNum w:abstractNumId="130" w15:restartNumberingAfterBreak="0">
+  <w:abstractNum w:abstractNumId="138" w15:restartNumberingAfterBreak="0">
     <w:nsid w:val="72C83012"/>
     <w:multiLevelType w:val="multilevel"/>
     <w:tmpl w:val="B4ACA258"/>
@@ -41490,7 +43912,7 @@
       </w:rPr>
     </w:lvl>
   </w:abstractNum>
-  <w:abstractNum w:abstractNumId="131" w15:restartNumberingAfterBreak="0">
+  <w:abstractNum w:abstractNumId="139" w15:restartNumberingAfterBreak="0">
     <w:nsid w:val="743E3484"/>
     <w:multiLevelType w:val="hybridMultilevel"/>
     <w:tmpl w:val="F148EE2C"/>
@@ -41603,7 +44025,7 @@
       </w:rPr>
     </w:lvl>
   </w:abstractNum>
-  <w:abstractNum w:abstractNumId="132" w15:restartNumberingAfterBreak="0">
+  <w:abstractNum w:abstractNumId="140" w15:restartNumberingAfterBreak="0">
     <w:nsid w:val="777C1D77"/>
     <w:multiLevelType w:val="hybridMultilevel"/>
     <w:tmpl w:val="2D0210B8"/>
@@ -41715,7 +44137,7 @@
       </w:rPr>
     </w:lvl>
   </w:abstractNum>
-  <w:abstractNum w:abstractNumId="133" w15:restartNumberingAfterBreak="0">
+  <w:abstractNum w:abstractNumId="141" w15:restartNumberingAfterBreak="0">
     <w:nsid w:val="79033895"/>
     <w:multiLevelType w:val="hybridMultilevel"/>
     <w:tmpl w:val="D0EC68D0"/>
@@ -41827,7 +44249,7 @@
       </w:rPr>
     </w:lvl>
   </w:abstractNum>
-  <w:abstractNum w:abstractNumId="134" w15:restartNumberingAfterBreak="0">
+  <w:abstractNum w:abstractNumId="142" w15:restartNumberingAfterBreak="0">
     <w:nsid w:val="79254661"/>
     <w:multiLevelType w:val="multilevel"/>
     <w:tmpl w:val="577EED92"/>
@@ -41976,7 +44398,7 @@
       </w:rPr>
     </w:lvl>
   </w:abstractNum>
-  <w:abstractNum w:abstractNumId="135" w15:restartNumberingAfterBreak="0">
+  <w:abstractNum w:abstractNumId="143" w15:restartNumberingAfterBreak="0">
     <w:nsid w:val="7A8751EA"/>
     <w:multiLevelType w:val="multilevel"/>
     <w:tmpl w:val="ADFE54B8"/>
@@ -42125,7 +44547,7 @@
       </w:rPr>
     </w:lvl>
   </w:abstractNum>
-  <w:abstractNum w:abstractNumId="136" w15:restartNumberingAfterBreak="0">
+  <w:abstractNum w:abstractNumId="144" w15:restartNumberingAfterBreak="0">
     <w:nsid w:val="7BB76968"/>
     <w:multiLevelType w:val="hybridMultilevel"/>
     <w:tmpl w:val="F1945E5E"/>
@@ -42237,7 +44659,7 @@
       </w:rPr>
     </w:lvl>
   </w:abstractNum>
-  <w:abstractNum w:abstractNumId="137" w15:restartNumberingAfterBreak="0">
+  <w:abstractNum w:abstractNumId="145" w15:restartNumberingAfterBreak="0">
     <w:nsid w:val="7D0F73BE"/>
     <w:multiLevelType w:val="multilevel"/>
     <w:tmpl w:val="283CE29A"/>
@@ -42386,7 +44808,7 @@
       </w:rPr>
     </w:lvl>
   </w:abstractNum>
-  <w:abstractNum w:abstractNumId="138" w15:restartNumberingAfterBreak="0">
+  <w:abstractNum w:abstractNumId="146" w15:restartNumberingAfterBreak="0">
     <w:nsid w:val="7E1427B3"/>
     <w:multiLevelType w:val="multilevel"/>
     <w:tmpl w:val="760E8CDE"/>
@@ -42536,423 +44958,447 @@
     </w:lvl>
   </w:abstractNum>
   <w:num w:numId="1" w16cid:durableId="1956208242">
-    <w:abstractNumId w:val="6"/>
+    <w:abstractNumId w:val="7"/>
   </w:num>
   <w:num w:numId="2" w16cid:durableId="77288022">
-    <w:abstractNumId w:val="7"/>
+    <w:abstractNumId w:val="8"/>
   </w:num>
   <w:num w:numId="3" w16cid:durableId="1080636982">
-    <w:abstractNumId w:val="88"/>
+    <w:abstractNumId w:val="92"/>
   </w:num>
   <w:num w:numId="4" w16cid:durableId="716128754">
-    <w:abstractNumId w:val="35"/>
+    <w:abstractNumId w:val="38"/>
   </w:num>
   <w:num w:numId="5" w16cid:durableId="1356880465">
-    <w:abstractNumId w:val="134"/>
+    <w:abstractNumId w:val="142"/>
   </w:num>
   <w:num w:numId="6" w16cid:durableId="1210613002">
-    <w:abstractNumId w:val="26"/>
+    <w:abstractNumId w:val="29"/>
   </w:num>
   <w:num w:numId="7" w16cid:durableId="2002191770">
+    <w:abstractNumId w:val="74"/>
+  </w:num>
+  <w:num w:numId="8" w16cid:durableId="998534124">
+    <w:abstractNumId w:val="46"/>
+  </w:num>
+  <w:num w:numId="9" w16cid:durableId="523247384">
+    <w:abstractNumId w:val="130"/>
+  </w:num>
+  <w:num w:numId="10" w16cid:durableId="261114341">
+    <w:abstractNumId w:val="23"/>
+  </w:num>
+  <w:num w:numId="11" w16cid:durableId="987244375">
+    <w:abstractNumId w:val="143"/>
+  </w:num>
+  <w:num w:numId="12" w16cid:durableId="1765805581">
+    <w:abstractNumId w:val="9"/>
+  </w:num>
+  <w:num w:numId="13" w16cid:durableId="820117559">
+    <w:abstractNumId w:val="121"/>
+  </w:num>
+  <w:num w:numId="14" w16cid:durableId="452291802">
+    <w:abstractNumId w:val="51"/>
+  </w:num>
+  <w:num w:numId="15" w16cid:durableId="71853967">
+    <w:abstractNumId w:val="37"/>
+  </w:num>
+  <w:num w:numId="16" w16cid:durableId="1587035945">
     <w:abstractNumId w:val="71"/>
   </w:num>
-  <w:num w:numId="8" w16cid:durableId="998534124">
-    <w:abstractNumId w:val="43"/>
-  </w:num>
-  <w:num w:numId="9" w16cid:durableId="523247384">
-    <w:abstractNumId w:val="122"/>
-  </w:num>
-  <w:num w:numId="10" w16cid:durableId="261114341">
-    <w:abstractNumId w:val="20"/>
-  </w:num>
-  <w:num w:numId="11" w16cid:durableId="987244375">
-    <w:abstractNumId w:val="135"/>
-  </w:num>
-  <w:num w:numId="12" w16cid:durableId="1765805581">
-    <w:abstractNumId w:val="8"/>
-  </w:num>
-  <w:num w:numId="13" w16cid:durableId="820117559">
-    <w:abstractNumId w:val="114"/>
-  </w:num>
-  <w:num w:numId="14" w16cid:durableId="452291802">
-    <w:abstractNumId w:val="48"/>
-  </w:num>
-  <w:num w:numId="15" w16cid:durableId="71853967">
-    <w:abstractNumId w:val="34"/>
-  </w:num>
-  <w:num w:numId="16" w16cid:durableId="1587035945">
-    <w:abstractNumId w:val="68"/>
-  </w:num>
   <w:num w:numId="17" w16cid:durableId="1439452709">
-    <w:abstractNumId w:val="57"/>
+    <w:abstractNumId w:val="60"/>
   </w:num>
   <w:num w:numId="18" w16cid:durableId="1627157179">
-    <w:abstractNumId w:val="93"/>
+    <w:abstractNumId w:val="97"/>
   </w:num>
   <w:num w:numId="19" w16cid:durableId="1214316601">
-    <w:abstractNumId w:val="74"/>
+    <w:abstractNumId w:val="77"/>
   </w:num>
   <w:num w:numId="20" w16cid:durableId="1685471909">
     <w:abstractNumId w:val="2"/>
   </w:num>
   <w:num w:numId="21" w16cid:durableId="914435209">
-    <w:abstractNumId w:val="49"/>
+    <w:abstractNumId w:val="52"/>
   </w:num>
   <w:num w:numId="22" w16cid:durableId="1255505909">
+    <w:abstractNumId w:val="45"/>
+  </w:num>
+  <w:num w:numId="23" w16cid:durableId="529799065">
+    <w:abstractNumId w:val="18"/>
+  </w:num>
+  <w:num w:numId="24" w16cid:durableId="1664163106">
+    <w:abstractNumId w:val="116"/>
+  </w:num>
+  <w:num w:numId="25" w16cid:durableId="1714576960">
+    <w:abstractNumId w:val="26"/>
+  </w:num>
+  <w:num w:numId="26" w16cid:durableId="2121341683">
+    <w:abstractNumId w:val="33"/>
+  </w:num>
+  <w:num w:numId="27" w16cid:durableId="827793205">
+    <w:abstractNumId w:val="139"/>
+  </w:num>
+  <w:num w:numId="28" w16cid:durableId="1275989163">
+    <w:abstractNumId w:val="69"/>
+  </w:num>
+  <w:num w:numId="29" w16cid:durableId="621544332">
+    <w:abstractNumId w:val="82"/>
+  </w:num>
+  <w:num w:numId="30" w16cid:durableId="1089692455">
+    <w:abstractNumId w:val="20"/>
+  </w:num>
+  <w:num w:numId="31" w16cid:durableId="1926265000">
+    <w:abstractNumId w:val="40"/>
+  </w:num>
+  <w:num w:numId="32" w16cid:durableId="2092268856">
+    <w:abstractNumId w:val="21"/>
+  </w:num>
+  <w:num w:numId="33" w16cid:durableId="46222972">
     <w:abstractNumId w:val="42"/>
   </w:num>
-  <w:num w:numId="23" w16cid:durableId="529799065">
-    <w:abstractNumId w:val="15"/>
+  <w:num w:numId="34" w16cid:durableId="721440043">
+    <w:abstractNumId w:val="89"/>
   </w:num>
-  <w:num w:numId="24" w16cid:durableId="1664163106">
-    <w:abstractNumId w:val="109"/>
+  <w:num w:numId="35" w16cid:durableId="1074085621">
+    <w:abstractNumId w:val="126"/>
   </w:num>
-  <w:num w:numId="25" w16cid:durableId="1714576960">
-    <w:abstractNumId w:val="23"/>
+  <w:num w:numId="36" w16cid:durableId="164785594">
+    <w:abstractNumId w:val="84"/>
   </w:num>
-  <w:num w:numId="26" w16cid:durableId="2121341683">
+  <w:num w:numId="37" w16cid:durableId="1690908687">
+    <w:abstractNumId w:val="85"/>
+  </w:num>
+  <w:num w:numId="38" w16cid:durableId="1494486041">
+    <w:abstractNumId w:val="67"/>
+  </w:num>
+  <w:num w:numId="39" w16cid:durableId="301084558">
+    <w:abstractNumId w:val="28"/>
+  </w:num>
+  <w:num w:numId="40" w16cid:durableId="1202018679">
+    <w:abstractNumId w:val="136"/>
+  </w:num>
+  <w:num w:numId="41" w16cid:durableId="696003112">
+    <w:abstractNumId w:val="144"/>
+  </w:num>
+  <w:num w:numId="42" w16cid:durableId="1488278798">
+    <w:abstractNumId w:val="79"/>
+  </w:num>
+  <w:num w:numId="43" w16cid:durableId="630794293">
+    <w:abstractNumId w:val="78"/>
+  </w:num>
+  <w:num w:numId="44" w16cid:durableId="170145410">
+    <w:abstractNumId w:val="103"/>
+  </w:num>
+  <w:num w:numId="45" w16cid:durableId="127862477">
     <w:abstractNumId w:val="30"/>
   </w:num>
-  <w:num w:numId="27" w16cid:durableId="827793205">
-    <w:abstractNumId w:val="131"/>
+  <w:num w:numId="46" w16cid:durableId="105513983">
+    <w:abstractNumId w:val="125"/>
   </w:num>
-  <w:num w:numId="28" w16cid:durableId="1275989163">
-    <w:abstractNumId w:val="66"/>
+  <w:num w:numId="47" w16cid:durableId="1514762862">
+    <w:abstractNumId w:val="36"/>
   </w:num>
-  <w:num w:numId="29" w16cid:durableId="621544332">
-    <w:abstractNumId w:val="79"/>
+  <w:num w:numId="48" w16cid:durableId="2091274094">
+    <w:abstractNumId w:val="5"/>
   </w:num>
-  <w:num w:numId="30" w16cid:durableId="1089692455">
-    <w:abstractNumId w:val="17"/>
-  </w:num>
-  <w:num w:numId="31" w16cid:durableId="1926265000">
-    <w:abstractNumId w:val="37"/>
-  </w:num>
-  <w:num w:numId="32" w16cid:durableId="2092268856">
-    <w:abstractNumId w:val="18"/>
-  </w:num>
-  <w:num w:numId="33" w16cid:durableId="46222972">
-    <w:abstractNumId w:val="39"/>
-  </w:num>
-  <w:num w:numId="34" w16cid:durableId="721440043">
-    <w:abstractNumId w:val="85"/>
-  </w:num>
-  <w:num w:numId="35" w16cid:durableId="1074085621">
-    <w:abstractNumId w:val="119"/>
-  </w:num>
-  <w:num w:numId="36" w16cid:durableId="164785594">
-    <w:abstractNumId w:val="81"/>
-  </w:num>
-  <w:num w:numId="37" w16cid:durableId="1690908687">
-    <w:abstractNumId w:val="82"/>
-  </w:num>
-  <w:num w:numId="38" w16cid:durableId="1494486041">
-    <w:abstractNumId w:val="64"/>
-  </w:num>
-  <w:num w:numId="39" w16cid:durableId="301084558">
-    <w:abstractNumId w:val="25"/>
-  </w:num>
-  <w:num w:numId="40" w16cid:durableId="1202018679">
-    <w:abstractNumId w:val="128"/>
-  </w:num>
-  <w:num w:numId="41" w16cid:durableId="696003112">
-    <w:abstractNumId w:val="136"/>
-  </w:num>
-  <w:num w:numId="42" w16cid:durableId="1488278798">
+  <w:num w:numId="49" w16cid:durableId="1099376477">
     <w:abstractNumId w:val="76"/>
   </w:num>
-  <w:num w:numId="43" w16cid:durableId="630794293">
+  <w:num w:numId="50" w16cid:durableId="1000231748">
+    <w:abstractNumId w:val="22"/>
+  </w:num>
+  <w:num w:numId="51" w16cid:durableId="1626617711">
+    <w:abstractNumId w:val="86"/>
+  </w:num>
+  <w:num w:numId="52" w16cid:durableId="853420226">
+    <w:abstractNumId w:val="107"/>
+  </w:num>
+  <w:num w:numId="53" w16cid:durableId="1519540791">
     <w:abstractNumId w:val="75"/>
   </w:num>
-  <w:num w:numId="44" w16cid:durableId="170145410">
-    <w:abstractNumId w:val="98"/>
-  </w:num>
-  <w:num w:numId="45" w16cid:durableId="127862477">
-    <w:abstractNumId w:val="27"/>
-  </w:num>
-  <w:num w:numId="46" w16cid:durableId="105513983">
-    <w:abstractNumId w:val="118"/>
-  </w:num>
-  <w:num w:numId="47" w16cid:durableId="1514762862">
-    <w:abstractNumId w:val="33"/>
-  </w:num>
-  <w:num w:numId="48" w16cid:durableId="2091274094">
-    <w:abstractNumId w:val="4"/>
-  </w:num>
-  <w:num w:numId="49" w16cid:durableId="1099376477">
-    <w:abstractNumId w:val="73"/>
-  </w:num>
-  <w:num w:numId="50" w16cid:durableId="1000231748">
-    <w:abstractNumId w:val="19"/>
-  </w:num>
-  <w:num w:numId="51" w16cid:durableId="1626617711">
-    <w:abstractNumId w:val="83"/>
-  </w:num>
-  <w:num w:numId="52" w16cid:durableId="853420226">
-    <w:abstractNumId w:val="101"/>
-  </w:num>
-  <w:num w:numId="53" w16cid:durableId="1519540791">
-    <w:abstractNumId w:val="72"/>
-  </w:num>
   <w:num w:numId="54" w16cid:durableId="1148135894">
-    <w:abstractNumId w:val="59"/>
+    <w:abstractNumId w:val="62"/>
   </w:num>
   <w:num w:numId="55" w16cid:durableId="1808281118">
-    <w:abstractNumId w:val="116"/>
+    <w:abstractNumId w:val="123"/>
   </w:num>
   <w:num w:numId="56" w16cid:durableId="1758408107">
-    <w:abstractNumId w:val="51"/>
+    <w:abstractNumId w:val="54"/>
   </w:num>
   <w:num w:numId="57" w16cid:durableId="820270538">
     <w:abstractNumId w:val="1"/>
   </w:num>
   <w:num w:numId="58" w16cid:durableId="433135565">
-    <w:abstractNumId w:val="61"/>
+    <w:abstractNumId w:val="64"/>
   </w:num>
   <w:num w:numId="59" w16cid:durableId="1891763306">
-    <w:abstractNumId w:val="132"/>
+    <w:abstractNumId w:val="140"/>
   </w:num>
   <w:num w:numId="60" w16cid:durableId="252595352">
-    <w:abstractNumId w:val="44"/>
+    <w:abstractNumId w:val="47"/>
   </w:num>
   <w:num w:numId="61" w16cid:durableId="43599653">
-    <w:abstractNumId w:val="31"/>
+    <w:abstractNumId w:val="34"/>
   </w:num>
   <w:num w:numId="62" w16cid:durableId="1724282809">
-    <w:abstractNumId w:val="87"/>
+    <w:abstractNumId w:val="91"/>
   </w:num>
   <w:num w:numId="63" w16cid:durableId="1221207068">
-    <w:abstractNumId w:val="3"/>
+    <w:abstractNumId w:val="4"/>
   </w:num>
   <w:num w:numId="64" w16cid:durableId="1494025353">
-    <w:abstractNumId w:val="55"/>
+    <w:abstractNumId w:val="58"/>
   </w:num>
   <w:num w:numId="65" w16cid:durableId="869296667">
-    <w:abstractNumId w:val="86"/>
+    <w:abstractNumId w:val="90"/>
   </w:num>
   <w:num w:numId="66" w16cid:durableId="91706771">
-    <w:abstractNumId w:val="29"/>
+    <w:abstractNumId w:val="32"/>
   </w:num>
   <w:num w:numId="67" w16cid:durableId="2083485411">
-    <w:abstractNumId w:val="38"/>
+    <w:abstractNumId w:val="41"/>
   </w:num>
   <w:num w:numId="68" w16cid:durableId="34044173">
-    <w:abstractNumId w:val="56"/>
+    <w:abstractNumId w:val="59"/>
   </w:num>
   <w:num w:numId="69" w16cid:durableId="1958246351">
-    <w:abstractNumId w:val="21"/>
+    <w:abstractNumId w:val="24"/>
   </w:num>
   <w:num w:numId="70" w16cid:durableId="1597665370">
-    <w:abstractNumId w:val="13"/>
+    <w:abstractNumId w:val="16"/>
   </w:num>
   <w:num w:numId="71" w16cid:durableId="389354266">
-    <w:abstractNumId w:val="127"/>
+    <w:abstractNumId w:val="135"/>
   </w:num>
   <w:num w:numId="72" w16cid:durableId="1195070258">
-    <w:abstractNumId w:val="123"/>
+    <w:abstractNumId w:val="131"/>
   </w:num>
   <w:num w:numId="73" w16cid:durableId="1972049655">
-    <w:abstractNumId w:val="65"/>
+    <w:abstractNumId w:val="68"/>
   </w:num>
   <w:num w:numId="74" w16cid:durableId="1499272371">
-    <w:abstractNumId w:val="89"/>
+    <w:abstractNumId w:val="93"/>
   </w:num>
   <w:num w:numId="75" w16cid:durableId="1796026856">
-    <w:abstractNumId w:val="100"/>
+    <w:abstractNumId w:val="106"/>
   </w:num>
   <w:num w:numId="76" w16cid:durableId="1229995767">
-    <w:abstractNumId w:val="105"/>
+    <w:abstractNumId w:val="111"/>
   </w:num>
   <w:num w:numId="77" w16cid:durableId="1817409612">
-    <w:abstractNumId w:val="95"/>
+    <w:abstractNumId w:val="99"/>
   </w:num>
   <w:num w:numId="78" w16cid:durableId="1134832258">
-    <w:abstractNumId w:val="133"/>
+    <w:abstractNumId w:val="141"/>
   </w:num>
   <w:num w:numId="79" w16cid:durableId="1911575055">
-    <w:abstractNumId w:val="67"/>
+    <w:abstractNumId w:val="70"/>
   </w:num>
   <w:num w:numId="80" w16cid:durableId="1638756930">
-    <w:abstractNumId w:val="40"/>
+    <w:abstractNumId w:val="43"/>
   </w:num>
   <w:num w:numId="81" w16cid:durableId="427506740">
-    <w:abstractNumId w:val="108"/>
+    <w:abstractNumId w:val="115"/>
   </w:num>
   <w:num w:numId="82" w16cid:durableId="513149297">
-    <w:abstractNumId w:val="94"/>
+    <w:abstractNumId w:val="98"/>
   </w:num>
   <w:num w:numId="83" w16cid:durableId="548422958">
-    <w:abstractNumId w:val="45"/>
+    <w:abstractNumId w:val="48"/>
   </w:num>
   <w:num w:numId="84" w16cid:durableId="931205951">
-    <w:abstractNumId w:val="121"/>
+    <w:abstractNumId w:val="128"/>
   </w:num>
   <w:num w:numId="85" w16cid:durableId="1261450898">
     <w:abstractNumId w:val="0"/>
   </w:num>
   <w:num w:numId="86" w16cid:durableId="470248295">
+    <w:abstractNumId w:val="83"/>
+  </w:num>
+  <w:num w:numId="87" w16cid:durableId="982394239">
+    <w:abstractNumId w:val="112"/>
+  </w:num>
+  <w:num w:numId="88" w16cid:durableId="2041782596">
+    <w:abstractNumId w:val="31"/>
+  </w:num>
+  <w:num w:numId="89" w16cid:durableId="558440056">
+    <w:abstractNumId w:val="39"/>
+  </w:num>
+  <w:num w:numId="90" w16cid:durableId="1366632968">
+    <w:abstractNumId w:val="6"/>
+  </w:num>
+  <w:num w:numId="91" w16cid:durableId="329143539">
+    <w:abstractNumId w:val="65"/>
+  </w:num>
+  <w:num w:numId="92" w16cid:durableId="1194732434">
+    <w:abstractNumId w:val="132"/>
+  </w:num>
+  <w:num w:numId="93" w16cid:durableId="1126509868">
+    <w:abstractNumId w:val="53"/>
+  </w:num>
+  <w:num w:numId="94" w16cid:durableId="1586915427">
+    <w:abstractNumId w:val="146"/>
+  </w:num>
+  <w:num w:numId="95" w16cid:durableId="1985424155">
+    <w:abstractNumId w:val="87"/>
+  </w:num>
+  <w:num w:numId="96" w16cid:durableId="1503928418">
+    <w:abstractNumId w:val="145"/>
+  </w:num>
+  <w:num w:numId="97" w16cid:durableId="1523935396">
+    <w:abstractNumId w:val="44"/>
+  </w:num>
+  <w:num w:numId="98" w16cid:durableId="918711878">
+    <w:abstractNumId w:val="117"/>
+  </w:num>
+  <w:num w:numId="99" w16cid:durableId="1606887394">
+    <w:abstractNumId w:val="120"/>
+  </w:num>
+  <w:num w:numId="100" w16cid:durableId="1027754377">
+    <w:abstractNumId w:val="96"/>
+  </w:num>
+  <w:num w:numId="101" w16cid:durableId="826559138">
+    <w:abstractNumId w:val="101"/>
+  </w:num>
+  <w:num w:numId="102" w16cid:durableId="442727970">
+    <w:abstractNumId w:val="113"/>
+  </w:num>
+  <w:num w:numId="103" w16cid:durableId="844444982">
+    <w:abstractNumId w:val="49"/>
+  </w:num>
+  <w:num w:numId="104" w16cid:durableId="1434743620">
+    <w:abstractNumId w:val="105"/>
+  </w:num>
+  <w:num w:numId="105" w16cid:durableId="2108646521">
+    <w:abstractNumId w:val="110"/>
+  </w:num>
+  <w:num w:numId="106" w16cid:durableId="590892086">
+    <w:abstractNumId w:val="72"/>
+  </w:num>
+  <w:num w:numId="107" w16cid:durableId="357900316">
+    <w:abstractNumId w:val="127"/>
+  </w:num>
+  <w:num w:numId="108" w16cid:durableId="1764102689">
+    <w:abstractNumId w:val="57"/>
+  </w:num>
+  <w:num w:numId="109" w16cid:durableId="912198173">
+    <w:abstractNumId w:val="25"/>
+  </w:num>
+  <w:num w:numId="110" w16cid:durableId="1241789548">
+    <w:abstractNumId w:val="81"/>
+  </w:num>
+  <w:num w:numId="111" w16cid:durableId="1400665305">
+    <w:abstractNumId w:val="133"/>
+  </w:num>
+  <w:num w:numId="112" w16cid:durableId="2112309544">
+    <w:abstractNumId w:val="124"/>
+  </w:num>
+  <w:num w:numId="113" w16cid:durableId="178980209">
     <w:abstractNumId w:val="80"/>
   </w:num>
-  <w:num w:numId="87" w16cid:durableId="982394239">
-    <w:abstractNumId w:val="106"/>
+  <w:num w:numId="114" w16cid:durableId="1439905237">
+    <w:abstractNumId w:val="94"/>
   </w:num>
-  <w:num w:numId="88" w16cid:durableId="2041782596">
-    <w:abstractNumId w:val="28"/>
+  <w:num w:numId="115" w16cid:durableId="1284994660">
+    <w:abstractNumId w:val="17"/>
   </w:num>
-  <w:num w:numId="89" w16cid:durableId="558440056">
-    <w:abstractNumId w:val="36"/>
+  <w:num w:numId="116" w16cid:durableId="1485464118">
+    <w:abstractNumId w:val="61"/>
   </w:num>
-  <w:num w:numId="90" w16cid:durableId="1366632968">
-    <w:abstractNumId w:val="5"/>
+  <w:num w:numId="117" w16cid:durableId="23748565">
+    <w:abstractNumId w:val="12"/>
   </w:num>
-  <w:num w:numId="91" w16cid:durableId="329143539">
-    <w:abstractNumId w:val="62"/>
+  <w:num w:numId="118" w16cid:durableId="1546982661">
+    <w:abstractNumId w:val="35"/>
   </w:num>
-  <w:num w:numId="92" w16cid:durableId="1194732434">
-    <w:abstractNumId w:val="124"/>
+  <w:num w:numId="119" w16cid:durableId="511844402">
+    <w:abstractNumId w:val="95"/>
   </w:num>
-  <w:num w:numId="93" w16cid:durableId="1126509868">
+  <w:num w:numId="120" w16cid:durableId="11885333">
+    <w:abstractNumId w:val="122"/>
+  </w:num>
+  <w:num w:numId="121" w16cid:durableId="505560641">
+    <w:abstractNumId w:val="19"/>
+  </w:num>
+  <w:num w:numId="122" w16cid:durableId="1705016172">
+    <w:abstractNumId w:val="14"/>
+  </w:num>
+  <w:num w:numId="123" w16cid:durableId="595557576">
+    <w:abstractNumId w:val="56"/>
+  </w:num>
+  <w:num w:numId="124" w16cid:durableId="414671139">
+    <w:abstractNumId w:val="134"/>
+  </w:num>
+  <w:num w:numId="125" w16cid:durableId="1611204867">
+    <w:abstractNumId w:val="108"/>
+  </w:num>
+  <w:num w:numId="126" w16cid:durableId="2000231371">
+    <w:abstractNumId w:val="119"/>
+  </w:num>
+  <w:num w:numId="127" w16cid:durableId="75368484">
+    <w:abstractNumId w:val="118"/>
+  </w:num>
+  <w:num w:numId="128" w16cid:durableId="1710884106">
+    <w:abstractNumId w:val="66"/>
+  </w:num>
+  <w:num w:numId="129" w16cid:durableId="2049917289">
+    <w:abstractNumId w:val="10"/>
+  </w:num>
+  <w:num w:numId="130" w16cid:durableId="578442513">
+    <w:abstractNumId w:val="27"/>
+  </w:num>
+  <w:num w:numId="131" w16cid:durableId="983386602">
+    <w:abstractNumId w:val="137"/>
+  </w:num>
+  <w:num w:numId="132" w16cid:durableId="1524629629">
+    <w:abstractNumId w:val="138"/>
+  </w:num>
+  <w:num w:numId="133" w16cid:durableId="378480816">
+    <w:abstractNumId w:val="63"/>
+  </w:num>
+  <w:num w:numId="134" w16cid:durableId="1317341191">
+    <w:abstractNumId w:val="109"/>
+  </w:num>
+  <w:num w:numId="135" w16cid:durableId="137309229">
+    <w:abstractNumId w:val="55"/>
+  </w:num>
+  <w:num w:numId="136" w16cid:durableId="799691230">
+    <w:abstractNumId w:val="15"/>
+  </w:num>
+  <w:num w:numId="137" w16cid:durableId="2104183833">
+    <w:abstractNumId w:val="73"/>
+  </w:num>
+  <w:num w:numId="138" w16cid:durableId="1488396013">
     <w:abstractNumId w:val="50"/>
   </w:num>
-  <w:num w:numId="94" w16cid:durableId="1586915427">
-    <w:abstractNumId w:val="138"/>
+  <w:num w:numId="139" w16cid:durableId="2014380956">
+    <w:abstractNumId w:val="100"/>
   </w:num>
-  <w:num w:numId="95" w16cid:durableId="1985424155">
-    <w:abstractNumId w:val="84"/>
+  <w:num w:numId="140" w16cid:durableId="1299264417">
+    <w:abstractNumId w:val="13"/>
   </w:num>
-  <w:num w:numId="96" w16cid:durableId="1503928418">
-    <w:abstractNumId w:val="137"/>
+  <w:num w:numId="141" w16cid:durableId="1840197347">
+    <w:abstractNumId w:val="114"/>
   </w:num>
-  <w:num w:numId="97" w16cid:durableId="1523935396">
-    <w:abstractNumId w:val="41"/>
+  <w:num w:numId="142" w16cid:durableId="157305379">
+    <w:abstractNumId w:val="129"/>
   </w:num>
-  <w:num w:numId="98" w16cid:durableId="918711878">
-    <w:abstractNumId w:val="110"/>
+  <w:num w:numId="143" w16cid:durableId="1979219235">
+    <w:abstractNumId w:val="102"/>
   </w:num>
-  <w:num w:numId="99" w16cid:durableId="1606887394">
-    <w:abstractNumId w:val="113"/>
+  <w:num w:numId="144" w16cid:durableId="982612301">
+    <w:abstractNumId w:val="11"/>
   </w:num>
-  <w:num w:numId="100" w16cid:durableId="1027754377">
-    <w:abstractNumId w:val="92"/>
+  <w:num w:numId="145" w16cid:durableId="719522062">
+    <w:abstractNumId w:val="88"/>
   </w:num>
-  <w:num w:numId="101" w16cid:durableId="826559138">
-    <w:abstractNumId w:val="97"/>
+  <w:num w:numId="146" w16cid:durableId="560292905">
+    <w:abstractNumId w:val="3"/>
   </w:num>
-  <w:num w:numId="102" w16cid:durableId="442727970">
-    <w:abstractNumId w:val="107"/>
-  </w:num>
-  <w:num w:numId="103" w16cid:durableId="844444982">
-    <w:abstractNumId w:val="46"/>
-  </w:num>
-  <w:num w:numId="104" w16cid:durableId="1434743620">
-    <w:abstractNumId w:val="99"/>
-  </w:num>
-  <w:num w:numId="105" w16cid:durableId="2108646521">
+  <w:num w:numId="147" w16cid:durableId="1063672708">
     <w:abstractNumId w:val="104"/>
   </w:num>
-  <w:num w:numId="106" w16cid:durableId="590892086">
-    <w:abstractNumId w:val="69"/>
-  </w:num>
-  <w:num w:numId="107" w16cid:durableId="357900316">
-    <w:abstractNumId w:val="120"/>
-  </w:num>
-  <w:num w:numId="108" w16cid:durableId="1764102689">
-    <w:abstractNumId w:val="54"/>
-  </w:num>
-  <w:num w:numId="109" w16cid:durableId="912198173">
-    <w:abstractNumId w:val="22"/>
-  </w:num>
-  <w:num w:numId="110" w16cid:durableId="1241789548">
-    <w:abstractNumId w:val="78"/>
-  </w:num>
-  <w:num w:numId="111" w16cid:durableId="1400665305">
-    <w:abstractNumId w:val="125"/>
-  </w:num>
-  <w:num w:numId="112" w16cid:durableId="2112309544">
-    <w:abstractNumId w:val="117"/>
-  </w:num>
-  <w:num w:numId="113" w16cid:durableId="178980209">
-    <w:abstractNumId w:val="77"/>
-  </w:num>
-  <w:num w:numId="114" w16cid:durableId="1439905237">
-    <w:abstractNumId w:val="90"/>
-  </w:num>
-  <w:num w:numId="115" w16cid:durableId="1284994660">
-    <w:abstractNumId w:val="14"/>
-  </w:num>
-  <w:num w:numId="116" w16cid:durableId="1485464118">
-    <w:abstractNumId w:val="58"/>
-  </w:num>
-  <w:num w:numId="117" w16cid:durableId="23748565">
-    <w:abstractNumId w:val="10"/>
-  </w:num>
-  <w:num w:numId="118" w16cid:durableId="1546982661">
-    <w:abstractNumId w:val="32"/>
-  </w:num>
-  <w:num w:numId="119" w16cid:durableId="511844402">
-    <w:abstractNumId w:val="91"/>
-  </w:num>
-  <w:num w:numId="120" w16cid:durableId="11885333">
-    <w:abstractNumId w:val="115"/>
-  </w:num>
-  <w:num w:numId="121" w16cid:durableId="505560641">
-    <w:abstractNumId w:val="16"/>
-  </w:num>
-  <w:num w:numId="122" w16cid:durableId="1705016172">
-    <w:abstractNumId w:val="11"/>
-  </w:num>
-  <w:num w:numId="123" w16cid:durableId="595557576">
-    <w:abstractNumId w:val="53"/>
-  </w:num>
-  <w:num w:numId="124" w16cid:durableId="414671139">
-    <w:abstractNumId w:val="126"/>
-  </w:num>
-  <w:num w:numId="125" w16cid:durableId="1611204867">
-    <w:abstractNumId w:val="102"/>
-  </w:num>
-  <w:num w:numId="126" w16cid:durableId="2000231371">
-    <w:abstractNumId w:val="112"/>
-  </w:num>
-  <w:num w:numId="127" w16cid:durableId="75368484">
-    <w:abstractNumId w:val="111"/>
-  </w:num>
-  <w:num w:numId="128" w16cid:durableId="1710884106">
-    <w:abstractNumId w:val="63"/>
-  </w:num>
-  <w:num w:numId="129" w16cid:durableId="2049917289">
-    <w:abstractNumId w:val="9"/>
-  </w:num>
-  <w:num w:numId="130" w16cid:durableId="578442513">
-    <w:abstractNumId w:val="24"/>
-  </w:num>
-  <w:num w:numId="131" w16cid:durableId="983386602">
-    <w:abstractNumId w:val="129"/>
-  </w:num>
-  <w:num w:numId="132" w16cid:durableId="1524629629">
-    <w:abstractNumId w:val="130"/>
-  </w:num>
-  <w:num w:numId="133" w16cid:durableId="378480816">
-    <w:abstractNumId w:val="60"/>
-  </w:num>
-  <w:num w:numId="134" w16cid:durableId="1317341191">
-    <w:abstractNumId w:val="103"/>
-  </w:num>
-  <w:num w:numId="135" w16cid:durableId="137309229">
-    <w:abstractNumId w:val="52"/>
-  </w:num>
-  <w:num w:numId="136" w16cid:durableId="799691230">
-    <w:abstractNumId w:val="12"/>
-  </w:num>
-  <w:num w:numId="137" w16cid:durableId="2104183833">
-    <w:abstractNumId w:val="70"/>
-  </w:num>
-  <w:num w:numId="138" w16cid:durableId="1488396013">
-    <w:abstractNumId w:val="47"/>
-  </w:num>
-  <w:num w:numId="139" w16cid:durableId="2014380956">
-    <w:abstractNumId w:val="96"/>
-  </w:num>
-  <w:numIdMacAtCleanup w:val="139"/>
+  <w:numIdMacAtCleanup w:val="147"/>
 </w:numbering>
 </file>
 

</xml_diff>

<commit_message>
Add scientist media pages, harmonize portrait photos, and rebuild Deployment.
- Add bilingual media / internet-resource pages for Bakhtiyar Sirajov,
  Teymur Rzayev, and Seymur Nasirov, with downloaded per-source thumbnails,
  a shared _scientist_media render module, routes/sitemap entries, and
  "Additional Resources" links from their profiles.
- Harmonize all scientist portraits to 296x352 transparent-cutout PNGs
  (37:44 frame, backgrounds removed) for consistent, crisp profile avatars;
  switch card avatars to object-fit: cover and add photo cache-busting.
- Regenerate all _thumbs/*.jpg avatars from the harmonized sources.
- Profile content updates: Teymur Rzayev awards list, Vahid Geruslu bio
  rewrite (AZ/EN) plus research/social profile links, Suleyman Allahverdiyev
  thumbnail refresh, Seymur Nasirov photo fix.
- Bump shared CSS/JS and profile-data versions; rebuild Deployment package.

Co-authored-by: Cursor <cursoragent@cursor.com>
</commit_message>
<xml_diff>
--- a/documents/docx/Prompts.docx
+++ b/documents/docx/Prompts.docx
@@ -26275,13 +26275,40 @@
     <w:p>
       <w:pPr>
         <w:spacing w:after="0" w:line="240" w:lineRule="auto"/>
+      </w:pPr>
+      <w:r>
+        <w:t>Go through the edited_stories folder and identify which stories don't yet have a matching image (by comparing story filenames/titles against existing image filenames). For each story that's missing one, generate an image that reflects its content and theme, following the established style (bright, light/pastel tones, daylight lighting, no dark areas). Save each new image in the same folder, using the same filename convention as the existing images.</w:t>
+      </w:r>
+    </w:p>
+    <w:p>
+      <w:pPr>
+        <w:spacing w:after="0" w:line="240" w:lineRule="auto"/>
+      </w:pPr>
+    </w:p>
+    <w:p>
+      <w:pPr>
+        <w:spacing w:after="0" w:line="240" w:lineRule="auto"/>
+      </w:pPr>
+    </w:p>
+    <w:p>
+      <w:pPr>
+        <w:spacing w:after="0" w:line="240" w:lineRule="auto"/>
         <w:rPr>
           <w:vanish/>
           <w:lang w:val="az-Latn-AZ"/>
         </w:rPr>
       </w:pPr>
       <w:r>
-        <w:t>Go through the edited_stories folder and identify which stories don't yet have a matching image (by comparing story filenames/titles against existing image filenames). For each story that's missing one, generate an image that reflects its content and theme, following the established style (bright, light/pastel tones, daylight lighting, no dark areas). Save each new image in the same folder, using the same filename convention as the existing images.</w:t>
+        <w:t>Please read through 'Adam olmaq.docx' and translate it into modern, natural English — faithful to the meaning of the story, but reading as though it were originally written by a native speaker.</w:t>
+      </w:r>
+      <w:r>
+        <w:t xml:space="preserve"> Make the translation more </w:t>
+      </w:r>
+      <w:r>
+        <w:t>literary suitable for publication in the illustrated story collection</w:t>
+      </w:r>
+      <w:r>
+        <w:t>.</w:t>
       </w:r>
     </w:p>
     <w:p>

</xml_diff>